<commit_message>
docs: diagramas em tamanho normal na versao ABNT
Cada diagrama do Apendice A volta a ocupar uma pagina paisagem com margens
normais, com titulo e descricao logo abaixo da figura.

Co-Authored-By: Claude Opus 5.5 <noreply@anthropic.com>
Claude-Session: https://claude.ai/code/session_011SKCdnRmci1yJCi4ZvMpS2
</commit_message>
<xml_diff>
--- a/docs/Documentacao-ABNT.docx
+++ b/docs/Documentacao-ABNT.docx
@@ -476,7 +476,7 @@
             </w:rPr>
             <w:fldChar w:fldCharType="separate"/>
           </w:r>
-          <w:hyperlink w:anchor="__RefHeading___Toc3206_1125974958">
+          <w:hyperlink w:anchor="__RefHeading___Toc3041_634922549">
             <w:r>
               <w:rPr>
                 <w:webHidden/>
@@ -497,7 +497,7 @@
             </w:tabs>
             <w:rPr/>
           </w:pPr>
-          <w:hyperlink w:anchor="__RefHeading___Toc3208_1125974958">
+          <w:hyperlink w:anchor="__RefHeading___Toc3043_634922549">
             <w:r>
               <w:rPr>
                 <w:webHidden/>
@@ -518,7 +518,7 @@
             </w:tabs>
             <w:rPr/>
           </w:pPr>
-          <w:hyperlink w:anchor="__RefHeading___Toc3210_1125974958">
+          <w:hyperlink w:anchor="__RefHeading___Toc3045_634922549">
             <w:r>
               <w:rPr>
                 <w:webHidden/>
@@ -539,7 +539,7 @@
             </w:tabs>
             <w:rPr/>
           </w:pPr>
-          <w:hyperlink w:anchor="__RefHeading___Toc3212_1125974958">
+          <w:hyperlink w:anchor="__RefHeading___Toc3047_634922549">
             <w:r>
               <w:rPr>
                 <w:webHidden/>
@@ -560,7 +560,7 @@
             </w:tabs>
             <w:rPr/>
           </w:pPr>
-          <w:hyperlink w:anchor="__RefHeading___Toc3214_1125974958">
+          <w:hyperlink w:anchor="__RefHeading___Toc3049_634922549">
             <w:r>
               <w:rPr>
                 <w:webHidden/>
@@ -581,7 +581,7 @@
             </w:tabs>
             <w:rPr/>
           </w:pPr>
-          <w:hyperlink w:anchor="__RefHeading___Toc3216_1125974958">
+          <w:hyperlink w:anchor="__RefHeading___Toc3051_634922549">
             <w:r>
               <w:rPr>
                 <w:webHidden/>
@@ -602,7 +602,7 @@
             </w:tabs>
             <w:rPr/>
           </w:pPr>
-          <w:hyperlink w:anchor="__RefHeading___Toc3218_1125974958">
+          <w:hyperlink w:anchor="__RefHeading___Toc3053_634922549">
             <w:r>
               <w:rPr>
                 <w:webHidden/>
@@ -623,7 +623,7 @@
             </w:tabs>
             <w:rPr/>
           </w:pPr>
-          <w:hyperlink w:anchor="__RefHeading___Toc3220_1125974958">
+          <w:hyperlink w:anchor="__RefHeading___Toc3055_634922549">
             <w:r>
               <w:rPr>
                 <w:webHidden/>
@@ -644,7 +644,7 @@
             </w:tabs>
             <w:rPr/>
           </w:pPr>
-          <w:hyperlink w:anchor="__RefHeading___Toc3222_1125974958">
+          <w:hyperlink w:anchor="__RefHeading___Toc3057_634922549">
             <w:r>
               <w:rPr>
                 <w:webHidden/>
@@ -665,7 +665,7 @@
             </w:tabs>
             <w:rPr/>
           </w:pPr>
-          <w:hyperlink w:anchor="__RefHeading___Toc3224_1125974958">
+          <w:hyperlink w:anchor="__RefHeading___Toc3059_634922549">
             <w:r>
               <w:rPr>
                 <w:webHidden/>
@@ -686,7 +686,7 @@
             </w:tabs>
             <w:rPr/>
           </w:pPr>
-          <w:hyperlink w:anchor="__RefHeading___Toc3226_1125974958">
+          <w:hyperlink w:anchor="__RefHeading___Toc3061_634922549">
             <w:r>
               <w:rPr>
                 <w:webHidden/>
@@ -707,7 +707,7 @@
             </w:tabs>
             <w:rPr/>
           </w:pPr>
-          <w:hyperlink w:anchor="__RefHeading___Toc3228_1125974958">
+          <w:hyperlink w:anchor="__RefHeading___Toc3063_634922549">
             <w:r>
               <w:rPr>
                 <w:webHidden/>
@@ -728,7 +728,7 @@
             </w:tabs>
             <w:rPr/>
           </w:pPr>
-          <w:hyperlink w:anchor="__RefHeading___Toc3230_1125974958">
+          <w:hyperlink w:anchor="__RefHeading___Toc3065_634922549">
             <w:r>
               <w:rPr>
                 <w:webHidden/>
@@ -749,7 +749,7 @@
             </w:tabs>
             <w:rPr/>
           </w:pPr>
-          <w:hyperlink w:anchor="__RefHeading___Toc3232_1125974958">
+          <w:hyperlink w:anchor="__RefHeading___Toc3067_634922549">
             <w:r>
               <w:rPr>
                 <w:webHidden/>
@@ -770,7 +770,7 @@
             </w:tabs>
             <w:rPr/>
           </w:pPr>
-          <w:hyperlink w:anchor="__RefHeading___Toc3234_1125974958">
+          <w:hyperlink w:anchor="__RefHeading___Toc3069_634922549">
             <w:r>
               <w:rPr>
                 <w:webHidden/>
@@ -791,7 +791,7 @@
             </w:tabs>
             <w:rPr/>
           </w:pPr>
-          <w:hyperlink w:anchor="__RefHeading___Toc3236_1125974958">
+          <w:hyperlink w:anchor="__RefHeading___Toc3071_634922549">
             <w:r>
               <w:rPr>
                 <w:webHidden/>
@@ -812,7 +812,7 @@
             </w:tabs>
             <w:rPr/>
           </w:pPr>
-          <w:hyperlink w:anchor="__RefHeading___Toc3238_1125974958">
+          <w:hyperlink w:anchor="__RefHeading___Toc3073_634922549">
             <w:r>
               <w:rPr>
                 <w:webHidden/>
@@ -833,7 +833,7 @@
             </w:tabs>
             <w:rPr/>
           </w:pPr>
-          <w:hyperlink w:anchor="__RefHeading___Toc3240_1125974958">
+          <w:hyperlink w:anchor="__RefHeading___Toc3075_634922549">
             <w:r>
               <w:rPr>
                 <w:webHidden/>
@@ -854,7 +854,7 @@
             </w:tabs>
             <w:rPr/>
           </w:pPr>
-          <w:hyperlink w:anchor="__RefHeading___Toc3242_1125974958">
+          <w:hyperlink w:anchor="__RefHeading___Toc3077_634922549">
             <w:r>
               <w:rPr>
                 <w:webHidden/>
@@ -875,7 +875,7 @@
             </w:tabs>
             <w:rPr/>
           </w:pPr>
-          <w:hyperlink w:anchor="__RefHeading___Toc3244_1125974958">
+          <w:hyperlink w:anchor="__RefHeading___Toc3079_634922549">
             <w:r>
               <w:rPr>
                 <w:webHidden/>
@@ -896,7 +896,7 @@
             </w:tabs>
             <w:rPr/>
           </w:pPr>
-          <w:hyperlink w:anchor="__RefHeading___Toc3246_1125974958">
+          <w:hyperlink w:anchor="__RefHeading___Toc3081_634922549">
             <w:r>
               <w:rPr>
                 <w:webHidden/>
@@ -917,7 +917,7 @@
             </w:tabs>
             <w:rPr/>
           </w:pPr>
-          <w:hyperlink w:anchor="__RefHeading___Toc3248_1125974958">
+          <w:hyperlink w:anchor="__RefHeading___Toc3083_634922549">
             <w:r>
               <w:rPr>
                 <w:webHidden/>
@@ -938,7 +938,7 @@
             </w:tabs>
             <w:rPr/>
           </w:pPr>
-          <w:hyperlink w:anchor="__RefHeading___Toc3250_1125974958">
+          <w:hyperlink w:anchor="__RefHeading___Toc3085_634922549">
             <w:r>
               <w:rPr>
                 <w:webHidden/>
@@ -959,7 +959,7 @@
             </w:tabs>
             <w:rPr/>
           </w:pPr>
-          <w:hyperlink w:anchor="__RefHeading___Toc3252_1125974958">
+          <w:hyperlink w:anchor="__RefHeading___Toc3087_634922549">
             <w:r>
               <w:rPr>
                 <w:webHidden/>
@@ -980,7 +980,7 @@
             </w:tabs>
             <w:rPr/>
           </w:pPr>
-          <w:hyperlink w:anchor="__RefHeading___Toc3254_1125974958">
+          <w:hyperlink w:anchor="__RefHeading___Toc3089_634922549">
             <w:r>
               <w:rPr>
                 <w:webHidden/>
@@ -1001,7 +1001,7 @@
             </w:tabs>
             <w:rPr/>
           </w:pPr>
-          <w:hyperlink w:anchor="__RefHeading___Toc3256_1125974958">
+          <w:hyperlink w:anchor="__RefHeading___Toc3091_634922549">
             <w:r>
               <w:rPr>
                 <w:webHidden/>
@@ -1022,7 +1022,7 @@
             </w:tabs>
             <w:rPr/>
           </w:pPr>
-          <w:hyperlink w:anchor="__RefHeading___Toc3258_1125974958">
+          <w:hyperlink w:anchor="__RefHeading___Toc3093_634922549">
             <w:r>
               <w:rPr>
                 <w:webHidden/>
@@ -1043,7 +1043,7 @@
             </w:tabs>
             <w:rPr/>
           </w:pPr>
-          <w:hyperlink w:anchor="__RefHeading___Toc3260_1125974958">
+          <w:hyperlink w:anchor="__RefHeading___Toc3095_634922549">
             <w:r>
               <w:rPr>
                 <w:webHidden/>
@@ -1064,7 +1064,7 @@
             </w:tabs>
             <w:rPr/>
           </w:pPr>
-          <w:hyperlink w:anchor="__RefHeading___Toc3262_1125974958">
+          <w:hyperlink w:anchor="__RefHeading___Toc3097_634922549">
             <w:r>
               <w:rPr>
                 <w:webHidden/>
@@ -1085,7 +1085,7 @@
             </w:tabs>
             <w:rPr/>
           </w:pPr>
-          <w:hyperlink w:anchor="__RefHeading___Toc3264_1125974958">
+          <w:hyperlink w:anchor="__RefHeading___Toc3099_634922549">
             <w:r>
               <w:rPr>
                 <w:webHidden/>
@@ -1106,7 +1106,7 @@
             </w:tabs>
             <w:rPr/>
           </w:pPr>
-          <w:hyperlink w:anchor="__RefHeading___Toc3266_1125974958">
+          <w:hyperlink w:anchor="__RefHeading___Toc3101_634922549">
             <w:r>
               <w:rPr>
                 <w:webHidden/>
@@ -1127,7 +1127,7 @@
             </w:tabs>
             <w:rPr/>
           </w:pPr>
-          <w:hyperlink w:anchor="__RefHeading___Toc3268_1125974958">
+          <w:hyperlink w:anchor="__RefHeading___Toc3103_634922549">
             <w:r>
               <w:rPr>
                 <w:webHidden/>
@@ -1148,7 +1148,7 @@
             </w:tabs>
             <w:rPr/>
           </w:pPr>
-          <w:hyperlink w:anchor="__RefHeading___Toc3270_1125974958">
+          <w:hyperlink w:anchor="__RefHeading___Toc3105_634922549">
             <w:r>
               <w:rPr>
                 <w:webHidden/>
@@ -1169,7 +1169,7 @@
             </w:tabs>
             <w:rPr/>
           </w:pPr>
-          <w:hyperlink w:anchor="__RefHeading___Toc3272_1125974958">
+          <w:hyperlink w:anchor="__RefHeading___Toc3107_634922549">
             <w:r>
               <w:rPr>
                 <w:webHidden/>
@@ -1190,7 +1190,7 @@
             </w:tabs>
             <w:rPr/>
           </w:pPr>
-          <w:hyperlink w:anchor="__RefHeading___Toc3274_1125974958">
+          <w:hyperlink w:anchor="__RefHeading___Toc3109_634922549">
             <w:r>
               <w:rPr>
                 <w:webHidden/>
@@ -1211,7 +1211,7 @@
             </w:tabs>
             <w:rPr/>
           </w:pPr>
-          <w:hyperlink w:anchor="__RefHeading___Toc3276_1125974958">
+          <w:hyperlink w:anchor="__RefHeading___Toc3111_634922549">
             <w:r>
               <w:rPr>
                 <w:webHidden/>
@@ -1232,7 +1232,7 @@
             </w:tabs>
             <w:rPr/>
           </w:pPr>
-          <w:hyperlink w:anchor="__RefHeading___Toc3278_1125974958">
+          <w:hyperlink w:anchor="__RefHeading___Toc3113_634922549">
             <w:r>
               <w:rPr>
                 <w:webHidden/>
@@ -1253,7 +1253,7 @@
             </w:tabs>
             <w:rPr/>
           </w:pPr>
-          <w:hyperlink w:anchor="__RefHeading___Toc3280_1125974958">
+          <w:hyperlink w:anchor="__RefHeading___Toc3115_634922549">
             <w:r>
               <w:rPr>
                 <w:webHidden/>
@@ -1274,7 +1274,7 @@
             </w:tabs>
             <w:rPr/>
           </w:pPr>
-          <w:hyperlink w:anchor="__RefHeading___Toc3282_1125974958">
+          <w:hyperlink w:anchor="__RefHeading___Toc3117_634922549">
             <w:r>
               <w:rPr>
                 <w:webHidden/>
@@ -1295,7 +1295,7 @@
             </w:tabs>
             <w:rPr/>
           </w:pPr>
-          <w:hyperlink w:anchor="__RefHeading___Toc3284_1125974958">
+          <w:hyperlink w:anchor="__RefHeading___Toc3119_634922549">
             <w:r>
               <w:rPr>
                 <w:webHidden/>
@@ -1316,7 +1316,7 @@
             </w:tabs>
             <w:rPr/>
           </w:pPr>
-          <w:hyperlink w:anchor="__RefHeading___Toc3286_1125974958">
+          <w:hyperlink w:anchor="__RefHeading___Toc3121_634922549">
             <w:r>
               <w:rPr>
                 <w:webHidden/>
@@ -1337,7 +1337,7 @@
             </w:tabs>
             <w:rPr/>
           </w:pPr>
-          <w:hyperlink w:anchor="__RefHeading___Toc3288_1125974958">
+          <w:hyperlink w:anchor="__RefHeading___Toc3123_634922549">
             <w:r>
               <w:rPr>
                 <w:webHidden/>
@@ -1358,7 +1358,7 @@
             </w:tabs>
             <w:rPr/>
           </w:pPr>
-          <w:hyperlink w:anchor="__RefHeading___Toc3290_1125974958">
+          <w:hyperlink w:anchor="__RefHeading___Toc3125_634922549">
             <w:r>
               <w:rPr>
                 <w:webHidden/>
@@ -1379,7 +1379,7 @@
             </w:tabs>
             <w:rPr/>
           </w:pPr>
-          <w:hyperlink w:anchor="__RefHeading___Toc3292_1125974958">
+          <w:hyperlink w:anchor="__RefHeading___Toc3127_634922549">
             <w:r>
               <w:rPr>
                 <w:webHidden/>
@@ -1400,7 +1400,7 @@
             </w:tabs>
             <w:rPr/>
           </w:pPr>
-          <w:hyperlink w:anchor="__RefHeading___Toc3294_1125974958">
+          <w:hyperlink w:anchor="__RefHeading___Toc3129_634922549">
             <w:r>
               <w:rPr>
                 <w:webHidden/>
@@ -1421,7 +1421,7 @@
             </w:tabs>
             <w:rPr/>
           </w:pPr>
-          <w:hyperlink w:anchor="__RefHeading___Toc3296_1125974958">
+          <w:hyperlink w:anchor="__RefHeading___Toc3131_634922549">
             <w:r>
               <w:rPr>
                 <w:webHidden/>
@@ -1442,7 +1442,7 @@
             </w:tabs>
             <w:rPr/>
           </w:pPr>
-          <w:hyperlink w:anchor="__RefHeading___Toc3298_1125974958">
+          <w:hyperlink w:anchor="__RefHeading___Toc3133_634922549">
             <w:r>
               <w:rPr>
                 <w:webHidden/>
@@ -1463,7 +1463,7 @@
             </w:tabs>
             <w:rPr/>
           </w:pPr>
-          <w:hyperlink w:anchor="__RefHeading___Toc3300_1125974958">
+          <w:hyperlink w:anchor="__RefHeading___Toc3135_634922549">
             <w:r>
               <w:rPr>
                 <w:webHidden/>
@@ -1484,7 +1484,7 @@
             </w:tabs>
             <w:rPr/>
           </w:pPr>
-          <w:hyperlink w:anchor="__RefHeading___Toc3302_1125974958">
+          <w:hyperlink w:anchor="__RefHeading___Toc3137_634922549">
             <w:r>
               <w:rPr>
                 <w:webHidden/>
@@ -1505,7 +1505,7 @@
             </w:tabs>
             <w:rPr/>
           </w:pPr>
-          <w:hyperlink w:anchor="__RefHeading___Toc3304_1125974958">
+          <w:hyperlink w:anchor="__RefHeading___Toc3139_634922549">
             <w:r>
               <w:rPr>
                 <w:webHidden/>
@@ -1526,7 +1526,7 @@
             </w:tabs>
             <w:rPr/>
           </w:pPr>
-          <w:hyperlink w:anchor="__RefHeading___Toc3306_1125974958">
+          <w:hyperlink w:anchor="__RefHeading___Toc3141_634922549">
             <w:r>
               <w:rPr>
                 <w:webHidden/>
@@ -1547,7 +1547,7 @@
             </w:tabs>
             <w:rPr/>
           </w:pPr>
-          <w:hyperlink w:anchor="__RefHeading___Toc3308_1125974958">
+          <w:hyperlink w:anchor="__RefHeading___Toc3143_634922549">
             <w:r>
               <w:rPr>
                 <w:webHidden/>
@@ -1568,7 +1568,7 @@
             </w:tabs>
             <w:rPr/>
           </w:pPr>
-          <w:hyperlink w:anchor="__RefHeading___Toc3310_1125974958">
+          <w:hyperlink w:anchor="__RefHeading___Toc3145_634922549">
             <w:r>
               <w:rPr>
                 <w:webHidden/>
@@ -1589,7 +1589,7 @@
             </w:tabs>
             <w:rPr/>
           </w:pPr>
-          <w:hyperlink w:anchor="__RefHeading___Toc3312_1125974958">
+          <w:hyperlink w:anchor="__RefHeading___Toc3147_634922549">
             <w:r>
               <w:rPr>
                 <w:webHidden/>
@@ -1610,7 +1610,7 @@
             </w:tabs>
             <w:rPr/>
           </w:pPr>
-          <w:hyperlink w:anchor="__RefHeading___Toc3314_1125974958">
+          <w:hyperlink w:anchor="__RefHeading___Toc3149_634922549">
             <w:r>
               <w:rPr>
                 <w:webHidden/>
@@ -1631,7 +1631,7 @@
             </w:tabs>
             <w:rPr/>
           </w:pPr>
-          <w:hyperlink w:anchor="__RefHeading___Toc3316_1125974958">
+          <w:hyperlink w:anchor="__RefHeading___Toc3151_634922549">
             <w:r>
               <w:rPr>
                 <w:webHidden/>
@@ -1652,7 +1652,7 @@
             </w:tabs>
             <w:rPr/>
           </w:pPr>
-          <w:hyperlink w:anchor="__RefHeading___Toc3318_1125974958">
+          <w:hyperlink w:anchor="__RefHeading___Toc3153_634922549">
             <w:r>
               <w:rPr>
                 <w:webHidden/>
@@ -1673,7 +1673,7 @@
             </w:tabs>
             <w:rPr/>
           </w:pPr>
-          <w:hyperlink w:anchor="__RefHeading___Toc3320_1125974958">
+          <w:hyperlink w:anchor="__RefHeading___Toc3155_634922549">
             <w:r>
               <w:rPr>
                 <w:webHidden/>
@@ -1694,7 +1694,7 @@
             </w:tabs>
             <w:rPr/>
           </w:pPr>
-          <w:hyperlink w:anchor="__RefHeading___Toc3322_1125974958">
+          <w:hyperlink w:anchor="__RefHeading___Toc3157_634922549">
             <w:r>
               <w:rPr>
                 <w:webHidden/>
@@ -1715,7 +1715,7 @@
             </w:tabs>
             <w:rPr/>
           </w:pPr>
-          <w:hyperlink w:anchor="__RefHeading___Toc3324_1125974958">
+          <w:hyperlink w:anchor="__RefHeading___Toc3159_634922549">
             <w:r>
               <w:rPr>
                 <w:webHidden/>
@@ -1736,7 +1736,7 @@
             </w:tabs>
             <w:rPr/>
           </w:pPr>
-          <w:hyperlink w:anchor="__RefHeading___Toc3326_1125974958">
+          <w:hyperlink w:anchor="__RefHeading___Toc3161_634922549">
             <w:r>
               <w:rPr>
                 <w:webHidden/>
@@ -1757,7 +1757,7 @@
             </w:tabs>
             <w:rPr/>
           </w:pPr>
-          <w:hyperlink w:anchor="__RefHeading___Toc3328_1125974958">
+          <w:hyperlink w:anchor="__RefHeading___Toc3163_634922549">
             <w:r>
               <w:rPr>
                 <w:webHidden/>
@@ -1778,7 +1778,7 @@
             </w:tabs>
             <w:rPr/>
           </w:pPr>
-          <w:hyperlink w:anchor="__RefHeading___Toc3330_1125974958">
+          <w:hyperlink w:anchor="__RefHeading___Toc3165_634922549">
             <w:r>
               <w:rPr>
                 <w:webHidden/>
@@ -1799,7 +1799,7 @@
             </w:tabs>
             <w:rPr/>
           </w:pPr>
-          <w:hyperlink w:anchor="__RefHeading___Toc3332_1125974958">
+          <w:hyperlink w:anchor="__RefHeading___Toc3167_634922549">
             <w:r>
               <w:rPr>
                 <w:webHidden/>
@@ -1820,7 +1820,7 @@
             </w:tabs>
             <w:rPr/>
           </w:pPr>
-          <w:hyperlink w:anchor="__RefHeading___Toc3334_1125974958">
+          <w:hyperlink w:anchor="__RefHeading___Toc3169_634922549">
             <w:r>
               <w:rPr>
                 <w:webHidden/>
@@ -1841,7 +1841,7 @@
             </w:tabs>
             <w:rPr/>
           </w:pPr>
-          <w:hyperlink w:anchor="__RefHeading___Toc3336_1125974958">
+          <w:hyperlink w:anchor="__RefHeading___Toc3171_634922549">
             <w:r>
               <w:rPr>
                 <w:webHidden/>
@@ -1862,7 +1862,7 @@
             </w:tabs>
             <w:rPr/>
           </w:pPr>
-          <w:hyperlink w:anchor="__RefHeading___Toc3338_1125974958">
+          <w:hyperlink w:anchor="__RefHeading___Toc3173_634922549">
             <w:r>
               <w:rPr>
                 <w:webHidden/>
@@ -1883,7 +1883,7 @@
             </w:tabs>
             <w:rPr/>
           </w:pPr>
-          <w:hyperlink w:anchor="__RefHeading___Toc3340_1125974958">
+          <w:hyperlink w:anchor="__RefHeading___Toc3175_634922549">
             <w:r>
               <w:rPr>
                 <w:webHidden/>
@@ -1904,7 +1904,7 @@
             </w:tabs>
             <w:rPr/>
           </w:pPr>
-          <w:hyperlink w:anchor="__RefHeading___Toc3342_1125974958">
+          <w:hyperlink w:anchor="__RefHeading___Toc3177_634922549">
             <w:r>
               <w:rPr>
                 <w:webHidden/>
@@ -1925,7 +1925,7 @@
             </w:tabs>
             <w:rPr/>
           </w:pPr>
-          <w:hyperlink w:anchor="__RefHeading___Toc3344_1125974958">
+          <w:hyperlink w:anchor="__RefHeading___Toc3179_634922549">
             <w:r>
               <w:rPr>
                 <w:webHidden/>
@@ -1946,7 +1946,7 @@
             </w:tabs>
             <w:rPr/>
           </w:pPr>
-          <w:hyperlink w:anchor="__RefHeading___Toc3346_1125974958">
+          <w:hyperlink w:anchor="__RefHeading___Toc3181_634922549">
             <w:r>
               <w:rPr>
                 <w:webHidden/>
@@ -1967,7 +1967,7 @@
             </w:tabs>
             <w:rPr/>
           </w:pPr>
-          <w:hyperlink w:anchor="__RefHeading___Toc3348_1125974958">
+          <w:hyperlink w:anchor="__RefHeading___Toc3183_634922549">
             <w:r>
               <w:rPr>
                 <w:webHidden/>
@@ -1988,7 +1988,7 @@
             </w:tabs>
             <w:rPr/>
           </w:pPr>
-          <w:hyperlink w:anchor="__RefHeading___Toc3350_1125974958">
+          <w:hyperlink w:anchor="__RefHeading___Toc3185_634922549">
             <w:r>
               <w:rPr>
                 <w:webHidden/>
@@ -1996,7 +1996,7 @@
               </w:rPr>
               <w:t>APÊNDICE B — VARIÁVEIS DE AMBIENTE</w:t>
               <w:tab/>
-              <w:t>75</w:t>
+              <w:t>64</w:t>
             </w:r>
           </w:hyperlink>
         </w:p>
@@ -2009,7 +2009,7 @@
             </w:tabs>
             <w:rPr/>
           </w:pPr>
-          <w:hyperlink w:anchor="__RefHeading___Toc3352_1125974958">
+          <w:hyperlink w:anchor="__RefHeading___Toc3187_634922549">
             <w:r>
               <w:rPr>
                 <w:webHidden/>
@@ -2017,7 +2017,7 @@
               </w:rPr>
               <w:t>APÊNDICE C — GLOSSÁRIO</w:t>
               <w:tab/>
-              <w:t>76</w:t>
+              <w:t>65</w:t>
             </w:r>
           </w:hyperlink>
           <w:r>
@@ -2050,7 +2050,7 @@
         <w:jc w:val="left"/>
         <w:rPr/>
       </w:pPr>
-      <w:bookmarkStart w:id="0" w:name="__RefHeading___Toc3206_1125974958"/>
+      <w:bookmarkStart w:id="0" w:name="__RefHeading___Toc3041_634922549"/>
       <w:bookmarkEnd w:id="0"/>
       <w:r>
         <w:rPr>
@@ -2071,7 +2071,7 @@
         <w:jc w:val="left"/>
         <w:rPr/>
       </w:pPr>
-      <w:bookmarkStart w:id="1" w:name="__RefHeading___Toc3208_1125974958"/>
+      <w:bookmarkStart w:id="1" w:name="__RefHeading___Toc3043_634922549"/>
       <w:bookmarkEnd w:id="1"/>
       <w:r>
         <w:rPr>
@@ -2174,7 +2174,7 @@
         <w:jc w:val="left"/>
         <w:rPr/>
       </w:pPr>
-      <w:bookmarkStart w:id="2" w:name="__RefHeading___Toc3210_1125974958"/>
+      <w:bookmarkStart w:id="2" w:name="__RefHeading___Toc3045_634922549"/>
       <w:bookmarkEnd w:id="2"/>
       <w:r>
         <w:rPr>
@@ -2193,7 +2193,7 @@
         <w:jc w:val="left"/>
         <w:rPr/>
       </w:pPr>
-      <w:bookmarkStart w:id="3" w:name="__RefHeading___Toc3212_1125974958"/>
+      <w:bookmarkStart w:id="3" w:name="__RefHeading___Toc3047_634922549"/>
       <w:bookmarkEnd w:id="3"/>
       <w:r>
         <w:rPr>
@@ -2235,7 +2235,7 @@
         <w:jc w:val="left"/>
         <w:rPr/>
       </w:pPr>
-      <w:bookmarkStart w:id="4" w:name="__RefHeading___Toc3214_1125974958"/>
+      <w:bookmarkStart w:id="4" w:name="__RefHeading___Toc3049_634922549"/>
       <w:bookmarkEnd w:id="4"/>
       <w:r>
         <w:rPr>
@@ -2375,7 +2375,7 @@
         <w:jc w:val="left"/>
         <w:rPr/>
       </w:pPr>
-      <w:bookmarkStart w:id="5" w:name="__RefHeading___Toc3216_1125974958"/>
+      <w:bookmarkStart w:id="5" w:name="__RefHeading___Toc3051_634922549"/>
       <w:bookmarkEnd w:id="5"/>
       <w:r>
         <w:rPr>
@@ -2438,7 +2438,7 @@
         <w:jc w:val="left"/>
         <w:rPr/>
       </w:pPr>
-      <w:bookmarkStart w:id="6" w:name="__RefHeading___Toc3218_1125974958"/>
+      <w:bookmarkStart w:id="6" w:name="__RefHeading___Toc3053_634922549"/>
       <w:bookmarkEnd w:id="6"/>
       <w:r>
         <w:rPr>
@@ -2565,7 +2565,7 @@
         <w:jc w:val="left"/>
         <w:rPr/>
       </w:pPr>
-      <w:bookmarkStart w:id="7" w:name="__RefHeading___Toc3220_1125974958"/>
+      <w:bookmarkStart w:id="7" w:name="__RefHeading___Toc3055_634922549"/>
       <w:bookmarkEnd w:id="7"/>
       <w:r>
         <w:rPr>
@@ -2795,7 +2795,7 @@
         <w:jc w:val="left"/>
         <w:rPr/>
       </w:pPr>
-      <w:bookmarkStart w:id="8" w:name="__RefHeading___Toc3222_1125974958"/>
+      <w:bookmarkStart w:id="8" w:name="__RefHeading___Toc3057_634922549"/>
       <w:bookmarkEnd w:id="8"/>
       <w:r>
         <w:rPr>
@@ -2816,7 +2816,7 @@
         <w:jc w:val="left"/>
         <w:rPr/>
       </w:pPr>
-      <w:bookmarkStart w:id="9" w:name="__RefHeading___Toc3224_1125974958"/>
+      <w:bookmarkStart w:id="9" w:name="__RefHeading___Toc3059_634922549"/>
       <w:bookmarkEnd w:id="9"/>
       <w:r>
         <w:rPr>
@@ -2898,7 +2898,7 @@
         <w:jc w:val="left"/>
         <w:rPr/>
       </w:pPr>
-      <w:bookmarkStart w:id="10" w:name="__RefHeading___Toc3226_1125974958"/>
+      <w:bookmarkStart w:id="10" w:name="__RefHeading___Toc3061_634922549"/>
       <w:bookmarkEnd w:id="10"/>
       <w:r>
         <w:rPr>
@@ -2980,7 +2980,7 @@
         <w:jc w:val="left"/>
         <w:rPr/>
       </w:pPr>
-      <w:bookmarkStart w:id="11" w:name="__RefHeading___Toc3228_1125974958"/>
+      <w:bookmarkStart w:id="11" w:name="__RefHeading___Toc3063_634922549"/>
       <w:bookmarkEnd w:id="11"/>
       <w:r>
         <w:rPr>
@@ -3044,7 +3044,7 @@
         <w:jc w:val="left"/>
         <w:rPr/>
       </w:pPr>
-      <w:bookmarkStart w:id="12" w:name="__RefHeading___Toc3230_1125974958"/>
+      <w:bookmarkStart w:id="12" w:name="__RefHeading___Toc3065_634922549"/>
       <w:bookmarkEnd w:id="12"/>
       <w:r>
         <w:rPr>
@@ -3065,7 +3065,7 @@
         <w:jc w:val="left"/>
         <w:rPr/>
       </w:pPr>
-      <w:bookmarkStart w:id="13" w:name="__RefHeading___Toc3232_1125974958"/>
+      <w:bookmarkStart w:id="13" w:name="__RefHeading___Toc3067_634922549"/>
       <w:bookmarkEnd w:id="13"/>
       <w:r>
         <w:rPr>
@@ -3254,7 +3254,7 @@
         <w:jc w:val="left"/>
         <w:rPr/>
       </w:pPr>
-      <w:bookmarkStart w:id="14" w:name="__RefHeading___Toc3234_1125974958"/>
+      <w:bookmarkStart w:id="14" w:name="__RefHeading___Toc3069_634922549"/>
       <w:bookmarkEnd w:id="14"/>
       <w:r>
         <w:rPr>
@@ -3361,7 +3361,7 @@
         <w:jc w:val="left"/>
         <w:rPr/>
       </w:pPr>
-      <w:bookmarkStart w:id="15" w:name="__RefHeading___Toc3236_1125974958"/>
+      <w:bookmarkStart w:id="15" w:name="__RefHeading___Toc3071_634922549"/>
       <w:bookmarkEnd w:id="15"/>
       <w:r>
         <w:rPr>
@@ -3403,7 +3403,7 @@
         <w:jc w:val="left"/>
         <w:rPr/>
       </w:pPr>
-      <w:bookmarkStart w:id="16" w:name="__RefHeading___Toc3238_1125974958"/>
+      <w:bookmarkStart w:id="16" w:name="__RefHeading___Toc3073_634922549"/>
       <w:bookmarkEnd w:id="16"/>
       <w:r>
         <w:rPr>
@@ -3707,7 +3707,7 @@
         <w:jc w:val="left"/>
         <w:rPr/>
       </w:pPr>
-      <w:bookmarkStart w:id="17" w:name="__RefHeading___Toc3240_1125974958"/>
+      <w:bookmarkStart w:id="17" w:name="__RefHeading___Toc3075_634922549"/>
       <w:bookmarkEnd w:id="17"/>
       <w:r>
         <w:rPr>
@@ -4014,7 +4014,7 @@
         <w:jc w:val="left"/>
         <w:rPr/>
       </w:pPr>
-      <w:bookmarkStart w:id="18" w:name="__RefHeading___Toc3242_1125974958"/>
+      <w:bookmarkStart w:id="18" w:name="__RefHeading___Toc3077_634922549"/>
       <w:bookmarkEnd w:id="18"/>
       <w:r>
         <w:rPr>
@@ -4035,7 +4035,7 @@
         <w:jc w:val="left"/>
         <w:rPr/>
       </w:pPr>
-      <w:bookmarkStart w:id="19" w:name="__RefHeading___Toc3244_1125974958"/>
+      <w:bookmarkStart w:id="19" w:name="__RefHeading___Toc3079_634922549"/>
       <w:bookmarkEnd w:id="19"/>
       <w:r>
         <w:rPr>
@@ -5214,7 +5214,7 @@
         <w:jc w:val="left"/>
         <w:rPr/>
       </w:pPr>
-      <w:bookmarkStart w:id="20" w:name="__RefHeading___Toc3246_1125974958"/>
+      <w:bookmarkStart w:id="20" w:name="__RefHeading___Toc3081_634922549"/>
       <w:bookmarkEnd w:id="20"/>
       <w:r>
         <w:rPr>
@@ -5932,7 +5932,7 @@
         <w:jc w:val="left"/>
         <w:rPr/>
       </w:pPr>
-      <w:bookmarkStart w:id="21" w:name="__RefHeading___Toc3248_1125974958"/>
+      <w:bookmarkStart w:id="21" w:name="__RefHeading___Toc3083_634922549"/>
       <w:bookmarkEnd w:id="21"/>
       <w:r>
         <w:rPr>
@@ -5953,7 +5953,7 @@
         <w:jc w:val="left"/>
         <w:rPr/>
       </w:pPr>
-      <w:bookmarkStart w:id="22" w:name="__RefHeading___Toc3250_1125974958"/>
+      <w:bookmarkStart w:id="22" w:name="__RefHeading___Toc3085_634922549"/>
       <w:bookmarkEnd w:id="22"/>
       <w:r>
         <w:rPr>
@@ -6077,7 +6077,7 @@
         <w:jc w:val="left"/>
         <w:rPr/>
       </w:pPr>
-      <w:bookmarkStart w:id="23" w:name="__RefHeading___Toc3252_1125974958"/>
+      <w:bookmarkStart w:id="23" w:name="__RefHeading___Toc3087_634922549"/>
       <w:bookmarkEnd w:id="23"/>
       <w:r>
         <w:rPr>
@@ -6795,7 +6795,7 @@
         <w:jc w:val="left"/>
         <w:rPr/>
       </w:pPr>
-      <w:bookmarkStart w:id="24" w:name="__RefHeading___Toc3254_1125974958"/>
+      <w:bookmarkStart w:id="24" w:name="__RefHeading___Toc3089_634922549"/>
       <w:bookmarkEnd w:id="24"/>
       <w:r>
         <w:rPr>
@@ -6816,7 +6816,7 @@
         <w:jc w:val="left"/>
         <w:rPr/>
       </w:pPr>
-      <w:bookmarkStart w:id="25" w:name="__RefHeading___Toc3256_1125974958"/>
+      <w:bookmarkStart w:id="25" w:name="__RefHeading___Toc3091_634922549"/>
       <w:bookmarkEnd w:id="25"/>
       <w:r>
         <w:rPr>
@@ -8254,7 +8254,7 @@
         <w:jc w:val="left"/>
         <w:rPr/>
       </w:pPr>
-      <w:bookmarkStart w:id="26" w:name="__RefHeading___Toc3258_1125974958"/>
+      <w:bookmarkStart w:id="26" w:name="__RefHeading___Toc3093_634922549"/>
       <w:bookmarkEnd w:id="26"/>
       <w:r>
         <w:rPr>
@@ -10405,7 +10405,7 @@
         <w:jc w:val="left"/>
         <w:rPr/>
       </w:pPr>
-      <w:bookmarkStart w:id="27" w:name="__RefHeading___Toc3260_1125974958"/>
+      <w:bookmarkStart w:id="27" w:name="__RefHeading___Toc3095_634922549"/>
       <w:bookmarkEnd w:id="27"/>
       <w:r>
         <w:rPr>
@@ -10445,7 +10445,7 @@
         <w:jc w:val="left"/>
         <w:rPr/>
       </w:pPr>
-      <w:bookmarkStart w:id="28" w:name="__RefHeading___Toc3262_1125974958"/>
+      <w:bookmarkStart w:id="28" w:name="__RefHeading___Toc3097_634922549"/>
       <w:bookmarkEnd w:id="28"/>
       <w:r>
         <w:rPr>
@@ -11206,7 +11206,7 @@
         <w:jc w:val="left"/>
         <w:rPr/>
       </w:pPr>
-      <w:bookmarkStart w:id="29" w:name="__RefHeading___Toc3264_1125974958"/>
+      <w:bookmarkStart w:id="29" w:name="__RefHeading___Toc3099_634922549"/>
       <w:bookmarkEnd w:id="29"/>
       <w:r>
         <w:rPr>
@@ -11729,7 +11729,7 @@
         <w:jc w:val="left"/>
         <w:rPr/>
       </w:pPr>
-      <w:bookmarkStart w:id="30" w:name="__RefHeading___Toc3266_1125974958"/>
+      <w:bookmarkStart w:id="30" w:name="__RefHeading___Toc3101_634922549"/>
       <w:bookmarkEnd w:id="30"/>
       <w:r>
         <w:rPr>
@@ -13323,7 +13323,7 @@
         <w:jc w:val="left"/>
         <w:rPr/>
       </w:pPr>
-      <w:bookmarkStart w:id="31" w:name="__RefHeading___Toc3268_1125974958"/>
+      <w:bookmarkStart w:id="31" w:name="__RefHeading___Toc3103_634922549"/>
       <w:bookmarkEnd w:id="31"/>
       <w:r>
         <w:rPr>
@@ -13965,7 +13965,7 @@
         <w:jc w:val="left"/>
         <w:rPr/>
       </w:pPr>
-      <w:bookmarkStart w:id="32" w:name="__RefHeading___Toc3270_1125974958"/>
+      <w:bookmarkStart w:id="32" w:name="__RefHeading___Toc3105_634922549"/>
       <w:bookmarkEnd w:id="32"/>
       <w:r>
         <w:rPr>
@@ -14845,7 +14845,7 @@
         <w:jc w:val="left"/>
         <w:rPr/>
       </w:pPr>
-      <w:bookmarkStart w:id="33" w:name="__RefHeading___Toc3272_1125974958"/>
+      <w:bookmarkStart w:id="33" w:name="__RefHeading___Toc3107_634922549"/>
       <w:bookmarkEnd w:id="33"/>
       <w:r>
         <w:rPr>
@@ -15487,7 +15487,7 @@
         <w:jc w:val="left"/>
         <w:rPr/>
       </w:pPr>
-      <w:bookmarkStart w:id="34" w:name="__RefHeading___Toc3274_1125974958"/>
+      <w:bookmarkStart w:id="34" w:name="__RefHeading___Toc3109_634922549"/>
       <w:bookmarkEnd w:id="34"/>
       <w:r>
         <w:rPr>
@@ -16248,7 +16248,7 @@
         <w:jc w:val="left"/>
         <w:rPr/>
       </w:pPr>
-      <w:bookmarkStart w:id="35" w:name="__RefHeading___Toc3276_1125974958"/>
+      <w:bookmarkStart w:id="35" w:name="__RefHeading___Toc3111_634922549"/>
       <w:bookmarkEnd w:id="35"/>
       <w:r>
         <w:rPr>
@@ -17009,7 +17009,7 @@
         <w:jc w:val="left"/>
         <w:rPr/>
       </w:pPr>
-      <w:bookmarkStart w:id="36" w:name="__RefHeading___Toc3278_1125974958"/>
+      <w:bookmarkStart w:id="36" w:name="__RefHeading___Toc3113_634922549"/>
       <w:bookmarkEnd w:id="36"/>
       <w:r>
         <w:rPr>
@@ -17889,7 +17889,7 @@
         <w:jc w:val="left"/>
         <w:rPr/>
       </w:pPr>
-      <w:bookmarkStart w:id="37" w:name="__RefHeading___Toc3280_1125974958"/>
+      <w:bookmarkStart w:id="37" w:name="__RefHeading___Toc3115_634922549"/>
       <w:bookmarkEnd w:id="37"/>
       <w:r>
         <w:rPr>
@@ -18891,7 +18891,7 @@
       <w:r>
         <w:br w:type="page"/>
       </w:r>
-      <w:bookmarkStart w:id="38" w:name="__RefHeading___Toc3282_1125974958"/>
+      <w:bookmarkStart w:id="38" w:name="__RefHeading___Toc3117_634922549"/>
       <w:bookmarkEnd w:id="38"/>
       <w:r>
         <w:rPr>
@@ -19812,7 +19812,7 @@
         <w:jc w:val="left"/>
         <w:rPr/>
       </w:pPr>
-      <w:bookmarkStart w:id="39" w:name="__RefHeading___Toc3284_1125974958"/>
+      <w:bookmarkStart w:id="39" w:name="__RefHeading___Toc3119_634922549"/>
       <w:bookmarkEnd w:id="39"/>
       <w:r>
         <w:rPr>
@@ -21210,7 +21210,7 @@
         <w:jc w:val="left"/>
         <w:rPr/>
       </w:pPr>
-      <w:bookmarkStart w:id="40" w:name="__RefHeading___Toc3286_1125974958"/>
+      <w:bookmarkStart w:id="40" w:name="__RefHeading___Toc3121_634922549"/>
       <w:bookmarkEnd w:id="40"/>
       <w:r>
         <w:rPr>
@@ -21313,7 +21313,7 @@
         <w:jc w:val="left"/>
         <w:rPr/>
       </w:pPr>
-      <w:bookmarkStart w:id="41" w:name="__RefHeading___Toc3288_1125974958"/>
+      <w:bookmarkStart w:id="41" w:name="__RefHeading___Toc3123_634922549"/>
       <w:bookmarkEnd w:id="41"/>
       <w:r>
         <w:rPr>
@@ -21440,7 +21440,7 @@
         <w:jc w:val="left"/>
         <w:rPr/>
       </w:pPr>
-      <w:bookmarkStart w:id="42" w:name="__RefHeading___Toc3290_1125974958"/>
+      <w:bookmarkStart w:id="42" w:name="__RefHeading___Toc3125_634922549"/>
       <w:bookmarkEnd w:id="42"/>
       <w:r>
         <w:rPr>
@@ -21461,7 +21461,7 @@
         <w:jc w:val="left"/>
         <w:rPr/>
       </w:pPr>
-      <w:bookmarkStart w:id="43" w:name="__RefHeading___Toc3292_1125974958"/>
+      <w:bookmarkStart w:id="43" w:name="__RefHeading___Toc3127_634922549"/>
       <w:bookmarkEnd w:id="43"/>
       <w:r>
         <w:rPr>
@@ -21522,7 +21522,7 @@
         <w:jc w:val="left"/>
         <w:rPr/>
       </w:pPr>
-      <w:bookmarkStart w:id="44" w:name="__RefHeading___Toc3294_1125974958"/>
+      <w:bookmarkStart w:id="44" w:name="__RefHeading___Toc3129_634922549"/>
       <w:bookmarkEnd w:id="44"/>
       <w:r>
         <w:rPr>
@@ -21841,7 +21841,7 @@
         <w:jc w:val="left"/>
         <w:rPr/>
       </w:pPr>
-      <w:bookmarkStart w:id="45" w:name="__RefHeading___Toc3296_1125974958"/>
+      <w:bookmarkStart w:id="45" w:name="__RefHeading___Toc3131_634922549"/>
       <w:bookmarkEnd w:id="45"/>
       <w:r>
         <w:rPr>
@@ -21862,7 +21862,7 @@
         <w:jc w:val="left"/>
         <w:rPr/>
       </w:pPr>
-      <w:bookmarkStart w:id="46" w:name="__RefHeading___Toc3298_1125974958"/>
+      <w:bookmarkStart w:id="46" w:name="__RefHeading___Toc3133_634922549"/>
       <w:bookmarkEnd w:id="46"/>
       <w:r>
         <w:rPr>
@@ -21944,7 +21944,7 @@
         <w:jc w:val="left"/>
         <w:rPr/>
       </w:pPr>
-      <w:bookmarkStart w:id="47" w:name="__RefHeading___Toc3300_1125974958"/>
+      <w:bookmarkStart w:id="47" w:name="__RefHeading___Toc3135_634922549"/>
       <w:bookmarkEnd w:id="47"/>
       <w:r>
         <w:rPr>
@@ -22029,7 +22029,7 @@
         <w:jc w:val="left"/>
         <w:rPr/>
       </w:pPr>
-      <w:bookmarkStart w:id="48" w:name="__RefHeading___Toc3302_1125974958"/>
+      <w:bookmarkStart w:id="48" w:name="__RefHeading___Toc3137_634922549"/>
       <w:bookmarkEnd w:id="48"/>
       <w:r>
         <w:rPr>
@@ -22050,7 +22050,7 @@
         <w:jc w:val="left"/>
         <w:rPr/>
       </w:pPr>
-      <w:bookmarkStart w:id="49" w:name="__RefHeading___Toc3304_1125974958"/>
+      <w:bookmarkStart w:id="49" w:name="__RefHeading___Toc3139_634922549"/>
       <w:bookmarkEnd w:id="49"/>
       <w:r>
         <w:rPr>
@@ -22090,7 +22090,7 @@
         <w:jc w:val="left"/>
         <w:rPr/>
       </w:pPr>
-      <w:bookmarkStart w:id="50" w:name="__RefHeading___Toc3306_1125974958"/>
+      <w:bookmarkStart w:id="50" w:name="__RefHeading___Toc3141_634922549"/>
       <w:bookmarkEnd w:id="50"/>
       <w:r>
         <w:rPr>
@@ -22613,7 +22613,7 @@
         <w:jc w:val="left"/>
         <w:rPr/>
       </w:pPr>
-      <w:bookmarkStart w:id="51" w:name="__RefHeading___Toc3308_1125974958"/>
+      <w:bookmarkStart w:id="51" w:name="__RefHeading___Toc3143_634922549"/>
       <w:bookmarkEnd w:id="51"/>
       <w:r>
         <w:rPr>
@@ -23871,7 +23871,7 @@
         <w:jc w:val="left"/>
         <w:rPr/>
       </w:pPr>
-      <w:bookmarkStart w:id="52" w:name="__RefHeading___Toc3310_1125974958"/>
+      <w:bookmarkStart w:id="52" w:name="__RefHeading___Toc3145_634922549"/>
       <w:bookmarkEnd w:id="52"/>
       <w:r>
         <w:rPr>
@@ -24513,7 +24513,7 @@
         <w:jc w:val="left"/>
         <w:rPr/>
       </w:pPr>
-      <w:bookmarkStart w:id="53" w:name="__RefHeading___Toc3312_1125974958"/>
+      <w:bookmarkStart w:id="53" w:name="__RefHeading___Toc3147_634922549"/>
       <w:bookmarkEnd w:id="53"/>
       <w:r>
         <w:rPr>
@@ -25274,7 +25274,7 @@
         <w:jc w:val="left"/>
         <w:rPr/>
       </w:pPr>
-      <w:bookmarkStart w:id="54" w:name="__RefHeading___Toc3314_1125974958"/>
+      <w:bookmarkStart w:id="54" w:name="__RefHeading___Toc3149_634922549"/>
       <w:bookmarkEnd w:id="54"/>
       <w:r>
         <w:rPr>
@@ -25916,7 +25916,7 @@
         <w:jc w:val="left"/>
         <w:rPr/>
       </w:pPr>
-      <w:bookmarkStart w:id="55" w:name="__RefHeading___Toc3316_1125974958"/>
+      <w:bookmarkStart w:id="55" w:name="__RefHeading___Toc3151_634922549"/>
       <w:bookmarkEnd w:id="55"/>
       <w:r>
         <w:rPr>
@@ -26882,7 +26882,7 @@
         <w:jc w:val="left"/>
         <w:rPr/>
       </w:pPr>
-      <w:bookmarkStart w:id="56" w:name="__RefHeading___Toc3318_1125974958"/>
+      <w:bookmarkStart w:id="56" w:name="__RefHeading___Toc3153_634922549"/>
       <w:bookmarkEnd w:id="56"/>
       <w:r>
         <w:rPr>
@@ -27056,7 +27056,7 @@
         <w:jc w:val="left"/>
         <w:rPr/>
       </w:pPr>
-      <w:bookmarkStart w:id="57" w:name="__RefHeading___Toc3320_1125974958"/>
+      <w:bookmarkStart w:id="57" w:name="__RefHeading___Toc3155_634922549"/>
       <w:bookmarkEnd w:id="57"/>
       <w:r>
         <w:rPr>
@@ -27077,7 +27077,7 @@
         <w:jc w:val="left"/>
         <w:rPr/>
       </w:pPr>
-      <w:bookmarkStart w:id="58" w:name="__RefHeading___Toc3322_1125974958"/>
+      <w:bookmarkStart w:id="58" w:name="__RefHeading___Toc3157_634922549"/>
       <w:bookmarkEnd w:id="58"/>
       <w:r>
         <w:rPr>
@@ -27222,7 +27222,7 @@
         <w:jc w:val="left"/>
         <w:rPr/>
       </w:pPr>
-      <w:bookmarkStart w:id="59" w:name="__RefHeading___Toc3324_1125974958"/>
+      <w:bookmarkStart w:id="59" w:name="__RefHeading___Toc3159_634922549"/>
       <w:bookmarkEnd w:id="59"/>
       <w:r>
         <w:rPr>
@@ -27515,7 +27515,7 @@
         <w:jc w:val="left"/>
         <w:rPr/>
       </w:pPr>
-      <w:bookmarkStart w:id="60" w:name="__RefHeading___Toc3326_1125974958"/>
+      <w:bookmarkStart w:id="60" w:name="__RefHeading___Toc3161_634922549"/>
       <w:bookmarkEnd w:id="60"/>
       <w:r>
         <w:rPr>
@@ -27536,7 +27536,7 @@
         <w:jc w:val="left"/>
         <w:rPr/>
       </w:pPr>
-      <w:bookmarkStart w:id="61" w:name="__RefHeading___Toc3328_1125974958"/>
+      <w:bookmarkStart w:id="61" w:name="__RefHeading___Toc3163_634922549"/>
       <w:bookmarkEnd w:id="61"/>
       <w:r>
         <w:rPr>
@@ -27597,7 +27597,7 @@
         <w:jc w:val="left"/>
         <w:rPr/>
       </w:pPr>
-      <w:bookmarkStart w:id="62" w:name="__RefHeading___Toc3330_1125974958"/>
+      <w:bookmarkStart w:id="62" w:name="__RefHeading___Toc3165_634922549"/>
       <w:bookmarkEnd w:id="62"/>
       <w:r>
         <w:rPr>
@@ -27681,7 +27681,7 @@
         <w:jc w:val="left"/>
         <w:rPr/>
       </w:pPr>
-      <w:bookmarkStart w:id="63" w:name="__RefHeading___Toc3332_1125974958"/>
+      <w:bookmarkStart w:id="63" w:name="__RefHeading___Toc3167_634922549"/>
       <w:bookmarkEnd w:id="63"/>
       <w:r>
         <w:rPr>
@@ -27744,7 +27744,7 @@
         <w:jc w:val="left"/>
         <w:rPr/>
       </w:pPr>
-      <w:bookmarkStart w:id="64" w:name="__RefHeading___Toc3334_1125974958"/>
+      <w:bookmarkStart w:id="64" w:name="__RefHeading___Toc3169_634922549"/>
       <w:bookmarkEnd w:id="64"/>
       <w:r>
         <w:rPr>
@@ -27786,7 +27786,7 @@
         <w:jc w:val="left"/>
         <w:rPr/>
       </w:pPr>
-      <w:bookmarkStart w:id="65" w:name="__RefHeading___Toc3336_1125974958"/>
+      <w:bookmarkStart w:id="65" w:name="__RefHeading___Toc3171_634922549"/>
       <w:bookmarkEnd w:id="65"/>
       <w:r>
         <w:rPr>
@@ -28436,7 +28436,7 @@
         <w:jc w:val="left"/>
         <w:rPr/>
       </w:pPr>
-      <w:bookmarkStart w:id="66" w:name="__RefHeading___Toc3338_1125974958"/>
+      <w:bookmarkStart w:id="66" w:name="__RefHeading___Toc3173_634922549"/>
       <w:bookmarkEnd w:id="66"/>
       <w:r>
         <w:rPr>
@@ -28457,7 +28457,7 @@
         <w:jc w:val="left"/>
         <w:rPr/>
       </w:pPr>
-      <w:bookmarkStart w:id="67" w:name="__RefHeading___Toc3340_1125974958"/>
+      <w:bookmarkStart w:id="67" w:name="__RefHeading___Toc3175_634922549"/>
       <w:bookmarkEnd w:id="67"/>
       <w:r>
         <w:rPr>
@@ -29422,7 +29422,7 @@
         <w:jc w:val="left"/>
         <w:rPr/>
       </w:pPr>
-      <w:bookmarkStart w:id="68" w:name="__RefHeading___Toc3342_1125974958"/>
+      <w:bookmarkStart w:id="68" w:name="__RefHeading___Toc3177_634922549"/>
       <w:bookmarkEnd w:id="68"/>
       <w:r>
         <w:rPr>
@@ -29443,7 +29443,7 @@
         <w:jc w:val="left"/>
         <w:rPr/>
       </w:pPr>
-      <w:bookmarkStart w:id="69" w:name="__RefHeading___Toc3344_1125974958"/>
+      <w:bookmarkStart w:id="69" w:name="__RefHeading___Toc3179_634922549"/>
       <w:bookmarkEnd w:id="69"/>
       <w:r>
         <w:rPr>
@@ -30950,7 +30950,7 @@
       <w:r>
         <w:br w:type="page"/>
       </w:r>
-      <w:bookmarkStart w:id="70" w:name="__RefHeading___Toc3346_1125974958"/>
+      <w:bookmarkStart w:id="70" w:name="__RefHeading___Toc3181_634922549"/>
       <w:bookmarkEnd w:id="70"/>
       <w:r>
         <w:rPr>
@@ -31369,7 +31369,7 @@
         <w:jc w:val="center"/>
         <w:rPr/>
       </w:pPr>
-      <w:bookmarkStart w:id="71" w:name="__RefHeading___Toc3348_1125974958"/>
+      <w:bookmarkStart w:id="71" w:name="__RefHeading___Toc3183_634922549"/>
       <w:bookmarkEnd w:id="71"/>
       <w:r>
         <w:rPr>
@@ -31410,7 +31410,7 @@
           <w:sz w:val="24"/>
           <w:szCs w:val="24"/>
         </w:rPr>
-        <w:t>Reproduzem-se a seguir, em páginas próprias e em orientação paisagem, os seis diagramas citados na seção 6.2: casos de uso, classes, estados, atividades, os dois diagramas de interação e o diagrama de componentes. Cada diagrama ocupa uma página inteira, com o título logo abaixo da figura, e a página seguinte traz a descrição que o relaciona aos requisitos e regras correspondentes.</w:t>
+        <w:t>Reproduzem-se a seguir, em páginas próprias e em orientação paisagem, os seis diagramas citados na seção 6.2: casos de uso, classes, estados, atividades, os dois diagramas de interação e o diagrama de componentes. Cada página traz, abaixo da figura, uma legenda que relaciona o diagrama aos requisitos e regras correspondentes.</w:t>
       </w:r>
     </w:p>
     <w:p>
@@ -31425,7 +31425,7 @@
         <w:rPr/>
         <w:drawing>
           <wp:inline distT="0" distB="0" distL="0" distR="0">
-            <wp:extent cx="9075420" cy="5902325"/>
+            <wp:extent cx="6365240" cy="4140200"/>
             <wp:effectExtent l="0" t="0" r="0" b="0"/>
             <wp:docPr id="6" name="Imagem 501" descr="Apêndice A.1a — Diagrama de Casos de Uso: Visitante e Participante"/>
             <wp:cNvGraphicFramePr>
@@ -31449,7 +31449,7 @@
                   <pic:spPr bwMode="auto">
                     <a:xfrm>
                       <a:off x="0" y="0"/>
-                      <a:ext cx="9075420" cy="5902325"/>
+                      <a:ext cx="6365240" cy="4140200"/>
                     </a:xfrm>
                     <a:prstGeom prst="rect">
                       <a:avLst/>
@@ -31464,12 +31464,31 @@
     </w:p>
     <w:p>
       <w:pPr>
+        <w:pStyle w:val="Normal"/>
+        <w:keepNext w:val="true"/>
+        <w:spacing w:lineRule="auto" w:line="240" w:before="240" w:after="60"/>
+        <w:jc w:val="left"/>
+        <w:rPr/>
+      </w:pPr>
+      <w:r>
+        <w:rPr>
+          <w:rFonts w:eastAsia="Arial" w:cs="Arial"/>
+          <w:b/>
+          <w:bCs/>
+          <w:sz w:val="22"/>
+          <w:szCs w:val="22"/>
+        </w:rPr>
+        <w:t>Apêndice A.1a — Diagrama de Casos de Uso: Visitante e Participante</w:t>
+      </w:r>
+    </w:p>
+    <w:p>
+      <w:pPr>
         <w:sectPr>
           <w:headerReference w:type="default" r:id="rId9"/>
           <w:headerReference w:type="first" r:id="rId10"/>
           <w:type w:val="nextPage"/>
           <w:pgSz w:orient="landscape" w:w="16838" w:h="11906"/>
-          <w:pgMar w:left="851" w:right="851" w:gutter="0" w:header="454" w:top="851" w:footer="0" w:bottom="851"/>
+          <w:pgMar w:left="1701" w:right="1134" w:gutter="0" w:header="1134" w:top="1701" w:footer="0" w:bottom="1134"/>
           <w:pgNumType w:fmt="decimal"/>
           <w:formProt w:val="false"/>
           <w:vAlign w:val="center"/>
@@ -31477,64 +31496,15 @@
           <w:docGrid w:type="default" w:linePitch="360" w:charSpace="0"/>
         </w:sectPr>
         <w:pStyle w:val="Normal"/>
-        <w:spacing w:lineRule="auto" w:line="240" w:before="120" w:after="0"/>
-        <w:jc w:val="center"/>
+        <w:spacing w:lineRule="auto" w:line="240" w:before="0" w:after="0"/>
+        <w:jc w:val="both"/>
         <w:rPr/>
       </w:pPr>
       <w:r>
         <w:rPr>
           <w:rFonts w:eastAsia="Arial" w:cs="Arial"/>
-          <w:b/>
-          <w:bCs/>
-          <w:sz w:val="22"/>
-          <w:szCs w:val="22"/>
-        </w:rPr>
-        <w:t>Apêndice A.1a — Diagrama de Casos de Uso: Visitante e Participante</w:t>
-      </w:r>
-    </w:p>
-    <w:p>
-      <w:pPr>
-        <w:pStyle w:val="Normal"/>
-        <w:keepNext w:val="true"/>
-        <w:spacing w:lineRule="auto" w:line="360" w:before="0" w:after="240"/>
-        <w:jc w:val="left"/>
-        <w:rPr/>
-      </w:pPr>
-      <w:r>
-        <w:rPr>
-          <w:rFonts w:eastAsia="Arial" w:cs="Arial"/>
-          <w:b/>
-          <w:bCs/>
-          <w:sz w:val="24"/>
-          <w:szCs w:val="24"/>
-        </w:rPr>
-        <w:t>Apêndice A.1a — Diagrama de Casos de Uso: Visitante e Participante</w:t>
-      </w:r>
-    </w:p>
-    <w:p>
-      <w:pPr>
-        <w:sectPr>
-          <w:headerReference w:type="default" r:id="rId11"/>
-          <w:headerReference w:type="first" r:id="rId12"/>
-          <w:type w:val="nextPage"/>
-          <w:pgSz w:w="11906" w:h="16838"/>
-          <w:pgMar w:left="1701" w:right="1134" w:gutter="0" w:header="1134" w:top="1701" w:footer="0" w:bottom="1134"/>
-          <w:pgNumType w:fmt="decimal"/>
-          <w:formProt w:val="false"/>
-          <w:textDirection w:val="lrTb"/>
-          <w:docGrid w:type="default" w:linePitch="360" w:charSpace="0"/>
-        </w:sectPr>
-        <w:pStyle w:val="Normal"/>
-        <w:spacing w:lineRule="auto" w:line="360" w:before="0" w:after="120"/>
-        <w:ind w:firstLine="709"/>
-        <w:jc w:val="both"/>
-        <w:rPr/>
-      </w:pPr>
-      <w:r>
-        <w:rPr>
-          <w:rFonts w:eastAsia="Arial" w:cs="Arial"/>
-          <w:sz w:val="24"/>
-          <w:szCs w:val="24"/>
+          <w:sz w:val="20"/>
+          <w:szCs w:val="20"/>
         </w:rPr>
         <w:t>Funcionalidades acessíveis ao visitante e ao participante, que herda os casos do visitante. Os relacionamentos «include» tornam obrigatórias a alocação de vaga na inscrição (RN-01) e a verificação de presença na emissão do certificado (RN-05); o «extend» indica que a promoção do primeiro da fila só ocorre quando um cancelamento libera vaga confirmada (RN-02).</w:t>
       </w:r>
@@ -31551,7 +31521,7 @@
         <w:rPr/>
         <w:drawing>
           <wp:inline distT="0" distB="0" distL="0" distR="0">
-            <wp:extent cx="9610090" cy="5737225"/>
+            <wp:extent cx="6934835" cy="4140200"/>
             <wp:effectExtent l="0" t="0" r="0" b="0"/>
             <wp:docPr id="7" name="Imagem 502" descr="Apêndice A.1b — Diagrama de Casos de Uso: Organizador"/>
             <wp:cNvGraphicFramePr>
@@ -31567,7 +31537,7 @@
                     </pic:cNvPicPr>
                   </pic:nvPicPr>
                   <pic:blipFill>
-                    <a:blip r:embed="rId13"/>
+                    <a:blip r:embed="rId11"/>
                     <a:stretch>
                       <a:fillRect/>
                     </a:stretch>
@@ -31575,7 +31545,7 @@
                   <pic:spPr bwMode="auto">
                     <a:xfrm>
                       <a:off x="0" y="0"/>
-                      <a:ext cx="9610090" cy="5737225"/>
+                      <a:ext cx="6934835" cy="4140200"/>
                     </a:xfrm>
                     <a:prstGeom prst="rect">
                       <a:avLst/>
@@ -31590,12 +31560,31 @@
     </w:p>
     <w:p>
       <w:pPr>
+        <w:pStyle w:val="Normal"/>
+        <w:keepNext w:val="true"/>
+        <w:spacing w:lineRule="auto" w:line="240" w:before="240" w:after="60"/>
+        <w:jc w:val="left"/>
+        <w:rPr/>
+      </w:pPr>
+      <w:r>
+        <w:rPr>
+          <w:rFonts w:eastAsia="Arial" w:cs="Arial"/>
+          <w:b/>
+          <w:bCs/>
+          <w:sz w:val="22"/>
+          <w:szCs w:val="22"/>
+        </w:rPr>
+        <w:t>Apêndice A.1b — Diagrama de Casos de Uso: Organizador</w:t>
+      </w:r>
+    </w:p>
+    <w:p>
+      <w:pPr>
         <w:sectPr>
-          <w:headerReference w:type="default" r:id="rId14"/>
-          <w:headerReference w:type="first" r:id="rId15"/>
+          <w:headerReference w:type="default" r:id="rId12"/>
+          <w:headerReference w:type="first" r:id="rId13"/>
           <w:type w:val="nextPage"/>
           <w:pgSz w:orient="landscape" w:w="16838" w:h="11906"/>
-          <w:pgMar w:left="851" w:right="851" w:gutter="0" w:header="454" w:top="851" w:footer="0" w:bottom="851"/>
+          <w:pgMar w:left="1701" w:right="1134" w:gutter="0" w:header="1134" w:top="1701" w:footer="0" w:bottom="1134"/>
           <w:pgNumType w:fmt="decimal"/>
           <w:formProt w:val="false"/>
           <w:vAlign w:val="center"/>
@@ -31603,64 +31592,15 @@
           <w:docGrid w:type="default" w:linePitch="360" w:charSpace="0"/>
         </w:sectPr>
         <w:pStyle w:val="Normal"/>
-        <w:spacing w:lineRule="auto" w:line="240" w:before="120" w:after="0"/>
-        <w:jc w:val="center"/>
+        <w:spacing w:lineRule="auto" w:line="240" w:before="0" w:after="0"/>
+        <w:jc w:val="both"/>
         <w:rPr/>
       </w:pPr>
       <w:r>
         <w:rPr>
           <w:rFonts w:eastAsia="Arial" w:cs="Arial"/>
-          <w:b/>
-          <w:bCs/>
-          <w:sz w:val="22"/>
-          <w:szCs w:val="22"/>
-        </w:rPr>
-        <w:t>Apêndice A.1b — Diagrama de Casos de Uso: Organizador</w:t>
-      </w:r>
-    </w:p>
-    <w:p>
-      <w:pPr>
-        <w:pStyle w:val="Normal"/>
-        <w:keepNext w:val="true"/>
-        <w:spacing w:lineRule="auto" w:line="360" w:before="0" w:after="240"/>
-        <w:jc w:val="left"/>
-        <w:rPr/>
-      </w:pPr>
-      <w:r>
-        <w:rPr>
-          <w:rFonts w:eastAsia="Arial" w:cs="Arial"/>
-          <w:b/>
-          <w:bCs/>
-          <w:sz w:val="24"/>
-          <w:szCs w:val="24"/>
-        </w:rPr>
-        <w:t>Apêndice A.1b — Diagrama de Casos de Uso: Organizador</w:t>
-      </w:r>
-    </w:p>
-    <w:p>
-      <w:pPr>
-        <w:sectPr>
-          <w:headerReference w:type="default" r:id="rId16"/>
-          <w:headerReference w:type="first" r:id="rId17"/>
-          <w:type w:val="nextPage"/>
-          <w:pgSz w:w="11906" w:h="16838"/>
-          <w:pgMar w:left="1701" w:right="1134" w:gutter="0" w:header="1134" w:top="1701" w:footer="0" w:bottom="1134"/>
-          <w:pgNumType w:fmt="decimal"/>
-          <w:formProt w:val="false"/>
-          <w:textDirection w:val="lrTb"/>
-          <w:docGrid w:type="default" w:linePitch="360" w:charSpace="0"/>
-        </w:sectPr>
-        <w:pStyle w:val="Normal"/>
-        <w:spacing w:lineRule="auto" w:line="360" w:before="0" w:after="120"/>
-        <w:ind w:firstLine="709"/>
-        <w:jc w:val="both"/>
-        <w:rPr/>
-      </w:pPr>
-      <w:r>
-        <w:rPr>
-          <w:rFonts w:eastAsia="Arial" w:cs="Arial"/>
-          <w:sz w:val="24"/>
-          <w:szCs w:val="24"/>
+          <w:sz w:val="20"/>
+          <w:szCs w:val="20"/>
         </w:rPr>
         <w:t>Funcionalidades do organizador. O preenchimento por IA estende a criação de evento (RF-03) e depende do serviço de linguagem, ator secundário; sem ele, a criação manual continua disponível (RN-10). Toda ação sobre um evento exige que o usuário seja o seu criador (RN-08).</w:t>
       </w:r>
@@ -31677,7 +31617,7 @@
         <w:rPr/>
         <w:drawing>
           <wp:inline distT="0" distB="0" distL="0" distR="0">
-            <wp:extent cx="9610090" cy="5387340"/>
+            <wp:extent cx="7385050" cy="4140200"/>
             <wp:effectExtent l="0" t="0" r="0" b="0"/>
             <wp:docPr id="8" name="Imagem 503" descr="Apêndice A.2a — Diagrama de Classes: Usuários, Eventos e Inscrições"/>
             <wp:cNvGraphicFramePr>
@@ -31693,7 +31633,7 @@
                     </pic:cNvPicPr>
                   </pic:nvPicPr>
                   <pic:blipFill>
-                    <a:blip r:embed="rId18"/>
+                    <a:blip r:embed="rId14"/>
                     <a:stretch>
                       <a:fillRect/>
                     </a:stretch>
@@ -31701,7 +31641,7 @@
                   <pic:spPr bwMode="auto">
                     <a:xfrm>
                       <a:off x="0" y="0"/>
-                      <a:ext cx="9610090" cy="5387340"/>
+                      <a:ext cx="7385050" cy="4140200"/>
                     </a:xfrm>
                     <a:prstGeom prst="rect">
                       <a:avLst/>
@@ -31716,12 +31656,31 @@
     </w:p>
     <w:p>
       <w:pPr>
+        <w:pStyle w:val="Normal"/>
+        <w:keepNext w:val="true"/>
+        <w:spacing w:lineRule="auto" w:line="240" w:before="240" w:after="60"/>
+        <w:jc w:val="left"/>
+        <w:rPr/>
+      </w:pPr>
+      <w:r>
+        <w:rPr>
+          <w:rFonts w:eastAsia="Arial" w:cs="Arial"/>
+          <w:b/>
+          <w:bCs/>
+          <w:sz w:val="22"/>
+          <w:szCs w:val="22"/>
+        </w:rPr>
+        <w:t>Apêndice A.2a — Diagrama de Classes: Usuários, Eventos e Inscrições</w:t>
+      </w:r>
+    </w:p>
+    <w:p>
+      <w:pPr>
         <w:sectPr>
-          <w:headerReference w:type="default" r:id="rId19"/>
-          <w:headerReference w:type="first" r:id="rId20"/>
+          <w:headerReference w:type="default" r:id="rId15"/>
+          <w:headerReference w:type="first" r:id="rId16"/>
           <w:type w:val="nextPage"/>
           <w:pgSz w:orient="landscape" w:w="16838" w:h="11906"/>
-          <w:pgMar w:left="851" w:right="851" w:gutter="0" w:header="454" w:top="851" w:footer="0" w:bottom="851"/>
+          <w:pgMar w:left="1701" w:right="1134" w:gutter="0" w:header="1134" w:top="1701" w:footer="0" w:bottom="1134"/>
           <w:pgNumType w:fmt="decimal"/>
           <w:formProt w:val="false"/>
           <w:vAlign w:val="center"/>
@@ -31729,64 +31688,15 @@
           <w:docGrid w:type="default" w:linePitch="360" w:charSpace="0"/>
         </w:sectPr>
         <w:pStyle w:val="Normal"/>
-        <w:spacing w:lineRule="auto" w:line="240" w:before="120" w:after="0"/>
-        <w:jc w:val="center"/>
+        <w:spacing w:lineRule="auto" w:line="240" w:before="0" w:after="0"/>
+        <w:jc w:val="both"/>
         <w:rPr/>
       </w:pPr>
       <w:r>
         <w:rPr>
           <w:rFonts w:eastAsia="Arial" w:cs="Arial"/>
-          <w:b/>
-          <w:bCs/>
-          <w:sz w:val="22"/>
-          <w:szCs w:val="22"/>
-        </w:rPr>
-        <w:t>Apêndice A.2a — Diagrama de Classes: Usuários, Eventos e Inscrições</w:t>
-      </w:r>
-    </w:p>
-    <w:p>
-      <w:pPr>
-        <w:pStyle w:val="Normal"/>
-        <w:keepNext w:val="true"/>
-        <w:spacing w:lineRule="auto" w:line="360" w:before="0" w:after="240"/>
-        <w:jc w:val="left"/>
-        <w:rPr/>
-      </w:pPr>
-      <w:r>
-        <w:rPr>
-          <w:rFonts w:eastAsia="Arial" w:cs="Arial"/>
-          <w:b/>
-          <w:bCs/>
-          <w:sz w:val="24"/>
-          <w:szCs w:val="24"/>
-        </w:rPr>
-        <w:t>Apêndice A.2a — Diagrama de Classes: Usuários, Eventos e Inscrições</w:t>
-      </w:r>
-    </w:p>
-    <w:p>
-      <w:pPr>
-        <w:sectPr>
-          <w:headerReference w:type="default" r:id="rId21"/>
-          <w:headerReference w:type="first" r:id="rId22"/>
-          <w:type w:val="nextPage"/>
-          <w:pgSz w:w="11906" w:h="16838"/>
-          <w:pgMar w:left="1701" w:right="1134" w:gutter="0" w:header="1134" w:top="1701" w:footer="0" w:bottom="1134"/>
-          <w:pgNumType w:fmt="decimal"/>
-          <w:formProt w:val="false"/>
-          <w:textDirection w:val="lrTb"/>
-          <w:docGrid w:type="default" w:linePitch="360" w:charSpace="0"/>
-        </w:sectPr>
-        <w:pStyle w:val="Normal"/>
-        <w:spacing w:lineRule="auto" w:line="360" w:before="0" w:after="120"/>
-        <w:ind w:firstLine="709"/>
-        <w:jc w:val="both"/>
-        <w:rPr/>
-      </w:pPr>
-      <w:r>
-        <w:rPr>
-          <w:rFonts w:eastAsia="Arial" w:cs="Arial"/>
-          <w:sz w:val="24"/>
-          <w:szCs w:val="24"/>
+          <w:sz w:val="20"/>
+          <w:szCs w:val="20"/>
         </w:rPr>
         <w:t>Núcleo do domínio, com os atributos e as operações públicas existentes no código; operações sublinhadas são estáticas. Inscricao liga Usuario a Evento e concentra a situação da vaga e a posição na fila (RN-01 a RN-03). O atributo versao de Evento sustenta o controle de concorrência na disputa pela última vaga.</w:t>
       </w:r>
@@ -31803,7 +31713,7 @@
         <w:rPr/>
         <w:drawing>
           <wp:inline distT="0" distB="0" distL="0" distR="0">
-            <wp:extent cx="9610090" cy="5617845"/>
+            <wp:extent cx="7081520" cy="4140200"/>
             <wp:effectExtent l="0" t="0" r="0" b="0"/>
             <wp:docPr id="9" name="Imagem 504" descr="Apêndice A.2b — Diagrama de Classes: Participação e Inteligência Artificial"/>
             <wp:cNvGraphicFramePr>
@@ -31819,7 +31729,7 @@
                     </pic:cNvPicPr>
                   </pic:nvPicPr>
                   <pic:blipFill>
-                    <a:blip r:embed="rId23"/>
+                    <a:blip r:embed="rId17"/>
                     <a:stretch>
                       <a:fillRect/>
                     </a:stretch>
@@ -31827,7 +31737,7 @@
                   <pic:spPr bwMode="auto">
                     <a:xfrm>
                       <a:off x="0" y="0"/>
-                      <a:ext cx="9610090" cy="5617845"/>
+                      <a:ext cx="7081520" cy="4140200"/>
                     </a:xfrm>
                     <a:prstGeom prst="rect">
                       <a:avLst/>
@@ -31842,12 +31752,31 @@
     </w:p>
     <w:p>
       <w:pPr>
+        <w:pStyle w:val="Normal"/>
+        <w:keepNext w:val="true"/>
+        <w:spacing w:lineRule="auto" w:line="240" w:before="240" w:after="60"/>
+        <w:jc w:val="left"/>
+        <w:rPr/>
+      </w:pPr>
+      <w:r>
+        <w:rPr>
+          <w:rFonts w:eastAsia="Arial" w:cs="Arial"/>
+          <w:b/>
+          <w:bCs/>
+          <w:sz w:val="22"/>
+          <w:szCs w:val="22"/>
+        </w:rPr>
+        <w:t>Apêndice A.2b — Diagrama de Classes: Participação e Inteligência Artificial</w:t>
+      </w:r>
+    </w:p>
+    <w:p>
+      <w:pPr>
         <w:sectPr>
-          <w:headerReference w:type="default" r:id="rId24"/>
-          <w:headerReference w:type="first" r:id="rId25"/>
+          <w:headerReference w:type="default" r:id="rId18"/>
+          <w:headerReference w:type="first" r:id="rId19"/>
           <w:type w:val="nextPage"/>
           <w:pgSz w:orient="landscape" w:w="16838" w:h="11906"/>
-          <w:pgMar w:left="851" w:right="851" w:gutter="0" w:header="454" w:top="851" w:footer="0" w:bottom="851"/>
+          <w:pgMar w:left="1701" w:right="1134" w:gutter="0" w:header="1134" w:top="1701" w:footer="0" w:bottom="1134"/>
           <w:pgNumType w:fmt="decimal"/>
           <w:formProt w:val="false"/>
           <w:vAlign w:val="center"/>
@@ -31855,64 +31784,15 @@
           <w:docGrid w:type="default" w:linePitch="360" w:charSpace="0"/>
         </w:sectPr>
         <w:pStyle w:val="Normal"/>
-        <w:spacing w:lineRule="auto" w:line="240" w:before="120" w:after="0"/>
-        <w:jc w:val="center"/>
+        <w:spacing w:lineRule="auto" w:line="240" w:before="0" w:after="0"/>
+        <w:jc w:val="both"/>
         <w:rPr/>
       </w:pPr>
       <w:r>
         <w:rPr>
           <w:rFonts w:eastAsia="Arial" w:cs="Arial"/>
-          <w:b/>
-          <w:bCs/>
-          <w:sz w:val="22"/>
-          <w:szCs w:val="22"/>
-        </w:rPr>
-        <w:t>Apêndice A.2b — Diagrama de Classes: Participação e Inteligência Artificial</w:t>
-      </w:r>
-    </w:p>
-    <w:p>
-      <w:pPr>
-        <w:pStyle w:val="Normal"/>
-        <w:keepNext w:val="true"/>
-        <w:spacing w:lineRule="auto" w:line="360" w:before="0" w:after="240"/>
-        <w:jc w:val="left"/>
-        <w:rPr/>
-      </w:pPr>
-      <w:r>
-        <w:rPr>
-          <w:rFonts w:eastAsia="Arial" w:cs="Arial"/>
-          <w:b/>
-          <w:bCs/>
-          <w:sz w:val="24"/>
-          <w:szCs w:val="24"/>
-        </w:rPr>
-        <w:t>Apêndice A.2b — Diagrama de Classes: Participação e Inteligência Artificial</w:t>
-      </w:r>
-    </w:p>
-    <w:p>
-      <w:pPr>
-        <w:sectPr>
-          <w:headerReference w:type="default" r:id="rId26"/>
-          <w:headerReference w:type="first" r:id="rId27"/>
-          <w:type w:val="nextPage"/>
-          <w:pgSz w:w="11906" w:h="16838"/>
-          <w:pgMar w:left="1701" w:right="1134" w:gutter="0" w:header="1134" w:top="1701" w:footer="0" w:bottom="1134"/>
-          <w:pgNumType w:fmt="decimal"/>
-          <w:formProt w:val="false"/>
-          <w:textDirection w:val="lrTb"/>
-          <w:docGrid w:type="default" w:linePitch="360" w:charSpace="0"/>
-        </w:sectPr>
-        <w:pStyle w:val="Normal"/>
-        <w:spacing w:lineRule="auto" w:line="360" w:before="0" w:after="120"/>
-        <w:ind w:firstLine="709"/>
-        <w:jc w:val="both"/>
-        <w:rPr/>
-      </w:pPr>
-      <w:r>
-        <w:rPr>
-          <w:rFonts w:eastAsia="Arial" w:cs="Arial"/>
-          <w:sz w:val="24"/>
-          <w:szCs w:val="24"/>
+          <w:sz w:val="20"/>
+          <w:szCs w:val="20"/>
         </w:rPr>
         <w:t>Registros que dependem da inscrição — presença, certificado e avaliação, no máximo um de cada por inscrição (RN-05 e RN-06) — e as entidades de IA: o resumo consolidado por evento (RN-07) e o histórico de interações com o modelo, mantido para auditoria (RN-10). Inscricao, Evento e Usuario aparecem apenas como referência ao diagrama A.2a.</w:t>
       </w:r>
@@ -31929,7 +31809,7 @@
         <w:rPr/>
         <w:drawing>
           <wp:inline distT="0" distB="0" distL="0" distR="0">
-            <wp:extent cx="9581515" cy="5902325"/>
+            <wp:extent cx="6720205" cy="4140200"/>
             <wp:effectExtent l="0" t="0" r="0" b="0"/>
             <wp:docPr id="10" name="Imagem 505" descr="Apêndice A.3a — Diagrama de Estados: Inscrição"/>
             <wp:cNvGraphicFramePr>
@@ -31945,7 +31825,7 @@
                     </pic:cNvPicPr>
                   </pic:nvPicPr>
                   <pic:blipFill>
-                    <a:blip r:embed="rId28"/>
+                    <a:blip r:embed="rId20"/>
                     <a:stretch>
                       <a:fillRect/>
                     </a:stretch>
@@ -31953,7 +31833,7 @@
                   <pic:spPr bwMode="auto">
                     <a:xfrm>
                       <a:off x="0" y="0"/>
-                      <a:ext cx="9581515" cy="5902325"/>
+                      <a:ext cx="6720205" cy="4140200"/>
                     </a:xfrm>
                     <a:prstGeom prst="rect">
                       <a:avLst/>
@@ -31968,12 +31848,31 @@
     </w:p>
     <w:p>
       <w:pPr>
+        <w:pStyle w:val="Normal"/>
+        <w:keepNext w:val="true"/>
+        <w:spacing w:lineRule="auto" w:line="240" w:before="240" w:after="60"/>
+        <w:jc w:val="left"/>
+        <w:rPr/>
+      </w:pPr>
+      <w:r>
+        <w:rPr>
+          <w:rFonts w:eastAsia="Arial" w:cs="Arial"/>
+          <w:b/>
+          <w:bCs/>
+          <w:sz w:val="22"/>
+          <w:szCs w:val="22"/>
+        </w:rPr>
+        <w:t>Apêndice A.3a — Diagrama de Estados: Inscrição</w:t>
+      </w:r>
+    </w:p>
+    <w:p>
+      <w:pPr>
         <w:sectPr>
-          <w:headerReference w:type="default" r:id="rId29"/>
-          <w:headerReference w:type="first" r:id="rId30"/>
+          <w:headerReference w:type="default" r:id="rId21"/>
+          <w:headerReference w:type="first" r:id="rId22"/>
           <w:type w:val="nextPage"/>
           <w:pgSz w:orient="landscape" w:w="16838" w:h="11906"/>
-          <w:pgMar w:left="851" w:right="851" w:gutter="0" w:header="454" w:top="851" w:footer="0" w:bottom="851"/>
+          <w:pgMar w:left="1701" w:right="1134" w:gutter="0" w:header="1134" w:top="1701" w:footer="0" w:bottom="1134"/>
           <w:pgNumType w:fmt="decimal"/>
           <w:formProt w:val="false"/>
           <w:vAlign w:val="center"/>
@@ -31981,64 +31880,15 @@
           <w:docGrid w:type="default" w:linePitch="360" w:charSpace="0"/>
         </w:sectPr>
         <w:pStyle w:val="Normal"/>
-        <w:spacing w:lineRule="auto" w:line="240" w:before="120" w:after="0"/>
-        <w:jc w:val="center"/>
+        <w:spacing w:lineRule="auto" w:line="240" w:before="0" w:after="0"/>
+        <w:jc w:val="both"/>
         <w:rPr/>
       </w:pPr>
       <w:r>
         <w:rPr>
           <w:rFonts w:eastAsia="Arial" w:cs="Arial"/>
-          <w:b/>
-          <w:bCs/>
-          <w:sz w:val="22"/>
-          <w:szCs w:val="22"/>
-        </w:rPr>
-        <w:t>Apêndice A.3a — Diagrama de Estados: Inscrição</w:t>
-      </w:r>
-    </w:p>
-    <w:p>
-      <w:pPr>
-        <w:pStyle w:val="Normal"/>
-        <w:keepNext w:val="true"/>
-        <w:spacing w:lineRule="auto" w:line="360" w:before="0" w:after="240"/>
-        <w:jc w:val="left"/>
-        <w:rPr/>
-      </w:pPr>
-      <w:r>
-        <w:rPr>
-          <w:rFonts w:eastAsia="Arial" w:cs="Arial"/>
-          <w:b/>
-          <w:bCs/>
-          <w:sz w:val="24"/>
-          <w:szCs w:val="24"/>
-        </w:rPr>
-        <w:t>Apêndice A.3a — Diagrama de Estados: Inscrição</w:t>
-      </w:r>
-    </w:p>
-    <w:p>
-      <w:pPr>
-        <w:sectPr>
-          <w:headerReference w:type="default" r:id="rId31"/>
-          <w:headerReference w:type="first" r:id="rId32"/>
-          <w:type w:val="nextPage"/>
-          <w:pgSz w:w="11906" w:h="16838"/>
-          <w:pgMar w:left="1701" w:right="1134" w:gutter="0" w:header="1134" w:top="1701" w:footer="0" w:bottom="1134"/>
-          <w:pgNumType w:fmt="decimal"/>
-          <w:formProt w:val="false"/>
-          <w:textDirection w:val="lrTb"/>
-          <w:docGrid w:type="default" w:linePitch="360" w:charSpace="0"/>
-        </w:sectPr>
-        <w:pStyle w:val="Normal"/>
-        <w:spacing w:lineRule="auto" w:line="360" w:before="0" w:after="120"/>
-        <w:ind w:firstLine="709"/>
-        <w:jc w:val="both"/>
-        <w:rPr/>
-      </w:pPr>
-      <w:r>
-        <w:rPr>
-          <w:rFonts w:eastAsia="Arial" w:cs="Arial"/>
-          <w:sz w:val="24"/>
-          <w:szCs w:val="24"/>
+          <w:sz w:val="20"/>
+          <w:szCs w:val="20"/>
         </w:rPr>
         <w:t>Ciclo de vida persistido da inscrição, cobrindo a garantia de vaga (RF-05), a fila de espera e a promoção por desistência (RF-06) e o cancelamento (RF-07). Presença e certificado não são estados, e sim registros vinculados a uma inscrição confirmada. O valor AUSENTE existe na enumeração, mas nenhum fluxo da versão atual o grava.</w:t>
       </w:r>
@@ -32055,7 +31905,7 @@
         <w:rPr/>
         <w:drawing>
           <wp:inline distT="0" distB="0" distL="0" distR="0">
-            <wp:extent cx="9610090" cy="4473575"/>
+            <wp:extent cx="7919720" cy="3686810"/>
             <wp:effectExtent l="0" t="0" r="0" b="0"/>
             <wp:docPr id="11" name="Imagem 506" descr="Apêndice A.3b — Diagrama de Estados: Evento"/>
             <wp:cNvGraphicFramePr>
@@ -32071,7 +31921,7 @@
                     </pic:cNvPicPr>
                   </pic:nvPicPr>
                   <pic:blipFill>
-                    <a:blip r:embed="rId33"/>
+                    <a:blip r:embed="rId23"/>
                     <a:stretch>
                       <a:fillRect/>
                     </a:stretch>
@@ -32079,7 +31929,7 @@
                   <pic:spPr bwMode="auto">
                     <a:xfrm>
                       <a:off x="0" y="0"/>
-                      <a:ext cx="9610090" cy="4473575"/>
+                      <a:ext cx="7919720" cy="3686810"/>
                     </a:xfrm>
                     <a:prstGeom prst="rect">
                       <a:avLst/>
@@ -32094,12 +31944,31 @@
     </w:p>
     <w:p>
       <w:pPr>
+        <w:pStyle w:val="Normal"/>
+        <w:keepNext w:val="true"/>
+        <w:spacing w:lineRule="auto" w:line="240" w:before="240" w:after="60"/>
+        <w:jc w:val="left"/>
+        <w:rPr/>
+      </w:pPr>
+      <w:r>
+        <w:rPr>
+          <w:rFonts w:eastAsia="Arial" w:cs="Arial"/>
+          <w:b/>
+          <w:bCs/>
+          <w:sz w:val="22"/>
+          <w:szCs w:val="22"/>
+        </w:rPr>
+        <w:t>Apêndice A.3b — Diagrama de Estados: Evento</w:t>
+      </w:r>
+    </w:p>
+    <w:p>
+      <w:pPr>
         <w:sectPr>
-          <w:headerReference w:type="default" r:id="rId34"/>
-          <w:headerReference w:type="first" r:id="rId35"/>
+          <w:headerReference w:type="default" r:id="rId24"/>
+          <w:headerReference w:type="first" r:id="rId25"/>
           <w:type w:val="nextPage"/>
           <w:pgSz w:orient="landscape" w:w="16838" w:h="11906"/>
-          <w:pgMar w:left="851" w:right="851" w:gutter="0" w:header="454" w:top="851" w:footer="0" w:bottom="851"/>
+          <w:pgMar w:left="1701" w:right="1134" w:gutter="0" w:header="1134" w:top="1701" w:footer="0" w:bottom="1134"/>
           <w:pgNumType w:fmt="decimal"/>
           <w:formProt w:val="false"/>
           <w:vAlign w:val="center"/>
@@ -32107,64 +31976,15 @@
           <w:docGrid w:type="default" w:linePitch="360" w:charSpace="0"/>
         </w:sectPr>
         <w:pStyle w:val="Normal"/>
-        <w:spacing w:lineRule="auto" w:line="240" w:before="120" w:after="0"/>
-        <w:jc w:val="center"/>
+        <w:spacing w:lineRule="auto" w:line="240" w:before="0" w:after="0"/>
+        <w:jc w:val="both"/>
         <w:rPr/>
       </w:pPr>
       <w:r>
         <w:rPr>
           <w:rFonts w:eastAsia="Arial" w:cs="Arial"/>
-          <w:b/>
-          <w:bCs/>
-          <w:sz w:val="22"/>
-          <w:szCs w:val="22"/>
-        </w:rPr>
-        <w:t>Apêndice A.3b — Diagrama de Estados: Evento</w:t>
-      </w:r>
-    </w:p>
-    <w:p>
-      <w:pPr>
-        <w:pStyle w:val="Normal"/>
-        <w:keepNext w:val="true"/>
-        <w:spacing w:lineRule="auto" w:line="360" w:before="0" w:after="240"/>
-        <w:jc w:val="left"/>
-        <w:rPr/>
-      </w:pPr>
-      <w:r>
-        <w:rPr>
-          <w:rFonts w:eastAsia="Arial" w:cs="Arial"/>
-          <w:b/>
-          <w:bCs/>
-          <w:sz w:val="24"/>
-          <w:szCs w:val="24"/>
-        </w:rPr>
-        <w:t>Apêndice A.3b — Diagrama de Estados: Evento</w:t>
-      </w:r>
-    </w:p>
-    <w:p>
-      <w:pPr>
-        <w:sectPr>
-          <w:headerReference w:type="default" r:id="rId36"/>
-          <w:headerReference w:type="first" r:id="rId37"/>
-          <w:type w:val="nextPage"/>
-          <w:pgSz w:w="11906" w:h="16838"/>
-          <w:pgMar w:left="1701" w:right="1134" w:gutter="0" w:header="1134" w:top="1701" w:footer="0" w:bottom="1134"/>
-          <w:pgNumType w:fmt="decimal"/>
-          <w:formProt w:val="false"/>
-          <w:textDirection w:val="lrTb"/>
-          <w:docGrid w:type="default" w:linePitch="360" w:charSpace="0"/>
-        </w:sectPr>
-        <w:pStyle w:val="Normal"/>
-        <w:spacing w:lineRule="auto" w:line="360" w:before="0" w:after="120"/>
-        <w:ind w:firstLine="709"/>
-        <w:jc w:val="both"/>
-        <w:rPr/>
-      </w:pPr>
-      <w:r>
-        <w:rPr>
-          <w:rFonts w:eastAsia="Arial" w:cs="Arial"/>
-          <w:sz w:val="24"/>
-          <w:szCs w:val="24"/>
+          <w:sz w:val="20"/>
+          <w:szCs w:val="20"/>
         </w:rPr>
         <w:t>Ciclo de vida do evento conforme as transições permitidas por StatusEvento. Somente a situação PUBLICADO aceita inscrições, e as situações ENCERRADO e CANCELADO são terminais, sem edição nem novas inscrições (RN-09).</w:t>
       </w:r>
@@ -32181,7 +32001,7 @@
         <w:rPr/>
         <w:drawing>
           <wp:inline distT="0" distB="0" distL="0" distR="0">
-            <wp:extent cx="9045575" cy="5902325"/>
+            <wp:extent cx="6344285" cy="4140200"/>
             <wp:effectExtent l="0" t="0" r="0" b="0"/>
             <wp:docPr id="12" name="Imagem 507" descr="Apêndice A.4 — Diagrama de Atividades: Cadastro de Evento Assistido por IA"/>
             <wp:cNvGraphicFramePr>
@@ -32197,7 +32017,7 @@
                     </pic:cNvPicPr>
                   </pic:nvPicPr>
                   <pic:blipFill>
-                    <a:blip r:embed="rId38"/>
+                    <a:blip r:embed="rId26"/>
                     <a:stretch>
                       <a:fillRect/>
                     </a:stretch>
@@ -32205,7 +32025,7 @@
                   <pic:spPr bwMode="auto">
                     <a:xfrm>
                       <a:off x="0" y="0"/>
-                      <a:ext cx="9045575" cy="5902325"/>
+                      <a:ext cx="6344285" cy="4140200"/>
                     </a:xfrm>
                     <a:prstGeom prst="rect">
                       <a:avLst/>
@@ -32220,12 +32040,31 @@
     </w:p>
     <w:p>
       <w:pPr>
+        <w:pStyle w:val="Normal"/>
+        <w:keepNext w:val="true"/>
+        <w:spacing w:lineRule="auto" w:line="240" w:before="240" w:after="60"/>
+        <w:jc w:val="left"/>
+        <w:rPr/>
+      </w:pPr>
+      <w:r>
+        <w:rPr>
+          <w:rFonts w:eastAsia="Arial" w:cs="Arial"/>
+          <w:b/>
+          <w:bCs/>
+          <w:sz w:val="22"/>
+          <w:szCs w:val="22"/>
+        </w:rPr>
+        <w:t>Apêndice A.4 — Diagrama de Atividades: Cadastro de Evento Assistido por IA</w:t>
+      </w:r>
+    </w:p>
+    <w:p>
+      <w:pPr>
         <w:sectPr>
-          <w:headerReference w:type="default" r:id="rId39"/>
-          <w:headerReference w:type="first" r:id="rId40"/>
+          <w:headerReference w:type="default" r:id="rId27"/>
+          <w:headerReference w:type="first" r:id="rId28"/>
           <w:type w:val="nextPage"/>
           <w:pgSz w:orient="landscape" w:w="16838" w:h="11906"/>
-          <w:pgMar w:left="851" w:right="851" w:gutter="0" w:header="454" w:top="851" w:footer="0" w:bottom="851"/>
+          <w:pgMar w:left="1701" w:right="1134" w:gutter="0" w:header="1134" w:top="1701" w:footer="0" w:bottom="1134"/>
           <w:pgNumType w:fmt="decimal"/>
           <w:formProt w:val="false"/>
           <w:vAlign w:val="center"/>
@@ -32233,64 +32072,15 @@
           <w:docGrid w:type="default" w:linePitch="360" w:charSpace="0"/>
         </w:sectPr>
         <w:pStyle w:val="Normal"/>
-        <w:spacing w:lineRule="auto" w:line="240" w:before="120" w:after="0"/>
-        <w:jc w:val="center"/>
+        <w:spacing w:lineRule="auto" w:line="240" w:before="0" w:after="0"/>
+        <w:jc w:val="both"/>
         <w:rPr/>
       </w:pPr>
       <w:r>
         <w:rPr>
           <w:rFonts w:eastAsia="Arial" w:cs="Arial"/>
-          <w:b/>
-          <w:bCs/>
-          <w:sz w:val="22"/>
-          <w:szCs w:val="22"/>
-        </w:rPr>
-        <w:t>Apêndice A.4 — Diagrama de Atividades: Cadastro de Evento Assistido por IA</w:t>
-      </w:r>
-    </w:p>
-    <w:p>
-      <w:pPr>
-        <w:pStyle w:val="Normal"/>
-        <w:keepNext w:val="true"/>
-        <w:spacing w:lineRule="auto" w:line="360" w:before="0" w:after="240"/>
-        <w:jc w:val="left"/>
-        <w:rPr/>
-      </w:pPr>
-      <w:r>
-        <w:rPr>
-          <w:rFonts w:eastAsia="Arial" w:cs="Arial"/>
-          <w:b/>
-          <w:bCs/>
-          <w:sz w:val="24"/>
-          <w:szCs w:val="24"/>
-        </w:rPr>
-        <w:t>Apêndice A.4 — Diagrama de Atividades: Cadastro de Evento Assistido por IA</w:t>
-      </w:r>
-    </w:p>
-    <w:p>
-      <w:pPr>
-        <w:sectPr>
-          <w:headerReference w:type="default" r:id="rId41"/>
-          <w:headerReference w:type="first" r:id="rId42"/>
-          <w:type w:val="nextPage"/>
-          <w:pgSz w:w="11906" w:h="16838"/>
-          <w:pgMar w:left="1701" w:right="1134" w:gutter="0" w:header="1134" w:top="1701" w:footer="0" w:bottom="1134"/>
-          <w:pgNumType w:fmt="decimal"/>
-          <w:formProt w:val="false"/>
-          <w:textDirection w:val="lrTb"/>
-          <w:docGrid w:type="default" w:linePitch="360" w:charSpace="0"/>
-        </w:sectPr>
-        <w:pStyle w:val="Normal"/>
-        <w:spacing w:lineRule="auto" w:line="360" w:before="0" w:after="120"/>
-        <w:ind w:firstLine="709"/>
-        <w:jc w:val="both"/>
-        <w:rPr/>
-      </w:pPr>
-      <w:r>
-        <w:rPr>
-          <w:rFonts w:eastAsia="Arial" w:cs="Arial"/>
-          <w:sz w:val="24"/>
-          <w:szCs w:val="24"/>
+          <w:sz w:val="20"/>
+          <w:szCs w:val="20"/>
         </w:rPr>
         <w:t>Fluxo do cadastro a partir de texto livre (RF-03), em raias de responsabilidade. Uma resposta inválida — falha do serviço, rotação de modelos esgotada ou tempo excedido — conduz ao preenchimento manual (RN-10). Em ambos os caminhos, o evento só é gravado após a revisão do organizador, em situação de rascunho.</w:t>
       </w:r>
@@ -32307,7 +32097,7 @@
         <w:rPr/>
         <w:drawing>
           <wp:inline distT="0" distB="0" distL="0" distR="0">
-            <wp:extent cx="9610090" cy="4565015"/>
+            <wp:extent cx="7919720" cy="3761740"/>
             <wp:effectExtent l="0" t="0" r="0" b="0"/>
             <wp:docPr id="13" name="Imagem 508" descr="Apêndice A.5 — Diagrama de Interação: Cadastro de Evento via IA"/>
             <wp:cNvGraphicFramePr>
@@ -32323,7 +32113,7 @@
                     </pic:cNvPicPr>
                   </pic:nvPicPr>
                   <pic:blipFill>
-                    <a:blip r:embed="rId43"/>
+                    <a:blip r:embed="rId29"/>
                     <a:stretch>
                       <a:fillRect/>
                     </a:stretch>
@@ -32331,7 +32121,7 @@
                   <pic:spPr bwMode="auto">
                     <a:xfrm>
                       <a:off x="0" y="0"/>
-                      <a:ext cx="9610090" cy="4565015"/>
+                      <a:ext cx="7919720" cy="3761740"/>
                     </a:xfrm>
                     <a:prstGeom prst="rect">
                       <a:avLst/>
@@ -32346,12 +32136,31 @@
     </w:p>
     <w:p>
       <w:pPr>
+        <w:pStyle w:val="Normal"/>
+        <w:keepNext w:val="true"/>
+        <w:spacing w:lineRule="auto" w:line="240" w:before="240" w:after="60"/>
+        <w:jc w:val="left"/>
+        <w:rPr/>
+      </w:pPr>
+      <w:r>
+        <w:rPr>
+          <w:rFonts w:eastAsia="Arial" w:cs="Arial"/>
+          <w:b/>
+          <w:bCs/>
+          <w:sz w:val="22"/>
+          <w:szCs w:val="22"/>
+        </w:rPr>
+        <w:t>Apêndice A.5 — Diagrama de Interação: Cadastro de Evento via IA</w:t>
+      </w:r>
+    </w:p>
+    <w:p>
+      <w:pPr>
         <w:sectPr>
-          <w:headerReference w:type="default" r:id="rId44"/>
-          <w:headerReference w:type="first" r:id="rId45"/>
+          <w:headerReference w:type="default" r:id="rId30"/>
+          <w:headerReference w:type="first" r:id="rId31"/>
           <w:type w:val="nextPage"/>
           <w:pgSz w:orient="landscape" w:w="16838" w:h="11906"/>
-          <w:pgMar w:left="851" w:right="851" w:gutter="0" w:header="454" w:top="851" w:footer="0" w:bottom="851"/>
+          <w:pgMar w:left="1701" w:right="1134" w:gutter="0" w:header="1134" w:top="1701" w:footer="0" w:bottom="1134"/>
           <w:pgNumType w:fmt="decimal"/>
           <w:formProt w:val="false"/>
           <w:vAlign w:val="center"/>
@@ -32359,64 +32168,15 @@
           <w:docGrid w:type="default" w:linePitch="360" w:charSpace="0"/>
         </w:sectPr>
         <w:pStyle w:val="Normal"/>
-        <w:spacing w:lineRule="auto" w:line="240" w:before="120" w:after="0"/>
-        <w:jc w:val="center"/>
+        <w:spacing w:lineRule="auto" w:line="240" w:before="0" w:after="0"/>
+        <w:jc w:val="both"/>
         <w:rPr/>
       </w:pPr>
       <w:r>
         <w:rPr>
           <w:rFonts w:eastAsia="Arial" w:cs="Arial"/>
-          <w:b/>
-          <w:bCs/>
-          <w:sz w:val="22"/>
-          <w:szCs w:val="22"/>
-        </w:rPr>
-        <w:t>Apêndice A.5 — Diagrama de Interação: Cadastro de Evento via IA</w:t>
-      </w:r>
-    </w:p>
-    <w:p>
-      <w:pPr>
-        <w:pStyle w:val="Normal"/>
-        <w:keepNext w:val="true"/>
-        <w:spacing w:lineRule="auto" w:line="360" w:before="0" w:after="240"/>
-        <w:jc w:val="left"/>
-        <w:rPr/>
-      </w:pPr>
-      <w:r>
-        <w:rPr>
-          <w:rFonts w:eastAsia="Arial" w:cs="Arial"/>
-          <w:b/>
-          <w:bCs/>
-          <w:sz w:val="24"/>
-          <w:szCs w:val="24"/>
-        </w:rPr>
-        <w:t>Apêndice A.5 — Diagrama de Interação: Cadastro de Evento via IA</w:t>
-      </w:r>
-    </w:p>
-    <w:p>
-      <w:pPr>
-        <w:sectPr>
-          <w:headerReference w:type="default" r:id="rId46"/>
-          <w:headerReference w:type="first" r:id="rId47"/>
-          <w:type w:val="nextPage"/>
-          <w:pgSz w:w="11906" w:h="16838"/>
-          <w:pgMar w:left="1701" w:right="1134" w:gutter="0" w:header="1134" w:top="1701" w:footer="0" w:bottom="1134"/>
-          <w:pgNumType w:fmt="decimal"/>
-          <w:formProt w:val="false"/>
-          <w:textDirection w:val="lrTb"/>
-          <w:docGrid w:type="default" w:linePitch="360" w:charSpace="0"/>
-        </w:sectPr>
-        <w:pStyle w:val="Normal"/>
-        <w:spacing w:lineRule="auto" w:line="360" w:before="0" w:after="120"/>
-        <w:ind w:firstLine="709"/>
-        <w:jc w:val="both"/>
-        <w:rPr/>
-      </w:pPr>
-      <w:r>
-        <w:rPr>
-          <w:rFonts w:eastAsia="Arial" w:cs="Arial"/>
-          <w:sz w:val="24"/>
-          <w:szCs w:val="24"/>
+          <w:sz w:val="20"/>
+          <w:szCs w:val="20"/>
         </w:rPr>
         <w:t>Interpretação do texto do evento por saída estruturada. O fragmento loop representa a rotação entre modelos de linguagem até que um responda; o fragmento alt separa o retorno do rascunho do caminho de contingência, em que a interface recebe o código IA_INDISPONIVEL (RN-10). Toda chamada é registrada em interacao_ia, com ou sem sucesso.</w:t>
       </w:r>
@@ -32433,7 +32193,7 @@
         <w:rPr/>
         <w:drawing>
           <wp:inline distT="0" distB="0" distL="0" distR="0">
-            <wp:extent cx="9610090" cy="5217160"/>
+            <wp:extent cx="7626350" cy="4140200"/>
             <wp:effectExtent l="0" t="0" r="0" b="0"/>
             <wp:docPr id="14" name="Imagem 509" descr="Apêndice A.6a — Diagrama de Interação: Emissão de Certificado"/>
             <wp:cNvGraphicFramePr>
@@ -32449,7 +32209,7 @@
                     </pic:cNvPicPr>
                   </pic:nvPicPr>
                   <pic:blipFill>
-                    <a:blip r:embed="rId48"/>
+                    <a:blip r:embed="rId32"/>
                     <a:stretch>
                       <a:fillRect/>
                     </a:stretch>
@@ -32457,7 +32217,7 @@
                   <pic:spPr bwMode="auto">
                     <a:xfrm>
                       <a:off x="0" y="0"/>
-                      <a:ext cx="9610090" cy="5217160"/>
+                      <a:ext cx="7626350" cy="4140200"/>
                     </a:xfrm>
                     <a:prstGeom prst="rect">
                       <a:avLst/>
@@ -32472,12 +32232,31 @@
     </w:p>
     <w:p>
       <w:pPr>
+        <w:pStyle w:val="Normal"/>
+        <w:keepNext w:val="true"/>
+        <w:spacing w:lineRule="auto" w:line="240" w:before="240" w:after="60"/>
+        <w:jc w:val="left"/>
+        <w:rPr/>
+      </w:pPr>
+      <w:r>
+        <w:rPr>
+          <w:rFonts w:eastAsia="Arial" w:cs="Arial"/>
+          <w:b/>
+          <w:bCs/>
+          <w:sz w:val="22"/>
+          <w:szCs w:val="22"/>
+        </w:rPr>
+        <w:t>Apêndice A.6a — Diagrama de Interação: Emissão de Certificado</w:t>
+      </w:r>
+    </w:p>
+    <w:p>
+      <w:pPr>
         <w:sectPr>
-          <w:headerReference w:type="default" r:id="rId49"/>
-          <w:headerReference w:type="first" r:id="rId50"/>
+          <w:headerReference w:type="default" r:id="rId33"/>
+          <w:headerReference w:type="first" r:id="rId34"/>
           <w:type w:val="nextPage"/>
           <w:pgSz w:orient="landscape" w:w="16838" w:h="11906"/>
-          <w:pgMar w:left="851" w:right="851" w:gutter="0" w:header="454" w:top="851" w:footer="0" w:bottom="851"/>
+          <w:pgMar w:left="1701" w:right="1134" w:gutter="0" w:header="1134" w:top="1701" w:footer="0" w:bottom="1134"/>
           <w:pgNumType w:fmt="decimal"/>
           <w:formProt w:val="false"/>
           <w:vAlign w:val="center"/>
@@ -32485,64 +32264,15 @@
           <w:docGrid w:type="default" w:linePitch="360" w:charSpace="0"/>
         </w:sectPr>
         <w:pStyle w:val="Normal"/>
-        <w:spacing w:lineRule="auto" w:line="240" w:before="120" w:after="0"/>
-        <w:jc w:val="center"/>
+        <w:spacing w:lineRule="auto" w:line="240" w:before="0" w:after="0"/>
+        <w:jc w:val="both"/>
         <w:rPr/>
       </w:pPr>
       <w:r>
         <w:rPr>
           <w:rFonts w:eastAsia="Arial" w:cs="Arial"/>
-          <w:b/>
-          <w:bCs/>
-          <w:sz w:val="22"/>
-          <w:szCs w:val="22"/>
-        </w:rPr>
-        <w:t>Apêndice A.6a — Diagrama de Interação: Emissão de Certificado</w:t>
-      </w:r>
-    </w:p>
-    <w:p>
-      <w:pPr>
-        <w:pStyle w:val="Normal"/>
-        <w:keepNext w:val="true"/>
-        <w:spacing w:lineRule="auto" w:line="360" w:before="0" w:after="240"/>
-        <w:jc w:val="left"/>
-        <w:rPr/>
-      </w:pPr>
-      <w:r>
-        <w:rPr>
-          <w:rFonts w:eastAsia="Arial" w:cs="Arial"/>
-          <w:b/>
-          <w:bCs/>
-          <w:sz w:val="24"/>
-          <w:szCs w:val="24"/>
-        </w:rPr>
-        <w:t>Apêndice A.6a — Diagrama de Interação: Emissão de Certificado</w:t>
-      </w:r>
-    </w:p>
-    <w:p>
-      <w:pPr>
-        <w:sectPr>
-          <w:headerReference w:type="default" r:id="rId51"/>
-          <w:headerReference w:type="first" r:id="rId52"/>
-          <w:type w:val="nextPage"/>
-          <w:pgSz w:w="11906" w:h="16838"/>
-          <w:pgMar w:left="1701" w:right="1134" w:gutter="0" w:header="1134" w:top="1701" w:footer="0" w:bottom="1134"/>
-          <w:pgNumType w:fmt="decimal"/>
-          <w:formProt w:val="false"/>
-          <w:textDirection w:val="lrTb"/>
-          <w:docGrid w:type="default" w:linePitch="360" w:charSpace="0"/>
-        </w:sectPr>
-        <w:pStyle w:val="Normal"/>
-        <w:spacing w:lineRule="auto" w:line="360" w:before="0" w:after="120"/>
-        <w:ind w:firstLine="709"/>
-        <w:jc w:val="both"/>
-        <w:rPr/>
-      </w:pPr>
-      <w:r>
-        <w:rPr>
-          <w:rFonts w:eastAsia="Arial" w:cs="Arial"/>
-          <w:sz w:val="24"/>
-          <w:szCs w:val="24"/>
+          <w:sz w:val="20"/>
+          <w:szCs w:val="20"/>
         </w:rPr>
         <w:t>Emissão do certificado (RF-09). A operação é idempotente: um certificado já emitido é devolvido sem nova gravação. Sem registro de presença, a emissão é recusada com PRESENCA_NAO_REGISTRADA (RN-05). O código de autenticidade é gerado no construtor de Certificado, e nenhum arquivo PDF é produzido nesta etapa.</w:t>
       </w:r>
@@ -32559,7 +32289,7 @@
         <w:rPr/>
         <w:drawing>
           <wp:inline distT="0" distB="0" distL="0" distR="0">
-            <wp:extent cx="9610090" cy="3707130"/>
+            <wp:extent cx="7919720" cy="3054985"/>
             <wp:effectExtent l="0" t="0" r="0" b="0"/>
             <wp:docPr id="15" name="Imagem 510" descr="Apêndice A.6b — Diagrama de Interação: Download do Certificado"/>
             <wp:cNvGraphicFramePr>
@@ -32575,7 +32305,7 @@
                     </pic:cNvPicPr>
                   </pic:nvPicPr>
                   <pic:blipFill>
-                    <a:blip r:embed="rId53"/>
+                    <a:blip r:embed="rId35"/>
                     <a:stretch>
                       <a:fillRect/>
                     </a:stretch>
@@ -32583,7 +32313,7 @@
                   <pic:spPr bwMode="auto">
                     <a:xfrm>
                       <a:off x="0" y="0"/>
-                      <a:ext cx="9610090" cy="3707130"/>
+                      <a:ext cx="7919720" cy="3054985"/>
                     </a:xfrm>
                     <a:prstGeom prst="rect">
                       <a:avLst/>
@@ -32598,12 +32328,31 @@
     </w:p>
     <w:p>
       <w:pPr>
+        <w:pStyle w:val="Normal"/>
+        <w:keepNext w:val="true"/>
+        <w:spacing w:lineRule="auto" w:line="240" w:before="240" w:after="60"/>
+        <w:jc w:val="left"/>
+        <w:rPr/>
+      </w:pPr>
+      <w:r>
+        <w:rPr>
+          <w:rFonts w:eastAsia="Arial" w:cs="Arial"/>
+          <w:b/>
+          <w:bCs/>
+          <w:sz w:val="22"/>
+          <w:szCs w:val="22"/>
+        </w:rPr>
+        <w:t>Apêndice A.6b — Diagrama de Interação: Download do Certificado</w:t>
+      </w:r>
+    </w:p>
+    <w:p>
+      <w:pPr>
         <w:sectPr>
-          <w:headerReference w:type="default" r:id="rId54"/>
-          <w:headerReference w:type="first" r:id="rId55"/>
+          <w:headerReference w:type="default" r:id="rId36"/>
+          <w:headerReference w:type="first" r:id="rId37"/>
           <w:type w:val="nextPage"/>
           <w:pgSz w:orient="landscape" w:w="16838" w:h="11906"/>
-          <w:pgMar w:left="851" w:right="851" w:gutter="0" w:header="454" w:top="851" w:footer="0" w:bottom="851"/>
+          <w:pgMar w:left="1701" w:right="1134" w:gutter="0" w:header="1134" w:top="1701" w:footer="0" w:bottom="1134"/>
           <w:pgNumType w:fmt="decimal"/>
           <w:formProt w:val="false"/>
           <w:vAlign w:val="center"/>
@@ -32611,64 +32360,15 @@
           <w:docGrid w:type="default" w:linePitch="360" w:charSpace="0"/>
         </w:sectPr>
         <w:pStyle w:val="Normal"/>
-        <w:spacing w:lineRule="auto" w:line="240" w:before="120" w:after="0"/>
-        <w:jc w:val="center"/>
+        <w:spacing w:lineRule="auto" w:line="240" w:before="0" w:after="0"/>
+        <w:jc w:val="both"/>
         <w:rPr/>
       </w:pPr>
       <w:r>
         <w:rPr>
           <w:rFonts w:eastAsia="Arial" w:cs="Arial"/>
-          <w:b/>
-          <w:bCs/>
-          <w:sz w:val="22"/>
-          <w:szCs w:val="22"/>
-        </w:rPr>
-        <w:t>Apêndice A.6b — Diagrama de Interação: Download do Certificado</w:t>
-      </w:r>
-    </w:p>
-    <w:p>
-      <w:pPr>
-        <w:pStyle w:val="Normal"/>
-        <w:keepNext w:val="true"/>
-        <w:spacing w:lineRule="auto" w:line="360" w:before="0" w:after="240"/>
-        <w:jc w:val="left"/>
-        <w:rPr/>
-      </w:pPr>
-      <w:r>
-        <w:rPr>
-          <w:rFonts w:eastAsia="Arial" w:cs="Arial"/>
-          <w:b/>
-          <w:bCs/>
-          <w:sz w:val="24"/>
-          <w:szCs w:val="24"/>
-        </w:rPr>
-        <w:t>Apêndice A.6b — Diagrama de Interação: Download do Certificado</w:t>
-      </w:r>
-    </w:p>
-    <w:p>
-      <w:pPr>
-        <w:sectPr>
-          <w:headerReference w:type="default" r:id="rId56"/>
-          <w:headerReference w:type="first" r:id="rId57"/>
-          <w:type w:val="nextPage"/>
-          <w:pgSz w:w="11906" w:h="16838"/>
-          <w:pgMar w:left="1701" w:right="1134" w:gutter="0" w:header="1134" w:top="1701" w:footer="0" w:bottom="1134"/>
-          <w:pgNumType w:fmt="decimal"/>
-          <w:formProt w:val="false"/>
-          <w:textDirection w:val="lrTb"/>
-          <w:docGrid w:type="default" w:linePitch="360" w:charSpace="0"/>
-        </w:sectPr>
-        <w:pStyle w:val="Normal"/>
-        <w:spacing w:lineRule="auto" w:line="360" w:before="0" w:after="120"/>
-        <w:ind w:firstLine="709"/>
-        <w:jc w:val="both"/>
-        <w:rPr/>
-      </w:pPr>
-      <w:r>
-        <w:rPr>
-          <w:rFonts w:eastAsia="Arial" w:cs="Arial"/>
-          <w:sz w:val="24"/>
-          <w:szCs w:val="24"/>
+          <w:sz w:val="20"/>
+          <w:szCs w:val="20"/>
         </w:rPr>
         <w:t>Obtenção do certificado em PDF, em requisição separada da emissão. O documento é montado pela biblioteca iText a cada solicitação, em memória e sem gravação em disco, e somente o titular da inscrição pode obtê-lo (RN-08).</w:t>
       </w:r>
@@ -32685,7 +32385,7 @@
         <w:rPr/>
         <w:drawing>
           <wp:inline distT="0" distB="0" distL="0" distR="0">
-            <wp:extent cx="9610090" cy="4538345"/>
+            <wp:extent cx="7919720" cy="3740150"/>
             <wp:effectExtent l="0" t="0" r="0" b="0"/>
             <wp:docPr id="16" name="Imagem 511" descr="Apêndice A.7 — Diagrama de Componentes"/>
             <wp:cNvGraphicFramePr>
@@ -32701,7 +32401,7 @@
                     </pic:cNvPicPr>
                   </pic:nvPicPr>
                   <pic:blipFill>
-                    <a:blip r:embed="rId58"/>
+                    <a:blip r:embed="rId38"/>
                     <a:stretch>
                       <a:fillRect/>
                     </a:stretch>
@@ -32709,7 +32409,7 @@
                   <pic:spPr bwMode="auto">
                     <a:xfrm>
                       <a:off x="0" y="0"/>
-                      <a:ext cx="9610090" cy="4538345"/>
+                      <a:ext cx="7919720" cy="3740150"/>
                     </a:xfrm>
                     <a:prstGeom prst="rect">
                       <a:avLst/>
@@ -32724,12 +32424,31 @@
     </w:p>
     <w:p>
       <w:pPr>
+        <w:pStyle w:val="Normal"/>
+        <w:keepNext w:val="true"/>
+        <w:spacing w:lineRule="auto" w:line="240" w:before="240" w:after="60"/>
+        <w:jc w:val="left"/>
+        <w:rPr/>
+      </w:pPr>
+      <w:r>
+        <w:rPr>
+          <w:rFonts w:eastAsia="Arial" w:cs="Arial"/>
+          <w:b/>
+          <w:bCs/>
+          <w:sz w:val="22"/>
+          <w:szCs w:val="22"/>
+        </w:rPr>
+        <w:t>Apêndice A.7 — Diagrama de Componentes</w:t>
+      </w:r>
+    </w:p>
+    <w:p>
+      <w:pPr>
         <w:sectPr>
-          <w:headerReference w:type="default" r:id="rId59"/>
-          <w:headerReference w:type="first" r:id="rId60"/>
+          <w:headerReference w:type="default" r:id="rId39"/>
+          <w:headerReference w:type="first" r:id="rId40"/>
           <w:type w:val="nextPage"/>
           <w:pgSz w:orient="landscape" w:w="16838" w:h="11906"/>
-          <w:pgMar w:left="851" w:right="851" w:gutter="0" w:header="454" w:top="851" w:footer="0" w:bottom="851"/>
+          <w:pgMar w:left="1701" w:right="1134" w:gutter="0" w:header="1134" w:top="1701" w:footer="0" w:bottom="1134"/>
           <w:pgNumType w:fmt="decimal"/>
           <w:formProt w:val="false"/>
           <w:vAlign w:val="center"/>
@@ -32737,64 +32456,15 @@
           <w:docGrid w:type="default" w:linePitch="360" w:charSpace="0"/>
         </w:sectPr>
         <w:pStyle w:val="Normal"/>
-        <w:spacing w:lineRule="auto" w:line="240" w:before="120" w:after="0"/>
-        <w:jc w:val="center"/>
+        <w:spacing w:lineRule="auto" w:line="240" w:before="0" w:after="0"/>
+        <w:jc w:val="both"/>
         <w:rPr/>
       </w:pPr>
       <w:r>
         <w:rPr>
           <w:rFonts w:eastAsia="Arial" w:cs="Arial"/>
-          <w:b/>
-          <w:bCs/>
-          <w:sz w:val="22"/>
-          <w:szCs w:val="22"/>
-        </w:rPr>
-        <w:t>Apêndice A.7 — Diagrama de Componentes</w:t>
-      </w:r>
-    </w:p>
-    <w:p>
-      <w:pPr>
-        <w:pStyle w:val="Normal"/>
-        <w:keepNext w:val="true"/>
-        <w:spacing w:lineRule="auto" w:line="360" w:before="0" w:after="240"/>
-        <w:jc w:val="left"/>
-        <w:rPr/>
-      </w:pPr>
-      <w:r>
-        <w:rPr>
-          <w:rFonts w:eastAsia="Arial" w:cs="Arial"/>
-          <w:b/>
-          <w:bCs/>
-          <w:sz w:val="24"/>
-          <w:szCs w:val="24"/>
-        </w:rPr>
-        <w:t>Apêndice A.7 — Diagrama de Componentes</w:t>
-      </w:r>
-    </w:p>
-    <w:p>
-      <w:pPr>
-        <w:sectPr>
-          <w:headerReference w:type="default" r:id="rId61"/>
-          <w:headerReference w:type="first" r:id="rId62"/>
-          <w:type w:val="nextPage"/>
-          <w:pgSz w:w="11906" w:h="16838"/>
-          <w:pgMar w:left="1701" w:right="1134" w:gutter="0" w:header="1134" w:top="1701" w:footer="0" w:bottom="1134"/>
-          <w:pgNumType w:fmt="decimal"/>
-          <w:formProt w:val="false"/>
-          <w:textDirection w:val="lrTb"/>
-          <w:docGrid w:type="default" w:linePitch="360" w:charSpace="0"/>
-        </w:sectPr>
-        <w:pStyle w:val="Normal"/>
-        <w:spacing w:lineRule="auto" w:line="360" w:before="0" w:after="120"/>
-        <w:ind w:firstLine="709"/>
-        <w:jc w:val="both"/>
-        <w:rPr/>
-      </w:pPr>
-      <w:r>
-        <w:rPr>
-          <w:rFonts w:eastAsia="Arial" w:cs="Arial"/>
-          <w:sz w:val="24"/>
-          <w:szCs w:val="24"/>
+          <w:sz w:val="20"/>
+          <w:szCs w:val="20"/>
         </w:rPr>
         <w:t>Arquitetura do monólito em camadas. Toda requisição da interface passa pelo filtro de segurança antes de alcançar os módulos de domínio. As dependências tracejadas para o módulo de IA são opcionais (RN-10), e a chave do serviço de linguagem permanece restrita ao servidor (RNF-03).</w:t>
       </w:r>
@@ -32810,7 +32480,7 @@
         <w:jc w:val="center"/>
         <w:rPr/>
       </w:pPr>
-      <w:bookmarkStart w:id="72" w:name="__RefHeading___Toc3350_1125974958"/>
+      <w:bookmarkStart w:id="72" w:name="__RefHeading___Toc3185_634922549"/>
       <w:bookmarkEnd w:id="72"/>
       <w:r>
         <w:rPr>
@@ -34319,7 +33989,7 @@
       <w:r>
         <w:br w:type="page"/>
       </w:r>
-      <w:bookmarkStart w:id="73" w:name="__RefHeading___Toc3352_1125974958"/>
+      <w:bookmarkStart w:id="73" w:name="__RefHeading___Toc3187_634922549"/>
       <w:bookmarkEnd w:id="73"/>
       <w:r>
         <w:rPr>
@@ -35257,8 +34927,8 @@
       </w:tr>
     </w:tbl>
     <w:sectPr>
-      <w:headerReference w:type="default" r:id="rId63"/>
-      <w:headerReference w:type="first" r:id="rId64"/>
+      <w:headerReference w:type="default" r:id="rId41"/>
+      <w:headerReference w:type="first" r:id="rId42"/>
       <w:type w:val="nextPage"/>
       <w:pgSz w:w="11906" w:h="16838"/>
       <w:pgMar w:left="1701" w:right="1134" w:gutter="0" w:header="1134" w:top="1701" w:footer="0" w:bottom="1134"/>
@@ -35623,7 +35293,7 @@
     </w:r>
     <w:r>
       <w:rPr/>
-      <w:t>64</w:t>
+      <w:t>65</w:t>
     </w:r>
     <w:r>
       <w:rPr/>
@@ -35639,273 +35309,7 @@
 </w:hdr>
 </file>
 
-<file path=word/header26.xml><?xml version="1.0" encoding="utf-8"?>
-<w:hdr xmlns:o="urn:schemas-microsoft-com:office:office" xmlns:r="http://schemas.openxmlformats.org/officeDocument/2006/relationships" xmlns:v="urn:schemas-microsoft-com:vml" xmlns:w="http://schemas.openxmlformats.org/wordprocessingml/2006/main" xmlns:w10="urn:schemas-microsoft-com:office:word" xmlns:wp="http://schemas.openxmlformats.org/drawingml/2006/wordprocessingDrawing" xmlns:wps="http://schemas.microsoft.com/office/word/2010/wordprocessingShape" xmlns:wpg="http://schemas.microsoft.com/office/word/2010/wordprocessingGroup" xmlns:mc="http://schemas.openxmlformats.org/markup-compatibility/2006" xmlns:wp14="http://schemas.microsoft.com/office/word/2010/wordprocessingDrawing" xmlns:w14="http://schemas.microsoft.com/office/word/2010/wordml" xmlns:w15="http://schemas.microsoft.com/office/word/2012/wordml" mc:Ignorable="w14 wp14 w15">
-  <w:p>
-    <w:pPr>
-      <w:pStyle w:val="Normal"/>
-      <w:jc w:val="right"/>
-      <w:rPr/>
-    </w:pPr>
-    <w:r>
-      <w:rPr/>
-      <w:fldChar w:fldCharType="begin"/>
-    </w:r>
-    <w:r>
-      <w:rPr/>
-      <w:instrText xml:space="preserve"> PAGE </w:instrText>
-    </w:r>
-    <w:r>
-      <w:rPr/>
-      <w:fldChar w:fldCharType="separate"/>
-    </w:r>
-    <w:r>
-      <w:rPr/>
-      <w:t>65</w:t>
-    </w:r>
-    <w:r>
-      <w:rPr/>
-      <w:fldChar w:fldCharType="end"/>
-    </w:r>
-  </w:p>
-</w:hdr>
-</file>
-
-<file path=word/header27.xml><?xml version="1.0" encoding="utf-8"?>
-<w:hdr xmlns:o="urn:schemas-microsoft-com:office:office" xmlns:r="http://schemas.openxmlformats.org/officeDocument/2006/relationships" xmlns:v="urn:schemas-microsoft-com:vml" xmlns:w="http://schemas.openxmlformats.org/wordprocessingml/2006/main" xmlns:w10="urn:schemas-microsoft-com:office:word" xmlns:wp="http://schemas.openxmlformats.org/drawingml/2006/wordprocessingDrawing" xmlns:wps="http://schemas.microsoft.com/office/word/2010/wordprocessingShape" xmlns:wpg="http://schemas.microsoft.com/office/word/2010/wordprocessingGroup" xmlns:mc="http://schemas.openxmlformats.org/markup-compatibility/2006" xmlns:wp14="http://schemas.microsoft.com/office/word/2010/wordprocessingDrawing" xmlns:w14="http://schemas.microsoft.com/office/word/2010/wordml" xmlns:w15="http://schemas.microsoft.com/office/word/2012/wordml" mc:Ignorable="w14 wp14 w15">
-  <w:p/>
-</w:hdr>
-</file>
-
-<file path=word/header28.xml><?xml version="1.0" encoding="utf-8"?>
-<w:hdr xmlns:o="urn:schemas-microsoft-com:office:office" xmlns:r="http://schemas.openxmlformats.org/officeDocument/2006/relationships" xmlns:v="urn:schemas-microsoft-com:vml" xmlns:w="http://schemas.openxmlformats.org/wordprocessingml/2006/main" xmlns:w10="urn:schemas-microsoft-com:office:word" xmlns:wp="http://schemas.openxmlformats.org/drawingml/2006/wordprocessingDrawing" xmlns:wps="http://schemas.microsoft.com/office/word/2010/wordprocessingShape" xmlns:wpg="http://schemas.microsoft.com/office/word/2010/wordprocessingGroup" xmlns:mc="http://schemas.openxmlformats.org/markup-compatibility/2006" xmlns:wp14="http://schemas.microsoft.com/office/word/2010/wordprocessingDrawing" xmlns:w14="http://schemas.microsoft.com/office/word/2010/wordml" xmlns:w15="http://schemas.microsoft.com/office/word/2012/wordml" mc:Ignorable="w14 wp14 w15">
-  <w:p>
-    <w:pPr>
-      <w:pStyle w:val="Normal"/>
-      <w:jc w:val="right"/>
-      <w:rPr/>
-    </w:pPr>
-    <w:r>
-      <w:rPr/>
-      <w:fldChar w:fldCharType="begin"/>
-    </w:r>
-    <w:r>
-      <w:rPr/>
-      <w:instrText xml:space="preserve"> PAGE </w:instrText>
-    </w:r>
-    <w:r>
-      <w:rPr/>
-      <w:fldChar w:fldCharType="separate"/>
-    </w:r>
-    <w:r>
-      <w:rPr/>
-      <w:t>66</w:t>
-    </w:r>
-    <w:r>
-      <w:rPr/>
-      <w:fldChar w:fldCharType="end"/>
-    </w:r>
-  </w:p>
-</w:hdr>
-</file>
-
-<file path=word/header29.xml><?xml version="1.0" encoding="utf-8"?>
-<w:hdr xmlns:o="urn:schemas-microsoft-com:office:office" xmlns:r="http://schemas.openxmlformats.org/officeDocument/2006/relationships" xmlns:v="urn:schemas-microsoft-com:vml" xmlns:w="http://schemas.openxmlformats.org/wordprocessingml/2006/main" xmlns:w10="urn:schemas-microsoft-com:office:word" xmlns:wp="http://schemas.openxmlformats.org/drawingml/2006/wordprocessingDrawing" xmlns:wps="http://schemas.microsoft.com/office/word/2010/wordprocessingShape" xmlns:wpg="http://schemas.microsoft.com/office/word/2010/wordprocessingGroup" xmlns:mc="http://schemas.openxmlformats.org/markup-compatibility/2006" xmlns:wp14="http://schemas.microsoft.com/office/word/2010/wordprocessingDrawing" xmlns:w14="http://schemas.microsoft.com/office/word/2010/wordml" xmlns:w15="http://schemas.microsoft.com/office/word/2012/wordml" mc:Ignorable="w14 wp14 w15">
-  <w:p/>
-</w:hdr>
-</file>
-
 <file path=word/header3.xml><?xml version="1.0" encoding="utf-8"?>
-<w:hdr xmlns:o="urn:schemas-microsoft-com:office:office" xmlns:r="http://schemas.openxmlformats.org/officeDocument/2006/relationships" xmlns:v="urn:schemas-microsoft-com:vml" xmlns:w="http://schemas.openxmlformats.org/wordprocessingml/2006/main" xmlns:w10="urn:schemas-microsoft-com:office:word" xmlns:wp="http://schemas.openxmlformats.org/drawingml/2006/wordprocessingDrawing" xmlns:wps="http://schemas.microsoft.com/office/word/2010/wordprocessingShape" xmlns:wpg="http://schemas.microsoft.com/office/word/2010/wordprocessingGroup" xmlns:mc="http://schemas.openxmlformats.org/markup-compatibility/2006" xmlns:wp14="http://schemas.microsoft.com/office/word/2010/wordprocessingDrawing" xmlns:w14="http://schemas.microsoft.com/office/word/2010/wordml" xmlns:w15="http://schemas.microsoft.com/office/word/2012/wordml" mc:Ignorable="w14 wp14 w15">
-  <w:p/>
-</w:hdr>
-</file>
-
-<file path=word/header30.xml><?xml version="1.0" encoding="utf-8"?>
-<w:hdr xmlns:o="urn:schemas-microsoft-com:office:office" xmlns:r="http://schemas.openxmlformats.org/officeDocument/2006/relationships" xmlns:v="urn:schemas-microsoft-com:vml" xmlns:w="http://schemas.openxmlformats.org/wordprocessingml/2006/main" xmlns:w10="urn:schemas-microsoft-com:office:word" xmlns:wp="http://schemas.openxmlformats.org/drawingml/2006/wordprocessingDrawing" xmlns:wps="http://schemas.microsoft.com/office/word/2010/wordprocessingShape" xmlns:wpg="http://schemas.microsoft.com/office/word/2010/wordprocessingGroup" xmlns:mc="http://schemas.openxmlformats.org/markup-compatibility/2006" xmlns:wp14="http://schemas.microsoft.com/office/word/2010/wordprocessingDrawing" xmlns:w14="http://schemas.microsoft.com/office/word/2010/wordml" xmlns:w15="http://schemas.microsoft.com/office/word/2012/wordml" mc:Ignorable="w14 wp14 w15">
-  <w:p>
-    <w:pPr>
-      <w:pStyle w:val="Normal"/>
-      <w:jc w:val="right"/>
-      <w:rPr/>
-    </w:pPr>
-    <w:r>
-      <w:rPr/>
-      <w:fldChar w:fldCharType="begin"/>
-    </w:r>
-    <w:r>
-      <w:rPr/>
-      <w:instrText xml:space="preserve"> PAGE </w:instrText>
-    </w:r>
-    <w:r>
-      <w:rPr/>
-      <w:fldChar w:fldCharType="separate"/>
-    </w:r>
-    <w:r>
-      <w:rPr/>
-      <w:t>67</w:t>
-    </w:r>
-    <w:r>
-      <w:rPr/>
-      <w:fldChar w:fldCharType="end"/>
-    </w:r>
-  </w:p>
-</w:hdr>
-</file>
-
-<file path=word/header31.xml><?xml version="1.0" encoding="utf-8"?>
-<w:hdr xmlns:o="urn:schemas-microsoft-com:office:office" xmlns:r="http://schemas.openxmlformats.org/officeDocument/2006/relationships" xmlns:v="urn:schemas-microsoft-com:vml" xmlns:w="http://schemas.openxmlformats.org/wordprocessingml/2006/main" xmlns:w10="urn:schemas-microsoft-com:office:word" xmlns:wp="http://schemas.openxmlformats.org/drawingml/2006/wordprocessingDrawing" xmlns:wps="http://schemas.microsoft.com/office/word/2010/wordprocessingShape" xmlns:wpg="http://schemas.microsoft.com/office/word/2010/wordprocessingGroup" xmlns:mc="http://schemas.openxmlformats.org/markup-compatibility/2006" xmlns:wp14="http://schemas.microsoft.com/office/word/2010/wordprocessingDrawing" xmlns:w14="http://schemas.microsoft.com/office/word/2010/wordml" xmlns:w15="http://schemas.microsoft.com/office/word/2012/wordml" mc:Ignorable="w14 wp14 w15">
-  <w:p/>
-</w:hdr>
-</file>
-
-<file path=word/header32.xml><?xml version="1.0" encoding="utf-8"?>
-<w:hdr xmlns:o="urn:schemas-microsoft-com:office:office" xmlns:r="http://schemas.openxmlformats.org/officeDocument/2006/relationships" xmlns:v="urn:schemas-microsoft-com:vml" xmlns:w="http://schemas.openxmlformats.org/wordprocessingml/2006/main" xmlns:w10="urn:schemas-microsoft-com:office:word" xmlns:wp="http://schemas.openxmlformats.org/drawingml/2006/wordprocessingDrawing" xmlns:wps="http://schemas.microsoft.com/office/word/2010/wordprocessingShape" xmlns:wpg="http://schemas.microsoft.com/office/word/2010/wordprocessingGroup" xmlns:mc="http://schemas.openxmlformats.org/markup-compatibility/2006" xmlns:wp14="http://schemas.microsoft.com/office/word/2010/wordprocessingDrawing" xmlns:w14="http://schemas.microsoft.com/office/word/2010/wordml" xmlns:w15="http://schemas.microsoft.com/office/word/2012/wordml" mc:Ignorable="w14 wp14 w15">
-  <w:p>
-    <w:pPr>
-      <w:pStyle w:val="Normal"/>
-      <w:jc w:val="right"/>
-      <w:rPr/>
-    </w:pPr>
-    <w:r>
-      <w:rPr/>
-      <w:fldChar w:fldCharType="begin"/>
-    </w:r>
-    <w:r>
-      <w:rPr/>
-      <w:instrText xml:space="preserve"> PAGE </w:instrText>
-    </w:r>
-    <w:r>
-      <w:rPr/>
-      <w:fldChar w:fldCharType="separate"/>
-    </w:r>
-    <w:r>
-      <w:rPr/>
-      <w:t>68</w:t>
-    </w:r>
-    <w:r>
-      <w:rPr/>
-      <w:fldChar w:fldCharType="end"/>
-    </w:r>
-  </w:p>
-</w:hdr>
-</file>
-
-<file path=word/header33.xml><?xml version="1.0" encoding="utf-8"?>
-<w:hdr xmlns:o="urn:schemas-microsoft-com:office:office" xmlns:r="http://schemas.openxmlformats.org/officeDocument/2006/relationships" xmlns:v="urn:schemas-microsoft-com:vml" xmlns:w="http://schemas.openxmlformats.org/wordprocessingml/2006/main" xmlns:w10="urn:schemas-microsoft-com:office:word" xmlns:wp="http://schemas.openxmlformats.org/drawingml/2006/wordprocessingDrawing" xmlns:wps="http://schemas.microsoft.com/office/word/2010/wordprocessingShape" xmlns:wpg="http://schemas.microsoft.com/office/word/2010/wordprocessingGroup" xmlns:mc="http://schemas.openxmlformats.org/markup-compatibility/2006" xmlns:wp14="http://schemas.microsoft.com/office/word/2010/wordprocessingDrawing" xmlns:w14="http://schemas.microsoft.com/office/word/2010/wordml" xmlns:w15="http://schemas.microsoft.com/office/word/2012/wordml" mc:Ignorable="w14 wp14 w15">
-  <w:p/>
-</w:hdr>
-</file>
-
-<file path=word/header34.xml><?xml version="1.0" encoding="utf-8"?>
-<w:hdr xmlns:o="urn:schemas-microsoft-com:office:office" xmlns:r="http://schemas.openxmlformats.org/officeDocument/2006/relationships" xmlns:v="urn:schemas-microsoft-com:vml" xmlns:w="http://schemas.openxmlformats.org/wordprocessingml/2006/main" xmlns:w10="urn:schemas-microsoft-com:office:word" xmlns:wp="http://schemas.openxmlformats.org/drawingml/2006/wordprocessingDrawing" xmlns:wps="http://schemas.microsoft.com/office/word/2010/wordprocessingShape" xmlns:wpg="http://schemas.microsoft.com/office/word/2010/wordprocessingGroup" xmlns:mc="http://schemas.openxmlformats.org/markup-compatibility/2006" xmlns:wp14="http://schemas.microsoft.com/office/word/2010/wordprocessingDrawing" xmlns:w14="http://schemas.microsoft.com/office/word/2010/wordml" xmlns:w15="http://schemas.microsoft.com/office/word/2012/wordml" mc:Ignorable="w14 wp14 w15">
-  <w:p>
-    <w:pPr>
-      <w:pStyle w:val="Normal"/>
-      <w:jc w:val="right"/>
-      <w:rPr/>
-    </w:pPr>
-    <w:r>
-      <w:rPr/>
-      <w:fldChar w:fldCharType="begin"/>
-    </w:r>
-    <w:r>
-      <w:rPr/>
-      <w:instrText xml:space="preserve"> PAGE </w:instrText>
-    </w:r>
-    <w:r>
-      <w:rPr/>
-      <w:fldChar w:fldCharType="separate"/>
-    </w:r>
-    <w:r>
-      <w:rPr/>
-      <w:t>69</w:t>
-    </w:r>
-    <w:r>
-      <w:rPr/>
-      <w:fldChar w:fldCharType="end"/>
-    </w:r>
-  </w:p>
-</w:hdr>
-</file>
-
-<file path=word/header35.xml><?xml version="1.0" encoding="utf-8"?>
-<w:hdr xmlns:o="urn:schemas-microsoft-com:office:office" xmlns:r="http://schemas.openxmlformats.org/officeDocument/2006/relationships" xmlns:v="urn:schemas-microsoft-com:vml" xmlns:w="http://schemas.openxmlformats.org/wordprocessingml/2006/main" xmlns:w10="urn:schemas-microsoft-com:office:word" xmlns:wp="http://schemas.openxmlformats.org/drawingml/2006/wordprocessingDrawing" xmlns:wps="http://schemas.microsoft.com/office/word/2010/wordprocessingShape" xmlns:wpg="http://schemas.microsoft.com/office/word/2010/wordprocessingGroup" xmlns:mc="http://schemas.openxmlformats.org/markup-compatibility/2006" xmlns:wp14="http://schemas.microsoft.com/office/word/2010/wordprocessingDrawing" xmlns:w14="http://schemas.microsoft.com/office/word/2010/wordml" xmlns:w15="http://schemas.microsoft.com/office/word/2012/wordml" mc:Ignorable="w14 wp14 w15">
-  <w:p/>
-</w:hdr>
-</file>
-
-<file path=word/header36.xml><?xml version="1.0" encoding="utf-8"?>
-<w:hdr xmlns:o="urn:schemas-microsoft-com:office:office" xmlns:r="http://schemas.openxmlformats.org/officeDocument/2006/relationships" xmlns:v="urn:schemas-microsoft-com:vml" xmlns:w="http://schemas.openxmlformats.org/wordprocessingml/2006/main" xmlns:w10="urn:schemas-microsoft-com:office:word" xmlns:wp="http://schemas.openxmlformats.org/drawingml/2006/wordprocessingDrawing" xmlns:wps="http://schemas.microsoft.com/office/word/2010/wordprocessingShape" xmlns:wpg="http://schemas.microsoft.com/office/word/2010/wordprocessingGroup" xmlns:mc="http://schemas.openxmlformats.org/markup-compatibility/2006" xmlns:wp14="http://schemas.microsoft.com/office/word/2010/wordprocessingDrawing" xmlns:w14="http://schemas.microsoft.com/office/word/2010/wordml" xmlns:w15="http://schemas.microsoft.com/office/word/2012/wordml" mc:Ignorable="w14 wp14 w15">
-  <w:p>
-    <w:pPr>
-      <w:pStyle w:val="Normal"/>
-      <w:jc w:val="right"/>
-      <w:rPr/>
-    </w:pPr>
-    <w:r>
-      <w:rPr/>
-      <w:fldChar w:fldCharType="begin"/>
-    </w:r>
-    <w:r>
-      <w:rPr/>
-      <w:instrText xml:space="preserve"> PAGE </w:instrText>
-    </w:r>
-    <w:r>
-      <w:rPr/>
-      <w:fldChar w:fldCharType="separate"/>
-    </w:r>
-    <w:r>
-      <w:rPr/>
-      <w:t>70</w:t>
-    </w:r>
-    <w:r>
-      <w:rPr/>
-      <w:fldChar w:fldCharType="end"/>
-    </w:r>
-  </w:p>
-</w:hdr>
-</file>
-
-<file path=word/header37.xml><?xml version="1.0" encoding="utf-8"?>
-<w:hdr xmlns:o="urn:schemas-microsoft-com:office:office" xmlns:r="http://schemas.openxmlformats.org/officeDocument/2006/relationships" xmlns:v="urn:schemas-microsoft-com:vml" xmlns:w="http://schemas.openxmlformats.org/wordprocessingml/2006/main" xmlns:w10="urn:schemas-microsoft-com:office:word" xmlns:wp="http://schemas.openxmlformats.org/drawingml/2006/wordprocessingDrawing" xmlns:wps="http://schemas.microsoft.com/office/word/2010/wordprocessingShape" xmlns:wpg="http://schemas.microsoft.com/office/word/2010/wordprocessingGroup" xmlns:mc="http://schemas.openxmlformats.org/markup-compatibility/2006" xmlns:wp14="http://schemas.microsoft.com/office/word/2010/wordprocessingDrawing" xmlns:w14="http://schemas.microsoft.com/office/word/2010/wordml" xmlns:w15="http://schemas.microsoft.com/office/word/2012/wordml" mc:Ignorable="w14 wp14 w15">
-  <w:p/>
-</w:hdr>
-</file>
-
-<file path=word/header38.xml><?xml version="1.0" encoding="utf-8"?>
-<w:hdr xmlns:o="urn:schemas-microsoft-com:office:office" xmlns:r="http://schemas.openxmlformats.org/officeDocument/2006/relationships" xmlns:v="urn:schemas-microsoft-com:vml" xmlns:w="http://schemas.openxmlformats.org/wordprocessingml/2006/main" xmlns:w10="urn:schemas-microsoft-com:office:word" xmlns:wp="http://schemas.openxmlformats.org/drawingml/2006/wordprocessingDrawing" xmlns:wps="http://schemas.microsoft.com/office/word/2010/wordprocessingShape" xmlns:wpg="http://schemas.microsoft.com/office/word/2010/wordprocessingGroup" xmlns:mc="http://schemas.openxmlformats.org/markup-compatibility/2006" xmlns:wp14="http://schemas.microsoft.com/office/word/2010/wordprocessingDrawing" xmlns:w14="http://schemas.microsoft.com/office/word/2010/wordml" xmlns:w15="http://schemas.microsoft.com/office/word/2012/wordml" mc:Ignorable="w14 wp14 w15">
-  <w:p>
-    <w:pPr>
-      <w:pStyle w:val="Normal"/>
-      <w:jc w:val="right"/>
-      <w:rPr/>
-    </w:pPr>
-    <w:r>
-      <w:rPr/>
-      <w:fldChar w:fldCharType="begin"/>
-    </w:r>
-    <w:r>
-      <w:rPr/>
-      <w:instrText xml:space="preserve"> PAGE </w:instrText>
-    </w:r>
-    <w:r>
-      <w:rPr/>
-      <w:fldChar w:fldCharType="separate"/>
-    </w:r>
-    <w:r>
-      <w:rPr/>
-      <w:t>71</w:t>
-    </w:r>
-    <w:r>
-      <w:rPr/>
-      <w:fldChar w:fldCharType="end"/>
-    </w:r>
-  </w:p>
-</w:hdr>
-</file>
-
-<file path=word/header39.xml><?xml version="1.0" encoding="utf-8"?>
 <w:hdr xmlns:o="urn:schemas-microsoft-com:office:office" xmlns:r="http://schemas.openxmlformats.org/officeDocument/2006/relationships" xmlns:v="urn:schemas-microsoft-com:vml" xmlns:w="http://schemas.openxmlformats.org/wordprocessingml/2006/main" xmlns:w10="urn:schemas-microsoft-com:office:word" xmlns:wp="http://schemas.openxmlformats.org/drawingml/2006/wordprocessingDrawing" xmlns:wps="http://schemas.microsoft.com/office/word/2010/wordprocessingShape" xmlns:wpg="http://schemas.microsoft.com/office/word/2010/wordprocessingGroup" xmlns:mc="http://schemas.openxmlformats.org/markup-compatibility/2006" xmlns:wp14="http://schemas.microsoft.com/office/word/2010/wordprocessingDrawing" xmlns:w14="http://schemas.microsoft.com/office/word/2010/wordml" xmlns:w15="http://schemas.microsoft.com/office/word/2012/wordml" mc:Ignorable="w14 wp14 w15">
   <w:p/>
 </w:hdr>
@@ -35940,158 +35344,6 @@
       <w:fldChar w:fldCharType="end"/>
     </w:r>
   </w:p>
-</w:hdr>
-</file>
-
-<file path=word/header40.xml><?xml version="1.0" encoding="utf-8"?>
-<w:hdr xmlns:o="urn:schemas-microsoft-com:office:office" xmlns:r="http://schemas.openxmlformats.org/officeDocument/2006/relationships" xmlns:v="urn:schemas-microsoft-com:vml" xmlns:w="http://schemas.openxmlformats.org/wordprocessingml/2006/main" xmlns:w10="urn:schemas-microsoft-com:office:word" xmlns:wp="http://schemas.openxmlformats.org/drawingml/2006/wordprocessingDrawing" xmlns:wps="http://schemas.microsoft.com/office/word/2010/wordprocessingShape" xmlns:wpg="http://schemas.microsoft.com/office/word/2010/wordprocessingGroup" xmlns:mc="http://schemas.openxmlformats.org/markup-compatibility/2006" xmlns:wp14="http://schemas.microsoft.com/office/word/2010/wordprocessingDrawing" xmlns:w14="http://schemas.microsoft.com/office/word/2010/wordml" xmlns:w15="http://schemas.microsoft.com/office/word/2012/wordml" mc:Ignorable="w14 wp14 w15">
-  <w:p>
-    <w:pPr>
-      <w:pStyle w:val="Normal"/>
-      <w:jc w:val="right"/>
-      <w:rPr/>
-    </w:pPr>
-    <w:r>
-      <w:rPr/>
-      <w:fldChar w:fldCharType="begin"/>
-    </w:r>
-    <w:r>
-      <w:rPr/>
-      <w:instrText xml:space="preserve"> PAGE </w:instrText>
-    </w:r>
-    <w:r>
-      <w:rPr/>
-      <w:fldChar w:fldCharType="separate"/>
-    </w:r>
-    <w:r>
-      <w:rPr/>
-      <w:t>72</w:t>
-    </w:r>
-    <w:r>
-      <w:rPr/>
-      <w:fldChar w:fldCharType="end"/>
-    </w:r>
-  </w:p>
-</w:hdr>
-</file>
-
-<file path=word/header41.xml><?xml version="1.0" encoding="utf-8"?>
-<w:hdr xmlns:o="urn:schemas-microsoft-com:office:office" xmlns:r="http://schemas.openxmlformats.org/officeDocument/2006/relationships" xmlns:v="urn:schemas-microsoft-com:vml" xmlns:w="http://schemas.openxmlformats.org/wordprocessingml/2006/main" xmlns:w10="urn:schemas-microsoft-com:office:word" xmlns:wp="http://schemas.openxmlformats.org/drawingml/2006/wordprocessingDrawing" xmlns:wps="http://schemas.microsoft.com/office/word/2010/wordprocessingShape" xmlns:wpg="http://schemas.microsoft.com/office/word/2010/wordprocessingGroup" xmlns:mc="http://schemas.openxmlformats.org/markup-compatibility/2006" xmlns:wp14="http://schemas.microsoft.com/office/word/2010/wordprocessingDrawing" xmlns:w14="http://schemas.microsoft.com/office/word/2010/wordml" xmlns:w15="http://schemas.microsoft.com/office/word/2012/wordml" mc:Ignorable="w14 wp14 w15">
-  <w:p/>
-</w:hdr>
-</file>
-
-<file path=word/header42.xml><?xml version="1.0" encoding="utf-8"?>
-<w:hdr xmlns:o="urn:schemas-microsoft-com:office:office" xmlns:r="http://schemas.openxmlformats.org/officeDocument/2006/relationships" xmlns:v="urn:schemas-microsoft-com:vml" xmlns:w="http://schemas.openxmlformats.org/wordprocessingml/2006/main" xmlns:w10="urn:schemas-microsoft-com:office:word" xmlns:wp="http://schemas.openxmlformats.org/drawingml/2006/wordprocessingDrawing" xmlns:wps="http://schemas.microsoft.com/office/word/2010/wordprocessingShape" xmlns:wpg="http://schemas.microsoft.com/office/word/2010/wordprocessingGroup" xmlns:mc="http://schemas.openxmlformats.org/markup-compatibility/2006" xmlns:wp14="http://schemas.microsoft.com/office/word/2010/wordprocessingDrawing" xmlns:w14="http://schemas.microsoft.com/office/word/2010/wordml" xmlns:w15="http://schemas.microsoft.com/office/word/2012/wordml" mc:Ignorable="w14 wp14 w15">
-  <w:p>
-    <w:pPr>
-      <w:pStyle w:val="Normal"/>
-      <w:jc w:val="right"/>
-      <w:rPr/>
-    </w:pPr>
-    <w:r>
-      <w:rPr/>
-      <w:fldChar w:fldCharType="begin"/>
-    </w:r>
-    <w:r>
-      <w:rPr/>
-      <w:instrText xml:space="preserve"> PAGE </w:instrText>
-    </w:r>
-    <w:r>
-      <w:rPr/>
-      <w:fldChar w:fldCharType="separate"/>
-    </w:r>
-    <w:r>
-      <w:rPr/>
-      <w:t>73</w:t>
-    </w:r>
-    <w:r>
-      <w:rPr/>
-      <w:fldChar w:fldCharType="end"/>
-    </w:r>
-  </w:p>
-</w:hdr>
-</file>
-
-<file path=word/header43.xml><?xml version="1.0" encoding="utf-8"?>
-<w:hdr xmlns:o="urn:schemas-microsoft-com:office:office" xmlns:r="http://schemas.openxmlformats.org/officeDocument/2006/relationships" xmlns:v="urn:schemas-microsoft-com:vml" xmlns:w="http://schemas.openxmlformats.org/wordprocessingml/2006/main" xmlns:w10="urn:schemas-microsoft-com:office:word" xmlns:wp="http://schemas.openxmlformats.org/drawingml/2006/wordprocessingDrawing" xmlns:wps="http://schemas.microsoft.com/office/word/2010/wordprocessingShape" xmlns:wpg="http://schemas.microsoft.com/office/word/2010/wordprocessingGroup" xmlns:mc="http://schemas.openxmlformats.org/markup-compatibility/2006" xmlns:wp14="http://schemas.microsoft.com/office/word/2010/wordprocessingDrawing" xmlns:w14="http://schemas.microsoft.com/office/word/2010/wordml" xmlns:w15="http://schemas.microsoft.com/office/word/2012/wordml" mc:Ignorable="w14 wp14 w15">
-  <w:p/>
-</w:hdr>
-</file>
-
-<file path=word/header44.xml><?xml version="1.0" encoding="utf-8"?>
-<w:hdr xmlns:o="urn:schemas-microsoft-com:office:office" xmlns:r="http://schemas.openxmlformats.org/officeDocument/2006/relationships" xmlns:v="urn:schemas-microsoft-com:vml" xmlns:w="http://schemas.openxmlformats.org/wordprocessingml/2006/main" xmlns:w10="urn:schemas-microsoft-com:office:word" xmlns:wp="http://schemas.openxmlformats.org/drawingml/2006/wordprocessingDrawing" xmlns:wps="http://schemas.microsoft.com/office/word/2010/wordprocessingShape" xmlns:wpg="http://schemas.microsoft.com/office/word/2010/wordprocessingGroup" xmlns:mc="http://schemas.openxmlformats.org/markup-compatibility/2006" xmlns:wp14="http://schemas.microsoft.com/office/word/2010/wordprocessingDrawing" xmlns:w14="http://schemas.microsoft.com/office/word/2010/wordml" xmlns:w15="http://schemas.microsoft.com/office/word/2012/wordml" mc:Ignorable="w14 wp14 w15">
-  <w:p>
-    <w:pPr>
-      <w:pStyle w:val="Normal"/>
-      <w:jc w:val="right"/>
-      <w:rPr/>
-    </w:pPr>
-    <w:r>
-      <w:rPr/>
-      <w:fldChar w:fldCharType="begin"/>
-    </w:r>
-    <w:r>
-      <w:rPr/>
-      <w:instrText xml:space="preserve"> PAGE </w:instrText>
-    </w:r>
-    <w:r>
-      <w:rPr/>
-      <w:fldChar w:fldCharType="separate"/>
-    </w:r>
-    <w:r>
-      <w:rPr/>
-      <w:t>74</w:t>
-    </w:r>
-    <w:r>
-      <w:rPr/>
-      <w:fldChar w:fldCharType="end"/>
-    </w:r>
-  </w:p>
-</w:hdr>
-</file>
-
-<file path=word/header45.xml><?xml version="1.0" encoding="utf-8"?>
-<w:hdr xmlns:o="urn:schemas-microsoft-com:office:office" xmlns:r="http://schemas.openxmlformats.org/officeDocument/2006/relationships" xmlns:v="urn:schemas-microsoft-com:vml" xmlns:w="http://schemas.openxmlformats.org/wordprocessingml/2006/main" xmlns:w10="urn:schemas-microsoft-com:office:word" xmlns:wp="http://schemas.openxmlformats.org/drawingml/2006/wordprocessingDrawing" xmlns:wps="http://schemas.microsoft.com/office/word/2010/wordprocessingShape" xmlns:wpg="http://schemas.microsoft.com/office/word/2010/wordprocessingGroup" xmlns:mc="http://schemas.openxmlformats.org/markup-compatibility/2006" xmlns:wp14="http://schemas.microsoft.com/office/word/2010/wordprocessingDrawing" xmlns:w14="http://schemas.microsoft.com/office/word/2010/wordml" xmlns:w15="http://schemas.microsoft.com/office/word/2012/wordml" mc:Ignorable="w14 wp14 w15">
-  <w:p/>
-</w:hdr>
-</file>
-
-<file path=word/header46.xml><?xml version="1.0" encoding="utf-8"?>
-<w:hdr xmlns:o="urn:schemas-microsoft-com:office:office" xmlns:r="http://schemas.openxmlformats.org/officeDocument/2006/relationships" xmlns:v="urn:schemas-microsoft-com:vml" xmlns:w="http://schemas.openxmlformats.org/wordprocessingml/2006/main" xmlns:w10="urn:schemas-microsoft-com:office:word" xmlns:wp="http://schemas.openxmlformats.org/drawingml/2006/wordprocessingDrawing" xmlns:wps="http://schemas.microsoft.com/office/word/2010/wordprocessingShape" xmlns:wpg="http://schemas.microsoft.com/office/word/2010/wordprocessingGroup" xmlns:mc="http://schemas.openxmlformats.org/markup-compatibility/2006" xmlns:wp14="http://schemas.microsoft.com/office/word/2010/wordprocessingDrawing" xmlns:w14="http://schemas.microsoft.com/office/word/2010/wordml" xmlns:w15="http://schemas.microsoft.com/office/word/2012/wordml" mc:Ignorable="w14 wp14 w15">
-  <w:p>
-    <w:pPr>
-      <w:pStyle w:val="Normal"/>
-      <w:jc w:val="right"/>
-      <w:rPr/>
-    </w:pPr>
-    <w:r>
-      <w:rPr/>
-      <w:fldChar w:fldCharType="begin"/>
-    </w:r>
-    <w:r>
-      <w:rPr/>
-      <w:instrText xml:space="preserve"> PAGE </w:instrText>
-    </w:r>
-    <w:r>
-      <w:rPr/>
-      <w:fldChar w:fldCharType="separate"/>
-    </w:r>
-    <w:r>
-      <w:rPr/>
-      <w:t>76</w:t>
-    </w:r>
-    <w:r>
-      <w:rPr/>
-      <w:fldChar w:fldCharType="end"/>
-    </w:r>
-  </w:p>
-</w:hdr>
-</file>
-
-<file path=word/header47.xml><?xml version="1.0" encoding="utf-8"?>
-<w:hdr xmlns:o="urn:schemas-microsoft-com:office:office" xmlns:r="http://schemas.openxmlformats.org/officeDocument/2006/relationships" xmlns:v="urn:schemas-microsoft-com:vml" xmlns:w="http://schemas.openxmlformats.org/wordprocessingml/2006/main" xmlns:w10="urn:schemas-microsoft-com:office:word" xmlns:wp="http://schemas.openxmlformats.org/drawingml/2006/wordprocessingDrawing" xmlns:wps="http://schemas.microsoft.com/office/word/2010/wordprocessingShape" xmlns:wpg="http://schemas.microsoft.com/office/word/2010/wordprocessingGroup" xmlns:mc="http://schemas.openxmlformats.org/markup-compatibility/2006" xmlns:wp14="http://schemas.microsoft.com/office/word/2010/wordprocessingDrawing" xmlns:w14="http://schemas.microsoft.com/office/word/2010/wordml" xmlns:w15="http://schemas.microsoft.com/office/word/2012/wordml" mc:Ignorable="w14 wp14 w15">
-  <w:p/>
 </w:hdr>
 </file>
 

</xml_diff>

<commit_message>
docs: remove folha de rosto e lista os diagramas no sumario da versao ABNT
O sumario passa a ser a primeira pagina contada e mostra os onze diagramas
abaixo do Apendice A.

Co-Authored-By: Claude Opus 5.5 <noreply@anthropic.com>
Claude-Session: https://claude.ai/code/session_011SKCdnRmci1yJCi4ZvMpS2
</commit_message>
<xml_diff>
--- a/docs/Documentacao-ABNT.docx
+++ b/docs/Documentacao-ABNT.docx
@@ -244,189 +244,6 @@
     <w:p>
       <w:pPr>
         <w:pStyle w:val="Normal"/>
-        <w:spacing w:lineRule="auto" w:line="360" w:before="0" w:after="0"/>
-        <w:jc w:val="center"/>
-        <w:rPr/>
-      </w:pPr>
-      <w:r>
-        <w:rPr>
-          <w:rFonts w:eastAsia="Arial" w:cs="Arial"/>
-          <w:sz w:val="24"/>
-          <w:szCs w:val="24"/>
-        </w:rPr>
-        <w:t>BIANCA GOMES DANTAS DE ALMEIDA</w:t>
-      </w:r>
-    </w:p>
-    <w:p>
-      <w:pPr>
-        <w:pStyle w:val="Normal"/>
-        <w:spacing w:lineRule="auto" w:line="360" w:before="0" w:after="0"/>
-        <w:jc w:val="center"/>
-        <w:rPr/>
-      </w:pPr>
-      <w:r>
-        <w:rPr>
-          <w:rFonts w:eastAsia="Arial" w:cs="Arial"/>
-          <w:sz w:val="24"/>
-          <w:szCs w:val="24"/>
-        </w:rPr>
-        <w:t>GIOVANNA GOMES SILVA</w:t>
-      </w:r>
-    </w:p>
-    <w:p>
-      <w:pPr>
-        <w:pStyle w:val="Normal"/>
-        <w:spacing w:lineRule="auto" w:line="360" w:before="0" w:after="0"/>
-        <w:jc w:val="center"/>
-        <w:rPr/>
-      </w:pPr>
-      <w:r>
-        <w:rPr>
-          <w:rFonts w:eastAsia="Arial" w:cs="Arial"/>
-          <w:sz w:val="24"/>
-          <w:szCs w:val="24"/>
-        </w:rPr>
-        <w:t>JAILTON SANTOS DE MATOS</w:t>
-      </w:r>
-    </w:p>
-    <w:p>
-      <w:pPr>
-        <w:pStyle w:val="Normal"/>
-        <w:spacing w:lineRule="auto" w:line="360" w:before="0" w:after="0"/>
-        <w:jc w:val="center"/>
-        <w:rPr/>
-      </w:pPr>
-      <w:r>
-        <w:rPr>
-          <w:rFonts w:eastAsia="Arial" w:cs="Arial"/>
-          <w:sz w:val="24"/>
-          <w:szCs w:val="24"/>
-        </w:rPr>
-        <w:t>LUCAS ALVES DE SOUZA</w:t>
-      </w:r>
-    </w:p>
-    <w:p>
-      <w:pPr>
-        <w:pStyle w:val="Normal"/>
-        <w:spacing w:lineRule="auto" w:line="360" w:before="0" w:after="0"/>
-        <w:jc w:val="center"/>
-        <w:rPr/>
-      </w:pPr>
-      <w:r>
-        <w:rPr>
-          <w:rFonts w:eastAsia="Arial" w:cs="Arial"/>
-          <w:sz w:val="24"/>
-          <w:szCs w:val="24"/>
-        </w:rPr>
-        <w:t>LUCAS NEVES DOS SANTOS</w:t>
-      </w:r>
-    </w:p>
-    <w:p>
-      <w:pPr>
-        <w:pStyle w:val="Normal"/>
-        <w:spacing w:lineRule="auto" w:line="360" w:before="3000" w:after="0"/>
-        <w:jc w:val="center"/>
-        <w:rPr/>
-      </w:pPr>
-      <w:r>
-        <w:rPr>
-          <w:rFonts w:eastAsia="Arial" w:cs="Arial"/>
-          <w:b/>
-          <w:bCs/>
-          <w:sz w:val="24"/>
-          <w:szCs w:val="24"/>
-        </w:rPr>
-        <w:t>GERENCIADOR DE EVENTOS ACADÊMICOS:</w:t>
-      </w:r>
-    </w:p>
-    <w:p>
-      <w:pPr>
-        <w:pStyle w:val="Normal"/>
-        <w:spacing w:lineRule="auto" w:line="360" w:before="0" w:after="0"/>
-        <w:jc w:val="center"/>
-        <w:rPr/>
-      </w:pPr>
-      <w:r>
-        <w:rPr>
-          <w:rFonts w:eastAsia="Arial" w:cs="Arial"/>
-          <w:sz w:val="24"/>
-          <w:szCs w:val="24"/>
-        </w:rPr>
-        <w:t>Documentação do Software</w:t>
-      </w:r>
-    </w:p>
-    <w:p>
-      <w:pPr>
-        <w:pStyle w:val="Normal"/>
-        <w:spacing w:lineRule="auto" w:line="240" w:before="1400" w:after="240"/>
-        <w:ind w:left="4536"/>
-        <w:jc w:val="both"/>
-        <w:rPr/>
-      </w:pPr>
-      <w:r>
-        <w:rPr>
-          <w:rFonts w:eastAsia="Arial" w:cs="Arial"/>
-          <w:sz w:val="20"/>
-          <w:szCs w:val="20"/>
-        </w:rPr>
-        <w:t>Documentação do Projeto Integrador apresentada ao Curso Superior de Tecnologia em Análise e Desenvolvimento de Sistemas da Universidade Santo Amaro (UNISA), como requisito parcial para aprovação.</w:t>
-      </w:r>
-    </w:p>
-    <w:p>
-      <w:pPr>
-        <w:pStyle w:val="Normal"/>
-        <w:spacing w:lineRule="auto" w:line="240" w:before="0" w:after="0"/>
-        <w:ind w:left="4536"/>
-        <w:jc w:val="left"/>
-        <w:rPr/>
-      </w:pPr>
-      <w:r>
-        <w:rPr>
-          <w:rFonts w:eastAsia="Arial" w:cs="Arial"/>
-          <w:sz w:val="20"/>
-          <w:szCs w:val="20"/>
-        </w:rPr>
-        <w:t xml:space="preserve">Orientador(a): </w:t>
-      </w:r>
-    </w:p>
-    <w:p>
-      <w:pPr>
-        <w:pStyle w:val="Normal"/>
-        <w:spacing w:lineRule="auto" w:line="360" w:before="3600" w:after="0"/>
-        <w:jc w:val="center"/>
-        <w:rPr/>
-      </w:pPr>
-      <w:r>
-        <w:rPr>
-          <w:rFonts w:eastAsia="Arial" w:cs="Arial"/>
-          <w:sz w:val="24"/>
-          <w:szCs w:val="24"/>
-        </w:rPr>
-        <w:t>SÃO PAULO</w:t>
-      </w:r>
-    </w:p>
-    <w:p>
-      <w:pPr>
-        <w:pStyle w:val="Normal"/>
-        <w:spacing w:lineRule="auto" w:line="360" w:before="0" w:after="0"/>
-        <w:jc w:val="center"/>
-        <w:rPr/>
-      </w:pPr>
-      <w:r>
-        <w:rPr>
-          <w:rFonts w:eastAsia="Arial" w:cs="Arial"/>
-          <w:sz w:val="24"/>
-          <w:szCs w:val="24"/>
-        </w:rPr>
-        <w:t>2026</w:t>
-      </w:r>
-      <w:r>
-        <w:br w:type="page"/>
-      </w:r>
-    </w:p>
-    <w:p>
-      <w:pPr>
-        <w:pStyle w:val="Normal"/>
         <w:spacing w:lineRule="auto" w:line="360" w:before="0" w:after="360"/>
         <w:jc w:val="center"/>
         <w:rPr/>
@@ -476,7 +293,7 @@
             </w:rPr>
             <w:fldChar w:fldCharType="separate"/>
           </w:r>
-          <w:hyperlink w:anchor="__RefHeading___Toc3041_634922549">
+          <w:hyperlink w:anchor="__RefHeading___Toc3030_3157206431">
             <w:r>
               <w:rPr>
                 <w:webHidden/>
@@ -484,7 +301,7 @@
               </w:rPr>
               <w:t>1 VISÃO GERAL DO PROJETO</w:t>
               <w:tab/>
-              <w:t>5</w:t>
+              <w:t>4</w:t>
             </w:r>
           </w:hyperlink>
         </w:p>
@@ -497,7 +314,7 @@
             </w:tabs>
             <w:rPr/>
           </w:pPr>
-          <w:hyperlink w:anchor="__RefHeading___Toc3043_634922549">
+          <w:hyperlink w:anchor="__RefHeading___Toc3032_3157206431">
             <w:r>
               <w:rPr>
                 <w:webHidden/>
@@ -505,7 +322,7 @@
               </w:rPr>
               <w:t>1.1 DESCRIÇÃO EXECUTIVA</w:t>
               <w:tab/>
-              <w:t>5</w:t>
+              <w:t>4</w:t>
             </w:r>
           </w:hyperlink>
         </w:p>
@@ -518,7 +335,7 @@
             </w:tabs>
             <w:rPr/>
           </w:pPr>
-          <w:hyperlink w:anchor="__RefHeading___Toc3045_634922549">
+          <w:hyperlink w:anchor="__RefHeading___Toc3034_3157206431">
             <w:r>
               <w:rPr>
                 <w:webHidden/>
@@ -526,7 +343,7 @@
               </w:rPr>
               <w:t>1.2 OBJETIVOS E ESCOPO</w:t>
               <w:tab/>
-              <w:t>5</w:t>
+              <w:t>4</w:t>
             </w:r>
           </w:hyperlink>
         </w:p>
@@ -539,7 +356,7 @@
             </w:tabs>
             <w:rPr/>
           </w:pPr>
-          <w:hyperlink w:anchor="__RefHeading___Toc3047_634922549">
+          <w:hyperlink w:anchor="__RefHeading___Toc3036_3157206431">
             <w:r>
               <w:rPr>
                 <w:webHidden/>
@@ -547,7 +364,7 @@
               </w:rPr>
               <w:t>1.2.1 Objetivo Geral</w:t>
               <w:tab/>
-              <w:t>5</w:t>
+              <w:t>4</w:t>
             </w:r>
           </w:hyperlink>
         </w:p>
@@ -560,7 +377,7 @@
             </w:tabs>
             <w:rPr/>
           </w:pPr>
-          <w:hyperlink w:anchor="__RefHeading___Toc3049_634922549">
+          <w:hyperlink w:anchor="__RefHeading___Toc3038_3157206431">
             <w:r>
               <w:rPr>
                 <w:webHidden/>
@@ -568,7 +385,7 @@
               </w:rPr>
               <w:t>1.2.2 Objetivos Específicos</w:t>
               <w:tab/>
-              <w:t>6</w:t>
+              <w:t>5</w:t>
             </w:r>
           </w:hyperlink>
         </w:p>
@@ -581,7 +398,7 @@
             </w:tabs>
             <w:rPr/>
           </w:pPr>
-          <w:hyperlink w:anchor="__RefHeading___Toc3051_634922549">
+          <w:hyperlink w:anchor="__RefHeading___Toc3040_3157206431">
             <w:r>
               <w:rPr>
                 <w:webHidden/>
@@ -589,7 +406,7 @@
               </w:rPr>
               <w:t>1.2.3 Escopo do Projeto</w:t>
               <w:tab/>
-              <w:t>6</w:t>
+              <w:t>5</w:t>
             </w:r>
           </w:hyperlink>
         </w:p>
@@ -602,7 +419,7 @@
             </w:tabs>
             <w:rPr/>
           </w:pPr>
-          <w:hyperlink w:anchor="__RefHeading___Toc3053_634922549">
+          <w:hyperlink w:anchor="__RefHeading___Toc3042_3157206431">
             <w:r>
               <w:rPr>
                 <w:webHidden/>
@@ -610,7 +427,7 @@
               </w:rPr>
               <w:t>1.2.4 Limitações de Escopo</w:t>
               <w:tab/>
-              <w:t>6</w:t>
+              <w:t>5</w:t>
             </w:r>
           </w:hyperlink>
         </w:p>
@@ -623,7 +440,7 @@
             </w:tabs>
             <w:rPr/>
           </w:pPr>
-          <w:hyperlink w:anchor="__RefHeading___Toc3055_634922549">
+          <w:hyperlink w:anchor="__RefHeading___Toc3044_3157206431">
             <w:r>
               <w:rPr>
                 <w:webHidden/>
@@ -631,7 +448,7 @@
               </w:rPr>
               <w:t>1.3 REGRAS DE NEGÓCIO</w:t>
               <w:tab/>
-              <w:t>7</w:t>
+              <w:t>6</w:t>
             </w:r>
           </w:hyperlink>
         </w:p>
@@ -644,7 +461,7 @@
             </w:tabs>
             <w:rPr/>
           </w:pPr>
-          <w:hyperlink w:anchor="__RefHeading___Toc3057_634922549">
+          <w:hyperlink w:anchor="__RefHeading___Toc3046_3157206431">
             <w:r>
               <w:rPr>
                 <w:webHidden/>
@@ -652,7 +469,7 @@
               </w:rPr>
               <w:t>2 ARQUITETURA DO SISTEMA</w:t>
               <w:tab/>
-              <w:t>9</w:t>
+              <w:t>8</w:t>
             </w:r>
           </w:hyperlink>
         </w:p>
@@ -665,7 +482,7 @@
             </w:tabs>
             <w:rPr/>
           </w:pPr>
-          <w:hyperlink w:anchor="__RefHeading___Toc3059_634922549">
+          <w:hyperlink w:anchor="__RefHeading___Toc3048_3157206431">
             <w:r>
               <w:rPr>
                 <w:webHidden/>
@@ -673,7 +490,7 @@
               </w:rPr>
               <w:t>2.1 COMPONENTES PRINCIPAIS</w:t>
               <w:tab/>
-              <w:t>9</w:t>
+              <w:t>8</w:t>
             </w:r>
           </w:hyperlink>
         </w:p>
@@ -686,7 +503,7 @@
             </w:tabs>
             <w:rPr/>
           </w:pPr>
-          <w:hyperlink w:anchor="__RefHeading___Toc3061_634922549">
+          <w:hyperlink w:anchor="__RefHeading___Toc3050_3157206431">
             <w:r>
               <w:rPr>
                 <w:webHidden/>
@@ -694,7 +511,7 @@
               </w:rPr>
               <w:t>2.2 DECISÕES ARQUITETURAIS (ADR)</w:t>
               <w:tab/>
-              <w:t>9</w:t>
+              <w:t>8</w:t>
             </w:r>
           </w:hyperlink>
         </w:p>
@@ -707,7 +524,7 @@
             </w:tabs>
             <w:rPr/>
           </w:pPr>
-          <w:hyperlink w:anchor="__RefHeading___Toc3063_634922549">
+          <w:hyperlink w:anchor="__RefHeading___Toc3052_3157206431">
             <w:r>
               <w:rPr>
                 <w:webHidden/>
@@ -715,7 +532,7 @@
               </w:rPr>
               <w:t>2.3 STACK TECNOLÓGICA</w:t>
               <w:tab/>
-              <w:t>10</w:t>
+              <w:t>9</w:t>
             </w:r>
           </w:hyperlink>
         </w:p>
@@ -728,7 +545,7 @@
             </w:tabs>
             <w:rPr/>
           </w:pPr>
-          <w:hyperlink w:anchor="__RefHeading___Toc3065_634922549">
+          <w:hyperlink w:anchor="__RefHeading___Toc3054_3157206431">
             <w:r>
               <w:rPr>
                 <w:webHidden/>
@@ -736,7 +553,7 @@
               </w:rPr>
               <w:t>3 ESPECIFICAÇÃO TÉCNICA</w:t>
               <w:tab/>
-              <w:t>11</w:t>
+              <w:t>10</w:t>
             </w:r>
           </w:hyperlink>
         </w:p>
@@ -749,7 +566,7 @@
             </w:tabs>
             <w:rPr/>
           </w:pPr>
-          <w:hyperlink w:anchor="__RefHeading___Toc3067_634922549">
+          <w:hyperlink w:anchor="__RefHeading___Toc3056_3157206431">
             <w:r>
               <w:rPr>
                 <w:webHidden/>
@@ -757,7 +574,7 @@
               </w:rPr>
               <w:t>3.1 REQUISITOS FUNCIONAIS</w:t>
               <w:tab/>
-              <w:t>11</w:t>
+              <w:t>10</w:t>
             </w:r>
           </w:hyperlink>
         </w:p>
@@ -770,7 +587,7 @@
             </w:tabs>
             <w:rPr/>
           </w:pPr>
-          <w:hyperlink w:anchor="__RefHeading___Toc3069_634922549">
+          <w:hyperlink w:anchor="__RefHeading___Toc3058_3157206431">
             <w:r>
               <w:rPr>
                 <w:webHidden/>
@@ -778,7 +595,7 @@
               </w:rPr>
               <w:t>3.2 REQUISITOS NÃO FUNCIONAIS</w:t>
               <w:tab/>
-              <w:t>11</w:t>
+              <w:t>10</w:t>
             </w:r>
           </w:hyperlink>
         </w:p>
@@ -791,7 +608,7 @@
             </w:tabs>
             <w:rPr/>
           </w:pPr>
-          <w:hyperlink w:anchor="__RefHeading___Toc3071_634922549">
+          <w:hyperlink w:anchor="__RefHeading___Toc3060_3157206431">
             <w:r>
               <w:rPr>
                 <w:webHidden/>
@@ -799,7 +616,7 @@
               </w:rPr>
               <w:t>4 PROTÓTIPO DE BAIXA E ALTA FIDELIDADE</w:t>
               <w:tab/>
-              <w:t>12</w:t>
+              <w:t>11</w:t>
             </w:r>
           </w:hyperlink>
         </w:p>
@@ -812,7 +629,7 @@
             </w:tabs>
             <w:rPr/>
           </w:pPr>
-          <w:hyperlink w:anchor="__RefHeading___Toc3073_634922549">
+          <w:hyperlink w:anchor="__RefHeading___Toc3062_3157206431">
             <w:r>
               <w:rPr>
                 <w:webHidden/>
@@ -820,7 +637,7 @@
               </w:rPr>
               <w:t>4.1 PROTÓTIPO DE BAIXA FIDELIDADE</w:t>
               <w:tab/>
-              <w:t>12</w:t>
+              <w:t>11</w:t>
             </w:r>
           </w:hyperlink>
         </w:p>
@@ -833,7 +650,7 @@
             </w:tabs>
             <w:rPr/>
           </w:pPr>
-          <w:hyperlink w:anchor="__RefHeading___Toc3075_634922549">
+          <w:hyperlink w:anchor="__RefHeading___Toc3064_3157206431">
             <w:r>
               <w:rPr>
                 <w:webHidden/>
@@ -841,7 +658,7 @@
               </w:rPr>
               <w:t>4.2 PROTÓTIPO DE ALTA FIDELIDADE</w:t>
               <w:tab/>
-              <w:t>13</w:t>
+              <w:t>12</w:t>
             </w:r>
           </w:hyperlink>
         </w:p>
@@ -854,7 +671,7 @@
             </w:tabs>
             <w:rPr/>
           </w:pPr>
-          <w:hyperlink w:anchor="__RefHeading___Toc3077_634922549">
+          <w:hyperlink w:anchor="__RefHeading___Toc3066_3157206431">
             <w:r>
               <w:rPr>
                 <w:webHidden/>
@@ -862,7 +679,7 @@
               </w:rPr>
               <w:t>5 MÉTRICAS E CRONOGRAMA</w:t>
               <w:tab/>
-              <w:t>15</w:t>
+              <w:t>14</w:t>
             </w:r>
           </w:hyperlink>
         </w:p>
@@ -875,7 +692,7 @@
             </w:tabs>
             <w:rPr/>
           </w:pPr>
-          <w:hyperlink w:anchor="__RefHeading___Toc3079_634922549">
+          <w:hyperlink w:anchor="__RefHeading___Toc3068_3157206431">
             <w:r>
               <w:rPr>
                 <w:webHidden/>
@@ -883,7 +700,7 @@
               </w:rPr>
               <w:t>5.1 CRONOGRAMA</w:t>
               <w:tab/>
-              <w:t>15</w:t>
+              <w:t>14</w:t>
             </w:r>
           </w:hyperlink>
         </w:p>
@@ -896,7 +713,7 @@
             </w:tabs>
             <w:rPr/>
           </w:pPr>
-          <w:hyperlink w:anchor="__RefHeading___Toc3081_634922549">
+          <w:hyperlink w:anchor="__RefHeading___Toc3070_3157206431">
             <w:r>
               <w:rPr>
                 <w:webHidden/>
@@ -904,7 +721,7 @@
               </w:rPr>
               <w:t>5.2 MÉTRICAS DE ACOMPANHAMENTO</w:t>
               <w:tab/>
-              <w:t>16</w:t>
+              <w:t>15</w:t>
             </w:r>
           </w:hyperlink>
         </w:p>
@@ -917,7 +734,7 @@
             </w:tabs>
             <w:rPr/>
           </w:pPr>
-          <w:hyperlink w:anchor="__RefHeading___Toc3083_634922549">
+          <w:hyperlink w:anchor="__RefHeading___Toc3072_3157206431">
             <w:r>
               <w:rPr>
                 <w:webHidden/>
@@ -925,7 +742,7 @@
               </w:rPr>
               <w:t>6 MODELO DO DOMÍNIO</w:t>
               <w:tab/>
-              <w:t>17</w:t>
+              <w:t>16</w:t>
             </w:r>
           </w:hyperlink>
         </w:p>
@@ -938,7 +755,7 @@
             </w:tabs>
             <w:rPr/>
           </w:pPr>
-          <w:hyperlink w:anchor="__RefHeading___Toc3085_634922549">
+          <w:hyperlink w:anchor="__RefHeading___Toc3074_3157206431">
             <w:r>
               <w:rPr>
                 <w:webHidden/>
@@ -946,7 +763,7 @@
               </w:rPr>
               <w:t>6.1 VISÃO CONCEITUAL DAS ENTIDADES</w:t>
               <w:tab/>
-              <w:t>17</w:t>
+              <w:t>16</w:t>
             </w:r>
           </w:hyperlink>
         </w:p>
@@ -959,7 +776,7 @@
             </w:tabs>
             <w:rPr/>
           </w:pPr>
-          <w:hyperlink w:anchor="__RefHeading___Toc3087_634922549">
+          <w:hyperlink w:anchor="__RefHeading___Toc3076_3157206431">
             <w:r>
               <w:rPr>
                 <w:webHidden/>
@@ -967,7 +784,7 @@
               </w:rPr>
               <w:t>6.2 DIAGRAMAS DE MODELAGEM</w:t>
               <w:tab/>
-              <w:t>18</w:t>
+              <w:t>17</w:t>
             </w:r>
           </w:hyperlink>
         </w:p>
@@ -980,7 +797,7 @@
             </w:tabs>
             <w:rPr/>
           </w:pPr>
-          <w:hyperlink w:anchor="__RefHeading___Toc3089_634922549">
+          <w:hyperlink w:anchor="__RefHeading___Toc3078_3157206431">
             <w:r>
               <w:rPr>
                 <w:webHidden/>
@@ -988,7 +805,7 @@
               </w:rPr>
               <w:t>7 MODELO DE DADOS</w:t>
               <w:tab/>
-              <w:t>19</w:t>
+              <w:t>18</w:t>
             </w:r>
           </w:hyperlink>
         </w:p>
@@ -1001,7 +818,7 @@
             </w:tabs>
             <w:rPr/>
           </w:pPr>
-          <w:hyperlink w:anchor="__RefHeading___Toc3091_634922549">
+          <w:hyperlink w:anchor="__RefHeading___Toc3080_3157206431">
             <w:r>
               <w:rPr>
                 <w:webHidden/>
@@ -1009,7 +826,7 @@
               </w:rPr>
               <w:t>7.1 MODELO LÓGICO DA BASE DE DADOS</w:t>
               <w:tab/>
-              <w:t>19</w:t>
+              <w:t>18</w:t>
             </w:r>
           </w:hyperlink>
         </w:p>
@@ -1022,7 +839,7 @@
             </w:tabs>
             <w:rPr/>
           </w:pPr>
-          <w:hyperlink w:anchor="__RefHeading___Toc3093_634922549">
+          <w:hyperlink w:anchor="__RefHeading___Toc3082_3157206431">
             <w:r>
               <w:rPr>
                 <w:webHidden/>
@@ -1030,7 +847,7 @@
               </w:rPr>
               <w:t>7.2 CRIAÇÃO FÍSICA DO MODELO DE DADOS</w:t>
               <w:tab/>
-              <w:t>20</w:t>
+              <w:t>19</w:t>
             </w:r>
           </w:hyperlink>
         </w:p>
@@ -1043,7 +860,7 @@
             </w:tabs>
             <w:rPr/>
           </w:pPr>
-          <w:hyperlink w:anchor="__RefHeading___Toc3095_634922549">
+          <w:hyperlink w:anchor="__RefHeading___Toc3084_3157206431">
             <w:r>
               <w:rPr>
                 <w:webHidden/>
@@ -1051,7 +868,7 @@
               </w:rPr>
               <w:t>7.3 DICIONÁRIO DE DADOS</w:t>
               <w:tab/>
-              <w:t>22</w:t>
+              <w:t>21</w:t>
             </w:r>
           </w:hyperlink>
         </w:p>
@@ -1064,7 +881,7 @@
             </w:tabs>
             <w:rPr/>
           </w:pPr>
-          <w:hyperlink w:anchor="__RefHeading___Toc3097_634922549">
+          <w:hyperlink w:anchor="__RefHeading___Toc3086_3157206431">
             <w:r>
               <w:rPr>
                 <w:webHidden/>
@@ -1072,7 +889,7 @@
               </w:rPr>
               <w:t>7.3.1 Tabela USUARIO</w:t>
               <w:tab/>
-              <w:t>22</w:t>
+              <w:t>21</w:t>
             </w:r>
           </w:hyperlink>
         </w:p>
@@ -1085,7 +902,7 @@
             </w:tabs>
             <w:rPr/>
           </w:pPr>
-          <w:hyperlink w:anchor="__RefHeading___Toc3099_634922549">
+          <w:hyperlink w:anchor="__RefHeading___Toc3088_3157206431">
             <w:r>
               <w:rPr>
                 <w:webHidden/>
@@ -1093,7 +910,7 @@
               </w:rPr>
               <w:t>7.3.2 Tabela USUARIO_PAPEL</w:t>
               <w:tab/>
-              <w:t>22</w:t>
+              <w:t>21</w:t>
             </w:r>
           </w:hyperlink>
         </w:p>
@@ -1106,7 +923,7 @@
             </w:tabs>
             <w:rPr/>
           </w:pPr>
-          <w:hyperlink w:anchor="__RefHeading___Toc3101_634922549">
+          <w:hyperlink w:anchor="__RefHeading___Toc3090_3157206431">
             <w:r>
               <w:rPr>
                 <w:webHidden/>
@@ -1114,7 +931,7 @@
               </w:rPr>
               <w:t>7.3.3 Tabela EVENTO</w:t>
               <w:tab/>
-              <w:t>22</w:t>
+              <w:t>21</w:t>
             </w:r>
           </w:hyperlink>
         </w:p>
@@ -1127,7 +944,7 @@
             </w:tabs>
             <w:rPr/>
           </w:pPr>
-          <w:hyperlink w:anchor="__RefHeading___Toc3103_634922549">
+          <w:hyperlink w:anchor="__RefHeading___Toc3092_3157206431">
             <w:r>
               <w:rPr>
                 <w:webHidden/>
@@ -1135,7 +952,7 @@
               </w:rPr>
               <w:t>7.3.4 Tabela EVENTO_FOTO</w:t>
               <w:tab/>
-              <w:t>23</w:t>
+              <w:t>22</w:t>
             </w:r>
           </w:hyperlink>
         </w:p>
@@ -1148,7 +965,7 @@
             </w:tabs>
             <w:rPr/>
           </w:pPr>
-          <w:hyperlink w:anchor="__RefHeading___Toc3105_634922549">
+          <w:hyperlink w:anchor="__RefHeading___Toc3094_3157206431">
             <w:r>
               <w:rPr>
                 <w:webHidden/>
@@ -1156,7 +973,7 @@
               </w:rPr>
               <w:t>7.3.5 Tabela INSCRICAO</w:t>
               <w:tab/>
-              <w:t>23</w:t>
+              <w:t>22</w:t>
             </w:r>
           </w:hyperlink>
         </w:p>
@@ -1169,7 +986,7 @@
             </w:tabs>
             <w:rPr/>
           </w:pPr>
-          <w:hyperlink w:anchor="__RefHeading___Toc3107_634922549">
+          <w:hyperlink w:anchor="__RefHeading___Toc3096_3157206431">
             <w:r>
               <w:rPr>
                 <w:webHidden/>
@@ -1177,7 +994,7 @@
               </w:rPr>
               <w:t>7.3.6 Tabela PRESENCA</w:t>
               <w:tab/>
-              <w:t>23</w:t>
+              <w:t>22</w:t>
             </w:r>
           </w:hyperlink>
         </w:p>
@@ -1190,7 +1007,7 @@
             </w:tabs>
             <w:rPr/>
           </w:pPr>
-          <w:hyperlink w:anchor="__RefHeading___Toc3109_634922549">
+          <w:hyperlink w:anchor="__RefHeading___Toc3098_3157206431">
             <w:r>
               <w:rPr>
                 <w:webHidden/>
@@ -1198,7 +1015,7 @@
               </w:rPr>
               <w:t>7.3.7 Tabela CERTIFICADO</w:t>
               <w:tab/>
-              <w:t>24</w:t>
+              <w:t>23</w:t>
             </w:r>
           </w:hyperlink>
         </w:p>
@@ -1211,7 +1028,7 @@
             </w:tabs>
             <w:rPr/>
           </w:pPr>
-          <w:hyperlink w:anchor="__RefHeading___Toc3111_634922549">
+          <w:hyperlink w:anchor="__RefHeading___Toc3100_3157206431">
             <w:r>
               <w:rPr>
                 <w:webHidden/>
@@ -1219,7 +1036,7 @@
               </w:rPr>
               <w:t>7.3.8 Tabela AVALIACAO</w:t>
               <w:tab/>
-              <w:t>24</w:t>
+              <w:t>23</w:t>
             </w:r>
           </w:hyperlink>
         </w:p>
@@ -1232,7 +1049,7 @@
             </w:tabs>
             <w:rPr/>
           </w:pPr>
-          <w:hyperlink w:anchor="__RefHeading___Toc3113_634922549">
+          <w:hyperlink w:anchor="__RefHeading___Toc3102_3157206431">
             <w:r>
               <w:rPr>
                 <w:webHidden/>
@@ -1240,7 +1057,7 @@
               </w:rPr>
               <w:t>7.3.9 Tabela RESUMO_AVALIACAO</w:t>
               <w:tab/>
-              <w:t>24</w:t>
+              <w:t>23</w:t>
             </w:r>
           </w:hyperlink>
         </w:p>
@@ -1253,7 +1070,7 @@
             </w:tabs>
             <w:rPr/>
           </w:pPr>
-          <w:hyperlink w:anchor="__RefHeading___Toc3115_634922549">
+          <w:hyperlink w:anchor="__RefHeading___Toc3104_3157206431">
             <w:r>
               <w:rPr>
                 <w:webHidden/>
@@ -1261,7 +1078,7 @@
               </w:rPr>
               <w:t>7.3.10 Tabela INTERACAO_IA</w:t>
               <w:tab/>
-              <w:t>25</w:t>
+              <w:t>24</w:t>
             </w:r>
           </w:hyperlink>
         </w:p>
@@ -1274,7 +1091,7 @@
             </w:tabs>
             <w:rPr/>
           </w:pPr>
-          <w:hyperlink w:anchor="__RefHeading___Toc3117_634922549">
+          <w:hyperlink w:anchor="__RefHeading___Toc3106_3157206431">
             <w:r>
               <w:rPr>
                 <w:webHidden/>
@@ -1282,7 +1099,7 @@
               </w:rPr>
               <w:t>8 AMBIENTE DE DESENVOLVIMENTO</w:t>
               <w:tab/>
-              <w:t>26</w:t>
+              <w:t>25</w:t>
             </w:r>
           </w:hyperlink>
         </w:p>
@@ -1295,7 +1112,7 @@
             </w:tabs>
             <w:rPr/>
           </w:pPr>
-          <w:hyperlink w:anchor="__RefHeading___Toc3119_634922549">
+          <w:hyperlink w:anchor="__RefHeading___Toc3108_3157206431">
             <w:r>
               <w:rPr>
                 <w:webHidden/>
@@ -1303,7 +1120,7 @@
               </w:rPr>
               <w:t>9 SISTEMAS E COMPONENTES EXTERNOS UTILIZADOS</w:t>
               <w:tab/>
-              <w:t>27</w:t>
+              <w:t>26</w:t>
             </w:r>
           </w:hyperlink>
         </w:p>
@@ -1316,7 +1133,7 @@
             </w:tabs>
             <w:rPr/>
           </w:pPr>
-          <w:hyperlink w:anchor="__RefHeading___Toc3121_634922549">
+          <w:hyperlink w:anchor="__RefHeading___Toc3110_3157206431">
             <w:r>
               <w:rPr>
                 <w:webHidden/>
@@ -1324,7 +1141,7 @@
               </w:rPr>
               <w:t>9.1 TECNOLOGIA EMERGENTE E SUA UTILIZAÇÃO</w:t>
               <w:tab/>
-              <w:t>28</w:t>
+              <w:t>27</w:t>
             </w:r>
           </w:hyperlink>
         </w:p>
@@ -1337,7 +1154,7 @@
             </w:tabs>
             <w:rPr/>
           </w:pPr>
-          <w:hyperlink w:anchor="__RefHeading___Toc3123_634922549">
+          <w:hyperlink w:anchor="__RefHeading___Toc3112_3157206431">
             <w:r>
               <w:rPr>
                 <w:webHidden/>
@@ -1345,7 +1162,7 @@
               </w:rPr>
               <w:t>9.2 SEGURANÇA DE DADOS</w:t>
               <w:tab/>
-              <w:t>29</w:t>
+              <w:t>28</w:t>
             </w:r>
           </w:hyperlink>
         </w:p>
@@ -1358,7 +1175,7 @@
             </w:tabs>
             <w:rPr/>
           </w:pPr>
-          <w:hyperlink w:anchor="__RefHeading___Toc3125_634922549">
+          <w:hyperlink w:anchor="__RefHeading___Toc3114_3157206431">
             <w:r>
               <w:rPr>
                 <w:webHidden/>
@@ -1366,7 +1183,7 @@
               </w:rPr>
               <w:t>10 INSTALAÇÃO E CONFIGURAÇÃO</w:t>
               <w:tab/>
-              <w:t>31</w:t>
+              <w:t>30</w:t>
             </w:r>
           </w:hyperlink>
         </w:p>
@@ -1379,7 +1196,7 @@
             </w:tabs>
             <w:rPr/>
           </w:pPr>
-          <w:hyperlink w:anchor="__RefHeading___Toc3127_634922549">
+          <w:hyperlink w:anchor="__RefHeading___Toc3116_3157206431">
             <w:r>
               <w:rPr>
                 <w:webHidden/>
@@ -1387,7 +1204,7 @@
               </w:rPr>
               <w:t>10.1 PRÉ-REQUISITOS</w:t>
               <w:tab/>
-              <w:t>31</w:t>
+              <w:t>30</w:t>
             </w:r>
           </w:hyperlink>
         </w:p>
@@ -1400,7 +1217,7 @@
             </w:tabs>
             <w:rPr/>
           </w:pPr>
-          <w:hyperlink w:anchor="__RefHeading___Toc3129_634922549">
+          <w:hyperlink w:anchor="__RefHeading___Toc3118_3157206431">
             <w:r>
               <w:rPr>
                 <w:webHidden/>
@@ -1408,7 +1225,7 @@
               </w:rPr>
               <w:t>10.2 PASSOS DE INSTALAÇÃO</w:t>
               <w:tab/>
-              <w:t>31</w:t>
+              <w:t>30</w:t>
             </w:r>
           </w:hyperlink>
         </w:p>
@@ -1421,7 +1238,7 @@
             </w:tabs>
             <w:rPr/>
           </w:pPr>
-          <w:hyperlink w:anchor="__RefHeading___Toc3131_634922549">
+          <w:hyperlink w:anchor="__RefHeading___Toc3120_3157206431">
             <w:r>
               <w:rPr>
                 <w:webHidden/>
@@ -1429,7 +1246,7 @@
               </w:rPr>
               <w:t>11 DESENVOLVIMENTO</w:t>
               <w:tab/>
-              <w:t>33</w:t>
+              <w:t>32</w:t>
             </w:r>
           </w:hyperlink>
         </w:p>
@@ -1442,7 +1259,7 @@
             </w:tabs>
             <w:rPr/>
           </w:pPr>
-          <w:hyperlink w:anchor="__RefHeading___Toc3133_634922549">
+          <w:hyperlink w:anchor="__RefHeading___Toc3122_3157206431">
             <w:r>
               <w:rPr>
                 <w:webHidden/>
@@ -1450,7 +1267,7 @@
               </w:rPr>
               <w:t>11.1 WORKFLOW DE BRANCHES</w:t>
               <w:tab/>
-              <w:t>33</w:t>
+              <w:t>32</w:t>
             </w:r>
           </w:hyperlink>
         </w:p>
@@ -1463,7 +1280,7 @@
             </w:tabs>
             <w:rPr/>
           </w:pPr>
-          <w:hyperlink w:anchor="__RefHeading___Toc3135_634922549">
+          <w:hyperlink w:anchor="__RefHeading___Toc3124_3157206431">
             <w:r>
               <w:rPr>
                 <w:webHidden/>
@@ -1471,7 +1288,7 @@
               </w:rPr>
               <w:t>11.2 CONVENÇÕES DE CÓDIGO</w:t>
               <w:tab/>
-              <w:t>33</w:t>
+              <w:t>32</w:t>
             </w:r>
           </w:hyperlink>
         </w:p>
@@ -1484,7 +1301,7 @@
             </w:tabs>
             <w:rPr/>
           </w:pPr>
-          <w:hyperlink w:anchor="__RefHeading___Toc3137_634922549">
+          <w:hyperlink w:anchor="__RefHeading___Toc3126_3157206431">
             <w:r>
               <w:rPr>
                 <w:webHidden/>
@@ -1492,7 +1309,7 @@
               </w:rPr>
               <w:t>12 API E INTERFACES</w:t>
               <w:tab/>
-              <w:t>35</w:t>
+              <w:t>34</w:t>
             </w:r>
           </w:hyperlink>
         </w:p>
@@ -1505,7 +1322,7 @@
             </w:tabs>
             <w:rPr/>
           </w:pPr>
-          <w:hyperlink w:anchor="__RefHeading___Toc3139_634922549">
+          <w:hyperlink w:anchor="__RefHeading___Toc3128_3157206431">
             <w:r>
               <w:rPr>
                 <w:webHidden/>
@@ -1513,7 +1330,7 @@
               </w:rPr>
               <w:t>12.1 ENDPOINTS PRINCIPAIS</w:t>
               <w:tab/>
-              <w:t>35</w:t>
+              <w:t>34</w:t>
             </w:r>
           </w:hyperlink>
         </w:p>
@@ -1526,7 +1343,7 @@
             </w:tabs>
             <w:rPr/>
           </w:pPr>
-          <w:hyperlink w:anchor="__RefHeading___Toc3141_634922549">
+          <w:hyperlink w:anchor="__RefHeading___Toc3130_3157206431">
             <w:r>
               <w:rPr>
                 <w:webHidden/>
@@ -1534,7 +1351,7 @@
               </w:rPr>
               <w:t>12.1.1 Rotas de Autenticação</w:t>
               <w:tab/>
-              <w:t>35</w:t>
+              <w:t>34</w:t>
             </w:r>
           </w:hyperlink>
         </w:p>
@@ -1547,7 +1364,7 @@
             </w:tabs>
             <w:rPr/>
           </w:pPr>
-          <w:hyperlink w:anchor="__RefHeading___Toc3143_634922549">
+          <w:hyperlink w:anchor="__RefHeading___Toc3132_3157206431">
             <w:r>
               <w:rPr>
                 <w:webHidden/>
@@ -1555,7 +1372,7 @@
               </w:rPr>
               <w:t>12.1.2 Eventos</w:t>
               <w:tab/>
-              <w:t>35</w:t>
+              <w:t>34</w:t>
             </w:r>
           </w:hyperlink>
         </w:p>
@@ -1568,7 +1385,7 @@
             </w:tabs>
             <w:rPr/>
           </w:pPr>
-          <w:hyperlink w:anchor="__RefHeading___Toc3145_634922549">
+          <w:hyperlink w:anchor="__RefHeading___Toc3134_3157206431">
             <w:r>
               <w:rPr>
                 <w:webHidden/>
@@ -1576,7 +1393,7 @@
               </w:rPr>
               <w:t>12.1.3 Inscrições</w:t>
               <w:tab/>
-              <w:t>36</w:t>
+              <w:t>35</w:t>
             </w:r>
           </w:hyperlink>
         </w:p>
@@ -1589,7 +1406,7 @@
             </w:tabs>
             <w:rPr/>
           </w:pPr>
-          <w:hyperlink w:anchor="__RefHeading___Toc3147_634922549">
+          <w:hyperlink w:anchor="__RefHeading___Toc3136_3157206431">
             <w:r>
               <w:rPr>
                 <w:webHidden/>
@@ -1597,7 +1414,7 @@
               </w:rPr>
               <w:t>12.1.4 Presença e Certificação</w:t>
               <w:tab/>
-              <w:t>36</w:t>
+              <w:t>35</w:t>
             </w:r>
           </w:hyperlink>
         </w:p>
@@ -1610,7 +1427,7 @@
             </w:tabs>
             <w:rPr/>
           </w:pPr>
-          <w:hyperlink w:anchor="__RefHeading___Toc3149_634922549">
+          <w:hyperlink w:anchor="__RefHeading___Toc3138_3157206431">
             <w:r>
               <w:rPr>
                 <w:webHidden/>
@@ -1618,7 +1435,7 @@
               </w:rPr>
               <w:t>12.1.5 Avaliações</w:t>
               <w:tab/>
-              <w:t>36</w:t>
+              <w:t>35</w:t>
             </w:r>
           </w:hyperlink>
         </w:p>
@@ -1631,7 +1448,7 @@
             </w:tabs>
             <w:rPr/>
           </w:pPr>
-          <w:hyperlink w:anchor="__RefHeading___Toc3151_634922549">
+          <w:hyperlink w:anchor="__RefHeading___Toc3140_3157206431">
             <w:r>
               <w:rPr>
                 <w:webHidden/>
@@ -1639,7 +1456,7 @@
               </w:rPr>
               <w:t>12.1.6 Padronização de Erros</w:t>
               <w:tab/>
-              <w:t>37</w:t>
+              <w:t>36</w:t>
             </w:r>
           </w:hyperlink>
         </w:p>
@@ -1652,7 +1469,7 @@
             </w:tabs>
             <w:rPr/>
           </w:pPr>
-          <w:hyperlink w:anchor="__RefHeading___Toc3153_634922549">
+          <w:hyperlink w:anchor="__RefHeading___Toc3142_3157206431">
             <w:r>
               <w:rPr>
                 <w:webHidden/>
@@ -1660,7 +1477,7 @@
               </w:rPr>
               <w:t>12.2 AUTENTICAÇÃO</w:t>
               <w:tab/>
-              <w:t>37</w:t>
+              <w:t>36</w:t>
             </w:r>
           </w:hyperlink>
         </w:p>
@@ -1673,7 +1490,7 @@
             </w:tabs>
             <w:rPr/>
           </w:pPr>
-          <w:hyperlink w:anchor="__RefHeading___Toc3155_634922549">
+          <w:hyperlink w:anchor="__RefHeading___Toc3144_3157206431">
             <w:r>
               <w:rPr>
                 <w:webHidden/>
@@ -1681,7 +1498,7 @@
               </w:rPr>
               <w:t>13 ESTRATÉGIA DE TESTES</w:t>
               <w:tab/>
-              <w:t>39</w:t>
+              <w:t>38</w:t>
             </w:r>
           </w:hyperlink>
         </w:p>
@@ -1694,7 +1511,7 @@
             </w:tabs>
             <w:rPr/>
           </w:pPr>
-          <w:hyperlink w:anchor="__RefHeading___Toc3157_634922549">
+          <w:hyperlink w:anchor="__RefHeading___Toc3146_3157206431">
             <w:r>
               <w:rPr>
                 <w:webHidden/>
@@ -1702,7 +1519,7 @@
               </w:rPr>
               <w:t>13.1 PIRÂMIDE DE TESTES</w:t>
               <w:tab/>
-              <w:t>39</w:t>
+              <w:t>38</w:t>
             </w:r>
           </w:hyperlink>
         </w:p>
@@ -1715,7 +1532,7 @@
             </w:tabs>
             <w:rPr/>
           </w:pPr>
-          <w:hyperlink w:anchor="__RefHeading___Toc3159_634922549">
+          <w:hyperlink w:anchor="__RefHeading___Toc3148_3157206431">
             <w:r>
               <w:rPr>
                 <w:webHidden/>
@@ -1723,7 +1540,7 @@
               </w:rPr>
               <w:t>13.2 EXECUÇÃO DOS TESTES</w:t>
               <w:tab/>
-              <w:t>40</w:t>
+              <w:t>39</w:t>
             </w:r>
           </w:hyperlink>
         </w:p>
@@ -1736,7 +1553,7 @@
             </w:tabs>
             <w:rPr/>
           </w:pPr>
-          <w:hyperlink w:anchor="__RefHeading___Toc3161_634922549">
+          <w:hyperlink w:anchor="__RefHeading___Toc3150_3157206431">
             <w:r>
               <w:rPr>
                 <w:webHidden/>
@@ -1744,7 +1561,7 @@
               </w:rPr>
               <w:t>14 DEPLOYMENT E DEVOPS</w:t>
               <w:tab/>
-              <w:t>42</w:t>
+              <w:t>41</w:t>
             </w:r>
           </w:hyperlink>
         </w:p>
@@ -1757,7 +1574,7 @@
             </w:tabs>
             <w:rPr/>
           </w:pPr>
-          <w:hyperlink w:anchor="__RefHeading___Toc3163_634922549">
+          <w:hyperlink w:anchor="__RefHeading___Toc3152_3157206431">
             <w:r>
               <w:rPr>
                 <w:webHidden/>
@@ -1765,7 +1582,7 @@
               </w:rPr>
               <w:t>14.1 PIPELINE DE INTEGRAÇÃO E ENTREGA CONTÍNUA</w:t>
               <w:tab/>
-              <w:t>42</w:t>
+              <w:t>41</w:t>
             </w:r>
           </w:hyperlink>
         </w:p>
@@ -1778,7 +1595,7 @@
             </w:tabs>
             <w:rPr/>
           </w:pPr>
-          <w:hyperlink w:anchor="__RefHeading___Toc3165_634922549">
+          <w:hyperlink w:anchor="__RefHeading___Toc3154_3157206431">
             <w:r>
               <w:rPr>
                 <w:webHidden/>
@@ -1786,7 +1603,7 @@
               </w:rPr>
               <w:t>14.1.1 Etapas do Pipeline</w:t>
               <w:tab/>
-              <w:t>42</w:t>
+              <w:t>41</w:t>
             </w:r>
           </w:hyperlink>
         </w:p>
@@ -1799,7 +1616,7 @@
             </w:tabs>
             <w:rPr/>
           </w:pPr>
-          <w:hyperlink w:anchor="__RefHeading___Toc3167_634922549">
+          <w:hyperlink w:anchor="__RefHeading___Toc3156_3157206431">
             <w:r>
               <w:rPr>
                 <w:webHidden/>
@@ -1807,7 +1624,7 @@
               </w:rPr>
               <w:t>14.1.2 Critérios de Aprovação</w:t>
               <w:tab/>
-              <w:t>43</w:t>
+              <w:t>42</w:t>
             </w:r>
           </w:hyperlink>
         </w:p>
@@ -1820,7 +1637,7 @@
             </w:tabs>
             <w:rPr/>
           </w:pPr>
-          <w:hyperlink w:anchor="__RefHeading___Toc3169_634922549">
+          <w:hyperlink w:anchor="__RefHeading___Toc3158_3157206431">
             <w:r>
               <w:rPr>
                 <w:webHidden/>
@@ -1828,7 +1645,7 @@
               </w:rPr>
               <w:t>14.1.3 Tratamento de Segredos</w:t>
               <w:tab/>
-              <w:t>43</w:t>
+              <w:t>42</w:t>
             </w:r>
           </w:hyperlink>
         </w:p>
@@ -1841,7 +1658,7 @@
             </w:tabs>
             <w:rPr/>
           </w:pPr>
-          <w:hyperlink w:anchor="__RefHeading___Toc3171_634922549">
+          <w:hyperlink w:anchor="__RefHeading___Toc3160_3157206431">
             <w:r>
               <w:rPr>
                 <w:webHidden/>
@@ -1849,7 +1666,7 @@
               </w:rPr>
               <w:t>14.2 AMBIENTES</w:t>
               <w:tab/>
-              <w:t>43</w:t>
+              <w:t>42</w:t>
             </w:r>
           </w:hyperlink>
         </w:p>
@@ -1862,7 +1679,7 @@
             </w:tabs>
             <w:rPr/>
           </w:pPr>
-          <w:hyperlink w:anchor="__RefHeading___Toc3173_634922549">
+          <w:hyperlink w:anchor="__RefHeading___Toc3162_3157206431">
             <w:r>
               <w:rPr>
                 <w:webHidden/>
@@ -1870,7 +1687,7 @@
               </w:rPr>
               <w:t>15 PERFORMANCE E OTIMIZAÇÃO</w:t>
               <w:tab/>
-              <w:t>46</w:t>
+              <w:t>45</w:t>
             </w:r>
           </w:hyperlink>
         </w:p>
@@ -1883,7 +1700,7 @@
             </w:tabs>
             <w:rPr/>
           </w:pPr>
-          <w:hyperlink w:anchor="__RefHeading___Toc3175_634922549">
+          <w:hyperlink w:anchor="__RefHeading___Toc3164_3157206431">
             <w:r>
               <w:rPr>
                 <w:webHidden/>
@@ -1891,7 +1708,7 @@
               </w:rPr>
               <w:t>15.1 MÉTRICAS DE EFICIÊNCIA</w:t>
               <w:tab/>
-              <w:t>46</w:t>
+              <w:t>45</w:t>
             </w:r>
           </w:hyperlink>
         </w:p>
@@ -1904,7 +1721,7 @@
             </w:tabs>
             <w:rPr/>
           </w:pPr>
-          <w:hyperlink w:anchor="__RefHeading___Toc3177_634922549">
+          <w:hyperlink w:anchor="__RefHeading___Toc3166_3157206431">
             <w:r>
               <w:rPr>
                 <w:webHidden/>
@@ -1912,7 +1729,7 @@
               </w:rPr>
               <w:t>16 TROUBLESHOOTING</w:t>
               <w:tab/>
-              <w:t>48</w:t>
+              <w:t>47</w:t>
             </w:r>
           </w:hyperlink>
         </w:p>
@@ -1925,7 +1742,7 @@
             </w:tabs>
             <w:rPr/>
           </w:pPr>
-          <w:hyperlink w:anchor="__RefHeading___Toc3179_634922549">
+          <w:hyperlink w:anchor="__RefHeading___Toc3168_3157206431">
             <w:r>
               <w:rPr>
                 <w:webHidden/>
@@ -1933,7 +1750,7 @@
               </w:rPr>
               <w:t>16.1 PROBLEMAS COMUNS</w:t>
               <w:tab/>
-              <w:t>48</w:t>
+              <w:t>47</w:t>
             </w:r>
           </w:hyperlink>
         </w:p>
@@ -1946,7 +1763,7 @@
             </w:tabs>
             <w:rPr/>
           </w:pPr>
-          <w:hyperlink w:anchor="__RefHeading___Toc3181_634922549">
+          <w:hyperlink w:anchor="__RefHeading___Toc3170_3157206431">
             <w:r>
               <w:rPr>
                 <w:webHidden/>
@@ -1954,7 +1771,7 @@
               </w:rPr>
               <w:t>REFERÊNCIAS</w:t>
               <w:tab/>
-              <w:t>50</w:t>
+              <w:t>49</w:t>
             </w:r>
           </w:hyperlink>
         </w:p>
@@ -1967,7 +1784,7 @@
             </w:tabs>
             <w:rPr/>
           </w:pPr>
-          <w:hyperlink w:anchor="__RefHeading___Toc3183_634922549">
+          <w:hyperlink w:anchor="__RefHeading___Toc3172_3157206431">
             <w:r>
               <w:rPr>
                 <w:webHidden/>
@@ -1975,7 +1792,238 @@
               </w:rPr>
               <w:t>APÊNDICE A — DIAGRAMAS DE MODELAGEM</w:t>
               <w:tab/>
+              <w:t>51</w:t>
+            </w:r>
+          </w:hyperlink>
+        </w:p>
+        <w:p>
+          <w:pPr>
+            <w:pStyle w:val="TOC2"/>
+            <w:tabs>
+              <w:tab w:val="clear" w:pos="9071"/>
+              <w:tab w:val="right" w:pos="9070" w:leader="dot"/>
+            </w:tabs>
+            <w:rPr/>
+          </w:pPr>
+          <w:hyperlink w:anchor="__RefHeading___Toc3174_3157206431">
+            <w:r>
+              <w:rPr>
+                <w:webHidden/>
+                <w:rStyle w:val="IndexLink"/>
+              </w:rPr>
+              <w:t>Apêndice A.1a — Diagrama de Casos de Uso: Visitante e Participante</w:t>
+              <w:tab/>
               <w:t>52</w:t>
+            </w:r>
+          </w:hyperlink>
+        </w:p>
+        <w:p>
+          <w:pPr>
+            <w:pStyle w:val="TOC2"/>
+            <w:tabs>
+              <w:tab w:val="clear" w:pos="9071"/>
+              <w:tab w:val="right" w:pos="9070" w:leader="dot"/>
+            </w:tabs>
+            <w:rPr/>
+          </w:pPr>
+          <w:hyperlink w:anchor="__RefHeading___Toc3176_3157206431">
+            <w:r>
+              <w:rPr>
+                <w:webHidden/>
+                <w:rStyle w:val="IndexLink"/>
+              </w:rPr>
+              <w:t>Apêndice A.1b — Diagrama de Casos de Uso: Organizador</w:t>
+              <w:tab/>
+              <w:t>53</w:t>
+            </w:r>
+          </w:hyperlink>
+        </w:p>
+        <w:p>
+          <w:pPr>
+            <w:pStyle w:val="TOC2"/>
+            <w:tabs>
+              <w:tab w:val="clear" w:pos="9071"/>
+              <w:tab w:val="right" w:pos="9070" w:leader="dot"/>
+            </w:tabs>
+            <w:rPr/>
+          </w:pPr>
+          <w:hyperlink w:anchor="__RefHeading___Toc3178_3157206431">
+            <w:r>
+              <w:rPr>
+                <w:webHidden/>
+                <w:rStyle w:val="IndexLink"/>
+              </w:rPr>
+              <w:t>Apêndice A.2a — Diagrama de Classes: Usuários, Eventos e Inscrições</w:t>
+              <w:tab/>
+              <w:t>54</w:t>
+            </w:r>
+          </w:hyperlink>
+        </w:p>
+        <w:p>
+          <w:pPr>
+            <w:pStyle w:val="TOC2"/>
+            <w:tabs>
+              <w:tab w:val="clear" w:pos="9071"/>
+              <w:tab w:val="right" w:pos="9070" w:leader="dot"/>
+            </w:tabs>
+            <w:rPr/>
+          </w:pPr>
+          <w:hyperlink w:anchor="__RefHeading___Toc3180_3157206431">
+            <w:r>
+              <w:rPr>
+                <w:webHidden/>
+                <w:rStyle w:val="IndexLink"/>
+              </w:rPr>
+              <w:t>Apêndice A.2b — Diagrama de Classes: Participação e Inteligência Artificial</w:t>
+              <w:tab/>
+              <w:t>55</w:t>
+            </w:r>
+          </w:hyperlink>
+        </w:p>
+        <w:p>
+          <w:pPr>
+            <w:pStyle w:val="TOC2"/>
+            <w:tabs>
+              <w:tab w:val="clear" w:pos="9071"/>
+              <w:tab w:val="right" w:pos="9070" w:leader="dot"/>
+            </w:tabs>
+            <w:rPr/>
+          </w:pPr>
+          <w:hyperlink w:anchor="__RefHeading___Toc3182_3157206431">
+            <w:r>
+              <w:rPr>
+                <w:webHidden/>
+                <w:rStyle w:val="IndexLink"/>
+              </w:rPr>
+              <w:t>Apêndice A.3a — Diagrama de Estados: Inscrição</w:t>
+              <w:tab/>
+              <w:t>56</w:t>
+            </w:r>
+          </w:hyperlink>
+        </w:p>
+        <w:p>
+          <w:pPr>
+            <w:pStyle w:val="TOC2"/>
+            <w:tabs>
+              <w:tab w:val="clear" w:pos="9071"/>
+              <w:tab w:val="right" w:pos="9070" w:leader="dot"/>
+            </w:tabs>
+            <w:rPr/>
+          </w:pPr>
+          <w:hyperlink w:anchor="__RefHeading___Toc3184_3157206431">
+            <w:r>
+              <w:rPr>
+                <w:webHidden/>
+                <w:rStyle w:val="IndexLink"/>
+              </w:rPr>
+              <w:t>Apêndice A.3b — Diagrama de Estados: Evento</w:t>
+              <w:tab/>
+              <w:t>57</w:t>
+            </w:r>
+          </w:hyperlink>
+        </w:p>
+        <w:p>
+          <w:pPr>
+            <w:pStyle w:val="TOC2"/>
+            <w:tabs>
+              <w:tab w:val="clear" w:pos="9071"/>
+              <w:tab w:val="right" w:pos="9070" w:leader="dot"/>
+            </w:tabs>
+            <w:rPr/>
+          </w:pPr>
+          <w:hyperlink w:anchor="__RefHeading___Toc3186_3157206431">
+            <w:r>
+              <w:rPr>
+                <w:webHidden/>
+                <w:rStyle w:val="IndexLink"/>
+              </w:rPr>
+              <w:t>Apêndice A.4 — Diagrama de Atividades: Cadastro de Evento Assistido por IA</w:t>
+              <w:tab/>
+              <w:t>58</w:t>
+            </w:r>
+          </w:hyperlink>
+        </w:p>
+        <w:p>
+          <w:pPr>
+            <w:pStyle w:val="TOC2"/>
+            <w:tabs>
+              <w:tab w:val="clear" w:pos="9071"/>
+              <w:tab w:val="right" w:pos="9070" w:leader="dot"/>
+            </w:tabs>
+            <w:rPr/>
+          </w:pPr>
+          <w:hyperlink w:anchor="__RefHeading___Toc3188_3157206431">
+            <w:r>
+              <w:rPr>
+                <w:webHidden/>
+                <w:rStyle w:val="IndexLink"/>
+              </w:rPr>
+              <w:t>Apêndice A.5 — Diagrama de Interação: Cadastro de Evento via IA</w:t>
+              <w:tab/>
+              <w:t>59</w:t>
+            </w:r>
+          </w:hyperlink>
+        </w:p>
+        <w:p>
+          <w:pPr>
+            <w:pStyle w:val="TOC2"/>
+            <w:tabs>
+              <w:tab w:val="clear" w:pos="9071"/>
+              <w:tab w:val="right" w:pos="9070" w:leader="dot"/>
+            </w:tabs>
+            <w:rPr/>
+          </w:pPr>
+          <w:hyperlink w:anchor="__RefHeading___Toc3190_3157206431">
+            <w:r>
+              <w:rPr>
+                <w:webHidden/>
+                <w:rStyle w:val="IndexLink"/>
+              </w:rPr>
+              <w:t>Apêndice A.6a — Diagrama de Interação: Emissão de Certificado</w:t>
+              <w:tab/>
+              <w:t>60</w:t>
+            </w:r>
+          </w:hyperlink>
+        </w:p>
+        <w:p>
+          <w:pPr>
+            <w:pStyle w:val="TOC2"/>
+            <w:tabs>
+              <w:tab w:val="clear" w:pos="9071"/>
+              <w:tab w:val="right" w:pos="9070" w:leader="dot"/>
+            </w:tabs>
+            <w:rPr/>
+          </w:pPr>
+          <w:hyperlink w:anchor="__RefHeading___Toc3192_3157206431">
+            <w:r>
+              <w:rPr>
+                <w:webHidden/>
+                <w:rStyle w:val="IndexLink"/>
+              </w:rPr>
+              <w:t>Apêndice A.6b — Diagrama de Interação: Download do Certificado</w:t>
+              <w:tab/>
+              <w:t>61</w:t>
+            </w:r>
+          </w:hyperlink>
+        </w:p>
+        <w:p>
+          <w:pPr>
+            <w:pStyle w:val="TOC2"/>
+            <w:tabs>
+              <w:tab w:val="clear" w:pos="9071"/>
+              <w:tab w:val="right" w:pos="9070" w:leader="dot"/>
+            </w:tabs>
+            <w:rPr/>
+          </w:pPr>
+          <w:hyperlink w:anchor="__RefHeading___Toc3194_3157206431">
+            <w:r>
+              <w:rPr>
+                <w:webHidden/>
+                <w:rStyle w:val="IndexLink"/>
+              </w:rPr>
+              <w:t>Apêndice A.7 — Diagrama de Componentes</w:t>
+              <w:tab/>
+              <w:t>62</w:t>
             </w:r>
           </w:hyperlink>
         </w:p>
@@ -1988,7 +2036,7 @@
             </w:tabs>
             <w:rPr/>
           </w:pPr>
-          <w:hyperlink w:anchor="__RefHeading___Toc3185_634922549">
+          <w:hyperlink w:anchor="__RefHeading___Toc3196_3157206431">
             <w:r>
               <w:rPr>
                 <w:webHidden/>
@@ -1996,7 +2044,7 @@
               </w:rPr>
               <w:t>APÊNDICE B — VARIÁVEIS DE AMBIENTE</w:t>
               <w:tab/>
-              <w:t>64</w:t>
+              <w:t>63</w:t>
             </w:r>
           </w:hyperlink>
         </w:p>
@@ -2009,7 +2057,7 @@
             </w:tabs>
             <w:rPr/>
           </w:pPr>
-          <w:hyperlink w:anchor="__RefHeading___Toc3187_634922549">
+          <w:hyperlink w:anchor="__RefHeading___Toc3198_3157206431">
             <w:r>
               <w:rPr>
                 <w:webHidden/>
@@ -2017,7 +2065,7 @@
               </w:rPr>
               <w:t>APÊNDICE C — GLOSSÁRIO</w:t>
               <w:tab/>
-              <w:t>65</w:t>
+              <w:t>64</w:t>
             </w:r>
           </w:hyperlink>
           <w:r>
@@ -2050,7 +2098,7 @@
         <w:jc w:val="left"/>
         <w:rPr/>
       </w:pPr>
-      <w:bookmarkStart w:id="0" w:name="__RefHeading___Toc3041_634922549"/>
+      <w:bookmarkStart w:id="0" w:name="__RefHeading___Toc3030_3157206431"/>
       <w:bookmarkEnd w:id="0"/>
       <w:r>
         <w:rPr>
@@ -2071,7 +2119,7 @@
         <w:jc w:val="left"/>
         <w:rPr/>
       </w:pPr>
-      <w:bookmarkStart w:id="1" w:name="__RefHeading___Toc3043_634922549"/>
+      <w:bookmarkStart w:id="1" w:name="__RefHeading___Toc3032_3157206431"/>
       <w:bookmarkEnd w:id="1"/>
       <w:r>
         <w:rPr>
@@ -2174,7 +2222,7 @@
         <w:jc w:val="left"/>
         <w:rPr/>
       </w:pPr>
-      <w:bookmarkStart w:id="2" w:name="__RefHeading___Toc3045_634922549"/>
+      <w:bookmarkStart w:id="2" w:name="__RefHeading___Toc3034_3157206431"/>
       <w:bookmarkEnd w:id="2"/>
       <w:r>
         <w:rPr>
@@ -2193,7 +2241,7 @@
         <w:jc w:val="left"/>
         <w:rPr/>
       </w:pPr>
-      <w:bookmarkStart w:id="3" w:name="__RefHeading___Toc3047_634922549"/>
+      <w:bookmarkStart w:id="3" w:name="__RefHeading___Toc3036_3157206431"/>
       <w:bookmarkEnd w:id="3"/>
       <w:r>
         <w:rPr>
@@ -2235,7 +2283,7 @@
         <w:jc w:val="left"/>
         <w:rPr/>
       </w:pPr>
-      <w:bookmarkStart w:id="4" w:name="__RefHeading___Toc3049_634922549"/>
+      <w:bookmarkStart w:id="4" w:name="__RefHeading___Toc3038_3157206431"/>
       <w:bookmarkEnd w:id="4"/>
       <w:r>
         <w:rPr>
@@ -2375,7 +2423,7 @@
         <w:jc w:val="left"/>
         <w:rPr/>
       </w:pPr>
-      <w:bookmarkStart w:id="5" w:name="__RefHeading___Toc3051_634922549"/>
+      <w:bookmarkStart w:id="5" w:name="__RefHeading___Toc3040_3157206431"/>
       <w:bookmarkEnd w:id="5"/>
       <w:r>
         <w:rPr>
@@ -2438,7 +2486,7 @@
         <w:jc w:val="left"/>
         <w:rPr/>
       </w:pPr>
-      <w:bookmarkStart w:id="6" w:name="__RefHeading___Toc3053_634922549"/>
+      <w:bookmarkStart w:id="6" w:name="__RefHeading___Toc3042_3157206431"/>
       <w:bookmarkEnd w:id="6"/>
       <w:r>
         <w:rPr>
@@ -2565,7 +2613,7 @@
         <w:jc w:val="left"/>
         <w:rPr/>
       </w:pPr>
-      <w:bookmarkStart w:id="7" w:name="__RefHeading___Toc3055_634922549"/>
+      <w:bookmarkStart w:id="7" w:name="__RefHeading___Toc3044_3157206431"/>
       <w:bookmarkEnd w:id="7"/>
       <w:r>
         <w:rPr>
@@ -2795,7 +2843,7 @@
         <w:jc w:val="left"/>
         <w:rPr/>
       </w:pPr>
-      <w:bookmarkStart w:id="8" w:name="__RefHeading___Toc3057_634922549"/>
+      <w:bookmarkStart w:id="8" w:name="__RefHeading___Toc3046_3157206431"/>
       <w:bookmarkEnd w:id="8"/>
       <w:r>
         <w:rPr>
@@ -2816,7 +2864,7 @@
         <w:jc w:val="left"/>
         <w:rPr/>
       </w:pPr>
-      <w:bookmarkStart w:id="9" w:name="__RefHeading___Toc3059_634922549"/>
+      <w:bookmarkStart w:id="9" w:name="__RefHeading___Toc3048_3157206431"/>
       <w:bookmarkEnd w:id="9"/>
       <w:r>
         <w:rPr>
@@ -2898,7 +2946,7 @@
         <w:jc w:val="left"/>
         <w:rPr/>
       </w:pPr>
-      <w:bookmarkStart w:id="10" w:name="__RefHeading___Toc3061_634922549"/>
+      <w:bookmarkStart w:id="10" w:name="__RefHeading___Toc3050_3157206431"/>
       <w:bookmarkEnd w:id="10"/>
       <w:r>
         <w:rPr>
@@ -2980,7 +3028,7 @@
         <w:jc w:val="left"/>
         <w:rPr/>
       </w:pPr>
-      <w:bookmarkStart w:id="11" w:name="__RefHeading___Toc3063_634922549"/>
+      <w:bookmarkStart w:id="11" w:name="__RefHeading___Toc3052_3157206431"/>
       <w:bookmarkEnd w:id="11"/>
       <w:r>
         <w:rPr>
@@ -3044,7 +3092,7 @@
         <w:jc w:val="left"/>
         <w:rPr/>
       </w:pPr>
-      <w:bookmarkStart w:id="12" w:name="__RefHeading___Toc3065_634922549"/>
+      <w:bookmarkStart w:id="12" w:name="__RefHeading___Toc3054_3157206431"/>
       <w:bookmarkEnd w:id="12"/>
       <w:r>
         <w:rPr>
@@ -3065,7 +3113,7 @@
         <w:jc w:val="left"/>
         <w:rPr/>
       </w:pPr>
-      <w:bookmarkStart w:id="13" w:name="__RefHeading___Toc3067_634922549"/>
+      <w:bookmarkStart w:id="13" w:name="__RefHeading___Toc3056_3157206431"/>
       <w:bookmarkEnd w:id="13"/>
       <w:r>
         <w:rPr>
@@ -3254,7 +3302,7 @@
         <w:jc w:val="left"/>
         <w:rPr/>
       </w:pPr>
-      <w:bookmarkStart w:id="14" w:name="__RefHeading___Toc3069_634922549"/>
+      <w:bookmarkStart w:id="14" w:name="__RefHeading___Toc3058_3157206431"/>
       <w:bookmarkEnd w:id="14"/>
       <w:r>
         <w:rPr>
@@ -3361,7 +3409,7 @@
         <w:jc w:val="left"/>
         <w:rPr/>
       </w:pPr>
-      <w:bookmarkStart w:id="15" w:name="__RefHeading___Toc3071_634922549"/>
+      <w:bookmarkStart w:id="15" w:name="__RefHeading___Toc3060_3157206431"/>
       <w:bookmarkEnd w:id="15"/>
       <w:r>
         <w:rPr>
@@ -3403,7 +3451,7 @@
         <w:jc w:val="left"/>
         <w:rPr/>
       </w:pPr>
-      <w:bookmarkStart w:id="16" w:name="__RefHeading___Toc3073_634922549"/>
+      <w:bookmarkStart w:id="16" w:name="__RefHeading___Toc3062_3157206431"/>
       <w:bookmarkEnd w:id="16"/>
       <w:r>
         <w:rPr>
@@ -3707,7 +3755,7 @@
         <w:jc w:val="left"/>
         <w:rPr/>
       </w:pPr>
-      <w:bookmarkStart w:id="17" w:name="__RefHeading___Toc3075_634922549"/>
+      <w:bookmarkStart w:id="17" w:name="__RefHeading___Toc3064_3157206431"/>
       <w:bookmarkEnd w:id="17"/>
       <w:r>
         <w:rPr>
@@ -4014,7 +4062,7 @@
         <w:jc w:val="left"/>
         <w:rPr/>
       </w:pPr>
-      <w:bookmarkStart w:id="18" w:name="__RefHeading___Toc3077_634922549"/>
+      <w:bookmarkStart w:id="18" w:name="__RefHeading___Toc3066_3157206431"/>
       <w:bookmarkEnd w:id="18"/>
       <w:r>
         <w:rPr>
@@ -4035,7 +4083,7 @@
         <w:jc w:val="left"/>
         <w:rPr/>
       </w:pPr>
-      <w:bookmarkStart w:id="19" w:name="__RefHeading___Toc3079_634922549"/>
+      <w:bookmarkStart w:id="19" w:name="__RefHeading___Toc3068_3157206431"/>
       <w:bookmarkEnd w:id="19"/>
       <w:r>
         <w:rPr>
@@ -5214,7 +5262,7 @@
         <w:jc w:val="left"/>
         <w:rPr/>
       </w:pPr>
-      <w:bookmarkStart w:id="20" w:name="__RefHeading___Toc3081_634922549"/>
+      <w:bookmarkStart w:id="20" w:name="__RefHeading___Toc3070_3157206431"/>
       <w:bookmarkEnd w:id="20"/>
       <w:r>
         <w:rPr>
@@ -5932,7 +5980,7 @@
         <w:jc w:val="left"/>
         <w:rPr/>
       </w:pPr>
-      <w:bookmarkStart w:id="21" w:name="__RefHeading___Toc3083_634922549"/>
+      <w:bookmarkStart w:id="21" w:name="__RefHeading___Toc3072_3157206431"/>
       <w:bookmarkEnd w:id="21"/>
       <w:r>
         <w:rPr>
@@ -5953,7 +6001,7 @@
         <w:jc w:val="left"/>
         <w:rPr/>
       </w:pPr>
-      <w:bookmarkStart w:id="22" w:name="__RefHeading___Toc3085_634922549"/>
+      <w:bookmarkStart w:id="22" w:name="__RefHeading___Toc3074_3157206431"/>
       <w:bookmarkEnd w:id="22"/>
       <w:r>
         <w:rPr>
@@ -6077,7 +6125,7 @@
         <w:jc w:val="left"/>
         <w:rPr/>
       </w:pPr>
-      <w:bookmarkStart w:id="23" w:name="__RefHeading___Toc3087_634922549"/>
+      <w:bookmarkStart w:id="23" w:name="__RefHeading___Toc3076_3157206431"/>
       <w:bookmarkEnd w:id="23"/>
       <w:r>
         <w:rPr>
@@ -6795,7 +6843,7 @@
         <w:jc w:val="left"/>
         <w:rPr/>
       </w:pPr>
-      <w:bookmarkStart w:id="24" w:name="__RefHeading___Toc3089_634922549"/>
+      <w:bookmarkStart w:id="24" w:name="__RefHeading___Toc3078_3157206431"/>
       <w:bookmarkEnd w:id="24"/>
       <w:r>
         <w:rPr>
@@ -6816,7 +6864,7 @@
         <w:jc w:val="left"/>
         <w:rPr/>
       </w:pPr>
-      <w:bookmarkStart w:id="25" w:name="__RefHeading___Toc3091_634922549"/>
+      <w:bookmarkStart w:id="25" w:name="__RefHeading___Toc3080_3157206431"/>
       <w:bookmarkEnd w:id="25"/>
       <w:r>
         <w:rPr>
@@ -8254,7 +8302,7 @@
         <w:jc w:val="left"/>
         <w:rPr/>
       </w:pPr>
-      <w:bookmarkStart w:id="26" w:name="__RefHeading___Toc3093_634922549"/>
+      <w:bookmarkStart w:id="26" w:name="__RefHeading___Toc3082_3157206431"/>
       <w:bookmarkEnd w:id="26"/>
       <w:r>
         <w:rPr>
@@ -10405,7 +10453,7 @@
         <w:jc w:val="left"/>
         <w:rPr/>
       </w:pPr>
-      <w:bookmarkStart w:id="27" w:name="__RefHeading___Toc3095_634922549"/>
+      <w:bookmarkStart w:id="27" w:name="__RefHeading___Toc3084_3157206431"/>
       <w:bookmarkEnd w:id="27"/>
       <w:r>
         <w:rPr>
@@ -10445,7 +10493,7 @@
         <w:jc w:val="left"/>
         <w:rPr/>
       </w:pPr>
-      <w:bookmarkStart w:id="28" w:name="__RefHeading___Toc3097_634922549"/>
+      <w:bookmarkStart w:id="28" w:name="__RefHeading___Toc3086_3157206431"/>
       <w:bookmarkEnd w:id="28"/>
       <w:r>
         <w:rPr>
@@ -11206,7 +11254,7 @@
         <w:jc w:val="left"/>
         <w:rPr/>
       </w:pPr>
-      <w:bookmarkStart w:id="29" w:name="__RefHeading___Toc3099_634922549"/>
+      <w:bookmarkStart w:id="29" w:name="__RefHeading___Toc3088_3157206431"/>
       <w:bookmarkEnd w:id="29"/>
       <w:r>
         <w:rPr>
@@ -11729,7 +11777,7 @@
         <w:jc w:val="left"/>
         <w:rPr/>
       </w:pPr>
-      <w:bookmarkStart w:id="30" w:name="__RefHeading___Toc3101_634922549"/>
+      <w:bookmarkStart w:id="30" w:name="__RefHeading___Toc3090_3157206431"/>
       <w:bookmarkEnd w:id="30"/>
       <w:r>
         <w:rPr>
@@ -13323,7 +13371,7 @@
         <w:jc w:val="left"/>
         <w:rPr/>
       </w:pPr>
-      <w:bookmarkStart w:id="31" w:name="__RefHeading___Toc3103_634922549"/>
+      <w:bookmarkStart w:id="31" w:name="__RefHeading___Toc3092_3157206431"/>
       <w:bookmarkEnd w:id="31"/>
       <w:r>
         <w:rPr>
@@ -13965,7 +14013,7 @@
         <w:jc w:val="left"/>
         <w:rPr/>
       </w:pPr>
-      <w:bookmarkStart w:id="32" w:name="__RefHeading___Toc3105_634922549"/>
+      <w:bookmarkStart w:id="32" w:name="__RefHeading___Toc3094_3157206431"/>
       <w:bookmarkEnd w:id="32"/>
       <w:r>
         <w:rPr>
@@ -14845,7 +14893,7 @@
         <w:jc w:val="left"/>
         <w:rPr/>
       </w:pPr>
-      <w:bookmarkStart w:id="33" w:name="__RefHeading___Toc3107_634922549"/>
+      <w:bookmarkStart w:id="33" w:name="__RefHeading___Toc3096_3157206431"/>
       <w:bookmarkEnd w:id="33"/>
       <w:r>
         <w:rPr>
@@ -15487,7 +15535,7 @@
         <w:jc w:val="left"/>
         <w:rPr/>
       </w:pPr>
-      <w:bookmarkStart w:id="34" w:name="__RefHeading___Toc3109_634922549"/>
+      <w:bookmarkStart w:id="34" w:name="__RefHeading___Toc3098_3157206431"/>
       <w:bookmarkEnd w:id="34"/>
       <w:r>
         <w:rPr>
@@ -16248,7 +16296,7 @@
         <w:jc w:val="left"/>
         <w:rPr/>
       </w:pPr>
-      <w:bookmarkStart w:id="35" w:name="__RefHeading___Toc3111_634922549"/>
+      <w:bookmarkStart w:id="35" w:name="__RefHeading___Toc3100_3157206431"/>
       <w:bookmarkEnd w:id="35"/>
       <w:r>
         <w:rPr>
@@ -17009,7 +17057,7 @@
         <w:jc w:val="left"/>
         <w:rPr/>
       </w:pPr>
-      <w:bookmarkStart w:id="36" w:name="__RefHeading___Toc3113_634922549"/>
+      <w:bookmarkStart w:id="36" w:name="__RefHeading___Toc3102_3157206431"/>
       <w:bookmarkEnd w:id="36"/>
       <w:r>
         <w:rPr>
@@ -17889,7 +17937,7 @@
         <w:jc w:val="left"/>
         <w:rPr/>
       </w:pPr>
-      <w:bookmarkStart w:id="37" w:name="__RefHeading___Toc3115_634922549"/>
+      <w:bookmarkStart w:id="37" w:name="__RefHeading___Toc3104_3157206431"/>
       <w:bookmarkEnd w:id="37"/>
       <w:r>
         <w:rPr>
@@ -18891,7 +18939,7 @@
       <w:r>
         <w:br w:type="page"/>
       </w:r>
-      <w:bookmarkStart w:id="38" w:name="__RefHeading___Toc3117_634922549"/>
+      <w:bookmarkStart w:id="38" w:name="__RefHeading___Toc3106_3157206431"/>
       <w:bookmarkEnd w:id="38"/>
       <w:r>
         <w:rPr>
@@ -19812,7 +19860,7 @@
         <w:jc w:val="left"/>
         <w:rPr/>
       </w:pPr>
-      <w:bookmarkStart w:id="39" w:name="__RefHeading___Toc3119_634922549"/>
+      <w:bookmarkStart w:id="39" w:name="__RefHeading___Toc3108_3157206431"/>
       <w:bookmarkEnd w:id="39"/>
       <w:r>
         <w:rPr>
@@ -21210,7 +21258,7 @@
         <w:jc w:val="left"/>
         <w:rPr/>
       </w:pPr>
-      <w:bookmarkStart w:id="40" w:name="__RefHeading___Toc3121_634922549"/>
+      <w:bookmarkStart w:id="40" w:name="__RefHeading___Toc3110_3157206431"/>
       <w:bookmarkEnd w:id="40"/>
       <w:r>
         <w:rPr>
@@ -21313,7 +21361,7 @@
         <w:jc w:val="left"/>
         <w:rPr/>
       </w:pPr>
-      <w:bookmarkStart w:id="41" w:name="__RefHeading___Toc3123_634922549"/>
+      <w:bookmarkStart w:id="41" w:name="__RefHeading___Toc3112_3157206431"/>
       <w:bookmarkEnd w:id="41"/>
       <w:r>
         <w:rPr>
@@ -21440,7 +21488,7 @@
         <w:jc w:val="left"/>
         <w:rPr/>
       </w:pPr>
-      <w:bookmarkStart w:id="42" w:name="__RefHeading___Toc3125_634922549"/>
+      <w:bookmarkStart w:id="42" w:name="__RefHeading___Toc3114_3157206431"/>
       <w:bookmarkEnd w:id="42"/>
       <w:r>
         <w:rPr>
@@ -21461,7 +21509,7 @@
         <w:jc w:val="left"/>
         <w:rPr/>
       </w:pPr>
-      <w:bookmarkStart w:id="43" w:name="__RefHeading___Toc3127_634922549"/>
+      <w:bookmarkStart w:id="43" w:name="__RefHeading___Toc3116_3157206431"/>
       <w:bookmarkEnd w:id="43"/>
       <w:r>
         <w:rPr>
@@ -21522,7 +21570,7 @@
         <w:jc w:val="left"/>
         <w:rPr/>
       </w:pPr>
-      <w:bookmarkStart w:id="44" w:name="__RefHeading___Toc3129_634922549"/>
+      <w:bookmarkStart w:id="44" w:name="__RefHeading___Toc3118_3157206431"/>
       <w:bookmarkEnd w:id="44"/>
       <w:r>
         <w:rPr>
@@ -21841,7 +21889,7 @@
         <w:jc w:val="left"/>
         <w:rPr/>
       </w:pPr>
-      <w:bookmarkStart w:id="45" w:name="__RefHeading___Toc3131_634922549"/>
+      <w:bookmarkStart w:id="45" w:name="__RefHeading___Toc3120_3157206431"/>
       <w:bookmarkEnd w:id="45"/>
       <w:r>
         <w:rPr>
@@ -21862,7 +21910,7 @@
         <w:jc w:val="left"/>
         <w:rPr/>
       </w:pPr>
-      <w:bookmarkStart w:id="46" w:name="__RefHeading___Toc3133_634922549"/>
+      <w:bookmarkStart w:id="46" w:name="__RefHeading___Toc3122_3157206431"/>
       <w:bookmarkEnd w:id="46"/>
       <w:r>
         <w:rPr>
@@ -21944,7 +21992,7 @@
         <w:jc w:val="left"/>
         <w:rPr/>
       </w:pPr>
-      <w:bookmarkStart w:id="47" w:name="__RefHeading___Toc3135_634922549"/>
+      <w:bookmarkStart w:id="47" w:name="__RefHeading___Toc3124_3157206431"/>
       <w:bookmarkEnd w:id="47"/>
       <w:r>
         <w:rPr>
@@ -22029,7 +22077,7 @@
         <w:jc w:val="left"/>
         <w:rPr/>
       </w:pPr>
-      <w:bookmarkStart w:id="48" w:name="__RefHeading___Toc3137_634922549"/>
+      <w:bookmarkStart w:id="48" w:name="__RefHeading___Toc3126_3157206431"/>
       <w:bookmarkEnd w:id="48"/>
       <w:r>
         <w:rPr>
@@ -22050,7 +22098,7 @@
         <w:jc w:val="left"/>
         <w:rPr/>
       </w:pPr>
-      <w:bookmarkStart w:id="49" w:name="__RefHeading___Toc3139_634922549"/>
+      <w:bookmarkStart w:id="49" w:name="__RefHeading___Toc3128_3157206431"/>
       <w:bookmarkEnd w:id="49"/>
       <w:r>
         <w:rPr>
@@ -22090,7 +22138,7 @@
         <w:jc w:val="left"/>
         <w:rPr/>
       </w:pPr>
-      <w:bookmarkStart w:id="50" w:name="__RefHeading___Toc3141_634922549"/>
+      <w:bookmarkStart w:id="50" w:name="__RefHeading___Toc3130_3157206431"/>
       <w:bookmarkEnd w:id="50"/>
       <w:r>
         <w:rPr>
@@ -22613,7 +22661,7 @@
         <w:jc w:val="left"/>
         <w:rPr/>
       </w:pPr>
-      <w:bookmarkStart w:id="51" w:name="__RefHeading___Toc3143_634922549"/>
+      <w:bookmarkStart w:id="51" w:name="__RefHeading___Toc3132_3157206431"/>
       <w:bookmarkEnd w:id="51"/>
       <w:r>
         <w:rPr>
@@ -23871,7 +23919,7 @@
         <w:jc w:val="left"/>
         <w:rPr/>
       </w:pPr>
-      <w:bookmarkStart w:id="52" w:name="__RefHeading___Toc3145_634922549"/>
+      <w:bookmarkStart w:id="52" w:name="__RefHeading___Toc3134_3157206431"/>
       <w:bookmarkEnd w:id="52"/>
       <w:r>
         <w:rPr>
@@ -24513,7 +24561,7 @@
         <w:jc w:val="left"/>
         <w:rPr/>
       </w:pPr>
-      <w:bookmarkStart w:id="53" w:name="__RefHeading___Toc3147_634922549"/>
+      <w:bookmarkStart w:id="53" w:name="__RefHeading___Toc3136_3157206431"/>
       <w:bookmarkEnd w:id="53"/>
       <w:r>
         <w:rPr>
@@ -25274,7 +25322,7 @@
         <w:jc w:val="left"/>
         <w:rPr/>
       </w:pPr>
-      <w:bookmarkStart w:id="54" w:name="__RefHeading___Toc3149_634922549"/>
+      <w:bookmarkStart w:id="54" w:name="__RefHeading___Toc3138_3157206431"/>
       <w:bookmarkEnd w:id="54"/>
       <w:r>
         <w:rPr>
@@ -25916,7 +25964,7 @@
         <w:jc w:val="left"/>
         <w:rPr/>
       </w:pPr>
-      <w:bookmarkStart w:id="55" w:name="__RefHeading___Toc3151_634922549"/>
+      <w:bookmarkStart w:id="55" w:name="__RefHeading___Toc3140_3157206431"/>
       <w:bookmarkEnd w:id="55"/>
       <w:r>
         <w:rPr>
@@ -26882,7 +26930,7 @@
         <w:jc w:val="left"/>
         <w:rPr/>
       </w:pPr>
-      <w:bookmarkStart w:id="56" w:name="__RefHeading___Toc3153_634922549"/>
+      <w:bookmarkStart w:id="56" w:name="__RefHeading___Toc3142_3157206431"/>
       <w:bookmarkEnd w:id="56"/>
       <w:r>
         <w:rPr>
@@ -27056,7 +27104,7 @@
         <w:jc w:val="left"/>
         <w:rPr/>
       </w:pPr>
-      <w:bookmarkStart w:id="57" w:name="__RefHeading___Toc3155_634922549"/>
+      <w:bookmarkStart w:id="57" w:name="__RefHeading___Toc3144_3157206431"/>
       <w:bookmarkEnd w:id="57"/>
       <w:r>
         <w:rPr>
@@ -27077,7 +27125,7 @@
         <w:jc w:val="left"/>
         <w:rPr/>
       </w:pPr>
-      <w:bookmarkStart w:id="58" w:name="__RefHeading___Toc3157_634922549"/>
+      <w:bookmarkStart w:id="58" w:name="__RefHeading___Toc3146_3157206431"/>
       <w:bookmarkEnd w:id="58"/>
       <w:r>
         <w:rPr>
@@ -27222,7 +27270,7 @@
         <w:jc w:val="left"/>
         <w:rPr/>
       </w:pPr>
-      <w:bookmarkStart w:id="59" w:name="__RefHeading___Toc3159_634922549"/>
+      <w:bookmarkStart w:id="59" w:name="__RefHeading___Toc3148_3157206431"/>
       <w:bookmarkEnd w:id="59"/>
       <w:r>
         <w:rPr>
@@ -27515,7 +27563,7 @@
         <w:jc w:val="left"/>
         <w:rPr/>
       </w:pPr>
-      <w:bookmarkStart w:id="60" w:name="__RefHeading___Toc3161_634922549"/>
+      <w:bookmarkStart w:id="60" w:name="__RefHeading___Toc3150_3157206431"/>
       <w:bookmarkEnd w:id="60"/>
       <w:r>
         <w:rPr>
@@ -27536,7 +27584,7 @@
         <w:jc w:val="left"/>
         <w:rPr/>
       </w:pPr>
-      <w:bookmarkStart w:id="61" w:name="__RefHeading___Toc3163_634922549"/>
+      <w:bookmarkStart w:id="61" w:name="__RefHeading___Toc3152_3157206431"/>
       <w:bookmarkEnd w:id="61"/>
       <w:r>
         <w:rPr>
@@ -27597,7 +27645,7 @@
         <w:jc w:val="left"/>
         <w:rPr/>
       </w:pPr>
-      <w:bookmarkStart w:id="62" w:name="__RefHeading___Toc3165_634922549"/>
+      <w:bookmarkStart w:id="62" w:name="__RefHeading___Toc3154_3157206431"/>
       <w:bookmarkEnd w:id="62"/>
       <w:r>
         <w:rPr>
@@ -27681,7 +27729,7 @@
         <w:jc w:val="left"/>
         <w:rPr/>
       </w:pPr>
-      <w:bookmarkStart w:id="63" w:name="__RefHeading___Toc3167_634922549"/>
+      <w:bookmarkStart w:id="63" w:name="__RefHeading___Toc3156_3157206431"/>
       <w:bookmarkEnd w:id="63"/>
       <w:r>
         <w:rPr>
@@ -27744,7 +27792,7 @@
         <w:jc w:val="left"/>
         <w:rPr/>
       </w:pPr>
-      <w:bookmarkStart w:id="64" w:name="__RefHeading___Toc3169_634922549"/>
+      <w:bookmarkStart w:id="64" w:name="__RefHeading___Toc3158_3157206431"/>
       <w:bookmarkEnd w:id="64"/>
       <w:r>
         <w:rPr>
@@ -27786,7 +27834,7 @@
         <w:jc w:val="left"/>
         <w:rPr/>
       </w:pPr>
-      <w:bookmarkStart w:id="65" w:name="__RefHeading___Toc3171_634922549"/>
+      <w:bookmarkStart w:id="65" w:name="__RefHeading___Toc3160_3157206431"/>
       <w:bookmarkEnd w:id="65"/>
       <w:r>
         <w:rPr>
@@ -28436,7 +28484,7 @@
         <w:jc w:val="left"/>
         <w:rPr/>
       </w:pPr>
-      <w:bookmarkStart w:id="66" w:name="__RefHeading___Toc3173_634922549"/>
+      <w:bookmarkStart w:id="66" w:name="__RefHeading___Toc3162_3157206431"/>
       <w:bookmarkEnd w:id="66"/>
       <w:r>
         <w:rPr>
@@ -28457,7 +28505,7 @@
         <w:jc w:val="left"/>
         <w:rPr/>
       </w:pPr>
-      <w:bookmarkStart w:id="67" w:name="__RefHeading___Toc3175_634922549"/>
+      <w:bookmarkStart w:id="67" w:name="__RefHeading___Toc3164_3157206431"/>
       <w:bookmarkEnd w:id="67"/>
       <w:r>
         <w:rPr>
@@ -29422,7 +29470,7 @@
         <w:jc w:val="left"/>
         <w:rPr/>
       </w:pPr>
-      <w:bookmarkStart w:id="68" w:name="__RefHeading___Toc3177_634922549"/>
+      <w:bookmarkStart w:id="68" w:name="__RefHeading___Toc3166_3157206431"/>
       <w:bookmarkEnd w:id="68"/>
       <w:r>
         <w:rPr>
@@ -29443,7 +29491,7 @@
         <w:jc w:val="left"/>
         <w:rPr/>
       </w:pPr>
-      <w:bookmarkStart w:id="69" w:name="__RefHeading___Toc3179_634922549"/>
+      <w:bookmarkStart w:id="69" w:name="__RefHeading___Toc3168_3157206431"/>
       <w:bookmarkEnd w:id="69"/>
       <w:r>
         <w:rPr>
@@ -30950,7 +30998,7 @@
       <w:r>
         <w:br w:type="page"/>
       </w:r>
-      <w:bookmarkStart w:id="70" w:name="__RefHeading___Toc3181_634922549"/>
+      <w:bookmarkStart w:id="70" w:name="__RefHeading___Toc3170_3157206431"/>
       <w:bookmarkEnd w:id="70"/>
       <w:r>
         <w:rPr>
@@ -31369,7 +31417,7 @@
         <w:jc w:val="center"/>
         <w:rPr/>
       </w:pPr>
-      <w:bookmarkStart w:id="71" w:name="__RefHeading___Toc3183_634922549"/>
+      <w:bookmarkStart w:id="71" w:name="__RefHeading___Toc3172_3157206431"/>
       <w:bookmarkEnd w:id="71"/>
       <w:r>
         <w:rPr>
@@ -31464,15 +31512,17 @@
     </w:p>
     <w:p>
       <w:pPr>
-        <w:pStyle w:val="Normal"/>
+        <w:pStyle w:val="Heading2"/>
         <w:keepNext w:val="true"/>
         <w:spacing w:lineRule="auto" w:line="240" w:before="240" w:after="60"/>
         <w:jc w:val="left"/>
         <w:rPr/>
       </w:pPr>
-      <w:r>
-        <w:rPr>
-          <w:rFonts w:eastAsia="Arial" w:cs="Arial"/>
+      <w:bookmarkStart w:id="72" w:name="__RefHeading___Toc3174_3157206431"/>
+      <w:bookmarkEnd w:id="72"/>
+      <w:r>
+        <w:rPr>
+          <w:rFonts w:eastAsia="Arial" w:cs="Arial" w:ascii="Arial" w:hAnsi="Arial"/>
           <w:b/>
           <w:bCs/>
           <w:sz w:val="22"/>
@@ -31560,15 +31610,17 @@
     </w:p>
     <w:p>
       <w:pPr>
-        <w:pStyle w:val="Normal"/>
+        <w:pStyle w:val="Heading2"/>
         <w:keepNext w:val="true"/>
         <w:spacing w:lineRule="auto" w:line="240" w:before="240" w:after="60"/>
         <w:jc w:val="left"/>
         <w:rPr/>
       </w:pPr>
-      <w:r>
-        <w:rPr>
-          <w:rFonts w:eastAsia="Arial" w:cs="Arial"/>
+      <w:bookmarkStart w:id="73" w:name="__RefHeading___Toc3176_3157206431"/>
+      <w:bookmarkEnd w:id="73"/>
+      <w:r>
+        <w:rPr>
+          <w:rFonts w:eastAsia="Arial" w:cs="Arial" w:ascii="Arial" w:hAnsi="Arial"/>
           <w:b/>
           <w:bCs/>
           <w:sz w:val="22"/>
@@ -31656,15 +31708,17 @@
     </w:p>
     <w:p>
       <w:pPr>
-        <w:pStyle w:val="Normal"/>
+        <w:pStyle w:val="Heading2"/>
         <w:keepNext w:val="true"/>
         <w:spacing w:lineRule="auto" w:line="240" w:before="240" w:after="60"/>
         <w:jc w:val="left"/>
         <w:rPr/>
       </w:pPr>
-      <w:r>
-        <w:rPr>
-          <w:rFonts w:eastAsia="Arial" w:cs="Arial"/>
+      <w:bookmarkStart w:id="74" w:name="__RefHeading___Toc3178_3157206431"/>
+      <w:bookmarkEnd w:id="74"/>
+      <w:r>
+        <w:rPr>
+          <w:rFonts w:eastAsia="Arial" w:cs="Arial" w:ascii="Arial" w:hAnsi="Arial"/>
           <w:b/>
           <w:bCs/>
           <w:sz w:val="22"/>
@@ -31752,15 +31806,17 @@
     </w:p>
     <w:p>
       <w:pPr>
-        <w:pStyle w:val="Normal"/>
+        <w:pStyle w:val="Heading2"/>
         <w:keepNext w:val="true"/>
         <w:spacing w:lineRule="auto" w:line="240" w:before="240" w:after="60"/>
         <w:jc w:val="left"/>
         <w:rPr/>
       </w:pPr>
-      <w:r>
-        <w:rPr>
-          <w:rFonts w:eastAsia="Arial" w:cs="Arial"/>
+      <w:bookmarkStart w:id="75" w:name="__RefHeading___Toc3180_3157206431"/>
+      <w:bookmarkEnd w:id="75"/>
+      <w:r>
+        <w:rPr>
+          <w:rFonts w:eastAsia="Arial" w:cs="Arial" w:ascii="Arial" w:hAnsi="Arial"/>
           <w:b/>
           <w:bCs/>
           <w:sz w:val="22"/>
@@ -31848,15 +31904,17 @@
     </w:p>
     <w:p>
       <w:pPr>
-        <w:pStyle w:val="Normal"/>
+        <w:pStyle w:val="Heading2"/>
         <w:keepNext w:val="true"/>
         <w:spacing w:lineRule="auto" w:line="240" w:before="240" w:after="60"/>
         <w:jc w:val="left"/>
         <w:rPr/>
       </w:pPr>
-      <w:r>
-        <w:rPr>
-          <w:rFonts w:eastAsia="Arial" w:cs="Arial"/>
+      <w:bookmarkStart w:id="76" w:name="__RefHeading___Toc3182_3157206431"/>
+      <w:bookmarkEnd w:id="76"/>
+      <w:r>
+        <w:rPr>
+          <w:rFonts w:eastAsia="Arial" w:cs="Arial" w:ascii="Arial" w:hAnsi="Arial"/>
           <w:b/>
           <w:bCs/>
           <w:sz w:val="22"/>
@@ -31944,15 +32002,17 @@
     </w:p>
     <w:p>
       <w:pPr>
-        <w:pStyle w:val="Normal"/>
+        <w:pStyle w:val="Heading2"/>
         <w:keepNext w:val="true"/>
         <w:spacing w:lineRule="auto" w:line="240" w:before="240" w:after="60"/>
         <w:jc w:val="left"/>
         <w:rPr/>
       </w:pPr>
-      <w:r>
-        <w:rPr>
-          <w:rFonts w:eastAsia="Arial" w:cs="Arial"/>
+      <w:bookmarkStart w:id="77" w:name="__RefHeading___Toc3184_3157206431"/>
+      <w:bookmarkEnd w:id="77"/>
+      <w:r>
+        <w:rPr>
+          <w:rFonts w:eastAsia="Arial" w:cs="Arial" w:ascii="Arial" w:hAnsi="Arial"/>
           <w:b/>
           <w:bCs/>
           <w:sz w:val="22"/>
@@ -32040,15 +32100,17 @@
     </w:p>
     <w:p>
       <w:pPr>
-        <w:pStyle w:val="Normal"/>
+        <w:pStyle w:val="Heading2"/>
         <w:keepNext w:val="true"/>
         <w:spacing w:lineRule="auto" w:line="240" w:before="240" w:after="60"/>
         <w:jc w:val="left"/>
         <w:rPr/>
       </w:pPr>
-      <w:r>
-        <w:rPr>
-          <w:rFonts w:eastAsia="Arial" w:cs="Arial"/>
+      <w:bookmarkStart w:id="78" w:name="__RefHeading___Toc3186_3157206431"/>
+      <w:bookmarkEnd w:id="78"/>
+      <w:r>
+        <w:rPr>
+          <w:rFonts w:eastAsia="Arial" w:cs="Arial" w:ascii="Arial" w:hAnsi="Arial"/>
           <w:b/>
           <w:bCs/>
           <w:sz w:val="22"/>
@@ -32136,15 +32198,17 @@
     </w:p>
     <w:p>
       <w:pPr>
-        <w:pStyle w:val="Normal"/>
+        <w:pStyle w:val="Heading2"/>
         <w:keepNext w:val="true"/>
         <w:spacing w:lineRule="auto" w:line="240" w:before="240" w:after="60"/>
         <w:jc w:val="left"/>
         <w:rPr/>
       </w:pPr>
-      <w:r>
-        <w:rPr>
-          <w:rFonts w:eastAsia="Arial" w:cs="Arial"/>
+      <w:bookmarkStart w:id="79" w:name="__RefHeading___Toc3188_3157206431"/>
+      <w:bookmarkEnd w:id="79"/>
+      <w:r>
+        <w:rPr>
+          <w:rFonts w:eastAsia="Arial" w:cs="Arial" w:ascii="Arial" w:hAnsi="Arial"/>
           <w:b/>
           <w:bCs/>
           <w:sz w:val="22"/>
@@ -32232,15 +32296,17 @@
     </w:p>
     <w:p>
       <w:pPr>
-        <w:pStyle w:val="Normal"/>
+        <w:pStyle w:val="Heading2"/>
         <w:keepNext w:val="true"/>
         <w:spacing w:lineRule="auto" w:line="240" w:before="240" w:after="60"/>
         <w:jc w:val="left"/>
         <w:rPr/>
       </w:pPr>
-      <w:r>
-        <w:rPr>
-          <w:rFonts w:eastAsia="Arial" w:cs="Arial"/>
+      <w:bookmarkStart w:id="80" w:name="__RefHeading___Toc3190_3157206431"/>
+      <w:bookmarkEnd w:id="80"/>
+      <w:r>
+        <w:rPr>
+          <w:rFonts w:eastAsia="Arial" w:cs="Arial" w:ascii="Arial" w:hAnsi="Arial"/>
           <w:b/>
           <w:bCs/>
           <w:sz w:val="22"/>
@@ -32328,15 +32394,17 @@
     </w:p>
     <w:p>
       <w:pPr>
-        <w:pStyle w:val="Normal"/>
+        <w:pStyle w:val="Heading2"/>
         <w:keepNext w:val="true"/>
         <w:spacing w:lineRule="auto" w:line="240" w:before="240" w:after="60"/>
         <w:jc w:val="left"/>
         <w:rPr/>
       </w:pPr>
-      <w:r>
-        <w:rPr>
-          <w:rFonts w:eastAsia="Arial" w:cs="Arial"/>
+      <w:bookmarkStart w:id="81" w:name="__RefHeading___Toc3192_3157206431"/>
+      <w:bookmarkEnd w:id="81"/>
+      <w:r>
+        <w:rPr>
+          <w:rFonts w:eastAsia="Arial" w:cs="Arial" w:ascii="Arial" w:hAnsi="Arial"/>
           <w:b/>
           <w:bCs/>
           <w:sz w:val="22"/>
@@ -32424,15 +32492,17 @@
     </w:p>
     <w:p>
       <w:pPr>
-        <w:pStyle w:val="Normal"/>
+        <w:pStyle w:val="Heading2"/>
         <w:keepNext w:val="true"/>
         <w:spacing w:lineRule="auto" w:line="240" w:before="240" w:after="60"/>
         <w:jc w:val="left"/>
         <w:rPr/>
       </w:pPr>
-      <w:r>
-        <w:rPr>
-          <w:rFonts w:eastAsia="Arial" w:cs="Arial"/>
+      <w:bookmarkStart w:id="82" w:name="__RefHeading___Toc3194_3157206431"/>
+      <w:bookmarkEnd w:id="82"/>
+      <w:r>
+        <w:rPr>
+          <w:rFonts w:eastAsia="Arial" w:cs="Arial" w:ascii="Arial" w:hAnsi="Arial"/>
           <w:b/>
           <w:bCs/>
           <w:sz w:val="22"/>
@@ -32480,8 +32550,8 @@
         <w:jc w:val="center"/>
         <w:rPr/>
       </w:pPr>
-      <w:bookmarkStart w:id="72" w:name="__RefHeading___Toc3185_634922549"/>
-      <w:bookmarkEnd w:id="72"/>
+      <w:bookmarkStart w:id="83" w:name="__RefHeading___Toc3196_3157206431"/>
+      <w:bookmarkEnd w:id="83"/>
       <w:r>
         <w:rPr>
           <w:rFonts w:eastAsia="Arial" w:cs="Arial" w:ascii="Arial" w:hAnsi="Arial"/>
@@ -33989,8 +34059,8 @@
       <w:r>
         <w:br w:type="page"/>
       </w:r>
-      <w:bookmarkStart w:id="73" w:name="__RefHeading___Toc3187_634922549"/>
-      <w:bookmarkEnd w:id="73"/>
+      <w:bookmarkStart w:id="84" w:name="__RefHeading___Toc3198_3157206431"/>
+      <w:bookmarkEnd w:id="84"/>
       <w:r>
         <w:rPr>
           <w:rFonts w:eastAsia="Arial" w:cs="Arial" w:ascii="Arial" w:hAnsi="Arial"/>
@@ -34963,7 +35033,7 @@
     </w:r>
     <w:r>
       <w:rPr/>
-      <w:t>52</w:t>
+      <w:t>51</w:t>
     </w:r>
     <w:r>
       <w:rPr/>
@@ -34995,7 +35065,7 @@
     </w:r>
     <w:r>
       <w:rPr/>
-      <w:t>57</w:t>
+      <w:t>56</w:t>
     </w:r>
     <w:r>
       <w:rPr/>
@@ -35033,7 +35103,7 @@
     </w:r>
     <w:r>
       <w:rPr/>
-      <w:t>58</w:t>
+      <w:t>57</w:t>
     </w:r>
     <w:r>
       <w:rPr/>
@@ -35071,7 +35141,7 @@
     </w:r>
     <w:r>
       <w:rPr/>
-      <w:t>59</w:t>
+      <w:t>58</w:t>
     </w:r>
     <w:r>
       <w:rPr/>
@@ -35109,7 +35179,7 @@
     </w:r>
     <w:r>
       <w:rPr/>
-      <w:t>60</w:t>
+      <w:t>59</w:t>
     </w:r>
     <w:r>
       <w:rPr/>
@@ -35147,7 +35217,7 @@
     </w:r>
     <w:r>
       <w:rPr/>
-      <w:t>61</w:t>
+      <w:t>60</w:t>
     </w:r>
     <w:r>
       <w:rPr/>
@@ -35185,7 +35255,7 @@
     </w:r>
     <w:r>
       <w:rPr/>
-      <w:t>53</w:t>
+      <w:t>52</w:t>
     </w:r>
     <w:r>
       <w:rPr/>
@@ -35217,7 +35287,7 @@
     </w:r>
     <w:r>
       <w:rPr/>
-      <w:t>62</w:t>
+      <w:t>61</w:t>
     </w:r>
     <w:r>
       <w:rPr/>
@@ -35255,7 +35325,7 @@
     </w:r>
     <w:r>
       <w:rPr/>
-      <w:t>63</w:t>
+      <w:t>62</w:t>
     </w:r>
     <w:r>
       <w:rPr/>
@@ -35293,7 +35363,7 @@
     </w:r>
     <w:r>
       <w:rPr/>
-      <w:t>65</w:t>
+      <w:t>64</w:t>
     </w:r>
     <w:r>
       <w:rPr/>
@@ -35337,7 +35407,7 @@
     </w:r>
     <w:r>
       <w:rPr/>
-      <w:t>54</w:t>
+      <w:t>53</w:t>
     </w:r>
     <w:r>
       <w:rPr/>
@@ -35375,7 +35445,7 @@
     </w:r>
     <w:r>
       <w:rPr/>
-      <w:t>55</w:t>
+      <w:t>54</w:t>
     </w:r>
     <w:r>
       <w:rPr/>
@@ -35413,7 +35483,7 @@
     </w:r>
     <w:r>
       <w:rPr/>
-      <w:t>56</w:t>
+      <w:t>55</w:t>
     </w:r>
     <w:r>
       <w:rPr/>

</xml_diff>

<commit_message>
docs: documentacao atualizada com a nova regra do certificado
As tres versoes (capa e conteudo, ABNT e modelo do professor) passam a
descrever a RN-05 nova: certificado so com presenca e depois do fim do evento,
pelo horario ou pelo encerramento antecipado do organizador. Tambem registram
a sessao guardada por aba, os testes de ponta a ponta atuais (cinco arquivos,
onze verificacoes) e dois itens novos no Troubleshooting: botao de certificado
que nao aparece e evento que some do catalogo.

O diagrama de emissao (A.6a) ganha o ramo EVENTO_NAO_TERMINADO, regerado nos
tres temas, e as legendas de A.6a e A.3b citam a regra.

Co-Authored-By: Claude Opus 5.5 <noreply@anthropic.com>
Claude-Session: https://claude.ai/code/session_011SKCdnRmci1yJCi4ZvMpS2
</commit_message>
<xml_diff>
--- a/docs/Documentacao-ABNT.docx
+++ b/docs/Documentacao-ABNT.docx
@@ -293,7 +293,7 @@
             </w:rPr>
             <w:fldChar w:fldCharType="separate"/>
           </w:r>
-          <w:hyperlink w:anchor="__RefHeading___Toc3030_3157206431">
+          <w:hyperlink w:anchor="__RefHeading___Toc3048_1200781530">
             <w:r>
               <w:rPr>
                 <w:webHidden/>
@@ -314,7 +314,7 @@
             </w:tabs>
             <w:rPr/>
           </w:pPr>
-          <w:hyperlink w:anchor="__RefHeading___Toc3032_3157206431">
+          <w:hyperlink w:anchor="__RefHeading___Toc3050_1200781530">
             <w:r>
               <w:rPr>
                 <w:webHidden/>
@@ -335,7 +335,7 @@
             </w:tabs>
             <w:rPr/>
           </w:pPr>
-          <w:hyperlink w:anchor="__RefHeading___Toc3034_3157206431">
+          <w:hyperlink w:anchor="__RefHeading___Toc3052_1200781530">
             <w:r>
               <w:rPr>
                 <w:webHidden/>
@@ -356,7 +356,7 @@
             </w:tabs>
             <w:rPr/>
           </w:pPr>
-          <w:hyperlink w:anchor="__RefHeading___Toc3036_3157206431">
+          <w:hyperlink w:anchor="__RefHeading___Toc3054_1200781530">
             <w:r>
               <w:rPr>
                 <w:webHidden/>
@@ -377,7 +377,7 @@
             </w:tabs>
             <w:rPr/>
           </w:pPr>
-          <w:hyperlink w:anchor="__RefHeading___Toc3038_3157206431">
+          <w:hyperlink w:anchor="__RefHeading___Toc3056_1200781530">
             <w:r>
               <w:rPr>
                 <w:webHidden/>
@@ -398,7 +398,7 @@
             </w:tabs>
             <w:rPr/>
           </w:pPr>
-          <w:hyperlink w:anchor="__RefHeading___Toc3040_3157206431">
+          <w:hyperlink w:anchor="__RefHeading___Toc3058_1200781530">
             <w:r>
               <w:rPr>
                 <w:webHidden/>
@@ -419,7 +419,7 @@
             </w:tabs>
             <w:rPr/>
           </w:pPr>
-          <w:hyperlink w:anchor="__RefHeading___Toc3042_3157206431">
+          <w:hyperlink w:anchor="__RefHeading___Toc3060_1200781530">
             <w:r>
               <w:rPr>
                 <w:webHidden/>
@@ -440,7 +440,7 @@
             </w:tabs>
             <w:rPr/>
           </w:pPr>
-          <w:hyperlink w:anchor="__RefHeading___Toc3044_3157206431">
+          <w:hyperlink w:anchor="__RefHeading___Toc3062_1200781530">
             <w:r>
               <w:rPr>
                 <w:webHidden/>
@@ -461,7 +461,7 @@
             </w:tabs>
             <w:rPr/>
           </w:pPr>
-          <w:hyperlink w:anchor="__RefHeading___Toc3046_3157206431">
+          <w:hyperlink w:anchor="__RefHeading___Toc3064_1200781530">
             <w:r>
               <w:rPr>
                 <w:webHidden/>
@@ -482,7 +482,7 @@
             </w:tabs>
             <w:rPr/>
           </w:pPr>
-          <w:hyperlink w:anchor="__RefHeading___Toc3048_3157206431">
+          <w:hyperlink w:anchor="__RefHeading___Toc3066_1200781530">
             <w:r>
               <w:rPr>
                 <w:webHidden/>
@@ -503,7 +503,7 @@
             </w:tabs>
             <w:rPr/>
           </w:pPr>
-          <w:hyperlink w:anchor="__RefHeading___Toc3050_3157206431">
+          <w:hyperlink w:anchor="__RefHeading___Toc3068_1200781530">
             <w:r>
               <w:rPr>
                 <w:webHidden/>
@@ -524,7 +524,7 @@
             </w:tabs>
             <w:rPr/>
           </w:pPr>
-          <w:hyperlink w:anchor="__RefHeading___Toc3052_3157206431">
+          <w:hyperlink w:anchor="__RefHeading___Toc3070_1200781530">
             <w:r>
               <w:rPr>
                 <w:webHidden/>
@@ -545,7 +545,7 @@
             </w:tabs>
             <w:rPr/>
           </w:pPr>
-          <w:hyperlink w:anchor="__RefHeading___Toc3054_3157206431">
+          <w:hyperlink w:anchor="__RefHeading___Toc3072_1200781530">
             <w:r>
               <w:rPr>
                 <w:webHidden/>
@@ -566,7 +566,7 @@
             </w:tabs>
             <w:rPr/>
           </w:pPr>
-          <w:hyperlink w:anchor="__RefHeading___Toc3056_3157206431">
+          <w:hyperlink w:anchor="__RefHeading___Toc3074_1200781530">
             <w:r>
               <w:rPr>
                 <w:webHidden/>
@@ -587,7 +587,7 @@
             </w:tabs>
             <w:rPr/>
           </w:pPr>
-          <w:hyperlink w:anchor="__RefHeading___Toc3058_3157206431">
+          <w:hyperlink w:anchor="__RefHeading___Toc3076_1200781530">
             <w:r>
               <w:rPr>
                 <w:webHidden/>
@@ -608,7 +608,7 @@
             </w:tabs>
             <w:rPr/>
           </w:pPr>
-          <w:hyperlink w:anchor="__RefHeading___Toc3060_3157206431">
+          <w:hyperlink w:anchor="__RefHeading___Toc3078_1200781530">
             <w:r>
               <w:rPr>
                 <w:webHidden/>
@@ -629,7 +629,7 @@
             </w:tabs>
             <w:rPr/>
           </w:pPr>
-          <w:hyperlink w:anchor="__RefHeading___Toc3062_3157206431">
+          <w:hyperlink w:anchor="__RefHeading___Toc3080_1200781530">
             <w:r>
               <w:rPr>
                 <w:webHidden/>
@@ -650,7 +650,7 @@
             </w:tabs>
             <w:rPr/>
           </w:pPr>
-          <w:hyperlink w:anchor="__RefHeading___Toc3064_3157206431">
+          <w:hyperlink w:anchor="__RefHeading___Toc3082_1200781530">
             <w:r>
               <w:rPr>
                 <w:webHidden/>
@@ -671,7 +671,7 @@
             </w:tabs>
             <w:rPr/>
           </w:pPr>
-          <w:hyperlink w:anchor="__RefHeading___Toc3066_3157206431">
+          <w:hyperlink w:anchor="__RefHeading___Toc3084_1200781530">
             <w:r>
               <w:rPr>
                 <w:webHidden/>
@@ -692,7 +692,7 @@
             </w:tabs>
             <w:rPr/>
           </w:pPr>
-          <w:hyperlink w:anchor="__RefHeading___Toc3068_3157206431">
+          <w:hyperlink w:anchor="__RefHeading___Toc3086_1200781530">
             <w:r>
               <w:rPr>
                 <w:webHidden/>
@@ -713,7 +713,7 @@
             </w:tabs>
             <w:rPr/>
           </w:pPr>
-          <w:hyperlink w:anchor="__RefHeading___Toc3070_3157206431">
+          <w:hyperlink w:anchor="__RefHeading___Toc3088_1200781530">
             <w:r>
               <w:rPr>
                 <w:webHidden/>
@@ -734,7 +734,7 @@
             </w:tabs>
             <w:rPr/>
           </w:pPr>
-          <w:hyperlink w:anchor="__RefHeading___Toc3072_3157206431">
+          <w:hyperlink w:anchor="__RefHeading___Toc3090_1200781530">
             <w:r>
               <w:rPr>
                 <w:webHidden/>
@@ -755,7 +755,7 @@
             </w:tabs>
             <w:rPr/>
           </w:pPr>
-          <w:hyperlink w:anchor="__RefHeading___Toc3074_3157206431">
+          <w:hyperlink w:anchor="__RefHeading___Toc3092_1200781530">
             <w:r>
               <w:rPr>
                 <w:webHidden/>
@@ -776,7 +776,7 @@
             </w:tabs>
             <w:rPr/>
           </w:pPr>
-          <w:hyperlink w:anchor="__RefHeading___Toc3076_3157206431">
+          <w:hyperlink w:anchor="__RefHeading___Toc3094_1200781530">
             <w:r>
               <w:rPr>
                 <w:webHidden/>
@@ -797,7 +797,7 @@
             </w:tabs>
             <w:rPr/>
           </w:pPr>
-          <w:hyperlink w:anchor="__RefHeading___Toc3078_3157206431">
+          <w:hyperlink w:anchor="__RefHeading___Toc3096_1200781530">
             <w:r>
               <w:rPr>
                 <w:webHidden/>
@@ -818,7 +818,7 @@
             </w:tabs>
             <w:rPr/>
           </w:pPr>
-          <w:hyperlink w:anchor="__RefHeading___Toc3080_3157206431">
+          <w:hyperlink w:anchor="__RefHeading___Toc3098_1200781530">
             <w:r>
               <w:rPr>
                 <w:webHidden/>
@@ -839,7 +839,7 @@
             </w:tabs>
             <w:rPr/>
           </w:pPr>
-          <w:hyperlink w:anchor="__RefHeading___Toc3082_3157206431">
+          <w:hyperlink w:anchor="__RefHeading___Toc3100_1200781530">
             <w:r>
               <w:rPr>
                 <w:webHidden/>
@@ -860,7 +860,7 @@
             </w:tabs>
             <w:rPr/>
           </w:pPr>
-          <w:hyperlink w:anchor="__RefHeading___Toc3084_3157206431">
+          <w:hyperlink w:anchor="__RefHeading___Toc3102_1200781530">
             <w:r>
               <w:rPr>
                 <w:webHidden/>
@@ -881,7 +881,7 @@
             </w:tabs>
             <w:rPr/>
           </w:pPr>
-          <w:hyperlink w:anchor="__RefHeading___Toc3086_3157206431">
+          <w:hyperlink w:anchor="__RefHeading___Toc3104_1200781530">
             <w:r>
               <w:rPr>
                 <w:webHidden/>
@@ -902,7 +902,7 @@
             </w:tabs>
             <w:rPr/>
           </w:pPr>
-          <w:hyperlink w:anchor="__RefHeading___Toc3088_3157206431">
+          <w:hyperlink w:anchor="__RefHeading___Toc3106_1200781530">
             <w:r>
               <w:rPr>
                 <w:webHidden/>
@@ -923,7 +923,7 @@
             </w:tabs>
             <w:rPr/>
           </w:pPr>
-          <w:hyperlink w:anchor="__RefHeading___Toc3090_3157206431">
+          <w:hyperlink w:anchor="__RefHeading___Toc3108_1200781530">
             <w:r>
               <w:rPr>
                 <w:webHidden/>
@@ -944,7 +944,7 @@
             </w:tabs>
             <w:rPr/>
           </w:pPr>
-          <w:hyperlink w:anchor="__RefHeading___Toc3092_3157206431">
+          <w:hyperlink w:anchor="__RefHeading___Toc3110_1200781530">
             <w:r>
               <w:rPr>
                 <w:webHidden/>
@@ -965,7 +965,7 @@
             </w:tabs>
             <w:rPr/>
           </w:pPr>
-          <w:hyperlink w:anchor="__RefHeading___Toc3094_3157206431">
+          <w:hyperlink w:anchor="__RefHeading___Toc3112_1200781530">
             <w:r>
               <w:rPr>
                 <w:webHidden/>
@@ -986,7 +986,7 @@
             </w:tabs>
             <w:rPr/>
           </w:pPr>
-          <w:hyperlink w:anchor="__RefHeading___Toc3096_3157206431">
+          <w:hyperlink w:anchor="__RefHeading___Toc3114_1200781530">
             <w:r>
               <w:rPr>
                 <w:webHidden/>
@@ -1007,7 +1007,7 @@
             </w:tabs>
             <w:rPr/>
           </w:pPr>
-          <w:hyperlink w:anchor="__RefHeading___Toc3098_3157206431">
+          <w:hyperlink w:anchor="__RefHeading___Toc3116_1200781530">
             <w:r>
               <w:rPr>
                 <w:webHidden/>
@@ -1028,7 +1028,7 @@
             </w:tabs>
             <w:rPr/>
           </w:pPr>
-          <w:hyperlink w:anchor="__RefHeading___Toc3100_3157206431">
+          <w:hyperlink w:anchor="__RefHeading___Toc3118_1200781530">
             <w:r>
               <w:rPr>
                 <w:webHidden/>
@@ -1049,7 +1049,7 @@
             </w:tabs>
             <w:rPr/>
           </w:pPr>
-          <w:hyperlink w:anchor="__RefHeading___Toc3102_3157206431">
+          <w:hyperlink w:anchor="__RefHeading___Toc3120_1200781530">
             <w:r>
               <w:rPr>
                 <w:webHidden/>
@@ -1070,7 +1070,7 @@
             </w:tabs>
             <w:rPr/>
           </w:pPr>
-          <w:hyperlink w:anchor="__RefHeading___Toc3104_3157206431">
+          <w:hyperlink w:anchor="__RefHeading___Toc3122_1200781530">
             <w:r>
               <w:rPr>
                 <w:webHidden/>
@@ -1091,7 +1091,7 @@
             </w:tabs>
             <w:rPr/>
           </w:pPr>
-          <w:hyperlink w:anchor="__RefHeading___Toc3106_3157206431">
+          <w:hyperlink w:anchor="__RefHeading___Toc3124_1200781530">
             <w:r>
               <w:rPr>
                 <w:webHidden/>
@@ -1112,7 +1112,7 @@
             </w:tabs>
             <w:rPr/>
           </w:pPr>
-          <w:hyperlink w:anchor="__RefHeading___Toc3108_3157206431">
+          <w:hyperlink w:anchor="__RefHeading___Toc3126_1200781530">
             <w:r>
               <w:rPr>
                 <w:webHidden/>
@@ -1133,7 +1133,7 @@
             </w:tabs>
             <w:rPr/>
           </w:pPr>
-          <w:hyperlink w:anchor="__RefHeading___Toc3110_3157206431">
+          <w:hyperlink w:anchor="__RefHeading___Toc3128_1200781530">
             <w:r>
               <w:rPr>
                 <w:webHidden/>
@@ -1154,7 +1154,7 @@
             </w:tabs>
             <w:rPr/>
           </w:pPr>
-          <w:hyperlink w:anchor="__RefHeading___Toc3112_3157206431">
+          <w:hyperlink w:anchor="__RefHeading___Toc3130_1200781530">
             <w:r>
               <w:rPr>
                 <w:webHidden/>
@@ -1175,7 +1175,7 @@
             </w:tabs>
             <w:rPr/>
           </w:pPr>
-          <w:hyperlink w:anchor="__RefHeading___Toc3114_3157206431">
+          <w:hyperlink w:anchor="__RefHeading___Toc3132_1200781530">
             <w:r>
               <w:rPr>
                 <w:webHidden/>
@@ -1196,7 +1196,7 @@
             </w:tabs>
             <w:rPr/>
           </w:pPr>
-          <w:hyperlink w:anchor="__RefHeading___Toc3116_3157206431">
+          <w:hyperlink w:anchor="__RefHeading___Toc3134_1200781530">
             <w:r>
               <w:rPr>
                 <w:webHidden/>
@@ -1217,7 +1217,7 @@
             </w:tabs>
             <w:rPr/>
           </w:pPr>
-          <w:hyperlink w:anchor="__RefHeading___Toc3118_3157206431">
+          <w:hyperlink w:anchor="__RefHeading___Toc3136_1200781530">
             <w:r>
               <w:rPr>
                 <w:webHidden/>
@@ -1238,7 +1238,7 @@
             </w:tabs>
             <w:rPr/>
           </w:pPr>
-          <w:hyperlink w:anchor="__RefHeading___Toc3120_3157206431">
+          <w:hyperlink w:anchor="__RefHeading___Toc3138_1200781530">
             <w:r>
               <w:rPr>
                 <w:webHidden/>
@@ -1259,7 +1259,7 @@
             </w:tabs>
             <w:rPr/>
           </w:pPr>
-          <w:hyperlink w:anchor="__RefHeading___Toc3122_3157206431">
+          <w:hyperlink w:anchor="__RefHeading___Toc3140_1200781530">
             <w:r>
               <w:rPr>
                 <w:webHidden/>
@@ -1280,7 +1280,7 @@
             </w:tabs>
             <w:rPr/>
           </w:pPr>
-          <w:hyperlink w:anchor="__RefHeading___Toc3124_3157206431">
+          <w:hyperlink w:anchor="__RefHeading___Toc3142_1200781530">
             <w:r>
               <w:rPr>
                 <w:webHidden/>
@@ -1301,7 +1301,7 @@
             </w:tabs>
             <w:rPr/>
           </w:pPr>
-          <w:hyperlink w:anchor="__RefHeading___Toc3126_3157206431">
+          <w:hyperlink w:anchor="__RefHeading___Toc3144_1200781530">
             <w:r>
               <w:rPr>
                 <w:webHidden/>
@@ -1322,7 +1322,7 @@
             </w:tabs>
             <w:rPr/>
           </w:pPr>
-          <w:hyperlink w:anchor="__RefHeading___Toc3128_3157206431">
+          <w:hyperlink w:anchor="__RefHeading___Toc3146_1200781530">
             <w:r>
               <w:rPr>
                 <w:webHidden/>
@@ -1343,7 +1343,7 @@
             </w:tabs>
             <w:rPr/>
           </w:pPr>
-          <w:hyperlink w:anchor="__RefHeading___Toc3130_3157206431">
+          <w:hyperlink w:anchor="__RefHeading___Toc3148_1200781530">
             <w:r>
               <w:rPr>
                 <w:webHidden/>
@@ -1364,7 +1364,7 @@
             </w:tabs>
             <w:rPr/>
           </w:pPr>
-          <w:hyperlink w:anchor="__RefHeading___Toc3132_3157206431">
+          <w:hyperlink w:anchor="__RefHeading___Toc3150_1200781530">
             <w:r>
               <w:rPr>
                 <w:webHidden/>
@@ -1385,7 +1385,7 @@
             </w:tabs>
             <w:rPr/>
           </w:pPr>
-          <w:hyperlink w:anchor="__RefHeading___Toc3134_3157206431">
+          <w:hyperlink w:anchor="__RefHeading___Toc3152_1200781530">
             <w:r>
               <w:rPr>
                 <w:webHidden/>
@@ -1406,7 +1406,7 @@
             </w:tabs>
             <w:rPr/>
           </w:pPr>
-          <w:hyperlink w:anchor="__RefHeading___Toc3136_3157206431">
+          <w:hyperlink w:anchor="__RefHeading___Toc3154_1200781530">
             <w:r>
               <w:rPr>
                 <w:webHidden/>
@@ -1427,7 +1427,7 @@
             </w:tabs>
             <w:rPr/>
           </w:pPr>
-          <w:hyperlink w:anchor="__RefHeading___Toc3138_3157206431">
+          <w:hyperlink w:anchor="__RefHeading___Toc3156_1200781530">
             <w:r>
               <w:rPr>
                 <w:webHidden/>
@@ -1448,7 +1448,7 @@
             </w:tabs>
             <w:rPr/>
           </w:pPr>
-          <w:hyperlink w:anchor="__RefHeading___Toc3140_3157206431">
+          <w:hyperlink w:anchor="__RefHeading___Toc3158_1200781530">
             <w:r>
               <w:rPr>
                 <w:webHidden/>
@@ -1469,7 +1469,7 @@
             </w:tabs>
             <w:rPr/>
           </w:pPr>
-          <w:hyperlink w:anchor="__RefHeading___Toc3142_3157206431">
+          <w:hyperlink w:anchor="__RefHeading___Toc3160_1200781530">
             <w:r>
               <w:rPr>
                 <w:webHidden/>
@@ -1490,7 +1490,7 @@
             </w:tabs>
             <w:rPr/>
           </w:pPr>
-          <w:hyperlink w:anchor="__RefHeading___Toc3144_3157206431">
+          <w:hyperlink w:anchor="__RefHeading___Toc3162_1200781530">
             <w:r>
               <w:rPr>
                 <w:webHidden/>
@@ -1511,7 +1511,7 @@
             </w:tabs>
             <w:rPr/>
           </w:pPr>
-          <w:hyperlink w:anchor="__RefHeading___Toc3146_3157206431">
+          <w:hyperlink w:anchor="__RefHeading___Toc3164_1200781530">
             <w:r>
               <w:rPr>
                 <w:webHidden/>
@@ -1532,7 +1532,7 @@
             </w:tabs>
             <w:rPr/>
           </w:pPr>
-          <w:hyperlink w:anchor="__RefHeading___Toc3148_3157206431">
+          <w:hyperlink w:anchor="__RefHeading___Toc3166_1200781530">
             <w:r>
               <w:rPr>
                 <w:webHidden/>
@@ -1553,7 +1553,7 @@
             </w:tabs>
             <w:rPr/>
           </w:pPr>
-          <w:hyperlink w:anchor="__RefHeading___Toc3150_3157206431">
+          <w:hyperlink w:anchor="__RefHeading___Toc3168_1200781530">
             <w:r>
               <w:rPr>
                 <w:webHidden/>
@@ -1574,7 +1574,7 @@
             </w:tabs>
             <w:rPr/>
           </w:pPr>
-          <w:hyperlink w:anchor="__RefHeading___Toc3152_3157206431">
+          <w:hyperlink w:anchor="__RefHeading___Toc3170_1200781530">
             <w:r>
               <w:rPr>
                 <w:webHidden/>
@@ -1595,7 +1595,7 @@
             </w:tabs>
             <w:rPr/>
           </w:pPr>
-          <w:hyperlink w:anchor="__RefHeading___Toc3154_3157206431">
+          <w:hyperlink w:anchor="__RefHeading___Toc3172_1200781530">
             <w:r>
               <w:rPr>
                 <w:webHidden/>
@@ -1616,7 +1616,7 @@
             </w:tabs>
             <w:rPr/>
           </w:pPr>
-          <w:hyperlink w:anchor="__RefHeading___Toc3156_3157206431">
+          <w:hyperlink w:anchor="__RefHeading___Toc3174_1200781530">
             <w:r>
               <w:rPr>
                 <w:webHidden/>
@@ -1637,7 +1637,7 @@
             </w:tabs>
             <w:rPr/>
           </w:pPr>
-          <w:hyperlink w:anchor="__RefHeading___Toc3158_3157206431">
+          <w:hyperlink w:anchor="__RefHeading___Toc3176_1200781530">
             <w:r>
               <w:rPr>
                 <w:webHidden/>
@@ -1658,7 +1658,7 @@
             </w:tabs>
             <w:rPr/>
           </w:pPr>
-          <w:hyperlink w:anchor="__RefHeading___Toc3160_3157206431">
+          <w:hyperlink w:anchor="__RefHeading___Toc3178_1200781530">
             <w:r>
               <w:rPr>
                 <w:webHidden/>
@@ -1679,7 +1679,7 @@
             </w:tabs>
             <w:rPr/>
           </w:pPr>
-          <w:hyperlink w:anchor="__RefHeading___Toc3162_3157206431">
+          <w:hyperlink w:anchor="__RefHeading___Toc3180_1200781530">
             <w:r>
               <w:rPr>
                 <w:webHidden/>
@@ -1700,7 +1700,7 @@
             </w:tabs>
             <w:rPr/>
           </w:pPr>
-          <w:hyperlink w:anchor="__RefHeading___Toc3164_3157206431">
+          <w:hyperlink w:anchor="__RefHeading___Toc3182_1200781530">
             <w:r>
               <w:rPr>
                 <w:webHidden/>
@@ -1721,7 +1721,7 @@
             </w:tabs>
             <w:rPr/>
           </w:pPr>
-          <w:hyperlink w:anchor="__RefHeading___Toc3166_3157206431">
+          <w:hyperlink w:anchor="__RefHeading___Toc3184_1200781530">
             <w:r>
               <w:rPr>
                 <w:webHidden/>
@@ -1742,7 +1742,7 @@
             </w:tabs>
             <w:rPr/>
           </w:pPr>
-          <w:hyperlink w:anchor="__RefHeading___Toc3168_3157206431">
+          <w:hyperlink w:anchor="__RefHeading___Toc3186_1200781530">
             <w:r>
               <w:rPr>
                 <w:webHidden/>
@@ -1763,7 +1763,7 @@
             </w:tabs>
             <w:rPr/>
           </w:pPr>
-          <w:hyperlink w:anchor="__RefHeading___Toc3170_3157206431">
+          <w:hyperlink w:anchor="__RefHeading___Toc3188_1200781530">
             <w:r>
               <w:rPr>
                 <w:webHidden/>
@@ -1784,7 +1784,7 @@
             </w:tabs>
             <w:rPr/>
           </w:pPr>
-          <w:hyperlink w:anchor="__RefHeading___Toc3172_3157206431">
+          <w:hyperlink w:anchor="__RefHeading___Toc3190_1200781530">
             <w:r>
               <w:rPr>
                 <w:webHidden/>
@@ -1805,7 +1805,7 @@
             </w:tabs>
             <w:rPr/>
           </w:pPr>
-          <w:hyperlink w:anchor="__RefHeading___Toc3174_3157206431">
+          <w:hyperlink w:anchor="__RefHeading___Toc3192_1200781530">
             <w:r>
               <w:rPr>
                 <w:webHidden/>
@@ -1826,7 +1826,7 @@
             </w:tabs>
             <w:rPr/>
           </w:pPr>
-          <w:hyperlink w:anchor="__RefHeading___Toc3176_3157206431">
+          <w:hyperlink w:anchor="__RefHeading___Toc3194_1200781530">
             <w:r>
               <w:rPr>
                 <w:webHidden/>
@@ -1847,7 +1847,7 @@
             </w:tabs>
             <w:rPr/>
           </w:pPr>
-          <w:hyperlink w:anchor="__RefHeading___Toc3178_3157206431">
+          <w:hyperlink w:anchor="__RefHeading___Toc3196_1200781530">
             <w:r>
               <w:rPr>
                 <w:webHidden/>
@@ -1868,7 +1868,7 @@
             </w:tabs>
             <w:rPr/>
           </w:pPr>
-          <w:hyperlink w:anchor="__RefHeading___Toc3180_3157206431">
+          <w:hyperlink w:anchor="__RefHeading___Toc3198_1200781530">
             <w:r>
               <w:rPr>
                 <w:webHidden/>
@@ -1889,7 +1889,7 @@
             </w:tabs>
             <w:rPr/>
           </w:pPr>
-          <w:hyperlink w:anchor="__RefHeading___Toc3182_3157206431">
+          <w:hyperlink w:anchor="__RefHeading___Toc3200_1200781530">
             <w:r>
               <w:rPr>
                 <w:webHidden/>
@@ -1910,7 +1910,7 @@
             </w:tabs>
             <w:rPr/>
           </w:pPr>
-          <w:hyperlink w:anchor="__RefHeading___Toc3184_3157206431">
+          <w:hyperlink w:anchor="__RefHeading___Toc3202_1200781530">
             <w:r>
               <w:rPr>
                 <w:webHidden/>
@@ -1931,7 +1931,7 @@
             </w:tabs>
             <w:rPr/>
           </w:pPr>
-          <w:hyperlink w:anchor="__RefHeading___Toc3186_3157206431">
+          <w:hyperlink w:anchor="__RefHeading___Toc3204_1200781530">
             <w:r>
               <w:rPr>
                 <w:webHidden/>
@@ -1952,7 +1952,7 @@
             </w:tabs>
             <w:rPr/>
           </w:pPr>
-          <w:hyperlink w:anchor="__RefHeading___Toc3188_3157206431">
+          <w:hyperlink w:anchor="__RefHeading___Toc3206_1200781530">
             <w:r>
               <w:rPr>
                 <w:webHidden/>
@@ -1973,7 +1973,7 @@
             </w:tabs>
             <w:rPr/>
           </w:pPr>
-          <w:hyperlink w:anchor="__RefHeading___Toc3190_3157206431">
+          <w:hyperlink w:anchor="__RefHeading___Toc3208_1200781530">
             <w:r>
               <w:rPr>
                 <w:webHidden/>
@@ -1994,7 +1994,7 @@
             </w:tabs>
             <w:rPr/>
           </w:pPr>
-          <w:hyperlink w:anchor="__RefHeading___Toc3192_3157206431">
+          <w:hyperlink w:anchor="__RefHeading___Toc3210_1200781530">
             <w:r>
               <w:rPr>
                 <w:webHidden/>
@@ -2015,7 +2015,7 @@
             </w:tabs>
             <w:rPr/>
           </w:pPr>
-          <w:hyperlink w:anchor="__RefHeading___Toc3194_3157206431">
+          <w:hyperlink w:anchor="__RefHeading___Toc3212_1200781530">
             <w:r>
               <w:rPr>
                 <w:webHidden/>
@@ -2036,7 +2036,7 @@
             </w:tabs>
             <w:rPr/>
           </w:pPr>
-          <w:hyperlink w:anchor="__RefHeading___Toc3196_3157206431">
+          <w:hyperlink w:anchor="__RefHeading___Toc3214_1200781530">
             <w:r>
               <w:rPr>
                 <w:webHidden/>
@@ -2057,7 +2057,7 @@
             </w:tabs>
             <w:rPr/>
           </w:pPr>
-          <w:hyperlink w:anchor="__RefHeading___Toc3198_3157206431">
+          <w:hyperlink w:anchor="__RefHeading___Toc3216_1200781530">
             <w:r>
               <w:rPr>
                 <w:webHidden/>
@@ -2098,7 +2098,7 @@
         <w:jc w:val="left"/>
         <w:rPr/>
       </w:pPr>
-      <w:bookmarkStart w:id="0" w:name="__RefHeading___Toc3030_3157206431"/>
+      <w:bookmarkStart w:id="0" w:name="__RefHeading___Toc3048_1200781530"/>
       <w:bookmarkEnd w:id="0"/>
       <w:r>
         <w:rPr>
@@ -2119,7 +2119,7 @@
         <w:jc w:val="left"/>
         <w:rPr/>
       </w:pPr>
-      <w:bookmarkStart w:id="1" w:name="__RefHeading___Toc3032_3157206431"/>
+      <w:bookmarkStart w:id="1" w:name="__RefHeading___Toc3050_1200781530"/>
       <w:bookmarkEnd w:id="1"/>
       <w:r>
         <w:rPr>
@@ -2222,7 +2222,7 @@
         <w:jc w:val="left"/>
         <w:rPr/>
       </w:pPr>
-      <w:bookmarkStart w:id="2" w:name="__RefHeading___Toc3034_3157206431"/>
+      <w:bookmarkStart w:id="2" w:name="__RefHeading___Toc3052_1200781530"/>
       <w:bookmarkEnd w:id="2"/>
       <w:r>
         <w:rPr>
@@ -2241,7 +2241,7 @@
         <w:jc w:val="left"/>
         <w:rPr/>
       </w:pPr>
-      <w:bookmarkStart w:id="3" w:name="__RefHeading___Toc3036_3157206431"/>
+      <w:bookmarkStart w:id="3" w:name="__RefHeading___Toc3054_1200781530"/>
       <w:bookmarkEnd w:id="3"/>
       <w:r>
         <w:rPr>
@@ -2283,7 +2283,7 @@
         <w:jc w:val="left"/>
         <w:rPr/>
       </w:pPr>
-      <w:bookmarkStart w:id="4" w:name="__RefHeading___Toc3038_3157206431"/>
+      <w:bookmarkStart w:id="4" w:name="__RefHeading___Toc3056_1200781530"/>
       <w:bookmarkEnd w:id="4"/>
       <w:r>
         <w:rPr>
@@ -2423,7 +2423,7 @@
         <w:jc w:val="left"/>
         <w:rPr/>
       </w:pPr>
-      <w:bookmarkStart w:id="5" w:name="__RefHeading___Toc3040_3157206431"/>
+      <w:bookmarkStart w:id="5" w:name="__RefHeading___Toc3058_1200781530"/>
       <w:bookmarkEnd w:id="5"/>
       <w:r>
         <w:rPr>
@@ -2486,7 +2486,7 @@
         <w:jc w:val="left"/>
         <w:rPr/>
       </w:pPr>
-      <w:bookmarkStart w:id="6" w:name="__RefHeading___Toc3042_3157206431"/>
+      <w:bookmarkStart w:id="6" w:name="__RefHeading___Toc3060_1200781530"/>
       <w:bookmarkEnd w:id="6"/>
       <w:r>
         <w:rPr>
@@ -2613,7 +2613,7 @@
         <w:jc w:val="left"/>
         <w:rPr/>
       </w:pPr>
-      <w:bookmarkStart w:id="7" w:name="__RefHeading___Toc3044_3157206431"/>
+      <w:bookmarkStart w:id="7" w:name="__RefHeading___Toc3062_1200781530"/>
       <w:bookmarkEnd w:id="7"/>
       <w:r>
         <w:rPr>
@@ -2727,7 +2727,7 @@
           <w:sz w:val="24"/>
           <w:szCs w:val="24"/>
         </w:rPr>
-        <w:t>RN-05: O certificado somente é emitido mediante a existência de registro de presença para a inscrição correspondente. A cada certificado é atribuído um código único de autenticidade, e novas solicitações de emissão retornam o mesmo documento já gerado (RF-09).</w:t>
+        <w:t>RN-05: O certificado somente é emitido mediante a existência de registro de presença para a inscrição correspondente e após o término do evento, seja pelo horário de encerramento previsto, seja pelo encerramento antecipado feito pelo organizador. Eventos cancelados não geram certificado. A cada certificado é atribuído um código único de autenticidade, e novas solicitações de emissão retornam o mesmo documento já gerado (RF-09).</w:t>
       </w:r>
     </w:p>
     <w:p>
@@ -2843,7 +2843,7 @@
         <w:jc w:val="left"/>
         <w:rPr/>
       </w:pPr>
-      <w:bookmarkStart w:id="8" w:name="__RefHeading___Toc3046_3157206431"/>
+      <w:bookmarkStart w:id="8" w:name="__RefHeading___Toc3064_1200781530"/>
       <w:bookmarkEnd w:id="8"/>
       <w:r>
         <w:rPr>
@@ -2864,7 +2864,7 @@
         <w:jc w:val="left"/>
         <w:rPr/>
       </w:pPr>
-      <w:bookmarkStart w:id="9" w:name="__RefHeading___Toc3048_3157206431"/>
+      <w:bookmarkStart w:id="9" w:name="__RefHeading___Toc3066_1200781530"/>
       <w:bookmarkEnd w:id="9"/>
       <w:r>
         <w:rPr>
@@ -2914,7 +2914,7 @@
           <w:sz w:val="24"/>
           <w:szCs w:val="24"/>
         </w:rPr>
-        <w:t>O Módulo de Inscrições e Presença administra a ocupação das vagas, a fila de espera e o registro de presença dos participantes durante a realização do evento. Por fim, o Módulo de Certificação valida se o participante cumpriu os requisitos de participação e gera automaticamente o certificado final em PDF, com código de autenticidade destinado à verificação pública.</w:t>
+        <w:t>O Módulo de Inscrições e Presença administra a ocupação das vagas, a fila de espera e o registro de presença dos participantes durante a realização do evento. Por fim, o Módulo de Certificação valida se o participante teve a presença registrada e se o evento já terminou e, cumpridas as duas condições, gera o certificado em PDF, com código de autenticidade destinado à verificação pública.</w:t>
       </w:r>
     </w:p>
     <w:p>
@@ -2946,7 +2946,7 @@
         <w:jc w:val="left"/>
         <w:rPr/>
       </w:pPr>
-      <w:bookmarkStart w:id="10" w:name="__RefHeading___Toc3050_3157206431"/>
+      <w:bookmarkStart w:id="10" w:name="__RefHeading___Toc3068_1200781530"/>
       <w:bookmarkEnd w:id="10"/>
       <w:r>
         <w:rPr>
@@ -3028,7 +3028,7 @@
         <w:jc w:val="left"/>
         <w:rPr/>
       </w:pPr>
-      <w:bookmarkStart w:id="11" w:name="__RefHeading___Toc3052_3157206431"/>
+      <w:bookmarkStart w:id="11" w:name="__RefHeading___Toc3070_1200781530"/>
       <w:bookmarkEnd w:id="11"/>
       <w:r>
         <w:rPr>
@@ -3092,7 +3092,7 @@
         <w:jc w:val="left"/>
         <w:rPr/>
       </w:pPr>
-      <w:bookmarkStart w:id="12" w:name="__RefHeading___Toc3054_3157206431"/>
+      <w:bookmarkStart w:id="12" w:name="__RefHeading___Toc3072_1200781530"/>
       <w:bookmarkEnd w:id="12"/>
       <w:r>
         <w:rPr>
@@ -3113,7 +3113,7 @@
         <w:jc w:val="left"/>
         <w:rPr/>
       </w:pPr>
-      <w:bookmarkStart w:id="13" w:name="__RefHeading___Toc3056_3157206431"/>
+      <w:bookmarkStart w:id="13" w:name="__RefHeading___Toc3074_1200781530"/>
       <w:bookmarkEnd w:id="13"/>
       <w:r>
         <w:rPr>
@@ -3274,7 +3274,7 @@
           <w:sz w:val="24"/>
           <w:szCs w:val="24"/>
         </w:rPr>
-        <w:t>RF-09: Gerar certificado para quem compareceu ao evento (Sistema)</w:t>
+        <w:t>RF-09: Gerar certificado para quem compareceu ao evento, após o seu término (Sistema)</w:t>
       </w:r>
     </w:p>
     <w:p>
@@ -3302,7 +3302,7 @@
         <w:jc w:val="left"/>
         <w:rPr/>
       </w:pPr>
-      <w:bookmarkStart w:id="14" w:name="__RefHeading___Toc3058_3157206431"/>
+      <w:bookmarkStart w:id="14" w:name="__RefHeading___Toc3076_1200781530"/>
       <w:bookmarkEnd w:id="14"/>
       <w:r>
         <w:rPr>
@@ -3409,7 +3409,7 @@
         <w:jc w:val="left"/>
         <w:rPr/>
       </w:pPr>
-      <w:bookmarkStart w:id="15" w:name="__RefHeading___Toc3060_3157206431"/>
+      <w:bookmarkStart w:id="15" w:name="__RefHeading___Toc3078_1200781530"/>
       <w:bookmarkEnd w:id="15"/>
       <w:r>
         <w:rPr>
@@ -3451,7 +3451,7 @@
         <w:jc w:val="left"/>
         <w:rPr/>
       </w:pPr>
-      <w:bookmarkStart w:id="16" w:name="__RefHeading___Toc3062_3157206431"/>
+      <w:bookmarkStart w:id="16" w:name="__RefHeading___Toc3080_1200781530"/>
       <w:bookmarkEnd w:id="16"/>
       <w:r>
         <w:rPr>
@@ -3755,7 +3755,7 @@
         <w:jc w:val="left"/>
         <w:rPr/>
       </w:pPr>
-      <w:bookmarkStart w:id="17" w:name="__RefHeading___Toc3064_3157206431"/>
+      <w:bookmarkStart w:id="17" w:name="__RefHeading___Toc3082_1200781530"/>
       <w:bookmarkEnd w:id="17"/>
       <w:r>
         <w:rPr>
@@ -4062,7 +4062,7 @@
         <w:jc w:val="left"/>
         <w:rPr/>
       </w:pPr>
-      <w:bookmarkStart w:id="18" w:name="__RefHeading___Toc3066_3157206431"/>
+      <w:bookmarkStart w:id="18" w:name="__RefHeading___Toc3084_1200781530"/>
       <w:bookmarkEnd w:id="18"/>
       <w:r>
         <w:rPr>
@@ -4083,7 +4083,7 @@
         <w:jc w:val="left"/>
         <w:rPr/>
       </w:pPr>
-      <w:bookmarkStart w:id="19" w:name="__RefHeading___Toc3068_3157206431"/>
+      <w:bookmarkStart w:id="19" w:name="__RefHeading___Toc3086_1200781530"/>
       <w:bookmarkEnd w:id="19"/>
       <w:r>
         <w:rPr>
@@ -5262,7 +5262,7 @@
         <w:jc w:val="left"/>
         <w:rPr/>
       </w:pPr>
-      <w:bookmarkStart w:id="20" w:name="__RefHeading___Toc3070_3157206431"/>
+      <w:bookmarkStart w:id="20" w:name="__RefHeading___Toc3088_1200781530"/>
       <w:bookmarkEnd w:id="20"/>
       <w:r>
         <w:rPr>
@@ -5980,7 +5980,7 @@
         <w:jc w:val="left"/>
         <w:rPr/>
       </w:pPr>
-      <w:bookmarkStart w:id="21" w:name="__RefHeading___Toc3072_3157206431"/>
+      <w:bookmarkStart w:id="21" w:name="__RefHeading___Toc3090_1200781530"/>
       <w:bookmarkEnd w:id="21"/>
       <w:r>
         <w:rPr>
@@ -6001,7 +6001,7 @@
         <w:jc w:val="left"/>
         <w:rPr/>
       </w:pPr>
-      <w:bookmarkStart w:id="22" w:name="__RefHeading___Toc3074_3157206431"/>
+      <w:bookmarkStart w:id="22" w:name="__RefHeading___Toc3092_1200781530"/>
       <w:bookmarkEnd w:id="22"/>
       <w:r>
         <w:rPr>
@@ -6125,7 +6125,7 @@
         <w:jc w:val="left"/>
         <w:rPr/>
       </w:pPr>
-      <w:bookmarkStart w:id="23" w:name="__RefHeading___Toc3076_3157206431"/>
+      <w:bookmarkStart w:id="23" w:name="__RefHeading___Toc3094_1200781530"/>
       <w:bookmarkEnd w:id="23"/>
       <w:r>
         <w:rPr>
@@ -6843,7 +6843,7 @@
         <w:jc w:val="left"/>
         <w:rPr/>
       </w:pPr>
-      <w:bookmarkStart w:id="24" w:name="__RefHeading___Toc3078_3157206431"/>
+      <w:bookmarkStart w:id="24" w:name="__RefHeading___Toc3096_1200781530"/>
       <w:bookmarkEnd w:id="24"/>
       <w:r>
         <w:rPr>
@@ -6864,7 +6864,7 @@
         <w:jc w:val="left"/>
         <w:rPr/>
       </w:pPr>
-      <w:bookmarkStart w:id="25" w:name="__RefHeading___Toc3080_3157206431"/>
+      <w:bookmarkStart w:id="25" w:name="__RefHeading___Toc3098_1200781530"/>
       <w:bookmarkEnd w:id="25"/>
       <w:r>
         <w:rPr>
@@ -8302,7 +8302,7 @@
         <w:jc w:val="left"/>
         <w:rPr/>
       </w:pPr>
-      <w:bookmarkStart w:id="26" w:name="__RefHeading___Toc3082_3157206431"/>
+      <w:bookmarkStart w:id="26" w:name="__RefHeading___Toc3100_1200781530"/>
       <w:bookmarkEnd w:id="26"/>
       <w:r>
         <w:rPr>
@@ -10453,7 +10453,7 @@
         <w:jc w:val="left"/>
         <w:rPr/>
       </w:pPr>
-      <w:bookmarkStart w:id="27" w:name="__RefHeading___Toc3084_3157206431"/>
+      <w:bookmarkStart w:id="27" w:name="__RefHeading___Toc3102_1200781530"/>
       <w:bookmarkEnd w:id="27"/>
       <w:r>
         <w:rPr>
@@ -10493,7 +10493,7 @@
         <w:jc w:val="left"/>
         <w:rPr/>
       </w:pPr>
-      <w:bookmarkStart w:id="28" w:name="__RefHeading___Toc3086_3157206431"/>
+      <w:bookmarkStart w:id="28" w:name="__RefHeading___Toc3104_1200781530"/>
       <w:bookmarkEnd w:id="28"/>
       <w:r>
         <w:rPr>
@@ -11254,7 +11254,7 @@
         <w:jc w:val="left"/>
         <w:rPr/>
       </w:pPr>
-      <w:bookmarkStart w:id="29" w:name="__RefHeading___Toc3088_3157206431"/>
+      <w:bookmarkStart w:id="29" w:name="__RefHeading___Toc3106_1200781530"/>
       <w:bookmarkEnd w:id="29"/>
       <w:r>
         <w:rPr>
@@ -11777,7 +11777,7 @@
         <w:jc w:val="left"/>
         <w:rPr/>
       </w:pPr>
-      <w:bookmarkStart w:id="30" w:name="__RefHeading___Toc3090_3157206431"/>
+      <w:bookmarkStart w:id="30" w:name="__RefHeading___Toc3108_1200781530"/>
       <w:bookmarkEnd w:id="30"/>
       <w:r>
         <w:rPr>
@@ -13371,7 +13371,7 @@
         <w:jc w:val="left"/>
         <w:rPr/>
       </w:pPr>
-      <w:bookmarkStart w:id="31" w:name="__RefHeading___Toc3092_3157206431"/>
+      <w:bookmarkStart w:id="31" w:name="__RefHeading___Toc3110_1200781530"/>
       <w:bookmarkEnd w:id="31"/>
       <w:r>
         <w:rPr>
@@ -14013,7 +14013,7 @@
         <w:jc w:val="left"/>
         <w:rPr/>
       </w:pPr>
-      <w:bookmarkStart w:id="32" w:name="__RefHeading___Toc3094_3157206431"/>
+      <w:bookmarkStart w:id="32" w:name="__RefHeading___Toc3112_1200781530"/>
       <w:bookmarkEnd w:id="32"/>
       <w:r>
         <w:rPr>
@@ -14893,7 +14893,7 @@
         <w:jc w:val="left"/>
         <w:rPr/>
       </w:pPr>
-      <w:bookmarkStart w:id="33" w:name="__RefHeading___Toc3096_3157206431"/>
+      <w:bookmarkStart w:id="33" w:name="__RefHeading___Toc3114_1200781530"/>
       <w:bookmarkEnd w:id="33"/>
       <w:r>
         <w:rPr>
@@ -15535,7 +15535,7 @@
         <w:jc w:val="left"/>
         <w:rPr/>
       </w:pPr>
-      <w:bookmarkStart w:id="34" w:name="__RefHeading___Toc3098_3157206431"/>
+      <w:bookmarkStart w:id="34" w:name="__RefHeading___Toc3116_1200781530"/>
       <w:bookmarkEnd w:id="34"/>
       <w:r>
         <w:rPr>
@@ -16296,7 +16296,7 @@
         <w:jc w:val="left"/>
         <w:rPr/>
       </w:pPr>
-      <w:bookmarkStart w:id="35" w:name="__RefHeading___Toc3100_3157206431"/>
+      <w:bookmarkStart w:id="35" w:name="__RefHeading___Toc3118_1200781530"/>
       <w:bookmarkEnd w:id="35"/>
       <w:r>
         <w:rPr>
@@ -17057,7 +17057,7 @@
         <w:jc w:val="left"/>
         <w:rPr/>
       </w:pPr>
-      <w:bookmarkStart w:id="36" w:name="__RefHeading___Toc3102_3157206431"/>
+      <w:bookmarkStart w:id="36" w:name="__RefHeading___Toc3120_1200781530"/>
       <w:bookmarkEnd w:id="36"/>
       <w:r>
         <w:rPr>
@@ -17937,7 +17937,7 @@
         <w:jc w:val="left"/>
         <w:rPr/>
       </w:pPr>
-      <w:bookmarkStart w:id="37" w:name="__RefHeading___Toc3104_3157206431"/>
+      <w:bookmarkStart w:id="37" w:name="__RefHeading___Toc3122_1200781530"/>
       <w:bookmarkEnd w:id="37"/>
       <w:r>
         <w:rPr>
@@ -18939,7 +18939,7 @@
       <w:r>
         <w:br w:type="page"/>
       </w:r>
-      <w:bookmarkStart w:id="38" w:name="__RefHeading___Toc3106_3157206431"/>
+      <w:bookmarkStart w:id="38" w:name="__RefHeading___Toc3124_1200781530"/>
       <w:bookmarkEnd w:id="38"/>
       <w:r>
         <w:rPr>
@@ -19860,7 +19860,7 @@
         <w:jc w:val="left"/>
         <w:rPr/>
       </w:pPr>
-      <w:bookmarkStart w:id="39" w:name="__RefHeading___Toc3108_3157206431"/>
+      <w:bookmarkStart w:id="39" w:name="__RefHeading___Toc3126_1200781530"/>
       <w:bookmarkEnd w:id="39"/>
       <w:r>
         <w:rPr>
@@ -21258,7 +21258,7 @@
         <w:jc w:val="left"/>
         <w:rPr/>
       </w:pPr>
-      <w:bookmarkStart w:id="40" w:name="__RefHeading___Toc3110_3157206431"/>
+      <w:bookmarkStart w:id="40" w:name="__RefHeading___Toc3128_1200781530"/>
       <w:bookmarkEnd w:id="40"/>
       <w:r>
         <w:rPr>
@@ -21361,7 +21361,7 @@
         <w:jc w:val="left"/>
         <w:rPr/>
       </w:pPr>
-      <w:bookmarkStart w:id="41" w:name="__RefHeading___Toc3112_3157206431"/>
+      <w:bookmarkStart w:id="41" w:name="__RefHeading___Toc3130_1200781530"/>
       <w:bookmarkEnd w:id="41"/>
       <w:r>
         <w:rPr>
@@ -21488,7 +21488,7 @@
         <w:jc w:val="left"/>
         <w:rPr/>
       </w:pPr>
-      <w:bookmarkStart w:id="42" w:name="__RefHeading___Toc3114_3157206431"/>
+      <w:bookmarkStart w:id="42" w:name="__RefHeading___Toc3132_1200781530"/>
       <w:bookmarkEnd w:id="42"/>
       <w:r>
         <w:rPr>
@@ -21509,7 +21509,7 @@
         <w:jc w:val="left"/>
         <w:rPr/>
       </w:pPr>
-      <w:bookmarkStart w:id="43" w:name="__RefHeading___Toc3116_3157206431"/>
+      <w:bookmarkStart w:id="43" w:name="__RefHeading___Toc3134_1200781530"/>
       <w:bookmarkEnd w:id="43"/>
       <w:r>
         <w:rPr>
@@ -21570,7 +21570,7 @@
         <w:jc w:val="left"/>
         <w:rPr/>
       </w:pPr>
-      <w:bookmarkStart w:id="44" w:name="__RefHeading___Toc3118_3157206431"/>
+      <w:bookmarkStart w:id="44" w:name="__RefHeading___Toc3136_1200781530"/>
       <w:bookmarkEnd w:id="44"/>
       <w:r>
         <w:rPr>
@@ -21889,7 +21889,7 @@
         <w:jc w:val="left"/>
         <w:rPr/>
       </w:pPr>
-      <w:bookmarkStart w:id="45" w:name="__RefHeading___Toc3120_3157206431"/>
+      <w:bookmarkStart w:id="45" w:name="__RefHeading___Toc3138_1200781530"/>
       <w:bookmarkEnd w:id="45"/>
       <w:r>
         <w:rPr>
@@ -21910,7 +21910,7 @@
         <w:jc w:val="left"/>
         <w:rPr/>
       </w:pPr>
-      <w:bookmarkStart w:id="46" w:name="__RefHeading___Toc3122_3157206431"/>
+      <w:bookmarkStart w:id="46" w:name="__RefHeading___Toc3140_1200781530"/>
       <w:bookmarkEnd w:id="46"/>
       <w:r>
         <w:rPr>
@@ -21992,7 +21992,7 @@
         <w:jc w:val="left"/>
         <w:rPr/>
       </w:pPr>
-      <w:bookmarkStart w:id="47" w:name="__RefHeading___Toc3124_3157206431"/>
+      <w:bookmarkStart w:id="47" w:name="__RefHeading___Toc3142_1200781530"/>
       <w:bookmarkEnd w:id="47"/>
       <w:r>
         <w:rPr>
@@ -22077,7 +22077,7 @@
         <w:jc w:val="left"/>
         <w:rPr/>
       </w:pPr>
-      <w:bookmarkStart w:id="48" w:name="__RefHeading___Toc3126_3157206431"/>
+      <w:bookmarkStart w:id="48" w:name="__RefHeading___Toc3144_1200781530"/>
       <w:bookmarkEnd w:id="48"/>
       <w:r>
         <w:rPr>
@@ -22098,7 +22098,7 @@
         <w:jc w:val="left"/>
         <w:rPr/>
       </w:pPr>
-      <w:bookmarkStart w:id="49" w:name="__RefHeading___Toc3128_3157206431"/>
+      <w:bookmarkStart w:id="49" w:name="__RefHeading___Toc3146_1200781530"/>
       <w:bookmarkEnd w:id="49"/>
       <w:r>
         <w:rPr>
@@ -22138,7 +22138,7 @@
         <w:jc w:val="left"/>
         <w:rPr/>
       </w:pPr>
-      <w:bookmarkStart w:id="50" w:name="__RefHeading___Toc3130_3157206431"/>
+      <w:bookmarkStart w:id="50" w:name="__RefHeading___Toc3148_1200781530"/>
       <w:bookmarkEnd w:id="50"/>
       <w:r>
         <w:rPr>
@@ -22661,7 +22661,7 @@
         <w:jc w:val="left"/>
         <w:rPr/>
       </w:pPr>
-      <w:bookmarkStart w:id="51" w:name="__RefHeading___Toc3132_3157206431"/>
+      <w:bookmarkStart w:id="51" w:name="__RefHeading___Toc3150_1200781530"/>
       <w:bookmarkEnd w:id="51"/>
       <w:r>
         <w:rPr>
@@ -23919,7 +23919,7 @@
         <w:jc w:val="left"/>
         <w:rPr/>
       </w:pPr>
-      <w:bookmarkStart w:id="52" w:name="__RefHeading___Toc3134_3157206431"/>
+      <w:bookmarkStart w:id="52" w:name="__RefHeading___Toc3152_1200781530"/>
       <w:bookmarkEnd w:id="52"/>
       <w:r>
         <w:rPr>
@@ -24561,7 +24561,7 @@
         <w:jc w:val="left"/>
         <w:rPr/>
       </w:pPr>
-      <w:bookmarkStart w:id="53" w:name="__RefHeading___Toc3136_3157206431"/>
+      <w:bookmarkStart w:id="53" w:name="__RefHeading___Toc3154_1200781530"/>
       <w:bookmarkEnd w:id="53"/>
       <w:r>
         <w:rPr>
@@ -25070,7 +25070,7 @@
                 <w:sz w:val="18"/>
                 <w:szCs w:val="18"/>
               </w:rPr>
-              <w:t>Emite o certificado, se houver presença (RF-09)</w:t>
+              <w:t>Emite o certificado, se houver presença e o evento tiver terminado (RF-09)</w:t>
             </w:r>
           </w:p>
         </w:tc>
@@ -25322,7 +25322,7 @@
         <w:jc w:val="left"/>
         <w:rPr/>
       </w:pPr>
-      <w:bookmarkStart w:id="54" w:name="__RefHeading___Toc3138_3157206431"/>
+      <w:bookmarkStart w:id="54" w:name="__RefHeading___Toc3156_1200781530"/>
       <w:bookmarkEnd w:id="54"/>
       <w:r>
         <w:rPr>
@@ -25964,7 +25964,7 @@
         <w:jc w:val="left"/>
         <w:rPr/>
       </w:pPr>
-      <w:bookmarkStart w:id="55" w:name="__RefHeading___Toc3140_3157206431"/>
+      <w:bookmarkStart w:id="55" w:name="__RefHeading___Toc3158_1200781530"/>
       <w:bookmarkEnd w:id="55"/>
       <w:r>
         <w:rPr>
@@ -26930,7 +26930,7 @@
         <w:jc w:val="left"/>
         <w:rPr/>
       </w:pPr>
-      <w:bookmarkStart w:id="56" w:name="__RefHeading___Toc3142_3157206431"/>
+      <w:bookmarkStart w:id="56" w:name="__RefHeading___Toc3160_1200781530"/>
       <w:bookmarkEnd w:id="56"/>
       <w:r>
         <w:rPr>
@@ -27027,7 +27027,7 @@
           <w:sz w:val="24"/>
           <w:szCs w:val="24"/>
         </w:rPr>
-        <w:t>d) A interface armazena o token e o reenvia no cabeçalho de autorização de cada requisição subsequente, no formato Bearer.</w:t>
+        <w:t>d) A interface armazena o token na sessão da aba do navegador, o que permite usar contas diferentes em abas distintas sem que uma substitua a outra, e o reenvia no cabeçalho de autorização de cada requisição subsequente, no formato Bearer.</w:t>
       </w:r>
     </w:p>
     <w:p>
@@ -27104,7 +27104,7 @@
         <w:jc w:val="left"/>
         <w:rPr/>
       </w:pPr>
-      <w:bookmarkStart w:id="57" w:name="__RefHeading___Toc3144_3157206431"/>
+      <w:bookmarkStart w:id="57" w:name="__RefHeading___Toc3162_1200781530"/>
       <w:bookmarkEnd w:id="57"/>
       <w:r>
         <w:rPr>
@@ -27125,7 +27125,7 @@
         <w:jc w:val="left"/>
         <w:rPr/>
       </w:pPr>
-      <w:bookmarkStart w:id="58" w:name="__RefHeading___Toc3146_3157206431"/>
+      <w:bookmarkStart w:id="58" w:name="__RefHeading___Toc3164_1200781530"/>
       <w:bookmarkEnd w:id="58"/>
       <w:r>
         <w:rPr>
@@ -27238,7 +27238,7 @@
           <w:sz w:val="24"/>
           <w:szCs w:val="24"/>
         </w:rPr>
-        <w:t>No topo da pirâmide estão os testes de ponta a ponta, executados em navegador real por meio do Playwright e distribuídos em quatro arquivos de especificação, com nove verificações. Eles percorrem os fluxos principais da aplicação pela perspectiva do usuário: a navegação no catálogo, a criação de eventos pelo organizador, a inscrição de participantes com formação de fila de espera, o registro de presença, a emissão do certificado e o comportamento do sistema com a inteligência artificial indisponível.</w:t>
+        <w:t>No topo da pirâmide estão os testes de ponta a ponta, executados em navegador real por meio do Playwright e distribuídos em cinco arquivos de especificação, com onze verificações. Eles percorrem os fluxos principais da aplicação pela perspectiva do usuário: a navegação no catálogo, a criação de eventos pelo organizador, a inscrição de participantes com formação de fila de espera, o registro de presença, a emissão do certificado após o encerramento do evento, o uso de contas diferentes em abas do mesmo navegador e o comportamento do sistema com a inteligência artificial indisponível.</w:t>
       </w:r>
     </w:p>
     <w:p>
@@ -27270,7 +27270,7 @@
         <w:jc w:val="left"/>
         <w:rPr/>
       </w:pPr>
-      <w:bookmarkStart w:id="59" w:name="__RefHeading___Toc3148_3157206431"/>
+      <w:bookmarkStart w:id="59" w:name="__RefHeading___Toc3166_1200781530"/>
       <w:bookmarkEnd w:id="59"/>
       <w:r>
         <w:rPr>
@@ -27494,7 +27494,7 @@
           <w:sz w:val="24"/>
           <w:szCs w:val="24"/>
         </w:rPr>
-        <w:t>c) Tentativa de emissão de certificado sem registro de presença, que deve ser recusada (RN-05);</w:t>
+        <w:t>c) Tentativa de emissão de certificado sem registro de presença ou antes do término do evento, que deve ser recusada (RN-05);</w:t>
       </w:r>
     </w:p>
     <w:p>
@@ -27563,7 +27563,7 @@
         <w:jc w:val="left"/>
         <w:rPr/>
       </w:pPr>
-      <w:bookmarkStart w:id="60" w:name="__RefHeading___Toc3150_3157206431"/>
+      <w:bookmarkStart w:id="60" w:name="__RefHeading___Toc3168_1200781530"/>
       <w:bookmarkEnd w:id="60"/>
       <w:r>
         <w:rPr>
@@ -27584,7 +27584,7 @@
         <w:jc w:val="left"/>
         <w:rPr/>
       </w:pPr>
-      <w:bookmarkStart w:id="61" w:name="__RefHeading___Toc3152_3157206431"/>
+      <w:bookmarkStart w:id="61" w:name="__RefHeading___Toc3170_1200781530"/>
       <w:bookmarkEnd w:id="61"/>
       <w:r>
         <w:rPr>
@@ -27645,7 +27645,7 @@
         <w:jc w:val="left"/>
         <w:rPr/>
       </w:pPr>
-      <w:bookmarkStart w:id="62" w:name="__RefHeading___Toc3154_3157206431"/>
+      <w:bookmarkStart w:id="62" w:name="__RefHeading___Toc3172_1200781530"/>
       <w:bookmarkEnd w:id="62"/>
       <w:r>
         <w:rPr>
@@ -27729,7 +27729,7 @@
         <w:jc w:val="left"/>
         <w:rPr/>
       </w:pPr>
-      <w:bookmarkStart w:id="63" w:name="__RefHeading___Toc3156_3157206431"/>
+      <w:bookmarkStart w:id="63" w:name="__RefHeading___Toc3174_1200781530"/>
       <w:bookmarkEnd w:id="63"/>
       <w:r>
         <w:rPr>
@@ -27792,7 +27792,7 @@
         <w:jc w:val="left"/>
         <w:rPr/>
       </w:pPr>
-      <w:bookmarkStart w:id="64" w:name="__RefHeading___Toc3158_3157206431"/>
+      <w:bookmarkStart w:id="64" w:name="__RefHeading___Toc3176_1200781530"/>
       <w:bookmarkEnd w:id="64"/>
       <w:r>
         <w:rPr>
@@ -27834,7 +27834,7 @@
         <w:jc w:val="left"/>
         <w:rPr/>
       </w:pPr>
-      <w:bookmarkStart w:id="65" w:name="__RefHeading___Toc3160_3157206431"/>
+      <w:bookmarkStart w:id="65" w:name="__RefHeading___Toc3178_1200781530"/>
       <w:bookmarkEnd w:id="65"/>
       <w:r>
         <w:rPr>
@@ -28484,7 +28484,7 @@
         <w:jc w:val="left"/>
         <w:rPr/>
       </w:pPr>
-      <w:bookmarkStart w:id="66" w:name="__RefHeading___Toc3162_3157206431"/>
+      <w:bookmarkStart w:id="66" w:name="__RefHeading___Toc3180_1200781530"/>
       <w:bookmarkEnd w:id="66"/>
       <w:r>
         <w:rPr>
@@ -28505,7 +28505,7 @@
         <w:jc w:val="left"/>
         <w:rPr/>
       </w:pPr>
-      <w:bookmarkStart w:id="67" w:name="__RefHeading___Toc3164_3157206431"/>
+      <w:bookmarkStart w:id="67" w:name="__RefHeading___Toc3182_1200781530"/>
       <w:bookmarkEnd w:id="67"/>
       <w:r>
         <w:rPr>
@@ -29470,7 +29470,7 @@
         <w:jc w:val="left"/>
         <w:rPr/>
       </w:pPr>
-      <w:bookmarkStart w:id="68" w:name="__RefHeading___Toc3166_3157206431"/>
+      <w:bookmarkStart w:id="68" w:name="__RefHeading___Toc3184_1200781530"/>
       <w:bookmarkEnd w:id="68"/>
       <w:r>
         <w:rPr>
@@ -29491,7 +29491,7 @@
         <w:jc w:val="left"/>
         <w:rPr/>
       </w:pPr>
-      <w:bookmarkStart w:id="69" w:name="__RefHeading___Toc3168_3157206431"/>
+      <w:bookmarkStart w:id="69" w:name="__RefHeading___Toc3186_1200781530"/>
       <w:bookmarkEnd w:id="69"/>
       <w:r>
         <w:rPr>
@@ -30383,7 +30383,7 @@
                 <w:sz w:val="18"/>
                 <w:szCs w:val="18"/>
               </w:rPr>
-              <w:t>Certificado emitido sem presença registrada</w:t>
+              <w:t>Certificado emitido sem presença registrada ou antes do fim do evento</w:t>
             </w:r>
           </w:p>
         </w:tc>
@@ -30412,7 +30412,7 @@
                 <w:sz w:val="18"/>
                 <w:szCs w:val="18"/>
               </w:rPr>
-              <w:t>Verificação de presença ausente ou posicionada após a geração do arquivo</w:t>
+              <w:t>Verificação de presença ou do término do evento ausente, ou posicionada após a gravação do certificado</w:t>
             </w:r>
           </w:p>
         </w:tc>
@@ -30441,7 +30441,187 @@
                 <w:sz w:val="18"/>
                 <w:szCs w:val="18"/>
               </w:rPr>
-              <w:t>A consulta ao registro de presença deve anteceder a geração do PDF, conforme o diagrama de interação do Apêndice A (RN-05)</w:t>
+              <w:t>A consulta ao registro de presença e ao término do evento deve anteceder a gravação do certificado, conforme o diagrama de interação do Apêndice A (RN-05)</w:t>
+            </w:r>
+          </w:p>
+        </w:tc>
+      </w:tr>
+      <w:tr>
+        <w:trPr/>
+        <w:tc>
+          <w:tcPr>
+            <w:tcW w:w="2563" w:type="dxa"/>
+            <w:tcBorders>
+              <w:top w:val="single" w:sz="4" w:space="0" w:color="999999"/>
+              <w:left w:val="single" w:sz="4" w:space="0" w:color="999999"/>
+              <w:bottom w:val="single" w:sz="4" w:space="0" w:color="999999"/>
+              <w:right w:val="single" w:sz="4" w:space="0" w:color="999999"/>
+            </w:tcBorders>
+          </w:tcPr>
+          <w:p>
+            <w:pPr>
+              <w:pStyle w:val="Normal"/>
+              <w:spacing w:lineRule="exact" w:line="240" w:before="0" w:after="0"/>
+              <w:jc w:val="left"/>
+              <w:rPr/>
+            </w:pPr>
+            <w:r>
+              <w:rPr>
+                <w:rFonts w:eastAsia="Arial" w:cs="Arial"/>
+                <w:b w:val="false"/>
+                <w:bCs w:val="false"/>
+                <w:sz w:val="18"/>
+                <w:szCs w:val="18"/>
+              </w:rPr>
+              <w:t>Botão de certificado não aparece para o participante</w:t>
+            </w:r>
+          </w:p>
+        </w:tc>
+        <w:tc>
+          <w:tcPr>
+            <w:tcW w:w="2563" w:type="dxa"/>
+            <w:tcBorders>
+              <w:top w:val="single" w:sz="4" w:space="0" w:color="999999"/>
+              <w:left w:val="single" w:sz="4" w:space="0" w:color="999999"/>
+              <w:bottom w:val="single" w:sz="4" w:space="0" w:color="999999"/>
+              <w:right w:val="single" w:sz="4" w:space="0" w:color="999999"/>
+            </w:tcBorders>
+          </w:tcPr>
+          <w:p>
+            <w:pPr>
+              <w:pStyle w:val="Normal"/>
+              <w:spacing w:lineRule="exact" w:line="240" w:before="0" w:after="0"/>
+              <w:jc w:val="left"/>
+              <w:rPr/>
+            </w:pPr>
+            <w:r>
+              <w:rPr>
+                <w:rFonts w:eastAsia="Arial" w:cs="Arial"/>
+                <w:b w:val="false"/>
+                <w:bCs w:val="false"/>
+                <w:sz w:val="18"/>
+                <w:szCs w:val="18"/>
+              </w:rPr>
+              <w:t>Presença ainda não registrada ou evento ainda em curso</w:t>
+            </w:r>
+          </w:p>
+        </w:tc>
+        <w:tc>
+          <w:tcPr>
+            <w:tcW w:w="3945" w:type="dxa"/>
+            <w:tcBorders>
+              <w:top w:val="single" w:sz="4" w:space="0" w:color="999999"/>
+              <w:left w:val="single" w:sz="4" w:space="0" w:color="999999"/>
+              <w:bottom w:val="single" w:sz="4" w:space="0" w:color="999999"/>
+              <w:right w:val="single" w:sz="4" w:space="0" w:color="999999"/>
+            </w:tcBorders>
+          </w:tcPr>
+          <w:p>
+            <w:pPr>
+              <w:pStyle w:val="Normal"/>
+              <w:spacing w:lineRule="exact" w:line="240" w:before="0" w:after="0"/>
+              <w:jc w:val="left"/>
+              <w:rPr/>
+            </w:pPr>
+            <w:r>
+              <w:rPr>
+                <w:rFonts w:eastAsia="Arial" w:cs="Arial"/>
+                <w:b w:val="false"/>
+                <w:bCs w:val="false"/>
+                <w:sz w:val="18"/>
+                <w:szCs w:val="18"/>
+              </w:rPr>
+              <w:t>Registrar a presença e aguardar o horário de fim ou encerrar o evento; o certificado é liberado no que ocorrer primeiro (RN-05)</w:t>
+            </w:r>
+          </w:p>
+        </w:tc>
+      </w:tr>
+      <w:tr>
+        <w:trPr/>
+        <w:tc>
+          <w:tcPr>
+            <w:tcW w:w="2563" w:type="dxa"/>
+            <w:tcBorders>
+              <w:top w:val="single" w:sz="4" w:space="0" w:color="999999"/>
+              <w:left w:val="single" w:sz="4" w:space="0" w:color="999999"/>
+              <w:bottom w:val="single" w:sz="4" w:space="0" w:color="999999"/>
+              <w:right w:val="single" w:sz="4" w:space="0" w:color="999999"/>
+            </w:tcBorders>
+          </w:tcPr>
+          <w:p>
+            <w:pPr>
+              <w:pStyle w:val="Normal"/>
+              <w:spacing w:lineRule="exact" w:line="240" w:before="0" w:after="0"/>
+              <w:jc w:val="left"/>
+              <w:rPr/>
+            </w:pPr>
+            <w:r>
+              <w:rPr>
+                <w:rFonts w:eastAsia="Arial" w:cs="Arial"/>
+                <w:b w:val="false"/>
+                <w:bCs w:val="false"/>
+                <w:sz w:val="18"/>
+                <w:szCs w:val="18"/>
+              </w:rPr>
+              <w:t>Evento não aparece no catálogo para outras pessoas</w:t>
+            </w:r>
+          </w:p>
+        </w:tc>
+        <w:tc>
+          <w:tcPr>
+            <w:tcW w:w="2563" w:type="dxa"/>
+            <w:tcBorders>
+              <w:top w:val="single" w:sz="4" w:space="0" w:color="999999"/>
+              <w:left w:val="single" w:sz="4" w:space="0" w:color="999999"/>
+              <w:bottom w:val="single" w:sz="4" w:space="0" w:color="999999"/>
+              <w:right w:val="single" w:sz="4" w:space="0" w:color="999999"/>
+            </w:tcBorders>
+          </w:tcPr>
+          <w:p>
+            <w:pPr>
+              <w:pStyle w:val="Normal"/>
+              <w:spacing w:lineRule="exact" w:line="240" w:before="0" w:after="0"/>
+              <w:jc w:val="left"/>
+              <w:rPr/>
+            </w:pPr>
+            <w:r>
+              <w:rPr>
+                <w:rFonts w:eastAsia="Arial" w:cs="Arial"/>
+                <w:b w:val="false"/>
+                <w:bCs w:val="false"/>
+                <w:sz w:val="18"/>
+                <w:szCs w:val="18"/>
+              </w:rPr>
+              <w:t>Evento em rascunho ou marcado como em andamento</w:t>
+            </w:r>
+          </w:p>
+        </w:tc>
+        <w:tc>
+          <w:tcPr>
+            <w:tcW w:w="3945" w:type="dxa"/>
+            <w:tcBorders>
+              <w:top w:val="single" w:sz="4" w:space="0" w:color="999999"/>
+              <w:left w:val="single" w:sz="4" w:space="0" w:color="999999"/>
+              <w:bottom w:val="single" w:sz="4" w:space="0" w:color="999999"/>
+              <w:right w:val="single" w:sz="4" w:space="0" w:color="999999"/>
+            </w:tcBorders>
+          </w:tcPr>
+          <w:p>
+            <w:pPr>
+              <w:pStyle w:val="Normal"/>
+              <w:spacing w:lineRule="exact" w:line="240" w:before="0" w:after="0"/>
+              <w:jc w:val="left"/>
+              <w:rPr/>
+            </w:pPr>
+            <w:r>
+              <w:rPr>
+                <w:rFonts w:eastAsia="Arial" w:cs="Arial"/>
+                <w:b w:val="false"/>
+                <w:bCs w:val="false"/>
+                <w:sz w:val="18"/>
+                <w:szCs w:val="18"/>
+              </w:rPr>
+              <w:t>Publicar o evento: o catálogo lista apenas eventos publicados (RF-04), e marcá-lo como em andamento o retira da listagem</w:t>
             </w:r>
           </w:p>
         </w:tc>
@@ -30998,7 +31178,7 @@
       <w:r>
         <w:br w:type="page"/>
       </w:r>
-      <w:bookmarkStart w:id="70" w:name="__RefHeading___Toc3170_3157206431"/>
+      <w:bookmarkStart w:id="70" w:name="__RefHeading___Toc3188_1200781530"/>
       <w:bookmarkEnd w:id="70"/>
       <w:r>
         <w:rPr>
@@ -31417,7 +31597,7 @@
         <w:jc w:val="center"/>
         <w:rPr/>
       </w:pPr>
-      <w:bookmarkStart w:id="71" w:name="__RefHeading___Toc3172_3157206431"/>
+      <w:bookmarkStart w:id="71" w:name="__RefHeading___Toc3190_1200781530"/>
       <w:bookmarkEnd w:id="71"/>
       <w:r>
         <w:rPr>
@@ -31518,7 +31698,7 @@
         <w:jc w:val="left"/>
         <w:rPr/>
       </w:pPr>
-      <w:bookmarkStart w:id="72" w:name="__RefHeading___Toc3174_3157206431"/>
+      <w:bookmarkStart w:id="72" w:name="__RefHeading___Toc3192_1200781530"/>
       <w:bookmarkEnd w:id="72"/>
       <w:r>
         <w:rPr>
@@ -31616,7 +31796,7 @@
         <w:jc w:val="left"/>
         <w:rPr/>
       </w:pPr>
-      <w:bookmarkStart w:id="73" w:name="__RefHeading___Toc3176_3157206431"/>
+      <w:bookmarkStart w:id="73" w:name="__RefHeading___Toc3194_1200781530"/>
       <w:bookmarkEnd w:id="73"/>
       <w:r>
         <w:rPr>
@@ -31714,7 +31894,7 @@
         <w:jc w:val="left"/>
         <w:rPr/>
       </w:pPr>
-      <w:bookmarkStart w:id="74" w:name="__RefHeading___Toc3178_3157206431"/>
+      <w:bookmarkStart w:id="74" w:name="__RefHeading___Toc3196_1200781530"/>
       <w:bookmarkEnd w:id="74"/>
       <w:r>
         <w:rPr>
@@ -31812,7 +31992,7 @@
         <w:jc w:val="left"/>
         <w:rPr/>
       </w:pPr>
-      <w:bookmarkStart w:id="75" w:name="__RefHeading___Toc3180_3157206431"/>
+      <w:bookmarkStart w:id="75" w:name="__RefHeading___Toc3198_1200781530"/>
       <w:bookmarkEnd w:id="75"/>
       <w:r>
         <w:rPr>
@@ -31910,7 +32090,7 @@
         <w:jc w:val="left"/>
         <w:rPr/>
       </w:pPr>
-      <w:bookmarkStart w:id="76" w:name="__RefHeading___Toc3182_3157206431"/>
+      <w:bookmarkStart w:id="76" w:name="__RefHeading___Toc3200_1200781530"/>
       <w:bookmarkEnd w:id="76"/>
       <w:r>
         <w:rPr>
@@ -32008,7 +32188,7 @@
         <w:jc w:val="left"/>
         <w:rPr/>
       </w:pPr>
-      <w:bookmarkStart w:id="77" w:name="__RefHeading___Toc3184_3157206431"/>
+      <w:bookmarkStart w:id="77" w:name="__RefHeading___Toc3202_1200781530"/>
       <w:bookmarkEnd w:id="77"/>
       <w:r>
         <w:rPr>
@@ -32046,7 +32226,7 @@
           <w:sz w:val="20"/>
           <w:szCs w:val="20"/>
         </w:rPr>
-        <w:t>Ciclo de vida do evento conforme as transições permitidas por StatusEvento. Somente a situação PUBLICADO aceita inscrições, e as situações ENCERRADO e CANCELADO são terminais, sem edição nem novas inscrições (RN-09).</w:t>
+        <w:t>Ciclo de vida do evento conforme as transições permitidas por StatusEvento. Somente a situação PUBLICADO aceita inscrições, e as situações ENCERRADO e CANCELADO são terminais, sem edição nem novas inscrições (RN-09). Encerrar o evento, mesmo antes do horário previsto, libera o certificado de quem teve presença registrada (RN-05).</w:t>
       </w:r>
     </w:p>
     <w:p>
@@ -32106,7 +32286,7 @@
         <w:jc w:val="left"/>
         <w:rPr/>
       </w:pPr>
-      <w:bookmarkStart w:id="78" w:name="__RefHeading___Toc3186_3157206431"/>
+      <w:bookmarkStart w:id="78" w:name="__RefHeading___Toc3204_1200781530"/>
       <w:bookmarkEnd w:id="78"/>
       <w:r>
         <w:rPr>
@@ -32204,7 +32384,7 @@
         <w:jc w:val="left"/>
         <w:rPr/>
       </w:pPr>
-      <w:bookmarkStart w:id="79" w:name="__RefHeading___Toc3188_3157206431"/>
+      <w:bookmarkStart w:id="79" w:name="__RefHeading___Toc3206_1200781530"/>
       <w:bookmarkEnd w:id="79"/>
       <w:r>
         <w:rPr>
@@ -32257,7 +32437,7 @@
         <w:rPr/>
         <w:drawing>
           <wp:inline distT="0" distB="0" distL="0" distR="0">
-            <wp:extent cx="7626350" cy="4140200"/>
+            <wp:extent cx="6440170" cy="4140200"/>
             <wp:effectExtent l="0" t="0" r="0" b="0"/>
             <wp:docPr id="14" name="Imagem 509" descr="Apêndice A.6a — Diagrama de Interação: Emissão de Certificado"/>
             <wp:cNvGraphicFramePr>
@@ -32281,7 +32461,7 @@
                   <pic:spPr bwMode="auto">
                     <a:xfrm>
                       <a:off x="0" y="0"/>
-                      <a:ext cx="7626350" cy="4140200"/>
+                      <a:ext cx="6440170" cy="4140200"/>
                     </a:xfrm>
                     <a:prstGeom prst="rect">
                       <a:avLst/>
@@ -32302,7 +32482,7 @@
         <w:jc w:val="left"/>
         <w:rPr/>
       </w:pPr>
-      <w:bookmarkStart w:id="80" w:name="__RefHeading___Toc3190_3157206431"/>
+      <w:bookmarkStart w:id="80" w:name="__RefHeading___Toc3208_1200781530"/>
       <w:bookmarkEnd w:id="80"/>
       <w:r>
         <w:rPr>
@@ -32340,7 +32520,7 @@
           <w:sz w:val="20"/>
           <w:szCs w:val="20"/>
         </w:rPr>
-        <w:t>Emissão do certificado (RF-09). A operação é idempotente: um certificado já emitido é devolvido sem nova gravação. Sem registro de presença, a emissão é recusada com PRESENCA_NAO_REGISTRADA (RN-05). O código de autenticidade é gerado no construtor de Certificado, e nenhum arquivo PDF é produzido nesta etapa.</w:t>
+        <w:t>Emissão do certificado (RF-09). A operação é idempotente: um certificado já emitido é devolvido sem nova gravação. A emissão exige presença registrada e evento terminado, pelo horário de fim ou pelo encerramento antecipado do organizador (RN-05); sem uma das condições, é recusada com PRESENCA_NAO_REGISTRADA ou EVENTO_NAO_TERMINADO. O código de autenticidade é gerado no construtor de Certificado, e nenhum arquivo PDF é produzido nesta etapa.</w:t>
       </w:r>
     </w:p>
     <w:p>
@@ -32400,7 +32580,7 @@
         <w:jc w:val="left"/>
         <w:rPr/>
       </w:pPr>
-      <w:bookmarkStart w:id="81" w:name="__RefHeading___Toc3192_3157206431"/>
+      <w:bookmarkStart w:id="81" w:name="__RefHeading___Toc3210_1200781530"/>
       <w:bookmarkEnd w:id="81"/>
       <w:r>
         <w:rPr>
@@ -32498,7 +32678,7 @@
         <w:jc w:val="left"/>
         <w:rPr/>
       </w:pPr>
-      <w:bookmarkStart w:id="82" w:name="__RefHeading___Toc3194_3157206431"/>
+      <w:bookmarkStart w:id="82" w:name="__RefHeading___Toc3212_1200781530"/>
       <w:bookmarkEnd w:id="82"/>
       <w:r>
         <w:rPr>
@@ -32550,7 +32730,7 @@
         <w:jc w:val="center"/>
         <w:rPr/>
       </w:pPr>
-      <w:bookmarkStart w:id="83" w:name="__RefHeading___Toc3196_3157206431"/>
+      <w:bookmarkStart w:id="83" w:name="__RefHeading___Toc3214_1200781530"/>
       <w:bookmarkEnd w:id="83"/>
       <w:r>
         <w:rPr>
@@ -34059,7 +34239,7 @@
       <w:r>
         <w:br w:type="page"/>
       </w:r>
-      <w:bookmarkStart w:id="84" w:name="__RefHeading___Toc3198_3157206431"/>
+      <w:bookmarkStart w:id="84" w:name="__RefHeading___Toc3216_1200781530"/>
       <w:bookmarkEnd w:id="84"/>
       <w:r>
         <w:rPr>

</xml_diff>

<commit_message>
docs: folha de rosto de volta na versao ABNT
A contagem de paginas volta a comecar na folha de rosto, como a NBR 14724 pede.

Co-Authored-By: Claude Opus 5.5 <noreply@anthropic.com>
Claude-Session: https://claude.ai/code/session_011SKCdnRmci1yJCi4ZvMpS2
</commit_message>
<xml_diff>
--- a/docs/Documentacao-ABNT.docx
+++ b/docs/Documentacao-ABNT.docx
@@ -244,6 +244,189 @@
     <w:p>
       <w:pPr>
         <w:pStyle w:val="Normal"/>
+        <w:spacing w:lineRule="auto" w:line="360" w:before="0" w:after="0"/>
+        <w:jc w:val="center"/>
+        <w:rPr/>
+      </w:pPr>
+      <w:r>
+        <w:rPr>
+          <w:rFonts w:eastAsia="Arial" w:cs="Arial"/>
+          <w:sz w:val="24"/>
+          <w:szCs w:val="24"/>
+        </w:rPr>
+        <w:t>BIANCA GOMES DANTAS DE ALMEIDA</w:t>
+      </w:r>
+    </w:p>
+    <w:p>
+      <w:pPr>
+        <w:pStyle w:val="Normal"/>
+        <w:spacing w:lineRule="auto" w:line="360" w:before="0" w:after="0"/>
+        <w:jc w:val="center"/>
+        <w:rPr/>
+      </w:pPr>
+      <w:r>
+        <w:rPr>
+          <w:rFonts w:eastAsia="Arial" w:cs="Arial"/>
+          <w:sz w:val="24"/>
+          <w:szCs w:val="24"/>
+        </w:rPr>
+        <w:t>GIOVANNA GOMES SILVA</w:t>
+      </w:r>
+    </w:p>
+    <w:p>
+      <w:pPr>
+        <w:pStyle w:val="Normal"/>
+        <w:spacing w:lineRule="auto" w:line="360" w:before="0" w:after="0"/>
+        <w:jc w:val="center"/>
+        <w:rPr/>
+      </w:pPr>
+      <w:r>
+        <w:rPr>
+          <w:rFonts w:eastAsia="Arial" w:cs="Arial"/>
+          <w:sz w:val="24"/>
+          <w:szCs w:val="24"/>
+        </w:rPr>
+        <w:t>JAILTON SANTOS DE MATOS</w:t>
+      </w:r>
+    </w:p>
+    <w:p>
+      <w:pPr>
+        <w:pStyle w:val="Normal"/>
+        <w:spacing w:lineRule="auto" w:line="360" w:before="0" w:after="0"/>
+        <w:jc w:val="center"/>
+        <w:rPr/>
+      </w:pPr>
+      <w:r>
+        <w:rPr>
+          <w:rFonts w:eastAsia="Arial" w:cs="Arial"/>
+          <w:sz w:val="24"/>
+          <w:szCs w:val="24"/>
+        </w:rPr>
+        <w:t>LUCAS ALVES DE SOUZA</w:t>
+      </w:r>
+    </w:p>
+    <w:p>
+      <w:pPr>
+        <w:pStyle w:val="Normal"/>
+        <w:spacing w:lineRule="auto" w:line="360" w:before="0" w:after="0"/>
+        <w:jc w:val="center"/>
+        <w:rPr/>
+      </w:pPr>
+      <w:r>
+        <w:rPr>
+          <w:rFonts w:eastAsia="Arial" w:cs="Arial"/>
+          <w:sz w:val="24"/>
+          <w:szCs w:val="24"/>
+        </w:rPr>
+        <w:t>LUCAS NEVES DOS SANTOS</w:t>
+      </w:r>
+    </w:p>
+    <w:p>
+      <w:pPr>
+        <w:pStyle w:val="Normal"/>
+        <w:spacing w:lineRule="auto" w:line="360" w:before="3000" w:after="0"/>
+        <w:jc w:val="center"/>
+        <w:rPr/>
+      </w:pPr>
+      <w:r>
+        <w:rPr>
+          <w:rFonts w:eastAsia="Arial" w:cs="Arial"/>
+          <w:b/>
+          <w:bCs/>
+          <w:sz w:val="24"/>
+          <w:szCs w:val="24"/>
+        </w:rPr>
+        <w:t>GERENCIADOR DE EVENTOS ACADÊMICOS:</w:t>
+      </w:r>
+    </w:p>
+    <w:p>
+      <w:pPr>
+        <w:pStyle w:val="Normal"/>
+        <w:spacing w:lineRule="auto" w:line="360" w:before="0" w:after="0"/>
+        <w:jc w:val="center"/>
+        <w:rPr/>
+      </w:pPr>
+      <w:r>
+        <w:rPr>
+          <w:rFonts w:eastAsia="Arial" w:cs="Arial"/>
+          <w:sz w:val="24"/>
+          <w:szCs w:val="24"/>
+        </w:rPr>
+        <w:t>Documentação do Software</w:t>
+      </w:r>
+    </w:p>
+    <w:p>
+      <w:pPr>
+        <w:pStyle w:val="Normal"/>
+        <w:spacing w:lineRule="auto" w:line="240" w:before="1400" w:after="240"/>
+        <w:ind w:left="4536"/>
+        <w:jc w:val="both"/>
+        <w:rPr/>
+      </w:pPr>
+      <w:r>
+        <w:rPr>
+          <w:rFonts w:eastAsia="Arial" w:cs="Arial"/>
+          <w:sz w:val="20"/>
+          <w:szCs w:val="20"/>
+        </w:rPr>
+        <w:t>Documentação do Projeto Integrador apresentada ao Curso Superior de Tecnologia em Análise e Desenvolvimento de Sistemas da Universidade Santo Amaro (UNISA), como requisito parcial para aprovação.</w:t>
+      </w:r>
+    </w:p>
+    <w:p>
+      <w:pPr>
+        <w:pStyle w:val="Normal"/>
+        <w:spacing w:lineRule="auto" w:line="240" w:before="0" w:after="0"/>
+        <w:ind w:left="4536"/>
+        <w:jc w:val="left"/>
+        <w:rPr/>
+      </w:pPr>
+      <w:r>
+        <w:rPr>
+          <w:rFonts w:eastAsia="Arial" w:cs="Arial"/>
+          <w:sz w:val="20"/>
+          <w:szCs w:val="20"/>
+        </w:rPr>
+        <w:t xml:space="preserve">Orientador(a): </w:t>
+      </w:r>
+    </w:p>
+    <w:p>
+      <w:pPr>
+        <w:pStyle w:val="Normal"/>
+        <w:spacing w:lineRule="auto" w:line="360" w:before="3600" w:after="0"/>
+        <w:jc w:val="center"/>
+        <w:rPr/>
+      </w:pPr>
+      <w:r>
+        <w:rPr>
+          <w:rFonts w:eastAsia="Arial" w:cs="Arial"/>
+          <w:sz w:val="24"/>
+          <w:szCs w:val="24"/>
+        </w:rPr>
+        <w:t>SÃO PAULO</w:t>
+      </w:r>
+    </w:p>
+    <w:p>
+      <w:pPr>
+        <w:pStyle w:val="Normal"/>
+        <w:spacing w:lineRule="auto" w:line="360" w:before="0" w:after="0"/>
+        <w:jc w:val="center"/>
+        <w:rPr/>
+      </w:pPr>
+      <w:r>
+        <w:rPr>
+          <w:rFonts w:eastAsia="Arial" w:cs="Arial"/>
+          <w:sz w:val="24"/>
+          <w:szCs w:val="24"/>
+        </w:rPr>
+        <w:t>2026</w:t>
+      </w:r>
+      <w:r>
+        <w:br w:type="page"/>
+      </w:r>
+    </w:p>
+    <w:p>
+      <w:pPr>
+        <w:pStyle w:val="Normal"/>
         <w:spacing w:lineRule="auto" w:line="360" w:before="0" w:after="360"/>
         <w:jc w:val="center"/>
         <w:rPr/>
@@ -293,7 +476,7 @@
             </w:rPr>
             <w:fldChar w:fldCharType="separate"/>
           </w:r>
-          <w:hyperlink w:anchor="__RefHeading___Toc3048_1200781530">
+          <w:hyperlink w:anchor="__RefHeading___Toc3059_1907633178">
             <w:r>
               <w:rPr>
                 <w:webHidden/>
@@ -301,7 +484,7 @@
               </w:rPr>
               <w:t>1 VISÃO GERAL DO PROJETO</w:t>
               <w:tab/>
-              <w:t>4</w:t>
+              <w:t>5</w:t>
             </w:r>
           </w:hyperlink>
         </w:p>
@@ -314,7 +497,7 @@
             </w:tabs>
             <w:rPr/>
           </w:pPr>
-          <w:hyperlink w:anchor="__RefHeading___Toc3050_1200781530">
+          <w:hyperlink w:anchor="__RefHeading___Toc3061_1907633178">
             <w:r>
               <w:rPr>
                 <w:webHidden/>
@@ -322,7 +505,7 @@
               </w:rPr>
               <w:t>1.1 DESCRIÇÃO EXECUTIVA</w:t>
               <w:tab/>
-              <w:t>4</w:t>
+              <w:t>5</w:t>
             </w:r>
           </w:hyperlink>
         </w:p>
@@ -335,7 +518,7 @@
             </w:tabs>
             <w:rPr/>
           </w:pPr>
-          <w:hyperlink w:anchor="__RefHeading___Toc3052_1200781530">
+          <w:hyperlink w:anchor="__RefHeading___Toc3063_1907633178">
             <w:r>
               <w:rPr>
                 <w:webHidden/>
@@ -343,7 +526,7 @@
               </w:rPr>
               <w:t>1.2 OBJETIVOS E ESCOPO</w:t>
               <w:tab/>
-              <w:t>4</w:t>
+              <w:t>5</w:t>
             </w:r>
           </w:hyperlink>
         </w:p>
@@ -356,7 +539,7 @@
             </w:tabs>
             <w:rPr/>
           </w:pPr>
-          <w:hyperlink w:anchor="__RefHeading___Toc3054_1200781530">
+          <w:hyperlink w:anchor="__RefHeading___Toc3065_1907633178">
             <w:r>
               <w:rPr>
                 <w:webHidden/>
@@ -364,7 +547,7 @@
               </w:rPr>
               <w:t>1.2.1 Objetivo Geral</w:t>
               <w:tab/>
-              <w:t>4</w:t>
+              <w:t>5</w:t>
             </w:r>
           </w:hyperlink>
         </w:p>
@@ -377,7 +560,7 @@
             </w:tabs>
             <w:rPr/>
           </w:pPr>
-          <w:hyperlink w:anchor="__RefHeading___Toc3056_1200781530">
+          <w:hyperlink w:anchor="__RefHeading___Toc3067_1907633178">
             <w:r>
               <w:rPr>
                 <w:webHidden/>
@@ -385,7 +568,7 @@
               </w:rPr>
               <w:t>1.2.2 Objetivos Específicos</w:t>
               <w:tab/>
-              <w:t>5</w:t>
+              <w:t>6</w:t>
             </w:r>
           </w:hyperlink>
         </w:p>
@@ -398,7 +581,7 @@
             </w:tabs>
             <w:rPr/>
           </w:pPr>
-          <w:hyperlink w:anchor="__RefHeading___Toc3058_1200781530">
+          <w:hyperlink w:anchor="__RefHeading___Toc3069_1907633178">
             <w:r>
               <w:rPr>
                 <w:webHidden/>
@@ -406,7 +589,7 @@
               </w:rPr>
               <w:t>1.2.3 Escopo do Projeto</w:t>
               <w:tab/>
-              <w:t>5</w:t>
+              <w:t>6</w:t>
             </w:r>
           </w:hyperlink>
         </w:p>
@@ -419,7 +602,7 @@
             </w:tabs>
             <w:rPr/>
           </w:pPr>
-          <w:hyperlink w:anchor="__RefHeading___Toc3060_1200781530">
+          <w:hyperlink w:anchor="__RefHeading___Toc3071_1907633178">
             <w:r>
               <w:rPr>
                 <w:webHidden/>
@@ -427,7 +610,7 @@
               </w:rPr>
               <w:t>1.2.4 Limitações de Escopo</w:t>
               <w:tab/>
-              <w:t>5</w:t>
+              <w:t>6</w:t>
             </w:r>
           </w:hyperlink>
         </w:p>
@@ -440,7 +623,7 @@
             </w:tabs>
             <w:rPr/>
           </w:pPr>
-          <w:hyperlink w:anchor="__RefHeading___Toc3062_1200781530">
+          <w:hyperlink w:anchor="__RefHeading___Toc3073_1907633178">
             <w:r>
               <w:rPr>
                 <w:webHidden/>
@@ -448,7 +631,7 @@
               </w:rPr>
               <w:t>1.3 REGRAS DE NEGÓCIO</w:t>
               <w:tab/>
-              <w:t>6</w:t>
+              <w:t>7</w:t>
             </w:r>
           </w:hyperlink>
         </w:p>
@@ -461,7 +644,7 @@
             </w:tabs>
             <w:rPr/>
           </w:pPr>
-          <w:hyperlink w:anchor="__RefHeading___Toc3064_1200781530">
+          <w:hyperlink w:anchor="__RefHeading___Toc3075_1907633178">
             <w:r>
               <w:rPr>
                 <w:webHidden/>
@@ -469,7 +652,7 @@
               </w:rPr>
               <w:t>2 ARQUITETURA DO SISTEMA</w:t>
               <w:tab/>
-              <w:t>8</w:t>
+              <w:t>9</w:t>
             </w:r>
           </w:hyperlink>
         </w:p>
@@ -482,7 +665,7 @@
             </w:tabs>
             <w:rPr/>
           </w:pPr>
-          <w:hyperlink w:anchor="__RefHeading___Toc3066_1200781530">
+          <w:hyperlink w:anchor="__RefHeading___Toc3077_1907633178">
             <w:r>
               <w:rPr>
                 <w:webHidden/>
@@ -490,7 +673,7 @@
               </w:rPr>
               <w:t>2.1 COMPONENTES PRINCIPAIS</w:t>
               <w:tab/>
-              <w:t>8</w:t>
+              <w:t>9</w:t>
             </w:r>
           </w:hyperlink>
         </w:p>
@@ -503,7 +686,7 @@
             </w:tabs>
             <w:rPr/>
           </w:pPr>
-          <w:hyperlink w:anchor="__RefHeading___Toc3068_1200781530">
+          <w:hyperlink w:anchor="__RefHeading___Toc3079_1907633178">
             <w:r>
               <w:rPr>
                 <w:webHidden/>
@@ -511,7 +694,7 @@
               </w:rPr>
               <w:t>2.2 DECISÕES ARQUITETURAIS (ADR)</w:t>
               <w:tab/>
-              <w:t>8</w:t>
+              <w:t>9</w:t>
             </w:r>
           </w:hyperlink>
         </w:p>
@@ -524,7 +707,7 @@
             </w:tabs>
             <w:rPr/>
           </w:pPr>
-          <w:hyperlink w:anchor="__RefHeading___Toc3070_1200781530">
+          <w:hyperlink w:anchor="__RefHeading___Toc3081_1907633178">
             <w:r>
               <w:rPr>
                 <w:webHidden/>
@@ -532,7 +715,7 @@
               </w:rPr>
               <w:t>2.3 STACK TECNOLÓGICA</w:t>
               <w:tab/>
-              <w:t>9</w:t>
+              <w:t>10</w:t>
             </w:r>
           </w:hyperlink>
         </w:p>
@@ -545,7 +728,7 @@
             </w:tabs>
             <w:rPr/>
           </w:pPr>
-          <w:hyperlink w:anchor="__RefHeading___Toc3072_1200781530">
+          <w:hyperlink w:anchor="__RefHeading___Toc3083_1907633178">
             <w:r>
               <w:rPr>
                 <w:webHidden/>
@@ -553,7 +736,7 @@
               </w:rPr>
               <w:t>3 ESPECIFICAÇÃO TÉCNICA</w:t>
               <w:tab/>
-              <w:t>10</w:t>
+              <w:t>11</w:t>
             </w:r>
           </w:hyperlink>
         </w:p>
@@ -566,7 +749,7 @@
             </w:tabs>
             <w:rPr/>
           </w:pPr>
-          <w:hyperlink w:anchor="__RefHeading___Toc3074_1200781530">
+          <w:hyperlink w:anchor="__RefHeading___Toc3085_1907633178">
             <w:r>
               <w:rPr>
                 <w:webHidden/>
@@ -574,7 +757,7 @@
               </w:rPr>
               <w:t>3.1 REQUISITOS FUNCIONAIS</w:t>
               <w:tab/>
-              <w:t>10</w:t>
+              <w:t>11</w:t>
             </w:r>
           </w:hyperlink>
         </w:p>
@@ -587,7 +770,7 @@
             </w:tabs>
             <w:rPr/>
           </w:pPr>
-          <w:hyperlink w:anchor="__RefHeading___Toc3076_1200781530">
+          <w:hyperlink w:anchor="__RefHeading___Toc3087_1907633178">
             <w:r>
               <w:rPr>
                 <w:webHidden/>
@@ -595,7 +778,7 @@
               </w:rPr>
               <w:t>3.2 REQUISITOS NÃO FUNCIONAIS</w:t>
               <w:tab/>
-              <w:t>10</w:t>
+              <w:t>11</w:t>
             </w:r>
           </w:hyperlink>
         </w:p>
@@ -608,7 +791,7 @@
             </w:tabs>
             <w:rPr/>
           </w:pPr>
-          <w:hyperlink w:anchor="__RefHeading___Toc3078_1200781530">
+          <w:hyperlink w:anchor="__RefHeading___Toc3089_1907633178">
             <w:r>
               <w:rPr>
                 <w:webHidden/>
@@ -616,7 +799,7 @@
               </w:rPr>
               <w:t>4 PROTÓTIPO DE BAIXA E ALTA FIDELIDADE</w:t>
               <w:tab/>
-              <w:t>11</w:t>
+              <w:t>12</w:t>
             </w:r>
           </w:hyperlink>
         </w:p>
@@ -629,7 +812,7 @@
             </w:tabs>
             <w:rPr/>
           </w:pPr>
-          <w:hyperlink w:anchor="__RefHeading___Toc3080_1200781530">
+          <w:hyperlink w:anchor="__RefHeading___Toc3091_1907633178">
             <w:r>
               <w:rPr>
                 <w:webHidden/>
@@ -637,7 +820,7 @@
               </w:rPr>
               <w:t>4.1 PROTÓTIPO DE BAIXA FIDELIDADE</w:t>
               <w:tab/>
-              <w:t>11</w:t>
+              <w:t>12</w:t>
             </w:r>
           </w:hyperlink>
         </w:p>
@@ -650,7 +833,7 @@
             </w:tabs>
             <w:rPr/>
           </w:pPr>
-          <w:hyperlink w:anchor="__RefHeading___Toc3082_1200781530">
+          <w:hyperlink w:anchor="__RefHeading___Toc3093_1907633178">
             <w:r>
               <w:rPr>
                 <w:webHidden/>
@@ -658,7 +841,7 @@
               </w:rPr>
               <w:t>4.2 PROTÓTIPO DE ALTA FIDELIDADE</w:t>
               <w:tab/>
-              <w:t>12</w:t>
+              <w:t>13</w:t>
             </w:r>
           </w:hyperlink>
         </w:p>
@@ -671,7 +854,7 @@
             </w:tabs>
             <w:rPr/>
           </w:pPr>
-          <w:hyperlink w:anchor="__RefHeading___Toc3084_1200781530">
+          <w:hyperlink w:anchor="__RefHeading___Toc3095_1907633178">
             <w:r>
               <w:rPr>
                 <w:webHidden/>
@@ -679,7 +862,7 @@
               </w:rPr>
               <w:t>5 MÉTRICAS E CRONOGRAMA</w:t>
               <w:tab/>
-              <w:t>14</w:t>
+              <w:t>15</w:t>
             </w:r>
           </w:hyperlink>
         </w:p>
@@ -692,7 +875,7 @@
             </w:tabs>
             <w:rPr/>
           </w:pPr>
-          <w:hyperlink w:anchor="__RefHeading___Toc3086_1200781530">
+          <w:hyperlink w:anchor="__RefHeading___Toc3097_1907633178">
             <w:r>
               <w:rPr>
                 <w:webHidden/>
@@ -700,7 +883,7 @@
               </w:rPr>
               <w:t>5.1 CRONOGRAMA</w:t>
               <w:tab/>
-              <w:t>14</w:t>
+              <w:t>15</w:t>
             </w:r>
           </w:hyperlink>
         </w:p>
@@ -713,7 +896,7 @@
             </w:tabs>
             <w:rPr/>
           </w:pPr>
-          <w:hyperlink w:anchor="__RefHeading___Toc3088_1200781530">
+          <w:hyperlink w:anchor="__RefHeading___Toc3099_1907633178">
             <w:r>
               <w:rPr>
                 <w:webHidden/>
@@ -721,7 +904,7 @@
               </w:rPr>
               <w:t>5.2 MÉTRICAS DE ACOMPANHAMENTO</w:t>
               <w:tab/>
-              <w:t>15</w:t>
+              <w:t>16</w:t>
             </w:r>
           </w:hyperlink>
         </w:p>
@@ -734,7 +917,7 @@
             </w:tabs>
             <w:rPr/>
           </w:pPr>
-          <w:hyperlink w:anchor="__RefHeading___Toc3090_1200781530">
+          <w:hyperlink w:anchor="__RefHeading___Toc3101_1907633178">
             <w:r>
               <w:rPr>
                 <w:webHidden/>
@@ -742,7 +925,7 @@
               </w:rPr>
               <w:t>6 MODELO DO DOMÍNIO</w:t>
               <w:tab/>
-              <w:t>16</w:t>
+              <w:t>17</w:t>
             </w:r>
           </w:hyperlink>
         </w:p>
@@ -755,7 +938,7 @@
             </w:tabs>
             <w:rPr/>
           </w:pPr>
-          <w:hyperlink w:anchor="__RefHeading___Toc3092_1200781530">
+          <w:hyperlink w:anchor="__RefHeading___Toc3103_1907633178">
             <w:r>
               <w:rPr>
                 <w:webHidden/>
@@ -763,7 +946,7 @@
               </w:rPr>
               <w:t>6.1 VISÃO CONCEITUAL DAS ENTIDADES</w:t>
               <w:tab/>
-              <w:t>16</w:t>
+              <w:t>17</w:t>
             </w:r>
           </w:hyperlink>
         </w:p>
@@ -776,7 +959,7 @@
             </w:tabs>
             <w:rPr/>
           </w:pPr>
-          <w:hyperlink w:anchor="__RefHeading___Toc3094_1200781530">
+          <w:hyperlink w:anchor="__RefHeading___Toc3105_1907633178">
             <w:r>
               <w:rPr>
                 <w:webHidden/>
@@ -784,7 +967,7 @@
               </w:rPr>
               <w:t>6.2 DIAGRAMAS DE MODELAGEM</w:t>
               <w:tab/>
-              <w:t>17</w:t>
+              <w:t>18</w:t>
             </w:r>
           </w:hyperlink>
         </w:p>
@@ -797,7 +980,7 @@
             </w:tabs>
             <w:rPr/>
           </w:pPr>
-          <w:hyperlink w:anchor="__RefHeading___Toc3096_1200781530">
+          <w:hyperlink w:anchor="__RefHeading___Toc3107_1907633178">
             <w:r>
               <w:rPr>
                 <w:webHidden/>
@@ -805,7 +988,7 @@
               </w:rPr>
               <w:t>7 MODELO DE DADOS</w:t>
               <w:tab/>
-              <w:t>18</w:t>
+              <w:t>19</w:t>
             </w:r>
           </w:hyperlink>
         </w:p>
@@ -818,7 +1001,7 @@
             </w:tabs>
             <w:rPr/>
           </w:pPr>
-          <w:hyperlink w:anchor="__RefHeading___Toc3098_1200781530">
+          <w:hyperlink w:anchor="__RefHeading___Toc3109_1907633178">
             <w:r>
               <w:rPr>
                 <w:webHidden/>
@@ -826,7 +1009,7 @@
               </w:rPr>
               <w:t>7.1 MODELO LÓGICO DA BASE DE DADOS</w:t>
               <w:tab/>
-              <w:t>18</w:t>
+              <w:t>19</w:t>
             </w:r>
           </w:hyperlink>
         </w:p>
@@ -839,7 +1022,7 @@
             </w:tabs>
             <w:rPr/>
           </w:pPr>
-          <w:hyperlink w:anchor="__RefHeading___Toc3100_1200781530">
+          <w:hyperlink w:anchor="__RefHeading___Toc3111_1907633178">
             <w:r>
               <w:rPr>
                 <w:webHidden/>
@@ -847,7 +1030,7 @@
               </w:rPr>
               <w:t>7.2 CRIAÇÃO FÍSICA DO MODELO DE DADOS</w:t>
               <w:tab/>
-              <w:t>19</w:t>
+              <w:t>20</w:t>
             </w:r>
           </w:hyperlink>
         </w:p>
@@ -860,7 +1043,7 @@
             </w:tabs>
             <w:rPr/>
           </w:pPr>
-          <w:hyperlink w:anchor="__RefHeading___Toc3102_1200781530">
+          <w:hyperlink w:anchor="__RefHeading___Toc3113_1907633178">
             <w:r>
               <w:rPr>
                 <w:webHidden/>
@@ -868,7 +1051,7 @@
               </w:rPr>
               <w:t>7.3 DICIONÁRIO DE DADOS</w:t>
               <w:tab/>
-              <w:t>21</w:t>
+              <w:t>22</w:t>
             </w:r>
           </w:hyperlink>
         </w:p>
@@ -881,7 +1064,7 @@
             </w:tabs>
             <w:rPr/>
           </w:pPr>
-          <w:hyperlink w:anchor="__RefHeading___Toc3104_1200781530">
+          <w:hyperlink w:anchor="__RefHeading___Toc3115_1907633178">
             <w:r>
               <w:rPr>
                 <w:webHidden/>
@@ -889,7 +1072,7 @@
               </w:rPr>
               <w:t>7.3.1 Tabela USUARIO</w:t>
               <w:tab/>
-              <w:t>21</w:t>
+              <w:t>22</w:t>
             </w:r>
           </w:hyperlink>
         </w:p>
@@ -902,7 +1085,7 @@
             </w:tabs>
             <w:rPr/>
           </w:pPr>
-          <w:hyperlink w:anchor="__RefHeading___Toc3106_1200781530">
+          <w:hyperlink w:anchor="__RefHeading___Toc3117_1907633178">
             <w:r>
               <w:rPr>
                 <w:webHidden/>
@@ -910,7 +1093,7 @@
               </w:rPr>
               <w:t>7.3.2 Tabela USUARIO_PAPEL</w:t>
               <w:tab/>
-              <w:t>21</w:t>
+              <w:t>22</w:t>
             </w:r>
           </w:hyperlink>
         </w:p>
@@ -923,7 +1106,7 @@
             </w:tabs>
             <w:rPr/>
           </w:pPr>
-          <w:hyperlink w:anchor="__RefHeading___Toc3108_1200781530">
+          <w:hyperlink w:anchor="__RefHeading___Toc3119_1907633178">
             <w:r>
               <w:rPr>
                 <w:webHidden/>
@@ -931,7 +1114,7 @@
               </w:rPr>
               <w:t>7.3.3 Tabela EVENTO</w:t>
               <w:tab/>
-              <w:t>21</w:t>
+              <w:t>22</w:t>
             </w:r>
           </w:hyperlink>
         </w:p>
@@ -944,7 +1127,7 @@
             </w:tabs>
             <w:rPr/>
           </w:pPr>
-          <w:hyperlink w:anchor="__RefHeading___Toc3110_1200781530">
+          <w:hyperlink w:anchor="__RefHeading___Toc3121_1907633178">
             <w:r>
               <w:rPr>
                 <w:webHidden/>
@@ -952,7 +1135,7 @@
               </w:rPr>
               <w:t>7.3.4 Tabela EVENTO_FOTO</w:t>
               <w:tab/>
-              <w:t>22</w:t>
+              <w:t>23</w:t>
             </w:r>
           </w:hyperlink>
         </w:p>
@@ -965,7 +1148,7 @@
             </w:tabs>
             <w:rPr/>
           </w:pPr>
-          <w:hyperlink w:anchor="__RefHeading___Toc3112_1200781530">
+          <w:hyperlink w:anchor="__RefHeading___Toc3123_1907633178">
             <w:r>
               <w:rPr>
                 <w:webHidden/>
@@ -973,7 +1156,7 @@
               </w:rPr>
               <w:t>7.3.5 Tabela INSCRICAO</w:t>
               <w:tab/>
-              <w:t>22</w:t>
+              <w:t>23</w:t>
             </w:r>
           </w:hyperlink>
         </w:p>
@@ -986,7 +1169,7 @@
             </w:tabs>
             <w:rPr/>
           </w:pPr>
-          <w:hyperlink w:anchor="__RefHeading___Toc3114_1200781530">
+          <w:hyperlink w:anchor="__RefHeading___Toc3125_1907633178">
             <w:r>
               <w:rPr>
                 <w:webHidden/>
@@ -994,7 +1177,7 @@
               </w:rPr>
               <w:t>7.3.6 Tabela PRESENCA</w:t>
               <w:tab/>
-              <w:t>22</w:t>
+              <w:t>23</w:t>
             </w:r>
           </w:hyperlink>
         </w:p>
@@ -1007,7 +1190,7 @@
             </w:tabs>
             <w:rPr/>
           </w:pPr>
-          <w:hyperlink w:anchor="__RefHeading___Toc3116_1200781530">
+          <w:hyperlink w:anchor="__RefHeading___Toc3127_1907633178">
             <w:r>
               <w:rPr>
                 <w:webHidden/>
@@ -1015,7 +1198,7 @@
               </w:rPr>
               <w:t>7.3.7 Tabela CERTIFICADO</w:t>
               <w:tab/>
-              <w:t>23</w:t>
+              <w:t>24</w:t>
             </w:r>
           </w:hyperlink>
         </w:p>
@@ -1028,7 +1211,7 @@
             </w:tabs>
             <w:rPr/>
           </w:pPr>
-          <w:hyperlink w:anchor="__RefHeading___Toc3118_1200781530">
+          <w:hyperlink w:anchor="__RefHeading___Toc3129_1907633178">
             <w:r>
               <w:rPr>
                 <w:webHidden/>
@@ -1036,7 +1219,7 @@
               </w:rPr>
               <w:t>7.3.8 Tabela AVALIACAO</w:t>
               <w:tab/>
-              <w:t>23</w:t>
+              <w:t>24</w:t>
             </w:r>
           </w:hyperlink>
         </w:p>
@@ -1049,7 +1232,7 @@
             </w:tabs>
             <w:rPr/>
           </w:pPr>
-          <w:hyperlink w:anchor="__RefHeading___Toc3120_1200781530">
+          <w:hyperlink w:anchor="__RefHeading___Toc3131_1907633178">
             <w:r>
               <w:rPr>
                 <w:webHidden/>
@@ -1057,7 +1240,7 @@
               </w:rPr>
               <w:t>7.3.9 Tabela RESUMO_AVALIACAO</w:t>
               <w:tab/>
-              <w:t>23</w:t>
+              <w:t>24</w:t>
             </w:r>
           </w:hyperlink>
         </w:p>
@@ -1070,7 +1253,7 @@
             </w:tabs>
             <w:rPr/>
           </w:pPr>
-          <w:hyperlink w:anchor="__RefHeading___Toc3122_1200781530">
+          <w:hyperlink w:anchor="__RefHeading___Toc3133_1907633178">
             <w:r>
               <w:rPr>
                 <w:webHidden/>
@@ -1078,7 +1261,7 @@
               </w:rPr>
               <w:t>7.3.10 Tabela INTERACAO_IA</w:t>
               <w:tab/>
-              <w:t>24</w:t>
+              <w:t>25</w:t>
             </w:r>
           </w:hyperlink>
         </w:p>
@@ -1091,7 +1274,7 @@
             </w:tabs>
             <w:rPr/>
           </w:pPr>
-          <w:hyperlink w:anchor="__RefHeading___Toc3124_1200781530">
+          <w:hyperlink w:anchor="__RefHeading___Toc3135_1907633178">
             <w:r>
               <w:rPr>
                 <w:webHidden/>
@@ -1099,7 +1282,7 @@
               </w:rPr>
               <w:t>8 AMBIENTE DE DESENVOLVIMENTO</w:t>
               <w:tab/>
-              <w:t>25</w:t>
+              <w:t>26</w:t>
             </w:r>
           </w:hyperlink>
         </w:p>
@@ -1112,7 +1295,7 @@
             </w:tabs>
             <w:rPr/>
           </w:pPr>
-          <w:hyperlink w:anchor="__RefHeading___Toc3126_1200781530">
+          <w:hyperlink w:anchor="__RefHeading___Toc3137_1907633178">
             <w:r>
               <w:rPr>
                 <w:webHidden/>
@@ -1120,7 +1303,7 @@
               </w:rPr>
               <w:t>9 SISTEMAS E COMPONENTES EXTERNOS UTILIZADOS</w:t>
               <w:tab/>
-              <w:t>26</w:t>
+              <w:t>27</w:t>
             </w:r>
           </w:hyperlink>
         </w:p>
@@ -1133,7 +1316,7 @@
             </w:tabs>
             <w:rPr/>
           </w:pPr>
-          <w:hyperlink w:anchor="__RefHeading___Toc3128_1200781530">
+          <w:hyperlink w:anchor="__RefHeading___Toc3139_1907633178">
             <w:r>
               <w:rPr>
                 <w:webHidden/>
@@ -1141,7 +1324,7 @@
               </w:rPr>
               <w:t>9.1 TECNOLOGIA EMERGENTE E SUA UTILIZAÇÃO</w:t>
               <w:tab/>
-              <w:t>27</w:t>
+              <w:t>28</w:t>
             </w:r>
           </w:hyperlink>
         </w:p>
@@ -1154,7 +1337,7 @@
             </w:tabs>
             <w:rPr/>
           </w:pPr>
-          <w:hyperlink w:anchor="__RefHeading___Toc3130_1200781530">
+          <w:hyperlink w:anchor="__RefHeading___Toc3141_1907633178">
             <w:r>
               <w:rPr>
                 <w:webHidden/>
@@ -1162,7 +1345,7 @@
               </w:rPr>
               <w:t>9.2 SEGURANÇA DE DADOS</w:t>
               <w:tab/>
-              <w:t>28</w:t>
+              <w:t>29</w:t>
             </w:r>
           </w:hyperlink>
         </w:p>
@@ -1175,7 +1358,7 @@
             </w:tabs>
             <w:rPr/>
           </w:pPr>
-          <w:hyperlink w:anchor="__RefHeading___Toc3132_1200781530">
+          <w:hyperlink w:anchor="__RefHeading___Toc3143_1907633178">
             <w:r>
               <w:rPr>
                 <w:webHidden/>
@@ -1183,7 +1366,7 @@
               </w:rPr>
               <w:t>10 INSTALAÇÃO E CONFIGURAÇÃO</w:t>
               <w:tab/>
-              <w:t>30</w:t>
+              <w:t>31</w:t>
             </w:r>
           </w:hyperlink>
         </w:p>
@@ -1196,7 +1379,7 @@
             </w:tabs>
             <w:rPr/>
           </w:pPr>
-          <w:hyperlink w:anchor="__RefHeading___Toc3134_1200781530">
+          <w:hyperlink w:anchor="__RefHeading___Toc3145_1907633178">
             <w:r>
               <w:rPr>
                 <w:webHidden/>
@@ -1204,7 +1387,7 @@
               </w:rPr>
               <w:t>10.1 PRÉ-REQUISITOS</w:t>
               <w:tab/>
-              <w:t>30</w:t>
+              <w:t>31</w:t>
             </w:r>
           </w:hyperlink>
         </w:p>
@@ -1217,7 +1400,7 @@
             </w:tabs>
             <w:rPr/>
           </w:pPr>
-          <w:hyperlink w:anchor="__RefHeading___Toc3136_1200781530">
+          <w:hyperlink w:anchor="__RefHeading___Toc3147_1907633178">
             <w:r>
               <w:rPr>
                 <w:webHidden/>
@@ -1225,7 +1408,7 @@
               </w:rPr>
               <w:t>10.2 PASSOS DE INSTALAÇÃO</w:t>
               <w:tab/>
-              <w:t>30</w:t>
+              <w:t>31</w:t>
             </w:r>
           </w:hyperlink>
         </w:p>
@@ -1238,7 +1421,7 @@
             </w:tabs>
             <w:rPr/>
           </w:pPr>
-          <w:hyperlink w:anchor="__RefHeading___Toc3138_1200781530">
+          <w:hyperlink w:anchor="__RefHeading___Toc3149_1907633178">
             <w:r>
               <w:rPr>
                 <w:webHidden/>
@@ -1246,7 +1429,7 @@
               </w:rPr>
               <w:t>11 DESENVOLVIMENTO</w:t>
               <w:tab/>
-              <w:t>32</w:t>
+              <w:t>33</w:t>
             </w:r>
           </w:hyperlink>
         </w:p>
@@ -1259,7 +1442,7 @@
             </w:tabs>
             <w:rPr/>
           </w:pPr>
-          <w:hyperlink w:anchor="__RefHeading___Toc3140_1200781530">
+          <w:hyperlink w:anchor="__RefHeading___Toc3151_1907633178">
             <w:r>
               <w:rPr>
                 <w:webHidden/>
@@ -1267,7 +1450,7 @@
               </w:rPr>
               <w:t>11.1 WORKFLOW DE BRANCHES</w:t>
               <w:tab/>
-              <w:t>32</w:t>
+              <w:t>33</w:t>
             </w:r>
           </w:hyperlink>
         </w:p>
@@ -1280,7 +1463,7 @@
             </w:tabs>
             <w:rPr/>
           </w:pPr>
-          <w:hyperlink w:anchor="__RefHeading___Toc3142_1200781530">
+          <w:hyperlink w:anchor="__RefHeading___Toc3153_1907633178">
             <w:r>
               <w:rPr>
                 <w:webHidden/>
@@ -1288,7 +1471,7 @@
               </w:rPr>
               <w:t>11.2 CONVENÇÕES DE CÓDIGO</w:t>
               <w:tab/>
-              <w:t>32</w:t>
+              <w:t>33</w:t>
             </w:r>
           </w:hyperlink>
         </w:p>
@@ -1301,7 +1484,7 @@
             </w:tabs>
             <w:rPr/>
           </w:pPr>
-          <w:hyperlink w:anchor="__RefHeading___Toc3144_1200781530">
+          <w:hyperlink w:anchor="__RefHeading___Toc3155_1907633178">
             <w:r>
               <w:rPr>
                 <w:webHidden/>
@@ -1309,7 +1492,7 @@
               </w:rPr>
               <w:t>12 API E INTERFACES</w:t>
               <w:tab/>
-              <w:t>34</w:t>
+              <w:t>35</w:t>
             </w:r>
           </w:hyperlink>
         </w:p>
@@ -1322,7 +1505,7 @@
             </w:tabs>
             <w:rPr/>
           </w:pPr>
-          <w:hyperlink w:anchor="__RefHeading___Toc3146_1200781530">
+          <w:hyperlink w:anchor="__RefHeading___Toc3157_1907633178">
             <w:r>
               <w:rPr>
                 <w:webHidden/>
@@ -1330,7 +1513,7 @@
               </w:rPr>
               <w:t>12.1 ENDPOINTS PRINCIPAIS</w:t>
               <w:tab/>
-              <w:t>34</w:t>
+              <w:t>35</w:t>
             </w:r>
           </w:hyperlink>
         </w:p>
@@ -1343,7 +1526,7 @@
             </w:tabs>
             <w:rPr/>
           </w:pPr>
-          <w:hyperlink w:anchor="__RefHeading___Toc3148_1200781530">
+          <w:hyperlink w:anchor="__RefHeading___Toc3159_1907633178">
             <w:r>
               <w:rPr>
                 <w:webHidden/>
@@ -1351,7 +1534,7 @@
               </w:rPr>
               <w:t>12.1.1 Rotas de Autenticação</w:t>
               <w:tab/>
-              <w:t>34</w:t>
+              <w:t>35</w:t>
             </w:r>
           </w:hyperlink>
         </w:p>
@@ -1364,7 +1547,7 @@
             </w:tabs>
             <w:rPr/>
           </w:pPr>
-          <w:hyperlink w:anchor="__RefHeading___Toc3150_1200781530">
+          <w:hyperlink w:anchor="__RefHeading___Toc3161_1907633178">
             <w:r>
               <w:rPr>
                 <w:webHidden/>
@@ -1372,7 +1555,7 @@
               </w:rPr>
               <w:t>12.1.2 Eventos</w:t>
               <w:tab/>
-              <w:t>34</w:t>
+              <w:t>35</w:t>
             </w:r>
           </w:hyperlink>
         </w:p>
@@ -1385,7 +1568,7 @@
             </w:tabs>
             <w:rPr/>
           </w:pPr>
-          <w:hyperlink w:anchor="__RefHeading___Toc3152_1200781530">
+          <w:hyperlink w:anchor="__RefHeading___Toc3163_1907633178">
             <w:r>
               <w:rPr>
                 <w:webHidden/>
@@ -1393,7 +1576,7 @@
               </w:rPr>
               <w:t>12.1.3 Inscrições</w:t>
               <w:tab/>
-              <w:t>35</w:t>
+              <w:t>36</w:t>
             </w:r>
           </w:hyperlink>
         </w:p>
@@ -1406,7 +1589,7 @@
             </w:tabs>
             <w:rPr/>
           </w:pPr>
-          <w:hyperlink w:anchor="__RefHeading___Toc3154_1200781530">
+          <w:hyperlink w:anchor="__RefHeading___Toc3165_1907633178">
             <w:r>
               <w:rPr>
                 <w:webHidden/>
@@ -1414,7 +1597,7 @@
               </w:rPr>
               <w:t>12.1.4 Presença e Certificação</w:t>
               <w:tab/>
-              <w:t>35</w:t>
+              <w:t>36</w:t>
             </w:r>
           </w:hyperlink>
         </w:p>
@@ -1427,7 +1610,7 @@
             </w:tabs>
             <w:rPr/>
           </w:pPr>
-          <w:hyperlink w:anchor="__RefHeading___Toc3156_1200781530">
+          <w:hyperlink w:anchor="__RefHeading___Toc3167_1907633178">
             <w:r>
               <w:rPr>
                 <w:webHidden/>
@@ -1435,7 +1618,7 @@
               </w:rPr>
               <w:t>12.1.5 Avaliações</w:t>
               <w:tab/>
-              <w:t>35</w:t>
+              <w:t>36</w:t>
             </w:r>
           </w:hyperlink>
         </w:p>
@@ -1448,7 +1631,7 @@
             </w:tabs>
             <w:rPr/>
           </w:pPr>
-          <w:hyperlink w:anchor="__RefHeading___Toc3158_1200781530">
+          <w:hyperlink w:anchor="__RefHeading___Toc3169_1907633178">
             <w:r>
               <w:rPr>
                 <w:webHidden/>
@@ -1456,7 +1639,7 @@
               </w:rPr>
               <w:t>12.1.6 Padronização de Erros</w:t>
               <w:tab/>
-              <w:t>36</w:t>
+              <w:t>37</w:t>
             </w:r>
           </w:hyperlink>
         </w:p>
@@ -1469,7 +1652,7 @@
             </w:tabs>
             <w:rPr/>
           </w:pPr>
-          <w:hyperlink w:anchor="__RefHeading___Toc3160_1200781530">
+          <w:hyperlink w:anchor="__RefHeading___Toc3171_1907633178">
             <w:r>
               <w:rPr>
                 <w:webHidden/>
@@ -1477,7 +1660,7 @@
               </w:rPr>
               <w:t>12.2 AUTENTICAÇÃO</w:t>
               <w:tab/>
-              <w:t>36</w:t>
+              <w:t>37</w:t>
             </w:r>
           </w:hyperlink>
         </w:p>
@@ -1490,7 +1673,7 @@
             </w:tabs>
             <w:rPr/>
           </w:pPr>
-          <w:hyperlink w:anchor="__RefHeading___Toc3162_1200781530">
+          <w:hyperlink w:anchor="__RefHeading___Toc3173_1907633178">
             <w:r>
               <w:rPr>
                 <w:webHidden/>
@@ -1498,7 +1681,7 @@
               </w:rPr>
               <w:t>13 ESTRATÉGIA DE TESTES</w:t>
               <w:tab/>
-              <w:t>38</w:t>
+              <w:t>39</w:t>
             </w:r>
           </w:hyperlink>
         </w:p>
@@ -1511,7 +1694,7 @@
             </w:tabs>
             <w:rPr/>
           </w:pPr>
-          <w:hyperlink w:anchor="__RefHeading___Toc3164_1200781530">
+          <w:hyperlink w:anchor="__RefHeading___Toc3175_1907633178">
             <w:r>
               <w:rPr>
                 <w:webHidden/>
@@ -1519,7 +1702,7 @@
               </w:rPr>
               <w:t>13.1 PIRÂMIDE DE TESTES</w:t>
               <w:tab/>
-              <w:t>38</w:t>
+              <w:t>39</w:t>
             </w:r>
           </w:hyperlink>
         </w:p>
@@ -1532,7 +1715,7 @@
             </w:tabs>
             <w:rPr/>
           </w:pPr>
-          <w:hyperlink w:anchor="__RefHeading___Toc3166_1200781530">
+          <w:hyperlink w:anchor="__RefHeading___Toc3177_1907633178">
             <w:r>
               <w:rPr>
                 <w:webHidden/>
@@ -1540,7 +1723,7 @@
               </w:rPr>
               <w:t>13.2 EXECUÇÃO DOS TESTES</w:t>
               <w:tab/>
-              <w:t>39</w:t>
+              <w:t>40</w:t>
             </w:r>
           </w:hyperlink>
         </w:p>
@@ -1553,7 +1736,7 @@
             </w:tabs>
             <w:rPr/>
           </w:pPr>
-          <w:hyperlink w:anchor="__RefHeading___Toc3168_1200781530">
+          <w:hyperlink w:anchor="__RefHeading___Toc3179_1907633178">
             <w:r>
               <w:rPr>
                 <w:webHidden/>
@@ -1561,7 +1744,7 @@
               </w:rPr>
               <w:t>14 DEPLOYMENT E DEVOPS</w:t>
               <w:tab/>
-              <w:t>41</w:t>
+              <w:t>42</w:t>
             </w:r>
           </w:hyperlink>
         </w:p>
@@ -1574,7 +1757,7 @@
             </w:tabs>
             <w:rPr/>
           </w:pPr>
-          <w:hyperlink w:anchor="__RefHeading___Toc3170_1200781530">
+          <w:hyperlink w:anchor="__RefHeading___Toc3181_1907633178">
             <w:r>
               <w:rPr>
                 <w:webHidden/>
@@ -1582,7 +1765,7 @@
               </w:rPr>
               <w:t>14.1 PIPELINE DE INTEGRAÇÃO E ENTREGA CONTÍNUA</w:t>
               <w:tab/>
-              <w:t>41</w:t>
+              <w:t>42</w:t>
             </w:r>
           </w:hyperlink>
         </w:p>
@@ -1595,7 +1778,7 @@
             </w:tabs>
             <w:rPr/>
           </w:pPr>
-          <w:hyperlink w:anchor="__RefHeading___Toc3172_1200781530">
+          <w:hyperlink w:anchor="__RefHeading___Toc3183_1907633178">
             <w:r>
               <w:rPr>
                 <w:webHidden/>
@@ -1603,7 +1786,7 @@
               </w:rPr>
               <w:t>14.1.1 Etapas do Pipeline</w:t>
               <w:tab/>
-              <w:t>41</w:t>
+              <w:t>42</w:t>
             </w:r>
           </w:hyperlink>
         </w:p>
@@ -1616,7 +1799,7 @@
             </w:tabs>
             <w:rPr/>
           </w:pPr>
-          <w:hyperlink w:anchor="__RefHeading___Toc3174_1200781530">
+          <w:hyperlink w:anchor="__RefHeading___Toc3185_1907633178">
             <w:r>
               <w:rPr>
                 <w:webHidden/>
@@ -1624,7 +1807,7 @@
               </w:rPr>
               <w:t>14.1.2 Critérios de Aprovação</w:t>
               <w:tab/>
-              <w:t>42</w:t>
+              <w:t>43</w:t>
             </w:r>
           </w:hyperlink>
         </w:p>
@@ -1637,7 +1820,7 @@
             </w:tabs>
             <w:rPr/>
           </w:pPr>
-          <w:hyperlink w:anchor="__RefHeading___Toc3176_1200781530">
+          <w:hyperlink w:anchor="__RefHeading___Toc3187_1907633178">
             <w:r>
               <w:rPr>
                 <w:webHidden/>
@@ -1645,7 +1828,7 @@
               </w:rPr>
               <w:t>14.1.3 Tratamento de Segredos</w:t>
               <w:tab/>
-              <w:t>42</w:t>
+              <w:t>43</w:t>
             </w:r>
           </w:hyperlink>
         </w:p>
@@ -1658,7 +1841,7 @@
             </w:tabs>
             <w:rPr/>
           </w:pPr>
-          <w:hyperlink w:anchor="__RefHeading___Toc3178_1200781530">
+          <w:hyperlink w:anchor="__RefHeading___Toc3189_1907633178">
             <w:r>
               <w:rPr>
                 <w:webHidden/>
@@ -1666,7 +1849,7 @@
               </w:rPr>
               <w:t>14.2 AMBIENTES</w:t>
               <w:tab/>
-              <w:t>42</w:t>
+              <w:t>43</w:t>
             </w:r>
           </w:hyperlink>
         </w:p>
@@ -1679,7 +1862,7 @@
             </w:tabs>
             <w:rPr/>
           </w:pPr>
-          <w:hyperlink w:anchor="__RefHeading___Toc3180_1200781530">
+          <w:hyperlink w:anchor="__RefHeading___Toc3191_1907633178">
             <w:r>
               <w:rPr>
                 <w:webHidden/>
@@ -1687,7 +1870,7 @@
               </w:rPr>
               <w:t>15 PERFORMANCE E OTIMIZAÇÃO</w:t>
               <w:tab/>
-              <w:t>45</w:t>
+              <w:t>46</w:t>
             </w:r>
           </w:hyperlink>
         </w:p>
@@ -1700,7 +1883,7 @@
             </w:tabs>
             <w:rPr/>
           </w:pPr>
-          <w:hyperlink w:anchor="__RefHeading___Toc3182_1200781530">
+          <w:hyperlink w:anchor="__RefHeading___Toc3193_1907633178">
             <w:r>
               <w:rPr>
                 <w:webHidden/>
@@ -1708,7 +1891,7 @@
               </w:rPr>
               <w:t>15.1 MÉTRICAS DE EFICIÊNCIA</w:t>
               <w:tab/>
-              <w:t>45</w:t>
+              <w:t>46</w:t>
             </w:r>
           </w:hyperlink>
         </w:p>
@@ -1721,7 +1904,7 @@
             </w:tabs>
             <w:rPr/>
           </w:pPr>
-          <w:hyperlink w:anchor="__RefHeading___Toc3184_1200781530">
+          <w:hyperlink w:anchor="__RefHeading___Toc3195_1907633178">
             <w:r>
               <w:rPr>
                 <w:webHidden/>
@@ -1729,7 +1912,7 @@
               </w:rPr>
               <w:t>16 TROUBLESHOOTING</w:t>
               <w:tab/>
-              <w:t>47</w:t>
+              <w:t>48</w:t>
             </w:r>
           </w:hyperlink>
         </w:p>
@@ -1742,7 +1925,7 @@
             </w:tabs>
             <w:rPr/>
           </w:pPr>
-          <w:hyperlink w:anchor="__RefHeading___Toc3186_1200781530">
+          <w:hyperlink w:anchor="__RefHeading___Toc3197_1907633178">
             <w:r>
               <w:rPr>
                 <w:webHidden/>
@@ -1750,7 +1933,7 @@
               </w:rPr>
               <w:t>16.1 PROBLEMAS COMUNS</w:t>
               <w:tab/>
-              <w:t>47</w:t>
+              <w:t>48</w:t>
             </w:r>
           </w:hyperlink>
         </w:p>
@@ -1763,7 +1946,7 @@
             </w:tabs>
             <w:rPr/>
           </w:pPr>
-          <w:hyperlink w:anchor="__RefHeading___Toc3188_1200781530">
+          <w:hyperlink w:anchor="__RefHeading___Toc3199_1907633178">
             <w:r>
               <w:rPr>
                 <w:webHidden/>
@@ -1771,7 +1954,7 @@
               </w:rPr>
               <w:t>REFERÊNCIAS</w:t>
               <w:tab/>
-              <w:t>49</w:t>
+              <w:t>50</w:t>
             </w:r>
           </w:hyperlink>
         </w:p>
@@ -1784,7 +1967,7 @@
             </w:tabs>
             <w:rPr/>
           </w:pPr>
-          <w:hyperlink w:anchor="__RefHeading___Toc3190_1200781530">
+          <w:hyperlink w:anchor="__RefHeading___Toc3201_1907633178">
             <w:r>
               <w:rPr>
                 <w:webHidden/>
@@ -1792,7 +1975,7 @@
               </w:rPr>
               <w:t>APÊNDICE A — DIAGRAMAS DE MODELAGEM</w:t>
               <w:tab/>
-              <w:t>51</w:t>
+              <w:t>52</w:t>
             </w:r>
           </w:hyperlink>
         </w:p>
@@ -1805,7 +1988,7 @@
             </w:tabs>
             <w:rPr/>
           </w:pPr>
-          <w:hyperlink w:anchor="__RefHeading___Toc3192_1200781530">
+          <w:hyperlink w:anchor="__RefHeading___Toc3203_1907633178">
             <w:r>
               <w:rPr>
                 <w:webHidden/>
@@ -1813,7 +1996,7 @@
               </w:rPr>
               <w:t>Apêndice A.1a — Diagrama de Casos de Uso: Visitante e Participante</w:t>
               <w:tab/>
-              <w:t>52</w:t>
+              <w:t>53</w:t>
             </w:r>
           </w:hyperlink>
         </w:p>
@@ -1826,7 +2009,7 @@
             </w:tabs>
             <w:rPr/>
           </w:pPr>
-          <w:hyperlink w:anchor="__RefHeading___Toc3194_1200781530">
+          <w:hyperlink w:anchor="__RefHeading___Toc3205_1907633178">
             <w:r>
               <w:rPr>
                 <w:webHidden/>
@@ -1834,7 +2017,7 @@
               </w:rPr>
               <w:t>Apêndice A.1b — Diagrama de Casos de Uso: Organizador</w:t>
               <w:tab/>
-              <w:t>53</w:t>
+              <w:t>54</w:t>
             </w:r>
           </w:hyperlink>
         </w:p>
@@ -1847,7 +2030,7 @@
             </w:tabs>
             <w:rPr/>
           </w:pPr>
-          <w:hyperlink w:anchor="__RefHeading___Toc3196_1200781530">
+          <w:hyperlink w:anchor="__RefHeading___Toc3207_1907633178">
             <w:r>
               <w:rPr>
                 <w:webHidden/>
@@ -1855,7 +2038,7 @@
               </w:rPr>
               <w:t>Apêndice A.2a — Diagrama de Classes: Usuários, Eventos e Inscrições</w:t>
               <w:tab/>
-              <w:t>54</w:t>
+              <w:t>55</w:t>
             </w:r>
           </w:hyperlink>
         </w:p>
@@ -1868,7 +2051,7 @@
             </w:tabs>
             <w:rPr/>
           </w:pPr>
-          <w:hyperlink w:anchor="__RefHeading___Toc3198_1200781530">
+          <w:hyperlink w:anchor="__RefHeading___Toc3209_1907633178">
             <w:r>
               <w:rPr>
                 <w:webHidden/>
@@ -1876,7 +2059,7 @@
               </w:rPr>
               <w:t>Apêndice A.2b — Diagrama de Classes: Participação e Inteligência Artificial</w:t>
               <w:tab/>
-              <w:t>55</w:t>
+              <w:t>56</w:t>
             </w:r>
           </w:hyperlink>
         </w:p>
@@ -1889,7 +2072,7 @@
             </w:tabs>
             <w:rPr/>
           </w:pPr>
-          <w:hyperlink w:anchor="__RefHeading___Toc3200_1200781530">
+          <w:hyperlink w:anchor="__RefHeading___Toc3211_1907633178">
             <w:r>
               <w:rPr>
                 <w:webHidden/>
@@ -1897,7 +2080,7 @@
               </w:rPr>
               <w:t>Apêndice A.3a — Diagrama de Estados: Inscrição</w:t>
               <w:tab/>
-              <w:t>56</w:t>
+              <w:t>57</w:t>
             </w:r>
           </w:hyperlink>
         </w:p>
@@ -1910,7 +2093,7 @@
             </w:tabs>
             <w:rPr/>
           </w:pPr>
-          <w:hyperlink w:anchor="__RefHeading___Toc3202_1200781530">
+          <w:hyperlink w:anchor="__RefHeading___Toc3213_1907633178">
             <w:r>
               <w:rPr>
                 <w:webHidden/>
@@ -1918,7 +2101,7 @@
               </w:rPr>
               <w:t>Apêndice A.3b — Diagrama de Estados: Evento</w:t>
               <w:tab/>
-              <w:t>57</w:t>
+              <w:t>58</w:t>
             </w:r>
           </w:hyperlink>
         </w:p>
@@ -1931,7 +2114,7 @@
             </w:tabs>
             <w:rPr/>
           </w:pPr>
-          <w:hyperlink w:anchor="__RefHeading___Toc3204_1200781530">
+          <w:hyperlink w:anchor="__RefHeading___Toc3215_1907633178">
             <w:r>
               <w:rPr>
                 <w:webHidden/>
@@ -1939,7 +2122,7 @@
               </w:rPr>
               <w:t>Apêndice A.4 — Diagrama de Atividades: Cadastro de Evento Assistido por IA</w:t>
               <w:tab/>
-              <w:t>58</w:t>
+              <w:t>59</w:t>
             </w:r>
           </w:hyperlink>
         </w:p>
@@ -1952,7 +2135,7 @@
             </w:tabs>
             <w:rPr/>
           </w:pPr>
-          <w:hyperlink w:anchor="__RefHeading___Toc3206_1200781530">
+          <w:hyperlink w:anchor="__RefHeading___Toc3217_1907633178">
             <w:r>
               <w:rPr>
                 <w:webHidden/>
@@ -1960,7 +2143,7 @@
               </w:rPr>
               <w:t>Apêndice A.5 — Diagrama de Interação: Cadastro de Evento via IA</w:t>
               <w:tab/>
-              <w:t>59</w:t>
+              <w:t>60</w:t>
             </w:r>
           </w:hyperlink>
         </w:p>
@@ -1973,7 +2156,7 @@
             </w:tabs>
             <w:rPr/>
           </w:pPr>
-          <w:hyperlink w:anchor="__RefHeading___Toc3208_1200781530">
+          <w:hyperlink w:anchor="__RefHeading___Toc3219_1907633178">
             <w:r>
               <w:rPr>
                 <w:webHidden/>
@@ -1981,7 +2164,7 @@
               </w:rPr>
               <w:t>Apêndice A.6a — Diagrama de Interação: Emissão de Certificado</w:t>
               <w:tab/>
-              <w:t>60</w:t>
+              <w:t>61</w:t>
             </w:r>
           </w:hyperlink>
         </w:p>
@@ -1994,7 +2177,7 @@
             </w:tabs>
             <w:rPr/>
           </w:pPr>
-          <w:hyperlink w:anchor="__RefHeading___Toc3210_1200781530">
+          <w:hyperlink w:anchor="__RefHeading___Toc3221_1907633178">
             <w:r>
               <w:rPr>
                 <w:webHidden/>
@@ -2002,7 +2185,7 @@
               </w:rPr>
               <w:t>Apêndice A.6b — Diagrama de Interação: Download do Certificado</w:t>
               <w:tab/>
-              <w:t>61</w:t>
+              <w:t>62</w:t>
             </w:r>
           </w:hyperlink>
         </w:p>
@@ -2015,7 +2198,7 @@
             </w:tabs>
             <w:rPr/>
           </w:pPr>
-          <w:hyperlink w:anchor="__RefHeading___Toc3212_1200781530">
+          <w:hyperlink w:anchor="__RefHeading___Toc3223_1907633178">
             <w:r>
               <w:rPr>
                 <w:webHidden/>
@@ -2023,7 +2206,7 @@
               </w:rPr>
               <w:t>Apêndice A.7 — Diagrama de Componentes</w:t>
               <w:tab/>
-              <w:t>62</w:t>
+              <w:t>63</w:t>
             </w:r>
           </w:hyperlink>
         </w:p>
@@ -2036,7 +2219,7 @@
             </w:tabs>
             <w:rPr/>
           </w:pPr>
-          <w:hyperlink w:anchor="__RefHeading___Toc3214_1200781530">
+          <w:hyperlink w:anchor="__RefHeading___Toc3225_1907633178">
             <w:r>
               <w:rPr>
                 <w:webHidden/>
@@ -2044,7 +2227,7 @@
               </w:rPr>
               <w:t>APÊNDICE B — VARIÁVEIS DE AMBIENTE</w:t>
               <w:tab/>
-              <w:t>63</w:t>
+              <w:t>64</w:t>
             </w:r>
           </w:hyperlink>
         </w:p>
@@ -2057,7 +2240,7 @@
             </w:tabs>
             <w:rPr/>
           </w:pPr>
-          <w:hyperlink w:anchor="__RefHeading___Toc3216_1200781530">
+          <w:hyperlink w:anchor="__RefHeading___Toc3227_1907633178">
             <w:r>
               <w:rPr>
                 <w:webHidden/>
@@ -2065,7 +2248,7 @@
               </w:rPr>
               <w:t>APÊNDICE C — GLOSSÁRIO</w:t>
               <w:tab/>
-              <w:t>64</w:t>
+              <w:t>65</w:t>
             </w:r>
           </w:hyperlink>
           <w:r>
@@ -2098,7 +2281,7 @@
         <w:jc w:val="left"/>
         <w:rPr/>
       </w:pPr>
-      <w:bookmarkStart w:id="0" w:name="__RefHeading___Toc3048_1200781530"/>
+      <w:bookmarkStart w:id="0" w:name="__RefHeading___Toc3059_1907633178"/>
       <w:bookmarkEnd w:id="0"/>
       <w:r>
         <w:rPr>
@@ -2119,7 +2302,7 @@
         <w:jc w:val="left"/>
         <w:rPr/>
       </w:pPr>
-      <w:bookmarkStart w:id="1" w:name="__RefHeading___Toc3050_1200781530"/>
+      <w:bookmarkStart w:id="1" w:name="__RefHeading___Toc3061_1907633178"/>
       <w:bookmarkEnd w:id="1"/>
       <w:r>
         <w:rPr>
@@ -2222,7 +2405,7 @@
         <w:jc w:val="left"/>
         <w:rPr/>
       </w:pPr>
-      <w:bookmarkStart w:id="2" w:name="__RefHeading___Toc3052_1200781530"/>
+      <w:bookmarkStart w:id="2" w:name="__RefHeading___Toc3063_1907633178"/>
       <w:bookmarkEnd w:id="2"/>
       <w:r>
         <w:rPr>
@@ -2241,7 +2424,7 @@
         <w:jc w:val="left"/>
         <w:rPr/>
       </w:pPr>
-      <w:bookmarkStart w:id="3" w:name="__RefHeading___Toc3054_1200781530"/>
+      <w:bookmarkStart w:id="3" w:name="__RefHeading___Toc3065_1907633178"/>
       <w:bookmarkEnd w:id="3"/>
       <w:r>
         <w:rPr>
@@ -2283,7 +2466,7 @@
         <w:jc w:val="left"/>
         <w:rPr/>
       </w:pPr>
-      <w:bookmarkStart w:id="4" w:name="__RefHeading___Toc3056_1200781530"/>
+      <w:bookmarkStart w:id="4" w:name="__RefHeading___Toc3067_1907633178"/>
       <w:bookmarkEnd w:id="4"/>
       <w:r>
         <w:rPr>
@@ -2423,7 +2606,7 @@
         <w:jc w:val="left"/>
         <w:rPr/>
       </w:pPr>
-      <w:bookmarkStart w:id="5" w:name="__RefHeading___Toc3058_1200781530"/>
+      <w:bookmarkStart w:id="5" w:name="__RefHeading___Toc3069_1907633178"/>
       <w:bookmarkEnd w:id="5"/>
       <w:r>
         <w:rPr>
@@ -2486,7 +2669,7 @@
         <w:jc w:val="left"/>
         <w:rPr/>
       </w:pPr>
-      <w:bookmarkStart w:id="6" w:name="__RefHeading___Toc3060_1200781530"/>
+      <w:bookmarkStart w:id="6" w:name="__RefHeading___Toc3071_1907633178"/>
       <w:bookmarkEnd w:id="6"/>
       <w:r>
         <w:rPr>
@@ -2613,7 +2796,7 @@
         <w:jc w:val="left"/>
         <w:rPr/>
       </w:pPr>
-      <w:bookmarkStart w:id="7" w:name="__RefHeading___Toc3062_1200781530"/>
+      <w:bookmarkStart w:id="7" w:name="__RefHeading___Toc3073_1907633178"/>
       <w:bookmarkEnd w:id="7"/>
       <w:r>
         <w:rPr>
@@ -2843,7 +3026,7 @@
         <w:jc w:val="left"/>
         <w:rPr/>
       </w:pPr>
-      <w:bookmarkStart w:id="8" w:name="__RefHeading___Toc3064_1200781530"/>
+      <w:bookmarkStart w:id="8" w:name="__RefHeading___Toc3075_1907633178"/>
       <w:bookmarkEnd w:id="8"/>
       <w:r>
         <w:rPr>
@@ -2864,7 +3047,7 @@
         <w:jc w:val="left"/>
         <w:rPr/>
       </w:pPr>
-      <w:bookmarkStart w:id="9" w:name="__RefHeading___Toc3066_1200781530"/>
+      <w:bookmarkStart w:id="9" w:name="__RefHeading___Toc3077_1907633178"/>
       <w:bookmarkEnd w:id="9"/>
       <w:r>
         <w:rPr>
@@ -2946,7 +3129,7 @@
         <w:jc w:val="left"/>
         <w:rPr/>
       </w:pPr>
-      <w:bookmarkStart w:id="10" w:name="__RefHeading___Toc3068_1200781530"/>
+      <w:bookmarkStart w:id="10" w:name="__RefHeading___Toc3079_1907633178"/>
       <w:bookmarkEnd w:id="10"/>
       <w:r>
         <w:rPr>
@@ -3028,7 +3211,7 @@
         <w:jc w:val="left"/>
         <w:rPr/>
       </w:pPr>
-      <w:bookmarkStart w:id="11" w:name="__RefHeading___Toc3070_1200781530"/>
+      <w:bookmarkStart w:id="11" w:name="__RefHeading___Toc3081_1907633178"/>
       <w:bookmarkEnd w:id="11"/>
       <w:r>
         <w:rPr>
@@ -3092,7 +3275,7 @@
         <w:jc w:val="left"/>
         <w:rPr/>
       </w:pPr>
-      <w:bookmarkStart w:id="12" w:name="__RefHeading___Toc3072_1200781530"/>
+      <w:bookmarkStart w:id="12" w:name="__RefHeading___Toc3083_1907633178"/>
       <w:bookmarkEnd w:id="12"/>
       <w:r>
         <w:rPr>
@@ -3113,7 +3296,7 @@
         <w:jc w:val="left"/>
         <w:rPr/>
       </w:pPr>
-      <w:bookmarkStart w:id="13" w:name="__RefHeading___Toc3074_1200781530"/>
+      <w:bookmarkStart w:id="13" w:name="__RefHeading___Toc3085_1907633178"/>
       <w:bookmarkEnd w:id="13"/>
       <w:r>
         <w:rPr>
@@ -3302,7 +3485,7 @@
         <w:jc w:val="left"/>
         <w:rPr/>
       </w:pPr>
-      <w:bookmarkStart w:id="14" w:name="__RefHeading___Toc3076_1200781530"/>
+      <w:bookmarkStart w:id="14" w:name="__RefHeading___Toc3087_1907633178"/>
       <w:bookmarkEnd w:id="14"/>
       <w:r>
         <w:rPr>
@@ -3409,7 +3592,7 @@
         <w:jc w:val="left"/>
         <w:rPr/>
       </w:pPr>
-      <w:bookmarkStart w:id="15" w:name="__RefHeading___Toc3078_1200781530"/>
+      <w:bookmarkStart w:id="15" w:name="__RefHeading___Toc3089_1907633178"/>
       <w:bookmarkEnd w:id="15"/>
       <w:r>
         <w:rPr>
@@ -3451,7 +3634,7 @@
         <w:jc w:val="left"/>
         <w:rPr/>
       </w:pPr>
-      <w:bookmarkStart w:id="16" w:name="__RefHeading___Toc3080_1200781530"/>
+      <w:bookmarkStart w:id="16" w:name="__RefHeading___Toc3091_1907633178"/>
       <w:bookmarkEnd w:id="16"/>
       <w:r>
         <w:rPr>
@@ -3755,7 +3938,7 @@
         <w:jc w:val="left"/>
         <w:rPr/>
       </w:pPr>
-      <w:bookmarkStart w:id="17" w:name="__RefHeading___Toc3082_1200781530"/>
+      <w:bookmarkStart w:id="17" w:name="__RefHeading___Toc3093_1907633178"/>
       <w:bookmarkEnd w:id="17"/>
       <w:r>
         <w:rPr>
@@ -4062,7 +4245,7 @@
         <w:jc w:val="left"/>
         <w:rPr/>
       </w:pPr>
-      <w:bookmarkStart w:id="18" w:name="__RefHeading___Toc3084_1200781530"/>
+      <w:bookmarkStart w:id="18" w:name="__RefHeading___Toc3095_1907633178"/>
       <w:bookmarkEnd w:id="18"/>
       <w:r>
         <w:rPr>
@@ -4083,7 +4266,7 @@
         <w:jc w:val="left"/>
         <w:rPr/>
       </w:pPr>
-      <w:bookmarkStart w:id="19" w:name="__RefHeading___Toc3086_1200781530"/>
+      <w:bookmarkStart w:id="19" w:name="__RefHeading___Toc3097_1907633178"/>
       <w:bookmarkEnd w:id="19"/>
       <w:r>
         <w:rPr>
@@ -5262,7 +5445,7 @@
         <w:jc w:val="left"/>
         <w:rPr/>
       </w:pPr>
-      <w:bookmarkStart w:id="20" w:name="__RefHeading___Toc3088_1200781530"/>
+      <w:bookmarkStart w:id="20" w:name="__RefHeading___Toc3099_1907633178"/>
       <w:bookmarkEnd w:id="20"/>
       <w:r>
         <w:rPr>
@@ -5980,7 +6163,7 @@
         <w:jc w:val="left"/>
         <w:rPr/>
       </w:pPr>
-      <w:bookmarkStart w:id="21" w:name="__RefHeading___Toc3090_1200781530"/>
+      <w:bookmarkStart w:id="21" w:name="__RefHeading___Toc3101_1907633178"/>
       <w:bookmarkEnd w:id="21"/>
       <w:r>
         <w:rPr>
@@ -6001,7 +6184,7 @@
         <w:jc w:val="left"/>
         <w:rPr/>
       </w:pPr>
-      <w:bookmarkStart w:id="22" w:name="__RefHeading___Toc3092_1200781530"/>
+      <w:bookmarkStart w:id="22" w:name="__RefHeading___Toc3103_1907633178"/>
       <w:bookmarkEnd w:id="22"/>
       <w:r>
         <w:rPr>
@@ -6125,7 +6308,7 @@
         <w:jc w:val="left"/>
         <w:rPr/>
       </w:pPr>
-      <w:bookmarkStart w:id="23" w:name="__RefHeading___Toc3094_1200781530"/>
+      <w:bookmarkStart w:id="23" w:name="__RefHeading___Toc3105_1907633178"/>
       <w:bookmarkEnd w:id="23"/>
       <w:r>
         <w:rPr>
@@ -6843,7 +7026,7 @@
         <w:jc w:val="left"/>
         <w:rPr/>
       </w:pPr>
-      <w:bookmarkStart w:id="24" w:name="__RefHeading___Toc3096_1200781530"/>
+      <w:bookmarkStart w:id="24" w:name="__RefHeading___Toc3107_1907633178"/>
       <w:bookmarkEnd w:id="24"/>
       <w:r>
         <w:rPr>
@@ -6864,7 +7047,7 @@
         <w:jc w:val="left"/>
         <w:rPr/>
       </w:pPr>
-      <w:bookmarkStart w:id="25" w:name="__RefHeading___Toc3098_1200781530"/>
+      <w:bookmarkStart w:id="25" w:name="__RefHeading___Toc3109_1907633178"/>
       <w:bookmarkEnd w:id="25"/>
       <w:r>
         <w:rPr>
@@ -8302,7 +8485,7 @@
         <w:jc w:val="left"/>
         <w:rPr/>
       </w:pPr>
-      <w:bookmarkStart w:id="26" w:name="__RefHeading___Toc3100_1200781530"/>
+      <w:bookmarkStart w:id="26" w:name="__RefHeading___Toc3111_1907633178"/>
       <w:bookmarkEnd w:id="26"/>
       <w:r>
         <w:rPr>
@@ -10453,7 +10636,7 @@
         <w:jc w:val="left"/>
         <w:rPr/>
       </w:pPr>
-      <w:bookmarkStart w:id="27" w:name="__RefHeading___Toc3102_1200781530"/>
+      <w:bookmarkStart w:id="27" w:name="__RefHeading___Toc3113_1907633178"/>
       <w:bookmarkEnd w:id="27"/>
       <w:r>
         <w:rPr>
@@ -10493,7 +10676,7 @@
         <w:jc w:val="left"/>
         <w:rPr/>
       </w:pPr>
-      <w:bookmarkStart w:id="28" w:name="__RefHeading___Toc3104_1200781530"/>
+      <w:bookmarkStart w:id="28" w:name="__RefHeading___Toc3115_1907633178"/>
       <w:bookmarkEnd w:id="28"/>
       <w:r>
         <w:rPr>
@@ -11254,7 +11437,7 @@
         <w:jc w:val="left"/>
         <w:rPr/>
       </w:pPr>
-      <w:bookmarkStart w:id="29" w:name="__RefHeading___Toc3106_1200781530"/>
+      <w:bookmarkStart w:id="29" w:name="__RefHeading___Toc3117_1907633178"/>
       <w:bookmarkEnd w:id="29"/>
       <w:r>
         <w:rPr>
@@ -11777,7 +11960,7 @@
         <w:jc w:val="left"/>
         <w:rPr/>
       </w:pPr>
-      <w:bookmarkStart w:id="30" w:name="__RefHeading___Toc3108_1200781530"/>
+      <w:bookmarkStart w:id="30" w:name="__RefHeading___Toc3119_1907633178"/>
       <w:bookmarkEnd w:id="30"/>
       <w:r>
         <w:rPr>
@@ -13371,7 +13554,7 @@
         <w:jc w:val="left"/>
         <w:rPr/>
       </w:pPr>
-      <w:bookmarkStart w:id="31" w:name="__RefHeading___Toc3110_1200781530"/>
+      <w:bookmarkStart w:id="31" w:name="__RefHeading___Toc3121_1907633178"/>
       <w:bookmarkEnd w:id="31"/>
       <w:r>
         <w:rPr>
@@ -14013,7 +14196,7 @@
         <w:jc w:val="left"/>
         <w:rPr/>
       </w:pPr>
-      <w:bookmarkStart w:id="32" w:name="__RefHeading___Toc3112_1200781530"/>
+      <w:bookmarkStart w:id="32" w:name="__RefHeading___Toc3123_1907633178"/>
       <w:bookmarkEnd w:id="32"/>
       <w:r>
         <w:rPr>
@@ -14893,7 +15076,7 @@
         <w:jc w:val="left"/>
         <w:rPr/>
       </w:pPr>
-      <w:bookmarkStart w:id="33" w:name="__RefHeading___Toc3114_1200781530"/>
+      <w:bookmarkStart w:id="33" w:name="__RefHeading___Toc3125_1907633178"/>
       <w:bookmarkEnd w:id="33"/>
       <w:r>
         <w:rPr>
@@ -15535,7 +15718,7 @@
         <w:jc w:val="left"/>
         <w:rPr/>
       </w:pPr>
-      <w:bookmarkStart w:id="34" w:name="__RefHeading___Toc3116_1200781530"/>
+      <w:bookmarkStart w:id="34" w:name="__RefHeading___Toc3127_1907633178"/>
       <w:bookmarkEnd w:id="34"/>
       <w:r>
         <w:rPr>
@@ -16296,7 +16479,7 @@
         <w:jc w:val="left"/>
         <w:rPr/>
       </w:pPr>
-      <w:bookmarkStart w:id="35" w:name="__RefHeading___Toc3118_1200781530"/>
+      <w:bookmarkStart w:id="35" w:name="__RefHeading___Toc3129_1907633178"/>
       <w:bookmarkEnd w:id="35"/>
       <w:r>
         <w:rPr>
@@ -17057,7 +17240,7 @@
         <w:jc w:val="left"/>
         <w:rPr/>
       </w:pPr>
-      <w:bookmarkStart w:id="36" w:name="__RefHeading___Toc3120_1200781530"/>
+      <w:bookmarkStart w:id="36" w:name="__RefHeading___Toc3131_1907633178"/>
       <w:bookmarkEnd w:id="36"/>
       <w:r>
         <w:rPr>
@@ -17937,7 +18120,7 @@
         <w:jc w:val="left"/>
         <w:rPr/>
       </w:pPr>
-      <w:bookmarkStart w:id="37" w:name="__RefHeading___Toc3122_1200781530"/>
+      <w:bookmarkStart w:id="37" w:name="__RefHeading___Toc3133_1907633178"/>
       <w:bookmarkEnd w:id="37"/>
       <w:r>
         <w:rPr>
@@ -18939,7 +19122,7 @@
       <w:r>
         <w:br w:type="page"/>
       </w:r>
-      <w:bookmarkStart w:id="38" w:name="__RefHeading___Toc3124_1200781530"/>
+      <w:bookmarkStart w:id="38" w:name="__RefHeading___Toc3135_1907633178"/>
       <w:bookmarkEnd w:id="38"/>
       <w:r>
         <w:rPr>
@@ -19860,7 +20043,7 @@
         <w:jc w:val="left"/>
         <w:rPr/>
       </w:pPr>
-      <w:bookmarkStart w:id="39" w:name="__RefHeading___Toc3126_1200781530"/>
+      <w:bookmarkStart w:id="39" w:name="__RefHeading___Toc3137_1907633178"/>
       <w:bookmarkEnd w:id="39"/>
       <w:r>
         <w:rPr>
@@ -21258,7 +21441,7 @@
         <w:jc w:val="left"/>
         <w:rPr/>
       </w:pPr>
-      <w:bookmarkStart w:id="40" w:name="__RefHeading___Toc3128_1200781530"/>
+      <w:bookmarkStart w:id="40" w:name="__RefHeading___Toc3139_1907633178"/>
       <w:bookmarkEnd w:id="40"/>
       <w:r>
         <w:rPr>
@@ -21361,7 +21544,7 @@
         <w:jc w:val="left"/>
         <w:rPr/>
       </w:pPr>
-      <w:bookmarkStart w:id="41" w:name="__RefHeading___Toc3130_1200781530"/>
+      <w:bookmarkStart w:id="41" w:name="__RefHeading___Toc3141_1907633178"/>
       <w:bookmarkEnd w:id="41"/>
       <w:r>
         <w:rPr>
@@ -21488,7 +21671,7 @@
         <w:jc w:val="left"/>
         <w:rPr/>
       </w:pPr>
-      <w:bookmarkStart w:id="42" w:name="__RefHeading___Toc3132_1200781530"/>
+      <w:bookmarkStart w:id="42" w:name="__RefHeading___Toc3143_1907633178"/>
       <w:bookmarkEnd w:id="42"/>
       <w:r>
         <w:rPr>
@@ -21509,7 +21692,7 @@
         <w:jc w:val="left"/>
         <w:rPr/>
       </w:pPr>
-      <w:bookmarkStart w:id="43" w:name="__RefHeading___Toc3134_1200781530"/>
+      <w:bookmarkStart w:id="43" w:name="__RefHeading___Toc3145_1907633178"/>
       <w:bookmarkEnd w:id="43"/>
       <w:r>
         <w:rPr>
@@ -21570,7 +21753,7 @@
         <w:jc w:val="left"/>
         <w:rPr/>
       </w:pPr>
-      <w:bookmarkStart w:id="44" w:name="__RefHeading___Toc3136_1200781530"/>
+      <w:bookmarkStart w:id="44" w:name="__RefHeading___Toc3147_1907633178"/>
       <w:bookmarkEnd w:id="44"/>
       <w:r>
         <w:rPr>
@@ -21889,7 +22072,7 @@
         <w:jc w:val="left"/>
         <w:rPr/>
       </w:pPr>
-      <w:bookmarkStart w:id="45" w:name="__RefHeading___Toc3138_1200781530"/>
+      <w:bookmarkStart w:id="45" w:name="__RefHeading___Toc3149_1907633178"/>
       <w:bookmarkEnd w:id="45"/>
       <w:r>
         <w:rPr>
@@ -21910,7 +22093,7 @@
         <w:jc w:val="left"/>
         <w:rPr/>
       </w:pPr>
-      <w:bookmarkStart w:id="46" w:name="__RefHeading___Toc3140_1200781530"/>
+      <w:bookmarkStart w:id="46" w:name="__RefHeading___Toc3151_1907633178"/>
       <w:bookmarkEnd w:id="46"/>
       <w:r>
         <w:rPr>
@@ -21992,7 +22175,7 @@
         <w:jc w:val="left"/>
         <w:rPr/>
       </w:pPr>
-      <w:bookmarkStart w:id="47" w:name="__RefHeading___Toc3142_1200781530"/>
+      <w:bookmarkStart w:id="47" w:name="__RefHeading___Toc3153_1907633178"/>
       <w:bookmarkEnd w:id="47"/>
       <w:r>
         <w:rPr>
@@ -22077,7 +22260,7 @@
         <w:jc w:val="left"/>
         <w:rPr/>
       </w:pPr>
-      <w:bookmarkStart w:id="48" w:name="__RefHeading___Toc3144_1200781530"/>
+      <w:bookmarkStart w:id="48" w:name="__RefHeading___Toc3155_1907633178"/>
       <w:bookmarkEnd w:id="48"/>
       <w:r>
         <w:rPr>
@@ -22098,7 +22281,7 @@
         <w:jc w:val="left"/>
         <w:rPr/>
       </w:pPr>
-      <w:bookmarkStart w:id="49" w:name="__RefHeading___Toc3146_1200781530"/>
+      <w:bookmarkStart w:id="49" w:name="__RefHeading___Toc3157_1907633178"/>
       <w:bookmarkEnd w:id="49"/>
       <w:r>
         <w:rPr>
@@ -22138,7 +22321,7 @@
         <w:jc w:val="left"/>
         <w:rPr/>
       </w:pPr>
-      <w:bookmarkStart w:id="50" w:name="__RefHeading___Toc3148_1200781530"/>
+      <w:bookmarkStart w:id="50" w:name="__RefHeading___Toc3159_1907633178"/>
       <w:bookmarkEnd w:id="50"/>
       <w:r>
         <w:rPr>
@@ -22661,7 +22844,7 @@
         <w:jc w:val="left"/>
         <w:rPr/>
       </w:pPr>
-      <w:bookmarkStart w:id="51" w:name="__RefHeading___Toc3150_1200781530"/>
+      <w:bookmarkStart w:id="51" w:name="__RefHeading___Toc3161_1907633178"/>
       <w:bookmarkEnd w:id="51"/>
       <w:r>
         <w:rPr>
@@ -23919,7 +24102,7 @@
         <w:jc w:val="left"/>
         <w:rPr/>
       </w:pPr>
-      <w:bookmarkStart w:id="52" w:name="__RefHeading___Toc3152_1200781530"/>
+      <w:bookmarkStart w:id="52" w:name="__RefHeading___Toc3163_1907633178"/>
       <w:bookmarkEnd w:id="52"/>
       <w:r>
         <w:rPr>
@@ -24561,7 +24744,7 @@
         <w:jc w:val="left"/>
         <w:rPr/>
       </w:pPr>
-      <w:bookmarkStart w:id="53" w:name="__RefHeading___Toc3154_1200781530"/>
+      <w:bookmarkStart w:id="53" w:name="__RefHeading___Toc3165_1907633178"/>
       <w:bookmarkEnd w:id="53"/>
       <w:r>
         <w:rPr>
@@ -25322,7 +25505,7 @@
         <w:jc w:val="left"/>
         <w:rPr/>
       </w:pPr>
-      <w:bookmarkStart w:id="54" w:name="__RefHeading___Toc3156_1200781530"/>
+      <w:bookmarkStart w:id="54" w:name="__RefHeading___Toc3167_1907633178"/>
       <w:bookmarkEnd w:id="54"/>
       <w:r>
         <w:rPr>
@@ -25964,7 +26147,7 @@
         <w:jc w:val="left"/>
         <w:rPr/>
       </w:pPr>
-      <w:bookmarkStart w:id="55" w:name="__RefHeading___Toc3158_1200781530"/>
+      <w:bookmarkStart w:id="55" w:name="__RefHeading___Toc3169_1907633178"/>
       <w:bookmarkEnd w:id="55"/>
       <w:r>
         <w:rPr>
@@ -26930,7 +27113,7 @@
         <w:jc w:val="left"/>
         <w:rPr/>
       </w:pPr>
-      <w:bookmarkStart w:id="56" w:name="__RefHeading___Toc3160_1200781530"/>
+      <w:bookmarkStart w:id="56" w:name="__RefHeading___Toc3171_1907633178"/>
       <w:bookmarkEnd w:id="56"/>
       <w:r>
         <w:rPr>
@@ -27104,7 +27287,7 @@
         <w:jc w:val="left"/>
         <w:rPr/>
       </w:pPr>
-      <w:bookmarkStart w:id="57" w:name="__RefHeading___Toc3162_1200781530"/>
+      <w:bookmarkStart w:id="57" w:name="__RefHeading___Toc3173_1907633178"/>
       <w:bookmarkEnd w:id="57"/>
       <w:r>
         <w:rPr>
@@ -27125,7 +27308,7 @@
         <w:jc w:val="left"/>
         <w:rPr/>
       </w:pPr>
-      <w:bookmarkStart w:id="58" w:name="__RefHeading___Toc3164_1200781530"/>
+      <w:bookmarkStart w:id="58" w:name="__RefHeading___Toc3175_1907633178"/>
       <w:bookmarkEnd w:id="58"/>
       <w:r>
         <w:rPr>
@@ -27270,7 +27453,7 @@
         <w:jc w:val="left"/>
         <w:rPr/>
       </w:pPr>
-      <w:bookmarkStart w:id="59" w:name="__RefHeading___Toc3166_1200781530"/>
+      <w:bookmarkStart w:id="59" w:name="__RefHeading___Toc3177_1907633178"/>
       <w:bookmarkEnd w:id="59"/>
       <w:r>
         <w:rPr>
@@ -27563,7 +27746,7 @@
         <w:jc w:val="left"/>
         <w:rPr/>
       </w:pPr>
-      <w:bookmarkStart w:id="60" w:name="__RefHeading___Toc3168_1200781530"/>
+      <w:bookmarkStart w:id="60" w:name="__RefHeading___Toc3179_1907633178"/>
       <w:bookmarkEnd w:id="60"/>
       <w:r>
         <w:rPr>
@@ -27584,7 +27767,7 @@
         <w:jc w:val="left"/>
         <w:rPr/>
       </w:pPr>
-      <w:bookmarkStart w:id="61" w:name="__RefHeading___Toc3170_1200781530"/>
+      <w:bookmarkStart w:id="61" w:name="__RefHeading___Toc3181_1907633178"/>
       <w:bookmarkEnd w:id="61"/>
       <w:r>
         <w:rPr>
@@ -27645,7 +27828,7 @@
         <w:jc w:val="left"/>
         <w:rPr/>
       </w:pPr>
-      <w:bookmarkStart w:id="62" w:name="__RefHeading___Toc3172_1200781530"/>
+      <w:bookmarkStart w:id="62" w:name="__RefHeading___Toc3183_1907633178"/>
       <w:bookmarkEnd w:id="62"/>
       <w:r>
         <w:rPr>
@@ -27729,7 +27912,7 @@
         <w:jc w:val="left"/>
         <w:rPr/>
       </w:pPr>
-      <w:bookmarkStart w:id="63" w:name="__RefHeading___Toc3174_1200781530"/>
+      <w:bookmarkStart w:id="63" w:name="__RefHeading___Toc3185_1907633178"/>
       <w:bookmarkEnd w:id="63"/>
       <w:r>
         <w:rPr>
@@ -27792,7 +27975,7 @@
         <w:jc w:val="left"/>
         <w:rPr/>
       </w:pPr>
-      <w:bookmarkStart w:id="64" w:name="__RefHeading___Toc3176_1200781530"/>
+      <w:bookmarkStart w:id="64" w:name="__RefHeading___Toc3187_1907633178"/>
       <w:bookmarkEnd w:id="64"/>
       <w:r>
         <w:rPr>
@@ -27834,7 +28017,7 @@
         <w:jc w:val="left"/>
         <w:rPr/>
       </w:pPr>
-      <w:bookmarkStart w:id="65" w:name="__RefHeading___Toc3178_1200781530"/>
+      <w:bookmarkStart w:id="65" w:name="__RefHeading___Toc3189_1907633178"/>
       <w:bookmarkEnd w:id="65"/>
       <w:r>
         <w:rPr>
@@ -28484,7 +28667,7 @@
         <w:jc w:val="left"/>
         <w:rPr/>
       </w:pPr>
-      <w:bookmarkStart w:id="66" w:name="__RefHeading___Toc3180_1200781530"/>
+      <w:bookmarkStart w:id="66" w:name="__RefHeading___Toc3191_1907633178"/>
       <w:bookmarkEnd w:id="66"/>
       <w:r>
         <w:rPr>
@@ -28505,7 +28688,7 @@
         <w:jc w:val="left"/>
         <w:rPr/>
       </w:pPr>
-      <w:bookmarkStart w:id="67" w:name="__RefHeading___Toc3182_1200781530"/>
+      <w:bookmarkStart w:id="67" w:name="__RefHeading___Toc3193_1907633178"/>
       <w:bookmarkEnd w:id="67"/>
       <w:r>
         <w:rPr>
@@ -29470,7 +29653,7 @@
         <w:jc w:val="left"/>
         <w:rPr/>
       </w:pPr>
-      <w:bookmarkStart w:id="68" w:name="__RefHeading___Toc3184_1200781530"/>
+      <w:bookmarkStart w:id="68" w:name="__RefHeading___Toc3195_1907633178"/>
       <w:bookmarkEnd w:id="68"/>
       <w:r>
         <w:rPr>
@@ -29491,7 +29674,7 @@
         <w:jc w:val="left"/>
         <w:rPr/>
       </w:pPr>
-      <w:bookmarkStart w:id="69" w:name="__RefHeading___Toc3186_1200781530"/>
+      <w:bookmarkStart w:id="69" w:name="__RefHeading___Toc3197_1907633178"/>
       <w:bookmarkEnd w:id="69"/>
       <w:r>
         <w:rPr>
@@ -31178,7 +31361,7 @@
       <w:r>
         <w:br w:type="page"/>
       </w:r>
-      <w:bookmarkStart w:id="70" w:name="__RefHeading___Toc3188_1200781530"/>
+      <w:bookmarkStart w:id="70" w:name="__RefHeading___Toc3199_1907633178"/>
       <w:bookmarkEnd w:id="70"/>
       <w:r>
         <w:rPr>
@@ -31597,7 +31780,7 @@
         <w:jc w:val="center"/>
         <w:rPr/>
       </w:pPr>
-      <w:bookmarkStart w:id="71" w:name="__RefHeading___Toc3190_1200781530"/>
+      <w:bookmarkStart w:id="71" w:name="__RefHeading___Toc3201_1907633178"/>
       <w:bookmarkEnd w:id="71"/>
       <w:r>
         <w:rPr>
@@ -31698,7 +31881,7 @@
         <w:jc w:val="left"/>
         <w:rPr/>
       </w:pPr>
-      <w:bookmarkStart w:id="72" w:name="__RefHeading___Toc3192_1200781530"/>
+      <w:bookmarkStart w:id="72" w:name="__RefHeading___Toc3203_1907633178"/>
       <w:bookmarkEnd w:id="72"/>
       <w:r>
         <w:rPr>
@@ -31796,7 +31979,7 @@
         <w:jc w:val="left"/>
         <w:rPr/>
       </w:pPr>
-      <w:bookmarkStart w:id="73" w:name="__RefHeading___Toc3194_1200781530"/>
+      <w:bookmarkStart w:id="73" w:name="__RefHeading___Toc3205_1907633178"/>
       <w:bookmarkEnd w:id="73"/>
       <w:r>
         <w:rPr>
@@ -31894,7 +32077,7 @@
         <w:jc w:val="left"/>
         <w:rPr/>
       </w:pPr>
-      <w:bookmarkStart w:id="74" w:name="__RefHeading___Toc3196_1200781530"/>
+      <w:bookmarkStart w:id="74" w:name="__RefHeading___Toc3207_1907633178"/>
       <w:bookmarkEnd w:id="74"/>
       <w:r>
         <w:rPr>
@@ -31992,7 +32175,7 @@
         <w:jc w:val="left"/>
         <w:rPr/>
       </w:pPr>
-      <w:bookmarkStart w:id="75" w:name="__RefHeading___Toc3198_1200781530"/>
+      <w:bookmarkStart w:id="75" w:name="__RefHeading___Toc3209_1907633178"/>
       <w:bookmarkEnd w:id="75"/>
       <w:r>
         <w:rPr>
@@ -32090,7 +32273,7 @@
         <w:jc w:val="left"/>
         <w:rPr/>
       </w:pPr>
-      <w:bookmarkStart w:id="76" w:name="__RefHeading___Toc3200_1200781530"/>
+      <w:bookmarkStart w:id="76" w:name="__RefHeading___Toc3211_1907633178"/>
       <w:bookmarkEnd w:id="76"/>
       <w:r>
         <w:rPr>
@@ -32188,7 +32371,7 @@
         <w:jc w:val="left"/>
         <w:rPr/>
       </w:pPr>
-      <w:bookmarkStart w:id="77" w:name="__RefHeading___Toc3202_1200781530"/>
+      <w:bookmarkStart w:id="77" w:name="__RefHeading___Toc3213_1907633178"/>
       <w:bookmarkEnd w:id="77"/>
       <w:r>
         <w:rPr>
@@ -32286,7 +32469,7 @@
         <w:jc w:val="left"/>
         <w:rPr/>
       </w:pPr>
-      <w:bookmarkStart w:id="78" w:name="__RefHeading___Toc3204_1200781530"/>
+      <w:bookmarkStart w:id="78" w:name="__RefHeading___Toc3215_1907633178"/>
       <w:bookmarkEnd w:id="78"/>
       <w:r>
         <w:rPr>
@@ -32384,7 +32567,7 @@
         <w:jc w:val="left"/>
         <w:rPr/>
       </w:pPr>
-      <w:bookmarkStart w:id="79" w:name="__RefHeading___Toc3206_1200781530"/>
+      <w:bookmarkStart w:id="79" w:name="__RefHeading___Toc3217_1907633178"/>
       <w:bookmarkEnd w:id="79"/>
       <w:r>
         <w:rPr>
@@ -32482,7 +32665,7 @@
         <w:jc w:val="left"/>
         <w:rPr/>
       </w:pPr>
-      <w:bookmarkStart w:id="80" w:name="__RefHeading___Toc3208_1200781530"/>
+      <w:bookmarkStart w:id="80" w:name="__RefHeading___Toc3219_1907633178"/>
       <w:bookmarkEnd w:id="80"/>
       <w:r>
         <w:rPr>
@@ -32580,7 +32763,7 @@
         <w:jc w:val="left"/>
         <w:rPr/>
       </w:pPr>
-      <w:bookmarkStart w:id="81" w:name="__RefHeading___Toc3210_1200781530"/>
+      <w:bookmarkStart w:id="81" w:name="__RefHeading___Toc3221_1907633178"/>
       <w:bookmarkEnd w:id="81"/>
       <w:r>
         <w:rPr>
@@ -32678,7 +32861,7 @@
         <w:jc w:val="left"/>
         <w:rPr/>
       </w:pPr>
-      <w:bookmarkStart w:id="82" w:name="__RefHeading___Toc3212_1200781530"/>
+      <w:bookmarkStart w:id="82" w:name="__RefHeading___Toc3223_1907633178"/>
       <w:bookmarkEnd w:id="82"/>
       <w:r>
         <w:rPr>
@@ -32730,7 +32913,7 @@
         <w:jc w:val="center"/>
         <w:rPr/>
       </w:pPr>
-      <w:bookmarkStart w:id="83" w:name="__RefHeading___Toc3214_1200781530"/>
+      <w:bookmarkStart w:id="83" w:name="__RefHeading___Toc3225_1907633178"/>
       <w:bookmarkEnd w:id="83"/>
       <w:r>
         <w:rPr>
@@ -34239,7 +34422,7 @@
       <w:r>
         <w:br w:type="page"/>
       </w:r>
-      <w:bookmarkStart w:id="84" w:name="__RefHeading___Toc3216_1200781530"/>
+      <w:bookmarkStart w:id="84" w:name="__RefHeading___Toc3227_1907633178"/>
       <w:bookmarkEnd w:id="84"/>
       <w:r>
         <w:rPr>
@@ -35213,7 +35396,7 @@
     </w:r>
     <w:r>
       <w:rPr/>
-      <w:t>51</w:t>
+      <w:t>52</w:t>
     </w:r>
     <w:r>
       <w:rPr/>
@@ -35245,7 +35428,7 @@
     </w:r>
     <w:r>
       <w:rPr/>
-      <w:t>56</w:t>
+      <w:t>57</w:t>
     </w:r>
     <w:r>
       <w:rPr/>
@@ -35283,7 +35466,7 @@
     </w:r>
     <w:r>
       <w:rPr/>
-      <w:t>57</w:t>
+      <w:t>58</w:t>
     </w:r>
     <w:r>
       <w:rPr/>
@@ -35321,7 +35504,7 @@
     </w:r>
     <w:r>
       <w:rPr/>
-      <w:t>58</w:t>
+      <w:t>59</w:t>
     </w:r>
     <w:r>
       <w:rPr/>
@@ -35359,7 +35542,7 @@
     </w:r>
     <w:r>
       <w:rPr/>
-      <w:t>59</w:t>
+      <w:t>60</w:t>
     </w:r>
     <w:r>
       <w:rPr/>
@@ -35397,7 +35580,7 @@
     </w:r>
     <w:r>
       <w:rPr/>
-      <w:t>60</w:t>
+      <w:t>61</w:t>
     </w:r>
     <w:r>
       <w:rPr/>
@@ -35435,7 +35618,7 @@
     </w:r>
     <w:r>
       <w:rPr/>
-      <w:t>52</w:t>
+      <w:t>53</w:t>
     </w:r>
     <w:r>
       <w:rPr/>
@@ -35467,7 +35650,7 @@
     </w:r>
     <w:r>
       <w:rPr/>
-      <w:t>61</w:t>
+      <w:t>62</w:t>
     </w:r>
     <w:r>
       <w:rPr/>
@@ -35505,7 +35688,7 @@
     </w:r>
     <w:r>
       <w:rPr/>
-      <w:t>62</w:t>
+      <w:t>63</w:t>
     </w:r>
     <w:r>
       <w:rPr/>
@@ -35543,7 +35726,7 @@
     </w:r>
     <w:r>
       <w:rPr/>
-      <w:t>64</w:t>
+      <w:t>65</w:t>
     </w:r>
     <w:r>
       <w:rPr/>
@@ -35587,7 +35770,7 @@
     </w:r>
     <w:r>
       <w:rPr/>
-      <w:t>53</w:t>
+      <w:t>54</w:t>
     </w:r>
     <w:r>
       <w:rPr/>
@@ -35625,7 +35808,7 @@
     </w:r>
     <w:r>
       <w:rPr/>
-      <w:t>54</w:t>
+      <w:t>55</w:t>
     </w:r>
     <w:r>
       <w:rPr/>
@@ -35663,7 +35846,7 @@
     </w:r>
     <w:r>
       <w:rPr/>
-      <w:t>55</w:t>
+      <w:t>56</w:t>
     </w:r>
     <w:r>
       <w:rPr/>

</xml_diff>

<commit_message>
docs: resumo, introducao, conclusao e orientador na versao ABNT
A versao ABNT ganha o resumo com palavras-chave, a introducao como secao 1 e a
conclusao como secao 18; as demais secoes sobem um numero, e as referencias
cruzadas do texto e do glossario acompanham. A folha de rosto traz o
orientador, Prof. Rafael Guem Murakami.

Corrige tambem a referencia ao Troubleshooting nas instrucoes de instalacao,
que apontava para a numeracao antiga na versao do modelo do professor.

Co-Authored-By: Claude Opus 5.5 <noreply@anthropic.com>
Claude-Session: https://claude.ai/code/session_011SKCdnRmci1yJCi4ZvMpS2
</commit_message>
<xml_diff>
--- a/docs/Documentacao-ABNT.docx
+++ b/docs/Documentacao-ABNT.docx
@@ -386,7 +386,7 @@
           <w:sz w:val="20"/>
           <w:szCs w:val="20"/>
         </w:rPr>
-        <w:t xml:space="preserve">Orientador(a): </w:t>
+        <w:t>Orientador: Prof. Rafael Guem Murakami</w:t>
       </w:r>
     </w:p>
     <w:p>
@@ -419,6 +419,69 @@
           <w:szCs w:val="24"/>
         </w:rPr>
         <w:t>2026</w:t>
+      </w:r>
+      <w:r>
+        <w:br w:type="page"/>
+      </w:r>
+    </w:p>
+    <w:p>
+      <w:pPr>
+        <w:pStyle w:val="Normal"/>
+        <w:spacing w:lineRule="auto" w:line="360" w:before="0" w:after="360"/>
+        <w:jc w:val="center"/>
+        <w:rPr/>
+      </w:pPr>
+      <w:r>
+        <w:rPr>
+          <w:rFonts w:eastAsia="Arial" w:cs="Arial"/>
+          <w:b/>
+          <w:bCs/>
+          <w:sz w:val="24"/>
+          <w:szCs w:val="24"/>
+        </w:rPr>
+        <w:t>RESUMO</w:t>
+      </w:r>
+    </w:p>
+    <w:p>
+      <w:pPr>
+        <w:pStyle w:val="Normal"/>
+        <w:spacing w:lineRule="auto" w:line="360" w:before="0" w:after="360"/>
+        <w:jc w:val="both"/>
+        <w:rPr/>
+      </w:pPr>
+      <w:r>
+        <w:rPr>
+          <w:rFonts w:eastAsia="Arial" w:cs="Arial"/>
+          <w:sz w:val="24"/>
+          <w:szCs w:val="24"/>
+        </w:rPr>
+        <w:t>Este documento apresenta o Gerenciador de Eventos Acadêmicos, aplicação web desenvolvida como Projeto Integrador do Curso Superior de Tecnologia em Análise e Desenvolvimento de Sistemas da Universidade Santo Amaro (UNISA) para organizar palestras, workshops, semanas temáticas e congressos internos. O sistema cobre o ciclo completo do evento: cadastro e publicação pelo organizador, inscrição de participantes com controle de vagas e fila de espera automática, registro de presença, emissão de certificados digitais em PDF com código de autenticidade verificável publicamente e coleta de avaliações ao final. O diferencial está no uso de inteligência artificial em duas etapas: na extração dos dados de um evento a partir de texto livre, sempre submetidos à revisão do organizador, e na síntese das avaliações em um resumo consolidado. Na indisponibilidade do serviço de linguagem, o cadastro manual garante a continuidade da operação. A solução adota arquitetura em camadas, com servidor em Java 21 e Spring Boot, interface em React com TypeScript e Tailwind CSS, banco de dados PostgreSQL e controle de acesso por JSON Web Token. As regras de negócio foram especificadas, rastreadas até o código-fonte e verificadas por testes automatizados de unidade, de integração e de ponta a ponta, e a aplicação foi publicada em serviços de nuvem de plano gratuito. Como resultado, obteve-se um sistema funcional que centraliza a gestão do evento e reduz o esforço manual na criação das atividades e na entrega dos certificados.</w:t>
+      </w:r>
+    </w:p>
+    <w:p>
+      <w:pPr>
+        <w:pStyle w:val="Normal"/>
+        <w:spacing w:lineRule="auto" w:line="360" w:before="0" w:after="0"/>
+        <w:jc w:val="both"/>
+        <w:rPr/>
+      </w:pPr>
+      <w:r>
+        <w:rPr>
+          <w:rFonts w:eastAsia="Arial" w:cs="Arial"/>
+          <w:b/>
+          <w:bCs/>
+          <w:sz w:val="24"/>
+          <w:szCs w:val="24"/>
+        </w:rPr>
+        <w:t xml:space="preserve">Palavras-chave: </w:t>
+      </w:r>
+      <w:r>
+        <w:rPr>
+          <w:rFonts w:eastAsia="Arial" w:cs="Arial"/>
+          <w:sz w:val="24"/>
+          <w:szCs w:val="24"/>
+        </w:rPr>
+        <w:t>eventos acadêmicos; inteligência artificial; certificado digital; Spring Boot; React.</w:t>
       </w:r>
       <w:r>
         <w:br w:type="page"/>
@@ -476,15 +539,36 @@
             </w:rPr>
             <w:fldChar w:fldCharType="separate"/>
           </w:r>
-          <w:hyperlink w:anchor="__RefHeading___Toc3059_1907633178">
+          <w:hyperlink w:anchor="__RefHeading___Toc3074_1968430665">
             <w:r>
               <w:rPr>
                 <w:webHidden/>
                 <w:rStyle w:val="IndexLink"/>
               </w:rPr>
-              <w:t>1 VISÃO GERAL DO PROJETO</w:t>
+              <w:t>1 INTRODUÇÃO</w:t>
               <w:tab/>
-              <w:t>5</w:t>
+              <w:t>6</w:t>
+            </w:r>
+          </w:hyperlink>
+        </w:p>
+        <w:p>
+          <w:pPr>
+            <w:pStyle w:val="TOC1"/>
+            <w:tabs>
+              <w:tab w:val="clear" w:pos="9071"/>
+              <w:tab w:val="right" w:pos="9070" w:leader="dot"/>
+            </w:tabs>
+            <w:rPr/>
+          </w:pPr>
+          <w:hyperlink w:anchor="__RefHeading___Toc3076_1968430665">
+            <w:r>
+              <w:rPr>
+                <w:webHidden/>
+                <w:rStyle w:val="IndexLink"/>
+              </w:rPr>
+              <w:t>2 VISÃO GERAL DO PROJETO</w:t>
+              <w:tab/>
+              <w:t>7</w:t>
             </w:r>
           </w:hyperlink>
         </w:p>
@@ -497,15 +581,15 @@
             </w:tabs>
             <w:rPr/>
           </w:pPr>
-          <w:hyperlink w:anchor="__RefHeading___Toc3061_1907633178">
+          <w:hyperlink w:anchor="__RefHeading___Toc3078_1968430665">
             <w:r>
               <w:rPr>
                 <w:webHidden/>
                 <w:rStyle w:val="IndexLink"/>
               </w:rPr>
-              <w:t>1.1 DESCRIÇÃO EXECUTIVA</w:t>
+              <w:t>2.1 DESCRIÇÃO EXECUTIVA</w:t>
               <w:tab/>
-              <w:t>5</w:t>
+              <w:t>7</w:t>
             </w:r>
           </w:hyperlink>
         </w:p>
@@ -518,15 +602,15 @@
             </w:tabs>
             <w:rPr/>
           </w:pPr>
-          <w:hyperlink w:anchor="__RefHeading___Toc3063_1907633178">
+          <w:hyperlink w:anchor="__RefHeading___Toc3080_1968430665">
             <w:r>
               <w:rPr>
                 <w:webHidden/>
                 <w:rStyle w:val="IndexLink"/>
               </w:rPr>
-              <w:t>1.2 OBJETIVOS E ESCOPO</w:t>
+              <w:t>2.2 OBJETIVOS E ESCOPO</w:t>
               <w:tab/>
-              <w:t>5</w:t>
+              <w:t>7</w:t>
             </w:r>
           </w:hyperlink>
         </w:p>
@@ -539,15 +623,15 @@
             </w:tabs>
             <w:rPr/>
           </w:pPr>
-          <w:hyperlink w:anchor="__RefHeading___Toc3065_1907633178">
+          <w:hyperlink w:anchor="__RefHeading___Toc3082_1968430665">
             <w:r>
               <w:rPr>
                 <w:webHidden/>
                 <w:rStyle w:val="IndexLink"/>
               </w:rPr>
-              <w:t>1.2.1 Objetivo Geral</w:t>
+              <w:t>2.2.1 Objetivo Geral</w:t>
               <w:tab/>
-              <w:t>5</w:t>
+              <w:t>7</w:t>
             </w:r>
           </w:hyperlink>
         </w:p>
@@ -560,15 +644,15 @@
             </w:tabs>
             <w:rPr/>
           </w:pPr>
-          <w:hyperlink w:anchor="__RefHeading___Toc3067_1907633178">
+          <w:hyperlink w:anchor="__RefHeading___Toc3084_1968430665">
             <w:r>
               <w:rPr>
                 <w:webHidden/>
                 <w:rStyle w:val="IndexLink"/>
               </w:rPr>
-              <w:t>1.2.2 Objetivos Específicos</w:t>
+              <w:t>2.2.2 Objetivos Específicos</w:t>
               <w:tab/>
-              <w:t>6</w:t>
+              <w:t>8</w:t>
             </w:r>
           </w:hyperlink>
         </w:p>
@@ -581,15 +665,15 @@
             </w:tabs>
             <w:rPr/>
           </w:pPr>
-          <w:hyperlink w:anchor="__RefHeading___Toc3069_1907633178">
+          <w:hyperlink w:anchor="__RefHeading___Toc3086_1968430665">
             <w:r>
               <w:rPr>
                 <w:webHidden/>
                 <w:rStyle w:val="IndexLink"/>
               </w:rPr>
-              <w:t>1.2.3 Escopo do Projeto</w:t>
+              <w:t>2.2.3 Escopo do Projeto</w:t>
               <w:tab/>
-              <w:t>6</w:t>
+              <w:t>8</w:t>
             </w:r>
           </w:hyperlink>
         </w:p>
@@ -602,15 +686,15 @@
             </w:tabs>
             <w:rPr/>
           </w:pPr>
-          <w:hyperlink w:anchor="__RefHeading___Toc3071_1907633178">
+          <w:hyperlink w:anchor="__RefHeading___Toc3088_1968430665">
             <w:r>
               <w:rPr>
                 <w:webHidden/>
                 <w:rStyle w:val="IndexLink"/>
               </w:rPr>
-              <w:t>1.2.4 Limitações de Escopo</w:t>
+              <w:t>2.2.4 Limitações de Escopo</w:t>
               <w:tab/>
-              <w:t>6</w:t>
+              <w:t>8</w:t>
             </w:r>
           </w:hyperlink>
         </w:p>
@@ -623,15 +707,15 @@
             </w:tabs>
             <w:rPr/>
           </w:pPr>
-          <w:hyperlink w:anchor="__RefHeading___Toc3073_1907633178">
+          <w:hyperlink w:anchor="__RefHeading___Toc3090_1968430665">
             <w:r>
               <w:rPr>
                 <w:webHidden/>
                 <w:rStyle w:val="IndexLink"/>
               </w:rPr>
-              <w:t>1.3 REGRAS DE NEGÓCIO</w:t>
+              <w:t>2.3 REGRAS DE NEGÓCIO</w:t>
               <w:tab/>
-              <w:t>7</w:t>
+              <w:t>9</w:t>
             </w:r>
           </w:hyperlink>
         </w:p>
@@ -644,15 +728,15 @@
             </w:tabs>
             <w:rPr/>
           </w:pPr>
-          <w:hyperlink w:anchor="__RefHeading___Toc3075_1907633178">
+          <w:hyperlink w:anchor="__RefHeading___Toc3092_1968430665">
             <w:r>
               <w:rPr>
                 <w:webHidden/>
                 <w:rStyle w:val="IndexLink"/>
               </w:rPr>
-              <w:t>2 ARQUITETURA DO SISTEMA</w:t>
+              <w:t>3 ARQUITETURA DO SISTEMA</w:t>
               <w:tab/>
-              <w:t>9</w:t>
+              <w:t>11</w:t>
             </w:r>
           </w:hyperlink>
         </w:p>
@@ -665,15 +749,15 @@
             </w:tabs>
             <w:rPr/>
           </w:pPr>
-          <w:hyperlink w:anchor="__RefHeading___Toc3077_1907633178">
+          <w:hyperlink w:anchor="__RefHeading___Toc3094_1968430665">
             <w:r>
               <w:rPr>
                 <w:webHidden/>
                 <w:rStyle w:val="IndexLink"/>
               </w:rPr>
-              <w:t>2.1 COMPONENTES PRINCIPAIS</w:t>
+              <w:t>3.1 COMPONENTES PRINCIPAIS</w:t>
               <w:tab/>
-              <w:t>9</w:t>
+              <w:t>11</w:t>
             </w:r>
           </w:hyperlink>
         </w:p>
@@ -686,15 +770,15 @@
             </w:tabs>
             <w:rPr/>
           </w:pPr>
-          <w:hyperlink w:anchor="__RefHeading___Toc3079_1907633178">
+          <w:hyperlink w:anchor="__RefHeading___Toc3096_1968430665">
             <w:r>
               <w:rPr>
                 <w:webHidden/>
                 <w:rStyle w:val="IndexLink"/>
               </w:rPr>
-              <w:t>2.2 DECISÕES ARQUITETURAIS (ADR)</w:t>
+              <w:t>3.2 DECISÕES ARQUITETURAIS (ADR)</w:t>
               <w:tab/>
-              <w:t>9</w:t>
+              <w:t>11</w:t>
             </w:r>
           </w:hyperlink>
         </w:p>
@@ -707,15 +791,15 @@
             </w:tabs>
             <w:rPr/>
           </w:pPr>
-          <w:hyperlink w:anchor="__RefHeading___Toc3081_1907633178">
+          <w:hyperlink w:anchor="__RefHeading___Toc3098_1968430665">
             <w:r>
               <w:rPr>
                 <w:webHidden/>
                 <w:rStyle w:val="IndexLink"/>
               </w:rPr>
-              <w:t>2.3 STACK TECNOLÓGICA</w:t>
+              <w:t>3.3 STACK TECNOLÓGICA</w:t>
               <w:tab/>
-              <w:t>10</w:t>
+              <w:t>12</w:t>
             </w:r>
           </w:hyperlink>
         </w:p>
@@ -728,15 +812,15 @@
             </w:tabs>
             <w:rPr/>
           </w:pPr>
-          <w:hyperlink w:anchor="__RefHeading___Toc3083_1907633178">
+          <w:hyperlink w:anchor="__RefHeading___Toc3100_1968430665">
             <w:r>
               <w:rPr>
                 <w:webHidden/>
                 <w:rStyle w:val="IndexLink"/>
               </w:rPr>
-              <w:t>3 ESPECIFICAÇÃO TÉCNICA</w:t>
+              <w:t>4 ESPECIFICAÇÃO TÉCNICA</w:t>
               <w:tab/>
-              <w:t>11</w:t>
+              <w:t>13</w:t>
             </w:r>
           </w:hyperlink>
         </w:p>
@@ -749,15 +833,15 @@
             </w:tabs>
             <w:rPr/>
           </w:pPr>
-          <w:hyperlink w:anchor="__RefHeading___Toc3085_1907633178">
+          <w:hyperlink w:anchor="__RefHeading___Toc3102_1968430665">
             <w:r>
               <w:rPr>
                 <w:webHidden/>
                 <w:rStyle w:val="IndexLink"/>
               </w:rPr>
-              <w:t>3.1 REQUISITOS FUNCIONAIS</w:t>
+              <w:t>4.1 REQUISITOS FUNCIONAIS</w:t>
               <w:tab/>
-              <w:t>11</w:t>
+              <w:t>13</w:t>
             </w:r>
           </w:hyperlink>
         </w:p>
@@ -770,15 +854,15 @@
             </w:tabs>
             <w:rPr/>
           </w:pPr>
-          <w:hyperlink w:anchor="__RefHeading___Toc3087_1907633178">
+          <w:hyperlink w:anchor="__RefHeading___Toc3104_1968430665">
             <w:r>
               <w:rPr>
                 <w:webHidden/>
                 <w:rStyle w:val="IndexLink"/>
               </w:rPr>
-              <w:t>3.2 REQUISITOS NÃO FUNCIONAIS</w:t>
+              <w:t>4.2 REQUISITOS NÃO FUNCIONAIS</w:t>
               <w:tab/>
-              <w:t>11</w:t>
+              <w:t>13</w:t>
             </w:r>
           </w:hyperlink>
         </w:p>
@@ -791,15 +875,15 @@
             </w:tabs>
             <w:rPr/>
           </w:pPr>
-          <w:hyperlink w:anchor="__RefHeading___Toc3089_1907633178">
+          <w:hyperlink w:anchor="__RefHeading___Toc3106_1968430665">
             <w:r>
               <w:rPr>
                 <w:webHidden/>
                 <w:rStyle w:val="IndexLink"/>
               </w:rPr>
-              <w:t>4 PROTÓTIPO DE BAIXA E ALTA FIDELIDADE</w:t>
+              <w:t>5 PROTÓTIPO DE BAIXA E ALTA FIDELIDADE</w:t>
               <w:tab/>
-              <w:t>12</w:t>
+              <w:t>14</w:t>
             </w:r>
           </w:hyperlink>
         </w:p>
@@ -812,15 +896,15 @@
             </w:tabs>
             <w:rPr/>
           </w:pPr>
-          <w:hyperlink w:anchor="__RefHeading___Toc3091_1907633178">
+          <w:hyperlink w:anchor="__RefHeading___Toc3108_1968430665">
             <w:r>
               <w:rPr>
                 <w:webHidden/>
                 <w:rStyle w:val="IndexLink"/>
               </w:rPr>
-              <w:t>4.1 PROTÓTIPO DE BAIXA FIDELIDADE</w:t>
+              <w:t>5.1 PROTÓTIPO DE BAIXA FIDELIDADE</w:t>
               <w:tab/>
-              <w:t>12</w:t>
+              <w:t>14</w:t>
             </w:r>
           </w:hyperlink>
         </w:p>
@@ -833,15 +917,15 @@
             </w:tabs>
             <w:rPr/>
           </w:pPr>
-          <w:hyperlink w:anchor="__RefHeading___Toc3093_1907633178">
+          <w:hyperlink w:anchor="__RefHeading___Toc3110_1968430665">
             <w:r>
               <w:rPr>
                 <w:webHidden/>
                 <w:rStyle w:val="IndexLink"/>
               </w:rPr>
-              <w:t>4.2 PROTÓTIPO DE ALTA FIDELIDADE</w:t>
+              <w:t>5.2 PROTÓTIPO DE ALTA FIDELIDADE</w:t>
               <w:tab/>
-              <w:t>13</w:t>
+              <w:t>15</w:t>
             </w:r>
           </w:hyperlink>
         </w:p>
@@ -854,15 +938,15 @@
             </w:tabs>
             <w:rPr/>
           </w:pPr>
-          <w:hyperlink w:anchor="__RefHeading___Toc3095_1907633178">
+          <w:hyperlink w:anchor="__RefHeading___Toc3112_1968430665">
             <w:r>
               <w:rPr>
                 <w:webHidden/>
                 <w:rStyle w:val="IndexLink"/>
               </w:rPr>
-              <w:t>5 MÉTRICAS E CRONOGRAMA</w:t>
+              <w:t>6 MÉTRICAS E CRONOGRAMA</w:t>
               <w:tab/>
-              <w:t>15</w:t>
+              <w:t>17</w:t>
             </w:r>
           </w:hyperlink>
         </w:p>
@@ -875,15 +959,15 @@
             </w:tabs>
             <w:rPr/>
           </w:pPr>
-          <w:hyperlink w:anchor="__RefHeading___Toc3097_1907633178">
+          <w:hyperlink w:anchor="__RefHeading___Toc3114_1968430665">
             <w:r>
               <w:rPr>
                 <w:webHidden/>
                 <w:rStyle w:val="IndexLink"/>
               </w:rPr>
-              <w:t>5.1 CRONOGRAMA</w:t>
+              <w:t>6.1 CRONOGRAMA</w:t>
               <w:tab/>
-              <w:t>15</w:t>
+              <w:t>17</w:t>
             </w:r>
           </w:hyperlink>
         </w:p>
@@ -896,15 +980,15 @@
             </w:tabs>
             <w:rPr/>
           </w:pPr>
-          <w:hyperlink w:anchor="__RefHeading___Toc3099_1907633178">
+          <w:hyperlink w:anchor="__RefHeading___Toc3116_1968430665">
             <w:r>
               <w:rPr>
                 <w:webHidden/>
                 <w:rStyle w:val="IndexLink"/>
               </w:rPr>
-              <w:t>5.2 MÉTRICAS DE ACOMPANHAMENTO</w:t>
+              <w:t>6.2 MÉTRICAS DE ACOMPANHAMENTO</w:t>
               <w:tab/>
-              <w:t>16</w:t>
+              <w:t>18</w:t>
             </w:r>
           </w:hyperlink>
         </w:p>
@@ -917,15 +1001,15 @@
             </w:tabs>
             <w:rPr/>
           </w:pPr>
-          <w:hyperlink w:anchor="__RefHeading___Toc3101_1907633178">
+          <w:hyperlink w:anchor="__RefHeading___Toc3118_1968430665">
             <w:r>
               <w:rPr>
                 <w:webHidden/>
                 <w:rStyle w:val="IndexLink"/>
               </w:rPr>
-              <w:t>6 MODELO DO DOMÍNIO</w:t>
+              <w:t>7 MODELO DO DOMÍNIO</w:t>
               <w:tab/>
-              <w:t>17</w:t>
+              <w:t>19</w:t>
             </w:r>
           </w:hyperlink>
         </w:p>
@@ -938,15 +1022,15 @@
             </w:tabs>
             <w:rPr/>
           </w:pPr>
-          <w:hyperlink w:anchor="__RefHeading___Toc3103_1907633178">
+          <w:hyperlink w:anchor="__RefHeading___Toc3120_1968430665">
             <w:r>
               <w:rPr>
                 <w:webHidden/>
                 <w:rStyle w:val="IndexLink"/>
               </w:rPr>
-              <w:t>6.1 VISÃO CONCEITUAL DAS ENTIDADES</w:t>
+              <w:t>7.1 VISÃO CONCEITUAL DAS ENTIDADES</w:t>
               <w:tab/>
-              <w:t>17</w:t>
+              <w:t>19</w:t>
             </w:r>
           </w:hyperlink>
         </w:p>
@@ -959,15 +1043,15 @@
             </w:tabs>
             <w:rPr/>
           </w:pPr>
-          <w:hyperlink w:anchor="__RefHeading___Toc3105_1907633178">
+          <w:hyperlink w:anchor="__RefHeading___Toc3122_1968430665">
             <w:r>
               <w:rPr>
                 <w:webHidden/>
                 <w:rStyle w:val="IndexLink"/>
               </w:rPr>
-              <w:t>6.2 DIAGRAMAS DE MODELAGEM</w:t>
+              <w:t>7.2 DIAGRAMAS DE MODELAGEM</w:t>
               <w:tab/>
-              <w:t>18</w:t>
+              <w:t>20</w:t>
             </w:r>
           </w:hyperlink>
         </w:p>
@@ -980,15 +1064,15 @@
             </w:tabs>
             <w:rPr/>
           </w:pPr>
-          <w:hyperlink w:anchor="__RefHeading___Toc3107_1907633178">
+          <w:hyperlink w:anchor="__RefHeading___Toc3124_1968430665">
             <w:r>
               <w:rPr>
                 <w:webHidden/>
                 <w:rStyle w:val="IndexLink"/>
               </w:rPr>
-              <w:t>7 MODELO DE DADOS</w:t>
+              <w:t>8 MODELO DE DADOS</w:t>
               <w:tab/>
-              <w:t>19</w:t>
+              <w:t>21</w:t>
             </w:r>
           </w:hyperlink>
         </w:p>
@@ -1001,15 +1085,15 @@
             </w:tabs>
             <w:rPr/>
           </w:pPr>
-          <w:hyperlink w:anchor="__RefHeading___Toc3109_1907633178">
+          <w:hyperlink w:anchor="__RefHeading___Toc3126_1968430665">
             <w:r>
               <w:rPr>
                 <w:webHidden/>
                 <w:rStyle w:val="IndexLink"/>
               </w:rPr>
-              <w:t>7.1 MODELO LÓGICO DA BASE DE DADOS</w:t>
+              <w:t>8.1 MODELO LÓGICO DA BASE DE DADOS</w:t>
               <w:tab/>
-              <w:t>19</w:t>
+              <w:t>21</w:t>
             </w:r>
           </w:hyperlink>
         </w:p>
@@ -1022,15 +1106,15 @@
             </w:tabs>
             <w:rPr/>
           </w:pPr>
-          <w:hyperlink w:anchor="__RefHeading___Toc3111_1907633178">
+          <w:hyperlink w:anchor="__RefHeading___Toc3128_1968430665">
             <w:r>
               <w:rPr>
                 <w:webHidden/>
                 <w:rStyle w:val="IndexLink"/>
               </w:rPr>
-              <w:t>7.2 CRIAÇÃO FÍSICA DO MODELO DE DADOS</w:t>
+              <w:t>8.2 CRIAÇÃO FÍSICA DO MODELO DE DADOS</w:t>
               <w:tab/>
-              <w:t>20</w:t>
+              <w:t>22</w:t>
             </w:r>
           </w:hyperlink>
         </w:p>
@@ -1043,15 +1127,15 @@
             </w:tabs>
             <w:rPr/>
           </w:pPr>
-          <w:hyperlink w:anchor="__RefHeading___Toc3113_1907633178">
+          <w:hyperlink w:anchor="__RefHeading___Toc3130_1968430665">
             <w:r>
               <w:rPr>
                 <w:webHidden/>
                 <w:rStyle w:val="IndexLink"/>
               </w:rPr>
-              <w:t>7.3 DICIONÁRIO DE DADOS</w:t>
+              <w:t>8.3 DICIONÁRIO DE DADOS</w:t>
               <w:tab/>
-              <w:t>22</w:t>
+              <w:t>24</w:t>
             </w:r>
           </w:hyperlink>
         </w:p>
@@ -1064,15 +1148,15 @@
             </w:tabs>
             <w:rPr/>
           </w:pPr>
-          <w:hyperlink w:anchor="__RefHeading___Toc3115_1907633178">
+          <w:hyperlink w:anchor="__RefHeading___Toc3132_1968430665">
             <w:r>
               <w:rPr>
                 <w:webHidden/>
                 <w:rStyle w:val="IndexLink"/>
               </w:rPr>
-              <w:t>7.3.1 Tabela USUARIO</w:t>
+              <w:t>8.3.1 Tabela USUARIO</w:t>
               <w:tab/>
-              <w:t>22</w:t>
+              <w:t>24</w:t>
             </w:r>
           </w:hyperlink>
         </w:p>
@@ -1085,15 +1169,15 @@
             </w:tabs>
             <w:rPr/>
           </w:pPr>
-          <w:hyperlink w:anchor="__RefHeading___Toc3117_1907633178">
+          <w:hyperlink w:anchor="__RefHeading___Toc3134_1968430665">
             <w:r>
               <w:rPr>
                 <w:webHidden/>
                 <w:rStyle w:val="IndexLink"/>
               </w:rPr>
-              <w:t>7.3.2 Tabela USUARIO_PAPEL</w:t>
+              <w:t>8.3.2 Tabela USUARIO_PAPEL</w:t>
               <w:tab/>
-              <w:t>22</w:t>
+              <w:t>24</w:t>
             </w:r>
           </w:hyperlink>
         </w:p>
@@ -1106,15 +1190,15 @@
             </w:tabs>
             <w:rPr/>
           </w:pPr>
-          <w:hyperlink w:anchor="__RefHeading___Toc3119_1907633178">
+          <w:hyperlink w:anchor="__RefHeading___Toc3136_1968430665">
             <w:r>
               <w:rPr>
                 <w:webHidden/>
                 <w:rStyle w:val="IndexLink"/>
               </w:rPr>
-              <w:t>7.3.3 Tabela EVENTO</w:t>
+              <w:t>8.3.3 Tabela EVENTO</w:t>
               <w:tab/>
-              <w:t>22</w:t>
+              <w:t>24</w:t>
             </w:r>
           </w:hyperlink>
         </w:p>
@@ -1127,15 +1211,15 @@
             </w:tabs>
             <w:rPr/>
           </w:pPr>
-          <w:hyperlink w:anchor="__RefHeading___Toc3121_1907633178">
+          <w:hyperlink w:anchor="__RefHeading___Toc3138_1968430665">
             <w:r>
               <w:rPr>
                 <w:webHidden/>
                 <w:rStyle w:val="IndexLink"/>
               </w:rPr>
-              <w:t>7.3.4 Tabela EVENTO_FOTO</w:t>
+              <w:t>8.3.4 Tabela EVENTO_FOTO</w:t>
               <w:tab/>
-              <w:t>23</w:t>
+              <w:t>25</w:t>
             </w:r>
           </w:hyperlink>
         </w:p>
@@ -1148,15 +1232,15 @@
             </w:tabs>
             <w:rPr/>
           </w:pPr>
-          <w:hyperlink w:anchor="__RefHeading___Toc3123_1907633178">
+          <w:hyperlink w:anchor="__RefHeading___Toc3140_1968430665">
             <w:r>
               <w:rPr>
                 <w:webHidden/>
                 <w:rStyle w:val="IndexLink"/>
               </w:rPr>
-              <w:t>7.3.5 Tabela INSCRICAO</w:t>
+              <w:t>8.3.5 Tabela INSCRICAO</w:t>
               <w:tab/>
-              <w:t>23</w:t>
+              <w:t>25</w:t>
             </w:r>
           </w:hyperlink>
         </w:p>
@@ -1169,15 +1253,15 @@
             </w:tabs>
             <w:rPr/>
           </w:pPr>
-          <w:hyperlink w:anchor="__RefHeading___Toc3125_1907633178">
+          <w:hyperlink w:anchor="__RefHeading___Toc3142_1968430665">
             <w:r>
               <w:rPr>
                 <w:webHidden/>
                 <w:rStyle w:val="IndexLink"/>
               </w:rPr>
-              <w:t>7.3.6 Tabela PRESENCA</w:t>
+              <w:t>8.3.6 Tabela PRESENCA</w:t>
               <w:tab/>
-              <w:t>23</w:t>
+              <w:t>25</w:t>
             </w:r>
           </w:hyperlink>
         </w:p>
@@ -1190,15 +1274,15 @@
             </w:tabs>
             <w:rPr/>
           </w:pPr>
-          <w:hyperlink w:anchor="__RefHeading___Toc3127_1907633178">
+          <w:hyperlink w:anchor="__RefHeading___Toc3144_1968430665">
             <w:r>
               <w:rPr>
                 <w:webHidden/>
                 <w:rStyle w:val="IndexLink"/>
               </w:rPr>
-              <w:t>7.3.7 Tabela CERTIFICADO</w:t>
+              <w:t>8.3.7 Tabela CERTIFICADO</w:t>
               <w:tab/>
-              <w:t>24</w:t>
+              <w:t>26</w:t>
             </w:r>
           </w:hyperlink>
         </w:p>
@@ -1211,15 +1295,15 @@
             </w:tabs>
             <w:rPr/>
           </w:pPr>
-          <w:hyperlink w:anchor="__RefHeading___Toc3129_1907633178">
+          <w:hyperlink w:anchor="__RefHeading___Toc3146_1968430665">
             <w:r>
               <w:rPr>
                 <w:webHidden/>
                 <w:rStyle w:val="IndexLink"/>
               </w:rPr>
-              <w:t>7.3.8 Tabela AVALIACAO</w:t>
+              <w:t>8.3.8 Tabela AVALIACAO</w:t>
               <w:tab/>
-              <w:t>24</w:t>
+              <w:t>26</w:t>
             </w:r>
           </w:hyperlink>
         </w:p>
@@ -1232,15 +1316,15 @@
             </w:tabs>
             <w:rPr/>
           </w:pPr>
-          <w:hyperlink w:anchor="__RefHeading___Toc3131_1907633178">
+          <w:hyperlink w:anchor="__RefHeading___Toc3148_1968430665">
             <w:r>
               <w:rPr>
                 <w:webHidden/>
                 <w:rStyle w:val="IndexLink"/>
               </w:rPr>
-              <w:t>7.3.9 Tabela RESUMO_AVALIACAO</w:t>
+              <w:t>8.3.9 Tabela RESUMO_AVALIACAO</w:t>
               <w:tab/>
-              <w:t>24</w:t>
+              <w:t>26</w:t>
             </w:r>
           </w:hyperlink>
         </w:p>
@@ -1253,15 +1337,15 @@
             </w:tabs>
             <w:rPr/>
           </w:pPr>
-          <w:hyperlink w:anchor="__RefHeading___Toc3133_1907633178">
+          <w:hyperlink w:anchor="__RefHeading___Toc3150_1968430665">
             <w:r>
               <w:rPr>
                 <w:webHidden/>
                 <w:rStyle w:val="IndexLink"/>
               </w:rPr>
-              <w:t>7.3.10 Tabela INTERACAO_IA</w:t>
+              <w:t>8.3.10 Tabela INTERACAO_IA</w:t>
               <w:tab/>
-              <w:t>25</w:t>
+              <w:t>27</w:t>
             </w:r>
           </w:hyperlink>
         </w:p>
@@ -1274,15 +1358,15 @@
             </w:tabs>
             <w:rPr/>
           </w:pPr>
-          <w:hyperlink w:anchor="__RefHeading___Toc3135_1907633178">
+          <w:hyperlink w:anchor="__RefHeading___Toc3152_1968430665">
             <w:r>
               <w:rPr>
                 <w:webHidden/>
                 <w:rStyle w:val="IndexLink"/>
               </w:rPr>
-              <w:t>8 AMBIENTE DE DESENVOLVIMENTO</w:t>
+              <w:t>9 AMBIENTE DE DESENVOLVIMENTO</w:t>
               <w:tab/>
-              <w:t>26</w:t>
+              <w:t>28</w:t>
             </w:r>
           </w:hyperlink>
         </w:p>
@@ -1295,15 +1379,15 @@
             </w:tabs>
             <w:rPr/>
           </w:pPr>
-          <w:hyperlink w:anchor="__RefHeading___Toc3137_1907633178">
+          <w:hyperlink w:anchor="__RefHeading___Toc3154_1968430665">
             <w:r>
               <w:rPr>
                 <w:webHidden/>
                 <w:rStyle w:val="IndexLink"/>
               </w:rPr>
-              <w:t>9 SISTEMAS E COMPONENTES EXTERNOS UTILIZADOS</w:t>
+              <w:t>10 SISTEMAS E COMPONENTES EXTERNOS UTILIZADOS</w:t>
               <w:tab/>
-              <w:t>27</w:t>
+              <w:t>29</w:t>
             </w:r>
           </w:hyperlink>
         </w:p>
@@ -1316,15 +1400,15 @@
             </w:tabs>
             <w:rPr/>
           </w:pPr>
-          <w:hyperlink w:anchor="__RefHeading___Toc3139_1907633178">
+          <w:hyperlink w:anchor="__RefHeading___Toc3156_1968430665">
             <w:r>
               <w:rPr>
                 <w:webHidden/>
                 <w:rStyle w:val="IndexLink"/>
               </w:rPr>
-              <w:t>9.1 TECNOLOGIA EMERGENTE E SUA UTILIZAÇÃO</w:t>
+              <w:t>10.1 TECNOLOGIA EMERGENTE E SUA UTILIZAÇÃO</w:t>
               <w:tab/>
-              <w:t>28</w:t>
+              <w:t>30</w:t>
             </w:r>
           </w:hyperlink>
         </w:p>
@@ -1337,15 +1421,15 @@
             </w:tabs>
             <w:rPr/>
           </w:pPr>
-          <w:hyperlink w:anchor="__RefHeading___Toc3141_1907633178">
+          <w:hyperlink w:anchor="__RefHeading___Toc3158_1968430665">
             <w:r>
               <w:rPr>
                 <w:webHidden/>
                 <w:rStyle w:val="IndexLink"/>
               </w:rPr>
-              <w:t>9.2 SEGURANÇA DE DADOS</w:t>
+              <w:t>10.2 SEGURANÇA DE DADOS</w:t>
               <w:tab/>
-              <w:t>29</w:t>
+              <w:t>31</w:t>
             </w:r>
           </w:hyperlink>
         </w:p>
@@ -1358,15 +1442,15 @@
             </w:tabs>
             <w:rPr/>
           </w:pPr>
-          <w:hyperlink w:anchor="__RefHeading___Toc3143_1907633178">
+          <w:hyperlink w:anchor="__RefHeading___Toc3160_1968430665">
             <w:r>
               <w:rPr>
                 <w:webHidden/>
                 <w:rStyle w:val="IndexLink"/>
               </w:rPr>
-              <w:t>10 INSTALAÇÃO E CONFIGURAÇÃO</w:t>
+              <w:t>11 INSTALAÇÃO E CONFIGURAÇÃO</w:t>
               <w:tab/>
-              <w:t>31</w:t>
+              <w:t>33</w:t>
             </w:r>
           </w:hyperlink>
         </w:p>
@@ -1379,15 +1463,15 @@
             </w:tabs>
             <w:rPr/>
           </w:pPr>
-          <w:hyperlink w:anchor="__RefHeading___Toc3145_1907633178">
+          <w:hyperlink w:anchor="__RefHeading___Toc3162_1968430665">
             <w:r>
               <w:rPr>
                 <w:webHidden/>
                 <w:rStyle w:val="IndexLink"/>
               </w:rPr>
-              <w:t>10.1 PRÉ-REQUISITOS</w:t>
+              <w:t>11.1 PRÉ-REQUISITOS</w:t>
               <w:tab/>
-              <w:t>31</w:t>
+              <w:t>33</w:t>
             </w:r>
           </w:hyperlink>
         </w:p>
@@ -1400,15 +1484,15 @@
             </w:tabs>
             <w:rPr/>
           </w:pPr>
-          <w:hyperlink w:anchor="__RefHeading___Toc3147_1907633178">
+          <w:hyperlink w:anchor="__RefHeading___Toc3164_1968430665">
             <w:r>
               <w:rPr>
                 <w:webHidden/>
                 <w:rStyle w:val="IndexLink"/>
               </w:rPr>
-              <w:t>10.2 PASSOS DE INSTALAÇÃO</w:t>
+              <w:t>11.2 PASSOS DE INSTALAÇÃO</w:t>
               <w:tab/>
-              <w:t>31</w:t>
+              <w:t>33</w:t>
             </w:r>
           </w:hyperlink>
         </w:p>
@@ -1421,15 +1505,15 @@
             </w:tabs>
             <w:rPr/>
           </w:pPr>
-          <w:hyperlink w:anchor="__RefHeading___Toc3149_1907633178">
+          <w:hyperlink w:anchor="__RefHeading___Toc3166_1968430665">
             <w:r>
               <w:rPr>
                 <w:webHidden/>
                 <w:rStyle w:val="IndexLink"/>
               </w:rPr>
-              <w:t>11 DESENVOLVIMENTO</w:t>
+              <w:t>12 DESENVOLVIMENTO</w:t>
               <w:tab/>
-              <w:t>33</w:t>
+              <w:t>35</w:t>
             </w:r>
           </w:hyperlink>
         </w:p>
@@ -1442,15 +1526,15 @@
             </w:tabs>
             <w:rPr/>
           </w:pPr>
-          <w:hyperlink w:anchor="__RefHeading___Toc3151_1907633178">
+          <w:hyperlink w:anchor="__RefHeading___Toc3168_1968430665">
             <w:r>
               <w:rPr>
                 <w:webHidden/>
                 <w:rStyle w:val="IndexLink"/>
               </w:rPr>
-              <w:t>11.1 WORKFLOW DE BRANCHES</w:t>
+              <w:t>12.1 WORKFLOW DE BRANCHES</w:t>
               <w:tab/>
-              <w:t>33</w:t>
+              <w:t>35</w:t>
             </w:r>
           </w:hyperlink>
         </w:p>
@@ -1463,15 +1547,15 @@
             </w:tabs>
             <w:rPr/>
           </w:pPr>
-          <w:hyperlink w:anchor="__RefHeading___Toc3153_1907633178">
+          <w:hyperlink w:anchor="__RefHeading___Toc3170_1968430665">
             <w:r>
               <w:rPr>
                 <w:webHidden/>
                 <w:rStyle w:val="IndexLink"/>
               </w:rPr>
-              <w:t>11.2 CONVENÇÕES DE CÓDIGO</w:t>
+              <w:t>12.2 CONVENÇÕES DE CÓDIGO</w:t>
               <w:tab/>
-              <w:t>33</w:t>
+              <w:t>35</w:t>
             </w:r>
           </w:hyperlink>
         </w:p>
@@ -1484,15 +1568,15 @@
             </w:tabs>
             <w:rPr/>
           </w:pPr>
-          <w:hyperlink w:anchor="__RefHeading___Toc3155_1907633178">
+          <w:hyperlink w:anchor="__RefHeading___Toc3172_1968430665">
             <w:r>
               <w:rPr>
                 <w:webHidden/>
                 <w:rStyle w:val="IndexLink"/>
               </w:rPr>
-              <w:t>12 API E INTERFACES</w:t>
+              <w:t>13 API E INTERFACES</w:t>
               <w:tab/>
-              <w:t>35</w:t>
+              <w:t>37</w:t>
             </w:r>
           </w:hyperlink>
         </w:p>
@@ -1505,15 +1589,15 @@
             </w:tabs>
             <w:rPr/>
           </w:pPr>
-          <w:hyperlink w:anchor="__RefHeading___Toc3157_1907633178">
+          <w:hyperlink w:anchor="__RefHeading___Toc3174_1968430665">
             <w:r>
               <w:rPr>
                 <w:webHidden/>
                 <w:rStyle w:val="IndexLink"/>
               </w:rPr>
-              <w:t>12.1 ENDPOINTS PRINCIPAIS</w:t>
+              <w:t>13.1 ENDPOINTS PRINCIPAIS</w:t>
               <w:tab/>
-              <w:t>35</w:t>
+              <w:t>37</w:t>
             </w:r>
           </w:hyperlink>
         </w:p>
@@ -1526,15 +1610,15 @@
             </w:tabs>
             <w:rPr/>
           </w:pPr>
-          <w:hyperlink w:anchor="__RefHeading___Toc3159_1907633178">
+          <w:hyperlink w:anchor="__RefHeading___Toc3176_1968430665">
             <w:r>
               <w:rPr>
                 <w:webHidden/>
                 <w:rStyle w:val="IndexLink"/>
               </w:rPr>
-              <w:t>12.1.1 Rotas de Autenticação</w:t>
+              <w:t>13.1.1 Rotas de Autenticação</w:t>
               <w:tab/>
-              <w:t>35</w:t>
+              <w:t>37</w:t>
             </w:r>
           </w:hyperlink>
         </w:p>
@@ -1547,15 +1631,15 @@
             </w:tabs>
             <w:rPr/>
           </w:pPr>
-          <w:hyperlink w:anchor="__RefHeading___Toc3161_1907633178">
+          <w:hyperlink w:anchor="__RefHeading___Toc3178_1968430665">
             <w:r>
               <w:rPr>
                 <w:webHidden/>
                 <w:rStyle w:val="IndexLink"/>
               </w:rPr>
-              <w:t>12.1.2 Eventos</w:t>
+              <w:t>13.1.2 Eventos</w:t>
               <w:tab/>
-              <w:t>35</w:t>
+              <w:t>37</w:t>
             </w:r>
           </w:hyperlink>
         </w:p>
@@ -1568,15 +1652,15 @@
             </w:tabs>
             <w:rPr/>
           </w:pPr>
-          <w:hyperlink w:anchor="__RefHeading___Toc3163_1907633178">
+          <w:hyperlink w:anchor="__RefHeading___Toc3180_1968430665">
             <w:r>
               <w:rPr>
                 <w:webHidden/>
                 <w:rStyle w:val="IndexLink"/>
               </w:rPr>
-              <w:t>12.1.3 Inscrições</w:t>
+              <w:t>13.1.3 Inscrições</w:t>
               <w:tab/>
-              <w:t>36</w:t>
+              <w:t>38</w:t>
             </w:r>
           </w:hyperlink>
         </w:p>
@@ -1589,15 +1673,15 @@
             </w:tabs>
             <w:rPr/>
           </w:pPr>
-          <w:hyperlink w:anchor="__RefHeading___Toc3165_1907633178">
+          <w:hyperlink w:anchor="__RefHeading___Toc3182_1968430665">
             <w:r>
               <w:rPr>
                 <w:webHidden/>
                 <w:rStyle w:val="IndexLink"/>
               </w:rPr>
-              <w:t>12.1.4 Presença e Certificação</w:t>
+              <w:t>13.1.4 Presença e Certificação</w:t>
               <w:tab/>
-              <w:t>36</w:t>
+              <w:t>38</w:t>
             </w:r>
           </w:hyperlink>
         </w:p>
@@ -1610,15 +1694,15 @@
             </w:tabs>
             <w:rPr/>
           </w:pPr>
-          <w:hyperlink w:anchor="__RefHeading___Toc3167_1907633178">
+          <w:hyperlink w:anchor="__RefHeading___Toc3184_1968430665">
             <w:r>
               <w:rPr>
                 <w:webHidden/>
                 <w:rStyle w:val="IndexLink"/>
               </w:rPr>
-              <w:t>12.1.5 Avaliações</w:t>
+              <w:t>13.1.5 Avaliações</w:t>
               <w:tab/>
-              <w:t>36</w:t>
+              <w:t>38</w:t>
             </w:r>
           </w:hyperlink>
         </w:p>
@@ -1631,15 +1715,15 @@
             </w:tabs>
             <w:rPr/>
           </w:pPr>
-          <w:hyperlink w:anchor="__RefHeading___Toc3169_1907633178">
+          <w:hyperlink w:anchor="__RefHeading___Toc3186_1968430665">
             <w:r>
               <w:rPr>
                 <w:webHidden/>
                 <w:rStyle w:val="IndexLink"/>
               </w:rPr>
-              <w:t>12.1.6 Padronização de Erros</w:t>
+              <w:t>13.1.6 Padronização de Erros</w:t>
               <w:tab/>
-              <w:t>37</w:t>
+              <w:t>39</w:t>
             </w:r>
           </w:hyperlink>
         </w:p>
@@ -1652,15 +1736,15 @@
             </w:tabs>
             <w:rPr/>
           </w:pPr>
-          <w:hyperlink w:anchor="__RefHeading___Toc3171_1907633178">
+          <w:hyperlink w:anchor="__RefHeading___Toc3188_1968430665">
             <w:r>
               <w:rPr>
                 <w:webHidden/>
                 <w:rStyle w:val="IndexLink"/>
               </w:rPr>
-              <w:t>12.2 AUTENTICAÇÃO</w:t>
+              <w:t>13.2 AUTENTICAÇÃO</w:t>
               <w:tab/>
-              <w:t>37</w:t>
+              <w:t>39</w:t>
             </w:r>
           </w:hyperlink>
         </w:p>
@@ -1673,15 +1757,15 @@
             </w:tabs>
             <w:rPr/>
           </w:pPr>
-          <w:hyperlink w:anchor="__RefHeading___Toc3173_1907633178">
+          <w:hyperlink w:anchor="__RefHeading___Toc3190_1968430665">
             <w:r>
               <w:rPr>
                 <w:webHidden/>
                 <w:rStyle w:val="IndexLink"/>
               </w:rPr>
-              <w:t>13 ESTRATÉGIA DE TESTES</w:t>
+              <w:t>14 ESTRATÉGIA DE TESTES</w:t>
               <w:tab/>
-              <w:t>39</w:t>
+              <w:t>41</w:t>
             </w:r>
           </w:hyperlink>
         </w:p>
@@ -1694,15 +1778,15 @@
             </w:tabs>
             <w:rPr/>
           </w:pPr>
-          <w:hyperlink w:anchor="__RefHeading___Toc3175_1907633178">
+          <w:hyperlink w:anchor="__RefHeading___Toc3192_1968430665">
             <w:r>
               <w:rPr>
                 <w:webHidden/>
                 <w:rStyle w:val="IndexLink"/>
               </w:rPr>
-              <w:t>13.1 PIRÂMIDE DE TESTES</w:t>
+              <w:t>14.1 PIRÂMIDE DE TESTES</w:t>
               <w:tab/>
-              <w:t>39</w:t>
+              <w:t>41</w:t>
             </w:r>
           </w:hyperlink>
         </w:p>
@@ -1715,15 +1799,15 @@
             </w:tabs>
             <w:rPr/>
           </w:pPr>
-          <w:hyperlink w:anchor="__RefHeading___Toc3177_1907633178">
+          <w:hyperlink w:anchor="__RefHeading___Toc3194_1968430665">
             <w:r>
               <w:rPr>
                 <w:webHidden/>
                 <w:rStyle w:val="IndexLink"/>
               </w:rPr>
-              <w:t>13.2 EXECUÇÃO DOS TESTES</w:t>
+              <w:t>14.2 EXECUÇÃO DOS TESTES</w:t>
               <w:tab/>
-              <w:t>40</w:t>
+              <w:t>42</w:t>
             </w:r>
           </w:hyperlink>
         </w:p>
@@ -1736,15 +1820,15 @@
             </w:tabs>
             <w:rPr/>
           </w:pPr>
-          <w:hyperlink w:anchor="__RefHeading___Toc3179_1907633178">
+          <w:hyperlink w:anchor="__RefHeading___Toc3196_1968430665">
             <w:r>
               <w:rPr>
                 <w:webHidden/>
                 <w:rStyle w:val="IndexLink"/>
               </w:rPr>
-              <w:t>14 DEPLOYMENT E DEVOPS</w:t>
+              <w:t>15 DEPLOYMENT E DEVOPS</w:t>
               <w:tab/>
-              <w:t>42</w:t>
+              <w:t>44</w:t>
             </w:r>
           </w:hyperlink>
         </w:p>
@@ -1757,15 +1841,15 @@
             </w:tabs>
             <w:rPr/>
           </w:pPr>
-          <w:hyperlink w:anchor="__RefHeading___Toc3181_1907633178">
+          <w:hyperlink w:anchor="__RefHeading___Toc3198_1968430665">
             <w:r>
               <w:rPr>
                 <w:webHidden/>
                 <w:rStyle w:val="IndexLink"/>
               </w:rPr>
-              <w:t>14.1 PIPELINE DE INTEGRAÇÃO E ENTREGA CONTÍNUA</w:t>
+              <w:t>15.1 PIPELINE DE INTEGRAÇÃO E ENTREGA CONTÍNUA</w:t>
               <w:tab/>
-              <w:t>42</w:t>
+              <w:t>44</w:t>
             </w:r>
           </w:hyperlink>
         </w:p>
@@ -1778,15 +1862,15 @@
             </w:tabs>
             <w:rPr/>
           </w:pPr>
-          <w:hyperlink w:anchor="__RefHeading___Toc3183_1907633178">
+          <w:hyperlink w:anchor="__RefHeading___Toc3200_1968430665">
             <w:r>
               <w:rPr>
                 <w:webHidden/>
                 <w:rStyle w:val="IndexLink"/>
               </w:rPr>
-              <w:t>14.1.1 Etapas do Pipeline</w:t>
+              <w:t>15.1.1 Etapas do Pipeline</w:t>
               <w:tab/>
-              <w:t>42</w:t>
+              <w:t>44</w:t>
             </w:r>
           </w:hyperlink>
         </w:p>
@@ -1799,15 +1883,15 @@
             </w:tabs>
             <w:rPr/>
           </w:pPr>
-          <w:hyperlink w:anchor="__RefHeading___Toc3185_1907633178">
+          <w:hyperlink w:anchor="__RefHeading___Toc3202_1968430665">
             <w:r>
               <w:rPr>
                 <w:webHidden/>
                 <w:rStyle w:val="IndexLink"/>
               </w:rPr>
-              <w:t>14.1.2 Critérios de Aprovação</w:t>
+              <w:t>15.1.2 Critérios de Aprovação</w:t>
               <w:tab/>
-              <w:t>43</w:t>
+              <w:t>45</w:t>
             </w:r>
           </w:hyperlink>
         </w:p>
@@ -1820,15 +1904,15 @@
             </w:tabs>
             <w:rPr/>
           </w:pPr>
-          <w:hyperlink w:anchor="__RefHeading___Toc3187_1907633178">
+          <w:hyperlink w:anchor="__RefHeading___Toc3204_1968430665">
             <w:r>
               <w:rPr>
                 <w:webHidden/>
                 <w:rStyle w:val="IndexLink"/>
               </w:rPr>
-              <w:t>14.1.3 Tratamento de Segredos</w:t>
+              <w:t>15.1.3 Tratamento de Segredos</w:t>
               <w:tab/>
-              <w:t>43</w:t>
+              <w:t>45</w:t>
             </w:r>
           </w:hyperlink>
         </w:p>
@@ -1841,15 +1925,15 @@
             </w:tabs>
             <w:rPr/>
           </w:pPr>
-          <w:hyperlink w:anchor="__RefHeading___Toc3189_1907633178">
+          <w:hyperlink w:anchor="__RefHeading___Toc3206_1968430665">
             <w:r>
               <w:rPr>
                 <w:webHidden/>
                 <w:rStyle w:val="IndexLink"/>
               </w:rPr>
-              <w:t>14.2 AMBIENTES</w:t>
+              <w:t>15.2 AMBIENTES</w:t>
               <w:tab/>
-              <w:t>43</w:t>
+              <w:t>45</w:t>
             </w:r>
           </w:hyperlink>
         </w:p>
@@ -1862,15 +1946,15 @@
             </w:tabs>
             <w:rPr/>
           </w:pPr>
-          <w:hyperlink w:anchor="__RefHeading___Toc3191_1907633178">
+          <w:hyperlink w:anchor="__RefHeading___Toc3208_1968430665">
             <w:r>
               <w:rPr>
                 <w:webHidden/>
                 <w:rStyle w:val="IndexLink"/>
               </w:rPr>
-              <w:t>15 PERFORMANCE E OTIMIZAÇÃO</w:t>
+              <w:t>16 PERFORMANCE E OTIMIZAÇÃO</w:t>
               <w:tab/>
-              <w:t>46</w:t>
+              <w:t>48</w:t>
             </w:r>
           </w:hyperlink>
         </w:p>
@@ -1883,15 +1967,15 @@
             </w:tabs>
             <w:rPr/>
           </w:pPr>
-          <w:hyperlink w:anchor="__RefHeading___Toc3193_1907633178">
+          <w:hyperlink w:anchor="__RefHeading___Toc3210_1968430665">
             <w:r>
               <w:rPr>
                 <w:webHidden/>
                 <w:rStyle w:val="IndexLink"/>
               </w:rPr>
-              <w:t>15.1 MÉTRICAS DE EFICIÊNCIA</w:t>
+              <w:t>16.1 MÉTRICAS DE EFICIÊNCIA</w:t>
               <w:tab/>
-              <w:t>46</w:t>
+              <w:t>48</w:t>
             </w:r>
           </w:hyperlink>
         </w:p>
@@ -1904,15 +1988,15 @@
             </w:tabs>
             <w:rPr/>
           </w:pPr>
-          <w:hyperlink w:anchor="__RefHeading___Toc3195_1907633178">
+          <w:hyperlink w:anchor="__RefHeading___Toc3212_1968430665">
             <w:r>
               <w:rPr>
                 <w:webHidden/>
                 <w:rStyle w:val="IndexLink"/>
               </w:rPr>
-              <w:t>16 TROUBLESHOOTING</w:t>
+              <w:t>17 TROUBLESHOOTING</w:t>
               <w:tab/>
-              <w:t>48</w:t>
+              <w:t>50</w:t>
             </w:r>
           </w:hyperlink>
         </w:p>
@@ -1925,15 +2009,15 @@
             </w:tabs>
             <w:rPr/>
           </w:pPr>
-          <w:hyperlink w:anchor="__RefHeading___Toc3197_1907633178">
+          <w:hyperlink w:anchor="__RefHeading___Toc3214_1968430665">
             <w:r>
               <w:rPr>
                 <w:webHidden/>
                 <w:rStyle w:val="IndexLink"/>
               </w:rPr>
-              <w:t>16.1 PROBLEMAS COMUNS</w:t>
+              <w:t>17.1 PROBLEMAS COMUNS</w:t>
               <w:tab/>
-              <w:t>48</w:t>
+              <w:t>50</w:t>
             </w:r>
           </w:hyperlink>
         </w:p>
@@ -1946,15 +2030,15 @@
             </w:tabs>
             <w:rPr/>
           </w:pPr>
-          <w:hyperlink w:anchor="__RefHeading___Toc3199_1907633178">
+          <w:hyperlink w:anchor="__RefHeading___Toc3216_1968430665">
             <w:r>
               <w:rPr>
                 <w:webHidden/>
                 <w:rStyle w:val="IndexLink"/>
               </w:rPr>
-              <w:t>REFERÊNCIAS</w:t>
+              <w:t>18 CONCLUSÃO</w:t>
               <w:tab/>
-              <w:t>50</w:t>
+              <w:t>52</w:t>
             </w:r>
           </w:hyperlink>
         </w:p>
@@ -1967,15 +2051,36 @@
             </w:tabs>
             <w:rPr/>
           </w:pPr>
-          <w:hyperlink w:anchor="__RefHeading___Toc3201_1907633178">
+          <w:hyperlink w:anchor="__RefHeading___Toc3218_1968430665">
             <w:r>
               <w:rPr>
                 <w:webHidden/>
                 <w:rStyle w:val="IndexLink"/>
               </w:rPr>
+              <w:t>REFERÊNCIAS</w:t>
+              <w:tab/>
+              <w:t>53</w:t>
+            </w:r>
+          </w:hyperlink>
+        </w:p>
+        <w:p>
+          <w:pPr>
+            <w:pStyle w:val="TOC1"/>
+            <w:tabs>
+              <w:tab w:val="clear" w:pos="9071"/>
+              <w:tab w:val="right" w:pos="9070" w:leader="dot"/>
+            </w:tabs>
+            <w:rPr/>
+          </w:pPr>
+          <w:hyperlink w:anchor="__RefHeading___Toc3220_1968430665">
+            <w:r>
+              <w:rPr>
+                <w:webHidden/>
+                <w:rStyle w:val="IndexLink"/>
+              </w:rPr>
               <w:t>APÊNDICE A — DIAGRAMAS DE MODELAGEM</w:t>
               <w:tab/>
-              <w:t>52</w:t>
+              <w:t>55</w:t>
             </w:r>
           </w:hyperlink>
         </w:p>
@@ -1988,7 +2093,7 @@
             </w:tabs>
             <w:rPr/>
           </w:pPr>
-          <w:hyperlink w:anchor="__RefHeading___Toc3203_1907633178">
+          <w:hyperlink w:anchor="__RefHeading___Toc3222_1968430665">
             <w:r>
               <w:rPr>
                 <w:webHidden/>
@@ -1996,7 +2101,7 @@
               </w:rPr>
               <w:t>Apêndice A.1a — Diagrama de Casos de Uso: Visitante e Participante</w:t>
               <w:tab/>
-              <w:t>53</w:t>
+              <w:t>56</w:t>
             </w:r>
           </w:hyperlink>
         </w:p>
@@ -2009,7 +2114,7 @@
             </w:tabs>
             <w:rPr/>
           </w:pPr>
-          <w:hyperlink w:anchor="__RefHeading___Toc3205_1907633178">
+          <w:hyperlink w:anchor="__RefHeading___Toc3224_1968430665">
             <w:r>
               <w:rPr>
                 <w:webHidden/>
@@ -2017,7 +2122,7 @@
               </w:rPr>
               <w:t>Apêndice A.1b — Diagrama de Casos de Uso: Organizador</w:t>
               <w:tab/>
-              <w:t>54</w:t>
+              <w:t>57</w:t>
             </w:r>
           </w:hyperlink>
         </w:p>
@@ -2030,7 +2135,7 @@
             </w:tabs>
             <w:rPr/>
           </w:pPr>
-          <w:hyperlink w:anchor="__RefHeading___Toc3207_1907633178">
+          <w:hyperlink w:anchor="__RefHeading___Toc3226_1968430665">
             <w:r>
               <w:rPr>
                 <w:webHidden/>
@@ -2038,7 +2143,7 @@
               </w:rPr>
               <w:t>Apêndice A.2a — Diagrama de Classes: Usuários, Eventos e Inscrições</w:t>
               <w:tab/>
-              <w:t>55</w:t>
+              <w:t>58</w:t>
             </w:r>
           </w:hyperlink>
         </w:p>
@@ -2051,7 +2156,7 @@
             </w:tabs>
             <w:rPr/>
           </w:pPr>
-          <w:hyperlink w:anchor="__RefHeading___Toc3209_1907633178">
+          <w:hyperlink w:anchor="__RefHeading___Toc3228_1968430665">
             <w:r>
               <w:rPr>
                 <w:webHidden/>
@@ -2059,7 +2164,7 @@
               </w:rPr>
               <w:t>Apêndice A.2b — Diagrama de Classes: Participação e Inteligência Artificial</w:t>
               <w:tab/>
-              <w:t>56</w:t>
+              <w:t>59</w:t>
             </w:r>
           </w:hyperlink>
         </w:p>
@@ -2072,7 +2177,7 @@
             </w:tabs>
             <w:rPr/>
           </w:pPr>
-          <w:hyperlink w:anchor="__RefHeading___Toc3211_1907633178">
+          <w:hyperlink w:anchor="__RefHeading___Toc3230_1968430665">
             <w:r>
               <w:rPr>
                 <w:webHidden/>
@@ -2080,7 +2185,7 @@
               </w:rPr>
               <w:t>Apêndice A.3a — Diagrama de Estados: Inscrição</w:t>
               <w:tab/>
-              <w:t>57</w:t>
+              <w:t>60</w:t>
             </w:r>
           </w:hyperlink>
         </w:p>
@@ -2093,7 +2198,7 @@
             </w:tabs>
             <w:rPr/>
           </w:pPr>
-          <w:hyperlink w:anchor="__RefHeading___Toc3213_1907633178">
+          <w:hyperlink w:anchor="__RefHeading___Toc3232_1968430665">
             <w:r>
               <w:rPr>
                 <w:webHidden/>
@@ -2101,7 +2206,7 @@
               </w:rPr>
               <w:t>Apêndice A.3b — Diagrama de Estados: Evento</w:t>
               <w:tab/>
-              <w:t>58</w:t>
+              <w:t>61</w:t>
             </w:r>
           </w:hyperlink>
         </w:p>
@@ -2114,7 +2219,7 @@
             </w:tabs>
             <w:rPr/>
           </w:pPr>
-          <w:hyperlink w:anchor="__RefHeading___Toc3215_1907633178">
+          <w:hyperlink w:anchor="__RefHeading___Toc3234_1968430665">
             <w:r>
               <w:rPr>
                 <w:webHidden/>
@@ -2122,7 +2227,7 @@
               </w:rPr>
               <w:t>Apêndice A.4 — Diagrama de Atividades: Cadastro de Evento Assistido por IA</w:t>
               <w:tab/>
-              <w:t>59</w:t>
+              <w:t>62</w:t>
             </w:r>
           </w:hyperlink>
         </w:p>
@@ -2135,7 +2240,7 @@
             </w:tabs>
             <w:rPr/>
           </w:pPr>
-          <w:hyperlink w:anchor="__RefHeading___Toc3217_1907633178">
+          <w:hyperlink w:anchor="__RefHeading___Toc3236_1968430665">
             <w:r>
               <w:rPr>
                 <w:webHidden/>
@@ -2143,7 +2248,7 @@
               </w:rPr>
               <w:t>Apêndice A.5 — Diagrama de Interação: Cadastro de Evento via IA</w:t>
               <w:tab/>
-              <w:t>60</w:t>
+              <w:t>63</w:t>
             </w:r>
           </w:hyperlink>
         </w:p>
@@ -2156,7 +2261,7 @@
             </w:tabs>
             <w:rPr/>
           </w:pPr>
-          <w:hyperlink w:anchor="__RefHeading___Toc3219_1907633178">
+          <w:hyperlink w:anchor="__RefHeading___Toc3238_1968430665">
             <w:r>
               <w:rPr>
                 <w:webHidden/>
@@ -2164,7 +2269,7 @@
               </w:rPr>
               <w:t>Apêndice A.6a — Diagrama de Interação: Emissão de Certificado</w:t>
               <w:tab/>
-              <w:t>61</w:t>
+              <w:t>64</w:t>
             </w:r>
           </w:hyperlink>
         </w:p>
@@ -2177,7 +2282,7 @@
             </w:tabs>
             <w:rPr/>
           </w:pPr>
-          <w:hyperlink w:anchor="__RefHeading___Toc3221_1907633178">
+          <w:hyperlink w:anchor="__RefHeading___Toc3240_1968430665">
             <w:r>
               <w:rPr>
                 <w:webHidden/>
@@ -2185,7 +2290,7 @@
               </w:rPr>
               <w:t>Apêndice A.6b — Diagrama de Interação: Download do Certificado</w:t>
               <w:tab/>
-              <w:t>62</w:t>
+              <w:t>65</w:t>
             </w:r>
           </w:hyperlink>
         </w:p>
@@ -2198,7 +2303,7 @@
             </w:tabs>
             <w:rPr/>
           </w:pPr>
-          <w:hyperlink w:anchor="__RefHeading___Toc3223_1907633178">
+          <w:hyperlink w:anchor="__RefHeading___Toc3242_1968430665">
             <w:r>
               <w:rPr>
                 <w:webHidden/>
@@ -2206,7 +2311,7 @@
               </w:rPr>
               <w:t>Apêndice A.7 — Diagrama de Componentes</w:t>
               <w:tab/>
-              <w:t>63</w:t>
+              <w:t>66</w:t>
             </w:r>
           </w:hyperlink>
         </w:p>
@@ -2219,7 +2324,7 @@
             </w:tabs>
             <w:rPr/>
           </w:pPr>
-          <w:hyperlink w:anchor="__RefHeading___Toc3225_1907633178">
+          <w:hyperlink w:anchor="__RefHeading___Toc3244_1968430665">
             <w:r>
               <w:rPr>
                 <w:webHidden/>
@@ -2227,7 +2332,7 @@
               </w:rPr>
               <w:t>APÊNDICE B — VARIÁVEIS DE AMBIENTE</w:t>
               <w:tab/>
-              <w:t>64</w:t>
+              <w:t>67</w:t>
             </w:r>
           </w:hyperlink>
         </w:p>
@@ -2240,7 +2345,7 @@
             </w:tabs>
             <w:rPr/>
           </w:pPr>
-          <w:hyperlink w:anchor="__RefHeading___Toc3227_1907633178">
+          <w:hyperlink w:anchor="__RefHeading___Toc3246_1968430665">
             <w:r>
               <w:rPr>
                 <w:webHidden/>
@@ -2248,7 +2353,7 @@
               </w:rPr>
               <w:t>APÊNDICE C — GLOSSÁRIO</w:t>
               <w:tab/>
-              <w:t>65</w:t>
+              <w:t>68</w:t>
             </w:r>
           </w:hyperlink>
           <w:r>
@@ -2281,7 +2386,7 @@
         <w:jc w:val="left"/>
         <w:rPr/>
       </w:pPr>
-      <w:bookmarkStart w:id="0" w:name="__RefHeading___Toc3059_1907633178"/>
+      <w:bookmarkStart w:id="0" w:name="__RefHeading___Toc3074_1968430665"/>
       <w:bookmarkEnd w:id="0"/>
       <w:r>
         <w:rPr>
@@ -2291,7 +2396,116 @@
           <w:sz w:val="24"/>
           <w:szCs w:val="24"/>
         </w:rPr>
-        <w:t>1 VISÃO GERAL DO PROJETO</w:t>
+        <w:t>1 INTRODUÇÃO</w:t>
+      </w:r>
+    </w:p>
+    <w:p>
+      <w:pPr>
+        <w:pStyle w:val="Normal"/>
+        <w:spacing w:lineRule="auto" w:line="360" w:before="0" w:after="120"/>
+        <w:ind w:firstLine="709"/>
+        <w:jc w:val="both"/>
+        <w:rPr/>
+      </w:pPr>
+      <w:r>
+        <w:rPr>
+          <w:rFonts w:eastAsia="Arial" w:cs="Arial"/>
+          <w:sz w:val="24"/>
+          <w:szCs w:val="24"/>
+        </w:rPr>
+        <w:t>A organização de eventos acadêmicos, como palestras, workshops e semanas temáticas, envolve etapas que vão da divulgação à certificação dos participantes. Em muitas instituições, essas etapas ainda são conduzidas de forma dispersa, com inscrições em formulários avulsos, listas de presença em papel ou em planilhas e certificados produzidos manualmente, o que consome o tempo dos organizadores e compromete a confiabilidade dos registros de participação.</w:t>
+      </w:r>
+    </w:p>
+    <w:p>
+      <w:pPr>
+        <w:pStyle w:val="Normal"/>
+        <w:spacing w:lineRule="auto" w:line="360" w:before="0" w:after="120"/>
+        <w:ind w:firstLine="709"/>
+        <w:jc w:val="both"/>
+        <w:rPr/>
+      </w:pPr>
+      <w:r>
+        <w:rPr>
+          <w:rFonts w:eastAsia="Arial" w:cs="Arial"/>
+          <w:sz w:val="24"/>
+          <w:szCs w:val="24"/>
+        </w:rPr>
+        <w:t>Diante desse cenário, o presente trabalho propõe o Gerenciador de Eventos Acadêmicos, uma aplicação web que reúne em uma única plataforma o cadastro e a publicação de eventos, a inscrição com controle de vagas e fila de espera, o registro de presença, a emissão de certificados com código de autenticidade e a coleta de avaliações. Para reduzir o esforço de cadastro, o sistema emprega inteligência artificial na extração dos dados do evento a partir de um texto livre, mantendo o organizador como responsável pela revisão final.</w:t>
+      </w:r>
+    </w:p>
+    <w:p>
+      <w:pPr>
+        <w:pStyle w:val="Normal"/>
+        <w:spacing w:lineRule="auto" w:line="360" w:before="0" w:after="120"/>
+        <w:ind w:firstLine="709"/>
+        <w:jc w:val="both"/>
+        <w:rPr/>
+      </w:pPr>
+      <w:r>
+        <w:rPr>
+          <w:rFonts w:eastAsia="Arial" w:cs="Arial"/>
+          <w:sz w:val="24"/>
+          <w:szCs w:val="24"/>
+        </w:rPr>
+        <w:t>O objetivo geral é desenvolver uma aplicação web para a gestão completa de eventos acadêmicos, desdobrado nos objetivos específicos da seção 2.2. Justificam o projeto a centralização das informações do evento, a rastreabilidade da participação, que passa a depender de um registro de presença, e a possibilidade de qualquer pessoa conferir a autenticidade de um certificado emitido.</w:t>
+      </w:r>
+    </w:p>
+    <w:p>
+      <w:pPr>
+        <w:pStyle w:val="Normal"/>
+        <w:spacing w:lineRule="auto" w:line="360" w:before="0" w:after="120"/>
+        <w:ind w:firstLine="709"/>
+        <w:jc w:val="both"/>
+        <w:rPr/>
+      </w:pPr>
+      <w:r>
+        <w:rPr>
+          <w:rFonts w:eastAsia="Arial" w:cs="Arial"/>
+          <w:sz w:val="24"/>
+          <w:szCs w:val="24"/>
+        </w:rPr>
+        <w:t>O desenvolvimento seguiu uma especificação técnica com regras de negócio numeradas, rastreáveis até o código-fonte e os testes automatizados, e foi organizado nas etapas sucessivas apresentadas no cronograma da seção 6.</w:t>
+      </w:r>
+    </w:p>
+    <w:p>
+      <w:pPr>
+        <w:pStyle w:val="Normal"/>
+        <w:spacing w:lineRule="auto" w:line="360" w:before="0" w:after="120"/>
+        <w:ind w:firstLine="709"/>
+        <w:jc w:val="both"/>
+        <w:rPr/>
+      </w:pPr>
+      <w:r>
+        <w:rPr>
+          <w:rFonts w:eastAsia="Arial" w:cs="Arial"/>
+          <w:sz w:val="24"/>
+          <w:szCs w:val="24"/>
+        </w:rPr>
+        <w:t>Este documento está organizado da seguinte forma: a seção 2 apresenta a visão geral do projeto, com objetivos, escopo e regras de negócio; as seções 3 a 8 tratam da arquitetura, da especificação técnica, dos protótipos, do planejamento, do modelo de domínio e do modelo de dados; as seções 9 a 11 descrevem o ambiente de desenvolvimento, os serviços externos, a inteligência artificial, a segurança e a instalação; as seções 12 a 17 abordam as convenções de desenvolvimento, a interface de programação, a estratégia de testes, a implantação, o desempenho e a solução de problemas; e a seção 18 apresenta a conclusão. Os diagramas de modelagem, as variáveis de ambiente e o glossário encontram-se nos apêndices.</w:t>
+      </w:r>
+      <w:r>
+        <w:br w:type="page"/>
+      </w:r>
+    </w:p>
+    <w:p>
+      <w:pPr>
+        <w:pStyle w:val="Heading1"/>
+        <w:keepNext w:val="true"/>
+        <w:spacing w:lineRule="auto" w:line="360" w:before="0" w:after="360"/>
+        <w:jc w:val="left"/>
+        <w:rPr/>
+      </w:pPr>
+      <w:bookmarkStart w:id="1" w:name="__RefHeading___Toc3076_1968430665"/>
+      <w:bookmarkEnd w:id="1"/>
+      <w:r>
+        <w:rPr>
+          <w:rFonts w:eastAsia="Arial" w:cs="Arial" w:ascii="Arial" w:hAnsi="Arial"/>
+          <w:b/>
+          <w:bCs/>
+          <w:sz w:val="24"/>
+          <w:szCs w:val="24"/>
+        </w:rPr>
+        <w:t>2 VISÃO GERAL DO PROJETO</w:t>
       </w:r>
     </w:p>
     <w:p>
@@ -2302,15 +2516,15 @@
         <w:jc w:val="left"/>
         <w:rPr/>
       </w:pPr>
-      <w:bookmarkStart w:id="1" w:name="__RefHeading___Toc3061_1907633178"/>
-      <w:bookmarkEnd w:id="1"/>
+      <w:bookmarkStart w:id="2" w:name="__RefHeading___Toc3078_1968430665"/>
+      <w:bookmarkEnd w:id="2"/>
       <w:r>
         <w:rPr>
           <w:rFonts w:eastAsia="Arial" w:cs="Arial" w:ascii="Arial" w:hAnsi="Arial"/>
           <w:sz w:val="24"/>
           <w:szCs w:val="24"/>
         </w:rPr>
-        <w:t>1.1 DESCRIÇÃO EXECUTIVA</w:t>
+        <w:t>2.1 DESCRIÇÃO EXECUTIVA</w:t>
       </w:r>
     </w:p>
     <w:p>
@@ -2405,15 +2619,15 @@
         <w:jc w:val="left"/>
         <w:rPr/>
       </w:pPr>
-      <w:bookmarkStart w:id="2" w:name="__RefHeading___Toc3063_1907633178"/>
-      <w:bookmarkEnd w:id="2"/>
+      <w:bookmarkStart w:id="3" w:name="__RefHeading___Toc3080_1968430665"/>
+      <w:bookmarkEnd w:id="3"/>
       <w:r>
         <w:rPr>
           <w:rFonts w:eastAsia="Arial" w:cs="Arial" w:ascii="Arial" w:hAnsi="Arial"/>
           <w:sz w:val="24"/>
           <w:szCs w:val="24"/>
         </w:rPr>
-        <w:t>1.2 OBJETIVOS E ESCOPO</w:t>
+        <w:t>2.2 OBJETIVOS E ESCOPO</w:t>
       </w:r>
     </w:p>
     <w:p>
@@ -2424,8 +2638,8 @@
         <w:jc w:val="left"/>
         <w:rPr/>
       </w:pPr>
-      <w:bookmarkStart w:id="3" w:name="__RefHeading___Toc3065_1907633178"/>
-      <w:bookmarkEnd w:id="3"/>
+      <w:bookmarkStart w:id="4" w:name="__RefHeading___Toc3082_1968430665"/>
+      <w:bookmarkEnd w:id="4"/>
       <w:r>
         <w:rPr>
           <w:rFonts w:eastAsia="Arial" w:cs="Arial" w:ascii="Arial" w:hAnsi="Arial"/>
@@ -2434,7 +2648,7 @@
           <w:sz w:val="24"/>
           <w:szCs w:val="24"/>
         </w:rPr>
-        <w:t>1.2.1 Objetivo Geral</w:t>
+        <w:t>2.2.1 Objetivo Geral</w:t>
       </w:r>
     </w:p>
     <w:p>
@@ -2466,8 +2680,8 @@
         <w:jc w:val="left"/>
         <w:rPr/>
       </w:pPr>
-      <w:bookmarkStart w:id="4" w:name="__RefHeading___Toc3067_1907633178"/>
-      <w:bookmarkEnd w:id="4"/>
+      <w:bookmarkStart w:id="5" w:name="__RefHeading___Toc3084_1968430665"/>
+      <w:bookmarkEnd w:id="5"/>
       <w:r>
         <w:rPr>
           <w:rFonts w:eastAsia="Arial" w:cs="Arial" w:ascii="Arial" w:hAnsi="Arial"/>
@@ -2476,7 +2690,7 @@
           <w:sz w:val="24"/>
           <w:szCs w:val="24"/>
         </w:rPr>
-        <w:t>1.2.2 Objetivos Específicos</w:t>
+        <w:t>2.2.2 Objetivos Específicos</w:t>
       </w:r>
     </w:p>
     <w:p>
@@ -2606,8 +2820,8 @@
         <w:jc w:val="left"/>
         <w:rPr/>
       </w:pPr>
-      <w:bookmarkStart w:id="5" w:name="__RefHeading___Toc3069_1907633178"/>
-      <w:bookmarkEnd w:id="5"/>
+      <w:bookmarkStart w:id="6" w:name="__RefHeading___Toc3086_1968430665"/>
+      <w:bookmarkEnd w:id="6"/>
       <w:r>
         <w:rPr>
           <w:rFonts w:eastAsia="Arial" w:cs="Arial" w:ascii="Arial" w:hAnsi="Arial"/>
@@ -2616,7 +2830,7 @@
           <w:sz w:val="24"/>
           <w:szCs w:val="24"/>
         </w:rPr>
-        <w:t>1.2.3 Escopo do Projeto</w:t>
+        <w:t>2.2.3 Escopo do Projeto</w:t>
       </w:r>
     </w:p>
     <w:p>
@@ -2669,8 +2883,8 @@
         <w:jc w:val="left"/>
         <w:rPr/>
       </w:pPr>
-      <w:bookmarkStart w:id="6" w:name="__RefHeading___Toc3071_1907633178"/>
-      <w:bookmarkEnd w:id="6"/>
+      <w:bookmarkStart w:id="7" w:name="__RefHeading___Toc3088_1968430665"/>
+      <w:bookmarkEnd w:id="7"/>
       <w:r>
         <w:rPr>
           <w:rFonts w:eastAsia="Arial" w:cs="Arial" w:ascii="Arial" w:hAnsi="Arial"/>
@@ -2679,7 +2893,7 @@
           <w:sz w:val="24"/>
           <w:szCs w:val="24"/>
         </w:rPr>
-        <w:t>1.2.4 Limitações de Escopo</w:t>
+        <w:t>2.2.4 Limitações de Escopo</w:t>
       </w:r>
     </w:p>
     <w:p>
@@ -2796,15 +3010,15 @@
         <w:jc w:val="left"/>
         <w:rPr/>
       </w:pPr>
-      <w:bookmarkStart w:id="7" w:name="__RefHeading___Toc3073_1907633178"/>
-      <w:bookmarkEnd w:id="7"/>
+      <w:bookmarkStart w:id="8" w:name="__RefHeading___Toc3090_1968430665"/>
+      <w:bookmarkEnd w:id="8"/>
       <w:r>
         <w:rPr>
           <w:rFonts w:eastAsia="Arial" w:cs="Arial" w:ascii="Arial" w:hAnsi="Arial"/>
           <w:sz w:val="24"/>
           <w:szCs w:val="24"/>
         </w:rPr>
-        <w:t>1.3 REGRAS DE NEGÓCIO</w:t>
+        <w:t>2.3 REGRAS DE NEGÓCIO</w:t>
       </w:r>
     </w:p>
     <w:p>
@@ -3026,8 +3240,8 @@
         <w:jc w:val="left"/>
         <w:rPr/>
       </w:pPr>
-      <w:bookmarkStart w:id="8" w:name="__RefHeading___Toc3075_1907633178"/>
-      <w:bookmarkEnd w:id="8"/>
+      <w:bookmarkStart w:id="9" w:name="__RefHeading___Toc3092_1968430665"/>
+      <w:bookmarkEnd w:id="9"/>
       <w:r>
         <w:rPr>
           <w:rFonts w:eastAsia="Arial" w:cs="Arial" w:ascii="Arial" w:hAnsi="Arial"/>
@@ -3036,7 +3250,7 @@
           <w:sz w:val="24"/>
           <w:szCs w:val="24"/>
         </w:rPr>
-        <w:t>2 ARQUITETURA DO SISTEMA</w:t>
+        <w:t>3 ARQUITETURA DO SISTEMA</w:t>
       </w:r>
     </w:p>
     <w:p>
@@ -3047,15 +3261,15 @@
         <w:jc w:val="left"/>
         <w:rPr/>
       </w:pPr>
-      <w:bookmarkStart w:id="9" w:name="__RefHeading___Toc3077_1907633178"/>
-      <w:bookmarkEnd w:id="9"/>
+      <w:bookmarkStart w:id="10" w:name="__RefHeading___Toc3094_1968430665"/>
+      <w:bookmarkEnd w:id="10"/>
       <w:r>
         <w:rPr>
           <w:rFonts w:eastAsia="Arial" w:cs="Arial" w:ascii="Arial" w:hAnsi="Arial"/>
           <w:sz w:val="24"/>
           <w:szCs w:val="24"/>
         </w:rPr>
-        <w:t>2.1 COMPONENTES PRINCIPAIS</w:t>
+        <w:t>3.1 COMPONENTES PRINCIPAIS</w:t>
       </w:r>
     </w:p>
     <w:p>
@@ -3129,15 +3343,15 @@
         <w:jc w:val="left"/>
         <w:rPr/>
       </w:pPr>
-      <w:bookmarkStart w:id="10" w:name="__RefHeading___Toc3079_1907633178"/>
-      <w:bookmarkEnd w:id="10"/>
+      <w:bookmarkStart w:id="11" w:name="__RefHeading___Toc3096_1968430665"/>
+      <w:bookmarkEnd w:id="11"/>
       <w:r>
         <w:rPr>
           <w:rFonts w:eastAsia="Arial" w:cs="Arial" w:ascii="Arial" w:hAnsi="Arial"/>
           <w:sz w:val="24"/>
           <w:szCs w:val="24"/>
         </w:rPr>
-        <w:t>2.2 DECISÕES ARQUITETURAIS (ADR)</w:t>
+        <w:t>3.2 DECISÕES ARQUITETURAIS (ADR)</w:t>
       </w:r>
     </w:p>
     <w:p>
@@ -3211,15 +3425,15 @@
         <w:jc w:val="left"/>
         <w:rPr/>
       </w:pPr>
-      <w:bookmarkStart w:id="11" w:name="__RefHeading___Toc3081_1907633178"/>
-      <w:bookmarkEnd w:id="11"/>
+      <w:bookmarkStart w:id="12" w:name="__RefHeading___Toc3098_1968430665"/>
+      <w:bookmarkEnd w:id="12"/>
       <w:r>
         <w:rPr>
           <w:rFonts w:eastAsia="Arial" w:cs="Arial" w:ascii="Arial" w:hAnsi="Arial"/>
           <w:sz w:val="24"/>
           <w:szCs w:val="24"/>
         </w:rPr>
-        <w:t>2.3 STACK TECNOLÓGICA</w:t>
+        <w:t>3.3 STACK TECNOLÓGICA</w:t>
       </w:r>
     </w:p>
     <w:p>
@@ -3275,8 +3489,8 @@
         <w:jc w:val="left"/>
         <w:rPr/>
       </w:pPr>
-      <w:bookmarkStart w:id="12" w:name="__RefHeading___Toc3083_1907633178"/>
-      <w:bookmarkEnd w:id="12"/>
+      <w:bookmarkStart w:id="13" w:name="__RefHeading___Toc3100_1968430665"/>
+      <w:bookmarkEnd w:id="13"/>
       <w:r>
         <w:rPr>
           <w:rFonts w:eastAsia="Arial" w:cs="Arial" w:ascii="Arial" w:hAnsi="Arial"/>
@@ -3285,7 +3499,7 @@
           <w:sz w:val="24"/>
           <w:szCs w:val="24"/>
         </w:rPr>
-        <w:t>3 ESPECIFICAÇÃO TÉCNICA</w:t>
+        <w:t>4 ESPECIFICAÇÃO TÉCNICA</w:t>
       </w:r>
     </w:p>
     <w:p>
@@ -3296,15 +3510,15 @@
         <w:jc w:val="left"/>
         <w:rPr/>
       </w:pPr>
-      <w:bookmarkStart w:id="13" w:name="__RefHeading___Toc3085_1907633178"/>
-      <w:bookmarkEnd w:id="13"/>
+      <w:bookmarkStart w:id="14" w:name="__RefHeading___Toc3102_1968430665"/>
+      <w:bookmarkEnd w:id="14"/>
       <w:r>
         <w:rPr>
           <w:rFonts w:eastAsia="Arial" w:cs="Arial" w:ascii="Arial" w:hAnsi="Arial"/>
           <w:sz w:val="24"/>
           <w:szCs w:val="24"/>
         </w:rPr>
-        <w:t>3.1 REQUISITOS FUNCIONAIS</w:t>
+        <w:t>4.1 REQUISITOS FUNCIONAIS</w:t>
       </w:r>
     </w:p>
     <w:p>
@@ -3485,15 +3699,15 @@
         <w:jc w:val="left"/>
         <w:rPr/>
       </w:pPr>
-      <w:bookmarkStart w:id="14" w:name="__RefHeading___Toc3087_1907633178"/>
-      <w:bookmarkEnd w:id="14"/>
+      <w:bookmarkStart w:id="15" w:name="__RefHeading___Toc3104_1968430665"/>
+      <w:bookmarkEnd w:id="15"/>
       <w:r>
         <w:rPr>
           <w:rFonts w:eastAsia="Arial" w:cs="Arial" w:ascii="Arial" w:hAnsi="Arial"/>
           <w:sz w:val="24"/>
           <w:szCs w:val="24"/>
         </w:rPr>
-        <w:t>3.2 REQUISITOS NÃO FUNCIONAIS</w:t>
+        <w:t>4.2 REQUISITOS NÃO FUNCIONAIS</w:t>
       </w:r>
     </w:p>
     <w:p>
@@ -3592,8 +3806,8 @@
         <w:jc w:val="left"/>
         <w:rPr/>
       </w:pPr>
-      <w:bookmarkStart w:id="15" w:name="__RefHeading___Toc3089_1907633178"/>
-      <w:bookmarkEnd w:id="15"/>
+      <w:bookmarkStart w:id="16" w:name="__RefHeading___Toc3106_1968430665"/>
+      <w:bookmarkEnd w:id="16"/>
       <w:r>
         <w:rPr>
           <w:rFonts w:eastAsia="Arial" w:cs="Arial" w:ascii="Arial" w:hAnsi="Arial"/>
@@ -3602,7 +3816,7 @@
           <w:sz w:val="24"/>
           <w:szCs w:val="24"/>
         </w:rPr>
-        <w:t>4 PROTÓTIPO DE BAIXA E ALTA FIDELIDADE</w:t>
+        <w:t>5 PROTÓTIPO DE BAIXA E ALTA FIDELIDADE</w:t>
       </w:r>
     </w:p>
     <w:p>
@@ -3634,15 +3848,15 @@
         <w:jc w:val="left"/>
         <w:rPr/>
       </w:pPr>
-      <w:bookmarkStart w:id="16" w:name="__RefHeading___Toc3091_1907633178"/>
-      <w:bookmarkEnd w:id="16"/>
+      <w:bookmarkStart w:id="17" w:name="__RefHeading___Toc3108_1968430665"/>
+      <w:bookmarkEnd w:id="17"/>
       <w:r>
         <w:rPr>
           <w:rFonts w:eastAsia="Arial" w:cs="Arial" w:ascii="Arial" w:hAnsi="Arial"/>
           <w:sz w:val="24"/>
           <w:szCs w:val="24"/>
         </w:rPr>
-        <w:t>4.1 PROTÓTIPO DE BAIXA FIDELIDADE</w:t>
+        <w:t>5.1 PROTÓTIPO DE BAIXA FIDELIDADE</w:t>
       </w:r>
     </w:p>
     <w:p>
@@ -3938,15 +4152,15 @@
         <w:jc w:val="left"/>
         <w:rPr/>
       </w:pPr>
-      <w:bookmarkStart w:id="17" w:name="__RefHeading___Toc3093_1907633178"/>
-      <w:bookmarkEnd w:id="17"/>
+      <w:bookmarkStart w:id="18" w:name="__RefHeading___Toc3110_1968430665"/>
+      <w:bookmarkEnd w:id="18"/>
       <w:r>
         <w:rPr>
           <w:rFonts w:eastAsia="Arial" w:cs="Arial" w:ascii="Arial" w:hAnsi="Arial"/>
           <w:sz w:val="24"/>
           <w:szCs w:val="24"/>
         </w:rPr>
-        <w:t>4.2 PROTÓTIPO DE ALTA FIDELIDADE</w:t>
+        <w:t>5.2 PROTÓTIPO DE ALTA FIDELIDADE</w:t>
       </w:r>
     </w:p>
     <w:p>
@@ -4245,8 +4459,8 @@
         <w:jc w:val="left"/>
         <w:rPr/>
       </w:pPr>
-      <w:bookmarkStart w:id="18" w:name="__RefHeading___Toc3095_1907633178"/>
-      <w:bookmarkEnd w:id="18"/>
+      <w:bookmarkStart w:id="19" w:name="__RefHeading___Toc3112_1968430665"/>
+      <w:bookmarkEnd w:id="19"/>
       <w:r>
         <w:rPr>
           <w:rFonts w:eastAsia="Arial" w:cs="Arial" w:ascii="Arial" w:hAnsi="Arial"/>
@@ -4255,7 +4469,7 @@
           <w:sz w:val="24"/>
           <w:szCs w:val="24"/>
         </w:rPr>
-        <w:t>5 MÉTRICAS E CRONOGRAMA</w:t>
+        <w:t>6 MÉTRICAS E CRONOGRAMA</w:t>
       </w:r>
     </w:p>
     <w:p>
@@ -4266,15 +4480,15 @@
         <w:jc w:val="left"/>
         <w:rPr/>
       </w:pPr>
-      <w:bookmarkStart w:id="19" w:name="__RefHeading___Toc3097_1907633178"/>
-      <w:bookmarkEnd w:id="19"/>
+      <w:bookmarkStart w:id="20" w:name="__RefHeading___Toc3114_1968430665"/>
+      <w:bookmarkEnd w:id="20"/>
       <w:r>
         <w:rPr>
           <w:rFonts w:eastAsia="Arial" w:cs="Arial" w:ascii="Arial" w:hAnsi="Arial"/>
           <w:sz w:val="24"/>
           <w:szCs w:val="24"/>
         </w:rPr>
-        <w:t>5.1 CRONOGRAMA</w:t>
+        <w:t>6.1 CRONOGRAMA</w:t>
       </w:r>
     </w:p>
     <w:p>
@@ -5445,15 +5659,15 @@
         <w:jc w:val="left"/>
         <w:rPr/>
       </w:pPr>
-      <w:bookmarkStart w:id="20" w:name="__RefHeading___Toc3099_1907633178"/>
-      <w:bookmarkEnd w:id="20"/>
+      <w:bookmarkStart w:id="21" w:name="__RefHeading___Toc3116_1968430665"/>
+      <w:bookmarkEnd w:id="21"/>
       <w:r>
         <w:rPr>
           <w:rFonts w:eastAsia="Arial" w:cs="Arial" w:ascii="Arial" w:hAnsi="Arial"/>
           <w:sz w:val="24"/>
           <w:szCs w:val="24"/>
         </w:rPr>
-        <w:t>5.2 MÉTRICAS DE ACOMPANHAMENTO</w:t>
+        <w:t>6.2 MÉTRICAS DE ACOMPANHAMENTO</w:t>
       </w:r>
     </w:p>
     <w:p>
@@ -6163,8 +6377,8 @@
         <w:jc w:val="left"/>
         <w:rPr/>
       </w:pPr>
-      <w:bookmarkStart w:id="21" w:name="__RefHeading___Toc3101_1907633178"/>
-      <w:bookmarkEnd w:id="21"/>
+      <w:bookmarkStart w:id="22" w:name="__RefHeading___Toc3118_1968430665"/>
+      <w:bookmarkEnd w:id="22"/>
       <w:r>
         <w:rPr>
           <w:rFonts w:eastAsia="Arial" w:cs="Arial" w:ascii="Arial" w:hAnsi="Arial"/>
@@ -6173,7 +6387,7 @@
           <w:sz w:val="24"/>
           <w:szCs w:val="24"/>
         </w:rPr>
-        <w:t>6 MODELO DO DOMÍNIO</w:t>
+        <w:t>7 MODELO DO DOMÍNIO</w:t>
       </w:r>
     </w:p>
     <w:p>
@@ -6184,15 +6398,15 @@
         <w:jc w:val="left"/>
         <w:rPr/>
       </w:pPr>
-      <w:bookmarkStart w:id="22" w:name="__RefHeading___Toc3103_1907633178"/>
-      <w:bookmarkEnd w:id="22"/>
+      <w:bookmarkStart w:id="23" w:name="__RefHeading___Toc3120_1968430665"/>
+      <w:bookmarkEnd w:id="23"/>
       <w:r>
         <w:rPr>
           <w:rFonts w:eastAsia="Arial" w:cs="Arial" w:ascii="Arial" w:hAnsi="Arial"/>
           <w:sz w:val="24"/>
           <w:szCs w:val="24"/>
         </w:rPr>
-        <w:t>6.1 VISÃO CONCEITUAL DAS ENTIDADES</w:t>
+        <w:t>7.1 VISÃO CONCEITUAL DAS ENTIDADES</w:t>
       </w:r>
     </w:p>
     <w:p>
@@ -6308,15 +6522,15 @@
         <w:jc w:val="left"/>
         <w:rPr/>
       </w:pPr>
-      <w:bookmarkStart w:id="23" w:name="__RefHeading___Toc3105_1907633178"/>
-      <w:bookmarkEnd w:id="23"/>
+      <w:bookmarkStart w:id="24" w:name="__RefHeading___Toc3122_1968430665"/>
+      <w:bookmarkEnd w:id="24"/>
       <w:r>
         <w:rPr>
           <w:rFonts w:eastAsia="Arial" w:cs="Arial" w:ascii="Arial" w:hAnsi="Arial"/>
           <w:sz w:val="24"/>
           <w:szCs w:val="24"/>
         </w:rPr>
-        <w:t>6.2 DIAGRAMAS DE MODELAGEM</w:t>
+        <w:t>7.2 DIAGRAMAS DE MODELAGEM</w:t>
       </w:r>
     </w:p>
     <w:p>
@@ -7026,8 +7240,8 @@
         <w:jc w:val="left"/>
         <w:rPr/>
       </w:pPr>
-      <w:bookmarkStart w:id="24" w:name="__RefHeading___Toc3107_1907633178"/>
-      <w:bookmarkEnd w:id="24"/>
+      <w:bookmarkStart w:id="25" w:name="__RefHeading___Toc3124_1968430665"/>
+      <w:bookmarkEnd w:id="25"/>
       <w:r>
         <w:rPr>
           <w:rFonts w:eastAsia="Arial" w:cs="Arial" w:ascii="Arial" w:hAnsi="Arial"/>
@@ -7036,7 +7250,7 @@
           <w:sz w:val="24"/>
           <w:szCs w:val="24"/>
         </w:rPr>
-        <w:t>7 MODELO DE DADOS</w:t>
+        <w:t>8 MODELO DE DADOS</w:t>
       </w:r>
     </w:p>
     <w:p>
@@ -7047,15 +7261,15 @@
         <w:jc w:val="left"/>
         <w:rPr/>
       </w:pPr>
-      <w:bookmarkStart w:id="25" w:name="__RefHeading___Toc3109_1907633178"/>
-      <w:bookmarkEnd w:id="25"/>
+      <w:bookmarkStart w:id="26" w:name="__RefHeading___Toc3126_1968430665"/>
+      <w:bookmarkEnd w:id="26"/>
       <w:r>
         <w:rPr>
           <w:rFonts w:eastAsia="Arial" w:cs="Arial" w:ascii="Arial" w:hAnsi="Arial"/>
           <w:sz w:val="24"/>
           <w:szCs w:val="24"/>
         </w:rPr>
-        <w:t>7.1 MODELO LÓGICO DA BASE DE DADOS</w:t>
+        <w:t>8.1 MODELO LÓGICO DA BASE DE DADOS</w:t>
       </w:r>
     </w:p>
     <w:p>
@@ -8485,15 +8699,15 @@
         <w:jc w:val="left"/>
         <w:rPr/>
       </w:pPr>
-      <w:bookmarkStart w:id="26" w:name="__RefHeading___Toc3111_1907633178"/>
-      <w:bookmarkEnd w:id="26"/>
+      <w:bookmarkStart w:id="27" w:name="__RefHeading___Toc3128_1968430665"/>
+      <w:bookmarkEnd w:id="27"/>
       <w:r>
         <w:rPr>
           <w:rFonts w:eastAsia="Arial" w:cs="Arial" w:ascii="Arial" w:hAnsi="Arial"/>
           <w:sz w:val="24"/>
           <w:szCs w:val="24"/>
         </w:rPr>
-        <w:t>7.2 CRIAÇÃO FÍSICA DO MODELO DE DADOS</w:t>
+        <w:t>8.2 CRIAÇÃO FÍSICA DO MODELO DE DADOS</w:t>
       </w:r>
     </w:p>
     <w:p>
@@ -10636,15 +10850,15 @@
         <w:jc w:val="left"/>
         <w:rPr/>
       </w:pPr>
-      <w:bookmarkStart w:id="27" w:name="__RefHeading___Toc3113_1907633178"/>
-      <w:bookmarkEnd w:id="27"/>
+      <w:bookmarkStart w:id="28" w:name="__RefHeading___Toc3130_1968430665"/>
+      <w:bookmarkEnd w:id="28"/>
       <w:r>
         <w:rPr>
           <w:rFonts w:eastAsia="Arial" w:cs="Arial" w:ascii="Arial" w:hAnsi="Arial"/>
           <w:sz w:val="24"/>
           <w:szCs w:val="24"/>
         </w:rPr>
-        <w:t>7.3 DICIONÁRIO DE DADOS</w:t>
+        <w:t>8.3 DICIONÁRIO DE DADOS</w:t>
       </w:r>
     </w:p>
     <w:p>
@@ -10676,8 +10890,8 @@
         <w:jc w:val="left"/>
         <w:rPr/>
       </w:pPr>
-      <w:bookmarkStart w:id="28" w:name="__RefHeading___Toc3115_1907633178"/>
-      <w:bookmarkEnd w:id="28"/>
+      <w:bookmarkStart w:id="29" w:name="__RefHeading___Toc3132_1968430665"/>
+      <w:bookmarkEnd w:id="29"/>
       <w:r>
         <w:rPr>
           <w:rFonts w:eastAsia="Arial" w:cs="Arial" w:ascii="Arial" w:hAnsi="Arial"/>
@@ -10686,7 +10900,7 @@
           <w:sz w:val="24"/>
           <w:szCs w:val="24"/>
         </w:rPr>
-        <w:t>7.3.1 Tabela USUARIO</w:t>
+        <w:t>8.3.1 Tabela USUARIO</w:t>
       </w:r>
     </w:p>
     <w:tbl>
@@ -11437,8 +11651,8 @@
         <w:jc w:val="left"/>
         <w:rPr/>
       </w:pPr>
-      <w:bookmarkStart w:id="29" w:name="__RefHeading___Toc3117_1907633178"/>
-      <w:bookmarkEnd w:id="29"/>
+      <w:bookmarkStart w:id="30" w:name="__RefHeading___Toc3134_1968430665"/>
+      <w:bookmarkEnd w:id="30"/>
       <w:r>
         <w:rPr>
           <w:rFonts w:eastAsia="Arial" w:cs="Arial" w:ascii="Arial" w:hAnsi="Arial"/>
@@ -11447,7 +11661,7 @@
           <w:sz w:val="24"/>
           <w:szCs w:val="24"/>
         </w:rPr>
-        <w:t>7.3.2 Tabela USUARIO_PAPEL</w:t>
+        <w:t>8.3.2 Tabela USUARIO_PAPEL</w:t>
       </w:r>
     </w:p>
     <w:tbl>
@@ -11960,8 +12174,8 @@
         <w:jc w:val="left"/>
         <w:rPr/>
       </w:pPr>
-      <w:bookmarkStart w:id="30" w:name="__RefHeading___Toc3119_1907633178"/>
-      <w:bookmarkEnd w:id="30"/>
+      <w:bookmarkStart w:id="31" w:name="__RefHeading___Toc3136_1968430665"/>
+      <w:bookmarkEnd w:id="31"/>
       <w:r>
         <w:rPr>
           <w:rFonts w:eastAsia="Arial" w:cs="Arial" w:ascii="Arial" w:hAnsi="Arial"/>
@@ -11970,7 +12184,7 @@
           <w:sz w:val="24"/>
           <w:szCs w:val="24"/>
         </w:rPr>
-        <w:t>7.3.3 Tabela EVENTO</w:t>
+        <w:t>8.3.3 Tabela EVENTO</w:t>
       </w:r>
     </w:p>
     <w:tbl>
@@ -13554,8 +13768,8 @@
         <w:jc w:val="left"/>
         <w:rPr/>
       </w:pPr>
-      <w:bookmarkStart w:id="31" w:name="__RefHeading___Toc3121_1907633178"/>
-      <w:bookmarkEnd w:id="31"/>
+      <w:bookmarkStart w:id="32" w:name="__RefHeading___Toc3138_1968430665"/>
+      <w:bookmarkEnd w:id="32"/>
       <w:r>
         <w:rPr>
           <w:rFonts w:eastAsia="Arial" w:cs="Arial" w:ascii="Arial" w:hAnsi="Arial"/>
@@ -13564,7 +13778,7 @@
           <w:sz w:val="24"/>
           <w:szCs w:val="24"/>
         </w:rPr>
-        <w:t>7.3.4 Tabela EVENTO_FOTO</w:t>
+        <w:t>8.3.4 Tabela EVENTO_FOTO</w:t>
       </w:r>
     </w:p>
     <w:tbl>
@@ -14196,8 +14410,8 @@
         <w:jc w:val="left"/>
         <w:rPr/>
       </w:pPr>
-      <w:bookmarkStart w:id="32" w:name="__RefHeading___Toc3123_1907633178"/>
-      <w:bookmarkEnd w:id="32"/>
+      <w:bookmarkStart w:id="33" w:name="__RefHeading___Toc3140_1968430665"/>
+      <w:bookmarkEnd w:id="33"/>
       <w:r>
         <w:rPr>
           <w:rFonts w:eastAsia="Arial" w:cs="Arial" w:ascii="Arial" w:hAnsi="Arial"/>
@@ -14206,7 +14420,7 @@
           <w:sz w:val="24"/>
           <w:szCs w:val="24"/>
         </w:rPr>
-        <w:t>7.3.5 Tabela INSCRICAO</w:t>
+        <w:t>8.3.5 Tabela INSCRICAO</w:t>
       </w:r>
     </w:p>
     <w:tbl>
@@ -15076,8 +15290,8 @@
         <w:jc w:val="left"/>
         <w:rPr/>
       </w:pPr>
-      <w:bookmarkStart w:id="33" w:name="__RefHeading___Toc3125_1907633178"/>
-      <w:bookmarkEnd w:id="33"/>
+      <w:bookmarkStart w:id="34" w:name="__RefHeading___Toc3142_1968430665"/>
+      <w:bookmarkEnd w:id="34"/>
       <w:r>
         <w:rPr>
           <w:rFonts w:eastAsia="Arial" w:cs="Arial" w:ascii="Arial" w:hAnsi="Arial"/>
@@ -15086,7 +15300,7 @@
           <w:sz w:val="24"/>
           <w:szCs w:val="24"/>
         </w:rPr>
-        <w:t>7.3.6 Tabela PRESENCA</w:t>
+        <w:t>8.3.6 Tabela PRESENCA</w:t>
       </w:r>
     </w:p>
     <w:tbl>
@@ -15718,8 +15932,8 @@
         <w:jc w:val="left"/>
         <w:rPr/>
       </w:pPr>
-      <w:bookmarkStart w:id="34" w:name="__RefHeading___Toc3127_1907633178"/>
-      <w:bookmarkEnd w:id="34"/>
+      <w:bookmarkStart w:id="35" w:name="__RefHeading___Toc3144_1968430665"/>
+      <w:bookmarkEnd w:id="35"/>
       <w:r>
         <w:rPr>
           <w:rFonts w:eastAsia="Arial" w:cs="Arial" w:ascii="Arial" w:hAnsi="Arial"/>
@@ -15728,7 +15942,7 @@
           <w:sz w:val="24"/>
           <w:szCs w:val="24"/>
         </w:rPr>
-        <w:t>7.3.7 Tabela CERTIFICADO</w:t>
+        <w:t>8.3.7 Tabela CERTIFICADO</w:t>
       </w:r>
     </w:p>
     <w:tbl>
@@ -16479,8 +16693,8 @@
         <w:jc w:val="left"/>
         <w:rPr/>
       </w:pPr>
-      <w:bookmarkStart w:id="35" w:name="__RefHeading___Toc3129_1907633178"/>
-      <w:bookmarkEnd w:id="35"/>
+      <w:bookmarkStart w:id="36" w:name="__RefHeading___Toc3146_1968430665"/>
+      <w:bookmarkEnd w:id="36"/>
       <w:r>
         <w:rPr>
           <w:rFonts w:eastAsia="Arial" w:cs="Arial" w:ascii="Arial" w:hAnsi="Arial"/>
@@ -16489,7 +16703,7 @@
           <w:sz w:val="24"/>
           <w:szCs w:val="24"/>
         </w:rPr>
-        <w:t>7.3.8 Tabela AVALIACAO</w:t>
+        <w:t>8.3.8 Tabela AVALIACAO</w:t>
       </w:r>
     </w:p>
     <w:tbl>
@@ -17240,8 +17454,8 @@
         <w:jc w:val="left"/>
         <w:rPr/>
       </w:pPr>
-      <w:bookmarkStart w:id="36" w:name="__RefHeading___Toc3131_1907633178"/>
-      <w:bookmarkEnd w:id="36"/>
+      <w:bookmarkStart w:id="37" w:name="__RefHeading___Toc3148_1968430665"/>
+      <w:bookmarkEnd w:id="37"/>
       <w:r>
         <w:rPr>
           <w:rFonts w:eastAsia="Arial" w:cs="Arial" w:ascii="Arial" w:hAnsi="Arial"/>
@@ -17250,7 +17464,7 @@
           <w:sz w:val="24"/>
           <w:szCs w:val="24"/>
         </w:rPr>
-        <w:t>7.3.9 Tabela RESUMO_AVALIACAO</w:t>
+        <w:t>8.3.9 Tabela RESUMO_AVALIACAO</w:t>
       </w:r>
     </w:p>
     <w:tbl>
@@ -18120,8 +18334,8 @@
         <w:jc w:val="left"/>
         <w:rPr/>
       </w:pPr>
-      <w:bookmarkStart w:id="37" w:name="__RefHeading___Toc3133_1907633178"/>
-      <w:bookmarkEnd w:id="37"/>
+      <w:bookmarkStart w:id="38" w:name="__RefHeading___Toc3150_1968430665"/>
+      <w:bookmarkEnd w:id="38"/>
       <w:r>
         <w:rPr>
           <w:rFonts w:eastAsia="Arial" w:cs="Arial" w:ascii="Arial" w:hAnsi="Arial"/>
@@ -18130,7 +18344,7 @@
           <w:sz w:val="24"/>
           <w:szCs w:val="24"/>
         </w:rPr>
-        <w:t>7.3.10 Tabela INTERACAO_IA</w:t>
+        <w:t>8.3.10 Tabela INTERACAO_IA</w:t>
       </w:r>
     </w:p>
     <w:tbl>
@@ -19122,8 +19336,8 @@
       <w:r>
         <w:br w:type="page"/>
       </w:r>
-      <w:bookmarkStart w:id="38" w:name="__RefHeading___Toc3135_1907633178"/>
-      <w:bookmarkEnd w:id="38"/>
+      <w:bookmarkStart w:id="39" w:name="__RefHeading___Toc3152_1968430665"/>
+      <w:bookmarkEnd w:id="39"/>
       <w:r>
         <w:rPr>
           <w:rFonts w:eastAsia="Arial" w:cs="Arial" w:ascii="Arial" w:hAnsi="Arial"/>
@@ -19132,7 +19346,7 @@
           <w:sz w:val="24"/>
           <w:szCs w:val="24"/>
         </w:rPr>
-        <w:t>8 AMBIENTE DE DESENVOLVIMENTO</w:t>
+        <w:t>9 AMBIENTE DE DESENVOLVIMENTO</w:t>
       </w:r>
     </w:p>
     <w:p>
@@ -20043,8 +20257,8 @@
         <w:jc w:val="left"/>
         <w:rPr/>
       </w:pPr>
-      <w:bookmarkStart w:id="39" w:name="__RefHeading___Toc3137_1907633178"/>
-      <w:bookmarkEnd w:id="39"/>
+      <w:bookmarkStart w:id="40" w:name="__RefHeading___Toc3154_1968430665"/>
+      <w:bookmarkEnd w:id="40"/>
       <w:r>
         <w:rPr>
           <w:rFonts w:eastAsia="Arial" w:cs="Arial" w:ascii="Arial" w:hAnsi="Arial"/>
@@ -20053,7 +20267,7 @@
           <w:sz w:val="24"/>
           <w:szCs w:val="24"/>
         </w:rPr>
-        <w:t>9 SISTEMAS E COMPONENTES EXTERNOS UTILIZADOS</w:t>
+        <w:t>10 SISTEMAS E COMPONENTES EXTERNOS UTILIZADOS</w:t>
       </w:r>
     </w:p>
     <w:p>
@@ -21441,15 +21655,15 @@
         <w:jc w:val="left"/>
         <w:rPr/>
       </w:pPr>
-      <w:bookmarkStart w:id="40" w:name="__RefHeading___Toc3139_1907633178"/>
-      <w:bookmarkEnd w:id="40"/>
+      <w:bookmarkStart w:id="41" w:name="__RefHeading___Toc3156_1968430665"/>
+      <w:bookmarkEnd w:id="41"/>
       <w:r>
         <w:rPr>
           <w:rFonts w:eastAsia="Arial" w:cs="Arial" w:ascii="Arial" w:hAnsi="Arial"/>
           <w:sz w:val="24"/>
           <w:szCs w:val="24"/>
         </w:rPr>
-        <w:t>9.1 TECNOLOGIA EMERGENTE E SUA UTILIZAÇÃO</w:t>
+        <w:t>10.1 TECNOLOGIA EMERGENTE E SUA UTILIZAÇÃO</w:t>
       </w:r>
     </w:p>
     <w:p>
@@ -21544,15 +21758,15 @@
         <w:jc w:val="left"/>
         <w:rPr/>
       </w:pPr>
-      <w:bookmarkStart w:id="41" w:name="__RefHeading___Toc3141_1907633178"/>
-      <w:bookmarkEnd w:id="41"/>
+      <w:bookmarkStart w:id="42" w:name="__RefHeading___Toc3158_1968430665"/>
+      <w:bookmarkEnd w:id="42"/>
       <w:r>
         <w:rPr>
           <w:rFonts w:eastAsia="Arial" w:cs="Arial" w:ascii="Arial" w:hAnsi="Arial"/>
           <w:sz w:val="24"/>
           <w:szCs w:val="24"/>
         </w:rPr>
-        <w:t>9.2 SEGURANÇA DE DADOS</w:t>
+        <w:t>10.2 SEGURANÇA DE DADOS</w:t>
       </w:r>
     </w:p>
     <w:p>
@@ -21671,8 +21885,8 @@
         <w:jc w:val="left"/>
         <w:rPr/>
       </w:pPr>
-      <w:bookmarkStart w:id="42" w:name="__RefHeading___Toc3143_1907633178"/>
-      <w:bookmarkEnd w:id="42"/>
+      <w:bookmarkStart w:id="43" w:name="__RefHeading___Toc3160_1968430665"/>
+      <w:bookmarkEnd w:id="43"/>
       <w:r>
         <w:rPr>
           <w:rFonts w:eastAsia="Arial" w:cs="Arial" w:ascii="Arial" w:hAnsi="Arial"/>
@@ -21681,7 +21895,7 @@
           <w:sz w:val="24"/>
           <w:szCs w:val="24"/>
         </w:rPr>
-        <w:t>10 INSTALAÇÃO E CONFIGURAÇÃO</w:t>
+        <w:t>11 INSTALAÇÃO E CONFIGURAÇÃO</w:t>
       </w:r>
     </w:p>
     <w:p>
@@ -21692,15 +21906,15 @@
         <w:jc w:val="left"/>
         <w:rPr/>
       </w:pPr>
-      <w:bookmarkStart w:id="43" w:name="__RefHeading___Toc3145_1907633178"/>
-      <w:bookmarkEnd w:id="43"/>
+      <w:bookmarkStart w:id="44" w:name="__RefHeading___Toc3162_1968430665"/>
+      <w:bookmarkEnd w:id="44"/>
       <w:r>
         <w:rPr>
           <w:rFonts w:eastAsia="Arial" w:cs="Arial" w:ascii="Arial" w:hAnsi="Arial"/>
           <w:sz w:val="24"/>
           <w:szCs w:val="24"/>
         </w:rPr>
-        <w:t>10.1 PRÉ-REQUISITOS</w:t>
+        <w:t>11.1 PRÉ-REQUISITOS</w:t>
       </w:r>
     </w:p>
     <w:p>
@@ -21753,15 +21967,15 @@
         <w:jc w:val="left"/>
         <w:rPr/>
       </w:pPr>
-      <w:bookmarkStart w:id="44" w:name="__RefHeading___Toc3147_1907633178"/>
-      <w:bookmarkEnd w:id="44"/>
+      <w:bookmarkStart w:id="45" w:name="__RefHeading___Toc3164_1968430665"/>
+      <w:bookmarkEnd w:id="45"/>
       <w:r>
         <w:rPr>
           <w:rFonts w:eastAsia="Arial" w:cs="Arial" w:ascii="Arial" w:hAnsi="Arial"/>
           <w:sz w:val="24"/>
           <w:szCs w:val="24"/>
         </w:rPr>
-        <w:t>10.2 PASSOS DE INSTALAÇÃO</w:t>
+        <w:t>11.2 PASSOS DE INSTALAÇÃO</w:t>
       </w:r>
     </w:p>
     <w:p>
@@ -21782,7 +21996,7 @@
           <w:sz w:val="24"/>
           <w:szCs w:val="24"/>
         </w:rPr>
-        <w:t>A sequência abaixo descreve a instalação completa do ambiente local, partindo de uma máquina na qual estejam disponíveis os componentes relacionados na seção 8. Os comandos devem ser executados a partir da raiz do repositório.</w:t>
+        <w:t>A sequência abaixo descreve a instalação completa do ambiente local, partindo de uma máquina na qual estejam disponíveis os componentes relacionados na seção 9. Os comandos devem ser executados a partir da raiz do repositório.</w:t>
       </w:r>
     </w:p>
     <w:p>
@@ -21918,7 +22132,7 @@
           <w:sz w:val="24"/>
           <w:szCs w:val="24"/>
         </w:rPr>
-        <w:t>d) Executar a aplicação. As migrações do Flyway são aplicadas automaticamente na inicialização, criando todas as tabelas descritas na seção 7.2. Em ambiente Windows, o executável é invocado como .\mvnw.cmd spring-boot:run.</w:t>
+        <w:t>d) Executar a aplicação. As migrações do Flyway são aplicadas automaticamente na inicialização, criando todas as tabelas descritas na seção 8.2. Em ambiente Windows, o executável é invocado como .\mvnw.cmd spring-boot:run.</w:t>
       </w:r>
     </w:p>
     <w:p>
@@ -22058,7 +22272,7 @@
           <w:sz w:val="24"/>
           <w:szCs w:val="24"/>
         </w:rPr>
-        <w:t>Caso a inicialização seja interrompida com erro relativo às migrações, a causa mais frequente é a existência de uma base anterior com estrutura divergente. O procedimento de correção está descrito na seção 16.</w:t>
+        <w:t>Caso a inicialização seja interrompida com erro relativo às migrações, a causa mais frequente é a existência de uma base anterior com estrutura divergente. O procedimento de correção está descrito na seção 17.</w:t>
       </w:r>
       <w:r>
         <w:br w:type="page"/>
@@ -22072,8 +22286,8 @@
         <w:jc w:val="left"/>
         <w:rPr/>
       </w:pPr>
-      <w:bookmarkStart w:id="45" w:name="__RefHeading___Toc3149_1907633178"/>
-      <w:bookmarkEnd w:id="45"/>
+      <w:bookmarkStart w:id="46" w:name="__RefHeading___Toc3166_1968430665"/>
+      <w:bookmarkEnd w:id="46"/>
       <w:r>
         <w:rPr>
           <w:rFonts w:eastAsia="Arial" w:cs="Arial" w:ascii="Arial" w:hAnsi="Arial"/>
@@ -22082,7 +22296,7 @@
           <w:sz w:val="24"/>
           <w:szCs w:val="24"/>
         </w:rPr>
-        <w:t>11 DESENVOLVIMENTO</w:t>
+        <w:t>12 DESENVOLVIMENTO</w:t>
       </w:r>
     </w:p>
     <w:p>
@@ -22093,15 +22307,15 @@
         <w:jc w:val="left"/>
         <w:rPr/>
       </w:pPr>
-      <w:bookmarkStart w:id="46" w:name="__RefHeading___Toc3151_1907633178"/>
-      <w:bookmarkEnd w:id="46"/>
+      <w:bookmarkStart w:id="47" w:name="__RefHeading___Toc3168_1968430665"/>
+      <w:bookmarkEnd w:id="47"/>
       <w:r>
         <w:rPr>
           <w:rFonts w:eastAsia="Arial" w:cs="Arial" w:ascii="Arial" w:hAnsi="Arial"/>
           <w:sz w:val="24"/>
           <w:szCs w:val="24"/>
         </w:rPr>
-        <w:t>11.1 WORKFLOW DE BRANCHES</w:t>
+        <w:t>12.1 WORKFLOW DE BRANCHES</w:t>
       </w:r>
     </w:p>
     <w:p>
@@ -22175,15 +22389,15 @@
         <w:jc w:val="left"/>
         <w:rPr/>
       </w:pPr>
-      <w:bookmarkStart w:id="47" w:name="__RefHeading___Toc3153_1907633178"/>
-      <w:bookmarkEnd w:id="47"/>
+      <w:bookmarkStart w:id="48" w:name="__RefHeading___Toc3170_1968430665"/>
+      <w:bookmarkEnd w:id="48"/>
       <w:r>
         <w:rPr>
           <w:rFonts w:eastAsia="Arial" w:cs="Arial" w:ascii="Arial" w:hAnsi="Arial"/>
           <w:sz w:val="24"/>
           <w:szCs w:val="24"/>
         </w:rPr>
-        <w:t>11.2 CONVENÇÕES DE CÓDIGO</w:t>
+        <w:t>12.2 CONVENÇÕES DE CÓDIGO</w:t>
       </w:r>
     </w:p>
     <w:p>
@@ -22260,8 +22474,8 @@
         <w:jc w:val="left"/>
         <w:rPr/>
       </w:pPr>
-      <w:bookmarkStart w:id="48" w:name="__RefHeading___Toc3155_1907633178"/>
-      <w:bookmarkEnd w:id="48"/>
+      <w:bookmarkStart w:id="49" w:name="__RefHeading___Toc3172_1968430665"/>
+      <w:bookmarkEnd w:id="49"/>
       <w:r>
         <w:rPr>
           <w:rFonts w:eastAsia="Arial" w:cs="Arial" w:ascii="Arial" w:hAnsi="Arial"/>
@@ -22270,7 +22484,7 @@
           <w:sz w:val="24"/>
           <w:szCs w:val="24"/>
         </w:rPr>
-        <w:t>12 API E INTERFACES</w:t>
+        <w:t>13 API E INTERFACES</w:t>
       </w:r>
     </w:p>
     <w:p>
@@ -22281,15 +22495,15 @@
         <w:jc w:val="left"/>
         <w:rPr/>
       </w:pPr>
-      <w:bookmarkStart w:id="49" w:name="__RefHeading___Toc3157_1907633178"/>
-      <w:bookmarkEnd w:id="49"/>
+      <w:bookmarkStart w:id="50" w:name="__RefHeading___Toc3174_1968430665"/>
+      <w:bookmarkEnd w:id="50"/>
       <w:r>
         <w:rPr>
           <w:rFonts w:eastAsia="Arial" w:cs="Arial" w:ascii="Arial" w:hAnsi="Arial"/>
           <w:sz w:val="24"/>
           <w:szCs w:val="24"/>
         </w:rPr>
-        <w:t>12.1 ENDPOINTS PRINCIPAIS</w:t>
+        <w:t>13.1 ENDPOINTS PRINCIPAIS</w:t>
       </w:r>
     </w:p>
     <w:p>
@@ -22321,8 +22535,8 @@
         <w:jc w:val="left"/>
         <w:rPr/>
       </w:pPr>
-      <w:bookmarkStart w:id="50" w:name="__RefHeading___Toc3159_1907633178"/>
-      <w:bookmarkEnd w:id="50"/>
+      <w:bookmarkStart w:id="51" w:name="__RefHeading___Toc3176_1968430665"/>
+      <w:bookmarkEnd w:id="51"/>
       <w:r>
         <w:rPr>
           <w:rFonts w:eastAsia="Arial" w:cs="Arial" w:ascii="Arial" w:hAnsi="Arial"/>
@@ -22331,7 +22545,7 @@
           <w:sz w:val="24"/>
           <w:szCs w:val="24"/>
         </w:rPr>
-        <w:t>12.1.1 Rotas de Autenticação</w:t>
+        <w:t>13.1.1 Rotas de Autenticação</w:t>
       </w:r>
     </w:p>
     <w:tbl>
@@ -22844,8 +23058,8 @@
         <w:jc w:val="left"/>
         <w:rPr/>
       </w:pPr>
-      <w:bookmarkStart w:id="51" w:name="__RefHeading___Toc3161_1907633178"/>
-      <w:bookmarkEnd w:id="51"/>
+      <w:bookmarkStart w:id="52" w:name="__RefHeading___Toc3178_1968430665"/>
+      <w:bookmarkEnd w:id="52"/>
       <w:r>
         <w:rPr>
           <w:rFonts w:eastAsia="Arial" w:cs="Arial" w:ascii="Arial" w:hAnsi="Arial"/>
@@ -22854,7 +23068,7 @@
           <w:sz w:val="24"/>
           <w:szCs w:val="24"/>
         </w:rPr>
-        <w:t>12.1.2 Eventos</w:t>
+        <w:t>13.1.2 Eventos</w:t>
       </w:r>
     </w:p>
     <w:tbl>
@@ -24102,8 +24316,8 @@
         <w:jc w:val="left"/>
         <w:rPr/>
       </w:pPr>
-      <w:bookmarkStart w:id="52" w:name="__RefHeading___Toc3163_1907633178"/>
-      <w:bookmarkEnd w:id="52"/>
+      <w:bookmarkStart w:id="53" w:name="__RefHeading___Toc3180_1968430665"/>
+      <w:bookmarkEnd w:id="53"/>
       <w:r>
         <w:rPr>
           <w:rFonts w:eastAsia="Arial" w:cs="Arial" w:ascii="Arial" w:hAnsi="Arial"/>
@@ -24112,7 +24326,7 @@
           <w:sz w:val="24"/>
           <w:szCs w:val="24"/>
         </w:rPr>
-        <w:t>12.1.3 Inscrições</w:t>
+        <w:t>13.1.3 Inscrições</w:t>
       </w:r>
     </w:p>
     <w:tbl>
@@ -24744,8 +24958,8 @@
         <w:jc w:val="left"/>
         <w:rPr/>
       </w:pPr>
-      <w:bookmarkStart w:id="53" w:name="__RefHeading___Toc3165_1907633178"/>
-      <w:bookmarkEnd w:id="53"/>
+      <w:bookmarkStart w:id="54" w:name="__RefHeading___Toc3182_1968430665"/>
+      <w:bookmarkEnd w:id="54"/>
       <w:r>
         <w:rPr>
           <w:rFonts w:eastAsia="Arial" w:cs="Arial" w:ascii="Arial" w:hAnsi="Arial"/>
@@ -24754,7 +24968,7 @@
           <w:sz w:val="24"/>
           <w:szCs w:val="24"/>
         </w:rPr>
-        <w:t>12.1.4 Presença e Certificação</w:t>
+        <w:t>13.1.4 Presença e Certificação</w:t>
       </w:r>
     </w:p>
     <w:tbl>
@@ -25505,8 +25719,8 @@
         <w:jc w:val="left"/>
         <w:rPr/>
       </w:pPr>
-      <w:bookmarkStart w:id="54" w:name="__RefHeading___Toc3167_1907633178"/>
-      <w:bookmarkEnd w:id="54"/>
+      <w:bookmarkStart w:id="55" w:name="__RefHeading___Toc3184_1968430665"/>
+      <w:bookmarkEnd w:id="55"/>
       <w:r>
         <w:rPr>
           <w:rFonts w:eastAsia="Arial" w:cs="Arial" w:ascii="Arial" w:hAnsi="Arial"/>
@@ -25515,7 +25729,7 @@
           <w:sz w:val="24"/>
           <w:szCs w:val="24"/>
         </w:rPr>
-        <w:t>12.1.5 Avaliações</w:t>
+        <w:t>13.1.5 Avaliações</w:t>
       </w:r>
     </w:p>
     <w:tbl>
@@ -26147,8 +26361,8 @@
         <w:jc w:val="left"/>
         <w:rPr/>
       </w:pPr>
-      <w:bookmarkStart w:id="55" w:name="__RefHeading___Toc3169_1907633178"/>
-      <w:bookmarkEnd w:id="55"/>
+      <w:bookmarkStart w:id="56" w:name="__RefHeading___Toc3186_1968430665"/>
+      <w:bookmarkEnd w:id="56"/>
       <w:r>
         <w:rPr>
           <w:rFonts w:eastAsia="Arial" w:cs="Arial" w:ascii="Arial" w:hAnsi="Arial"/>
@@ -26157,7 +26371,7 @@
           <w:sz w:val="24"/>
           <w:szCs w:val="24"/>
         </w:rPr>
-        <w:t>12.1.6 Padronização de Erros</w:t>
+        <w:t>13.1.6 Padronização de Erros</w:t>
       </w:r>
     </w:p>
     <w:p>
@@ -27113,15 +27327,15 @@
         <w:jc w:val="left"/>
         <w:rPr/>
       </w:pPr>
-      <w:bookmarkStart w:id="56" w:name="__RefHeading___Toc3171_1907633178"/>
-      <w:bookmarkEnd w:id="56"/>
+      <w:bookmarkStart w:id="57" w:name="__RefHeading___Toc3188_1968430665"/>
+      <w:bookmarkEnd w:id="57"/>
       <w:r>
         <w:rPr>
           <w:rFonts w:eastAsia="Arial" w:cs="Arial" w:ascii="Arial" w:hAnsi="Arial"/>
           <w:sz w:val="24"/>
           <w:szCs w:val="24"/>
         </w:rPr>
-        <w:t>12.2 AUTENTICAÇÃO</w:t>
+        <w:t>13.2 AUTENTICAÇÃO</w:t>
       </w:r>
     </w:p>
     <w:p>
@@ -27287,8 +27501,8 @@
         <w:jc w:val="left"/>
         <w:rPr/>
       </w:pPr>
-      <w:bookmarkStart w:id="57" w:name="__RefHeading___Toc3173_1907633178"/>
-      <w:bookmarkEnd w:id="57"/>
+      <w:bookmarkStart w:id="58" w:name="__RefHeading___Toc3190_1968430665"/>
+      <w:bookmarkEnd w:id="58"/>
       <w:r>
         <w:rPr>
           <w:rFonts w:eastAsia="Arial" w:cs="Arial" w:ascii="Arial" w:hAnsi="Arial"/>
@@ -27297,7 +27511,7 @@
           <w:sz w:val="24"/>
           <w:szCs w:val="24"/>
         </w:rPr>
-        <w:t>13 ESTRATÉGIA DE TESTES</w:t>
+        <w:t>14 ESTRATÉGIA DE TESTES</w:t>
       </w:r>
     </w:p>
     <w:p>
@@ -27308,15 +27522,15 @@
         <w:jc w:val="left"/>
         <w:rPr/>
       </w:pPr>
-      <w:bookmarkStart w:id="58" w:name="__RefHeading___Toc3175_1907633178"/>
-      <w:bookmarkEnd w:id="58"/>
+      <w:bookmarkStart w:id="59" w:name="__RefHeading___Toc3192_1968430665"/>
+      <w:bookmarkEnd w:id="59"/>
       <w:r>
         <w:rPr>
           <w:rFonts w:eastAsia="Arial" w:cs="Arial" w:ascii="Arial" w:hAnsi="Arial"/>
           <w:sz w:val="24"/>
           <w:szCs w:val="24"/>
         </w:rPr>
-        <w:t>13.1 PIRÂMIDE DE TESTES</w:t>
+        <w:t>14.1 PIRÂMIDE DE TESTES</w:t>
       </w:r>
     </w:p>
     <w:p>
@@ -27453,15 +27667,15 @@
         <w:jc w:val="left"/>
         <w:rPr/>
       </w:pPr>
-      <w:bookmarkStart w:id="59" w:name="__RefHeading___Toc3177_1907633178"/>
-      <w:bookmarkEnd w:id="59"/>
+      <w:bookmarkStart w:id="60" w:name="__RefHeading___Toc3194_1968430665"/>
+      <w:bookmarkEnd w:id="60"/>
       <w:r>
         <w:rPr>
           <w:rFonts w:eastAsia="Arial" w:cs="Arial" w:ascii="Arial" w:hAnsi="Arial"/>
           <w:sz w:val="24"/>
           <w:szCs w:val="24"/>
         </w:rPr>
-        <w:t>13.2 EXECUÇÃO DOS TESTES</w:t>
+        <w:t>14.2 EXECUÇÃO DOS TESTES</w:t>
       </w:r>
     </w:p>
     <w:p>
@@ -27746,8 +27960,8 @@
         <w:jc w:val="left"/>
         <w:rPr/>
       </w:pPr>
-      <w:bookmarkStart w:id="60" w:name="__RefHeading___Toc3179_1907633178"/>
-      <w:bookmarkEnd w:id="60"/>
+      <w:bookmarkStart w:id="61" w:name="__RefHeading___Toc3196_1968430665"/>
+      <w:bookmarkEnd w:id="61"/>
       <w:r>
         <w:rPr>
           <w:rFonts w:eastAsia="Arial" w:cs="Arial" w:ascii="Arial" w:hAnsi="Arial"/>
@@ -27756,7 +27970,7 @@
           <w:sz w:val="24"/>
           <w:szCs w:val="24"/>
         </w:rPr>
-        <w:t>14 DEPLOYMENT E DEVOPS</w:t>
+        <w:t>15 DEPLOYMENT E DEVOPS</w:t>
       </w:r>
     </w:p>
     <w:p>
@@ -27767,15 +27981,15 @@
         <w:jc w:val="left"/>
         <w:rPr/>
       </w:pPr>
-      <w:bookmarkStart w:id="61" w:name="__RefHeading___Toc3181_1907633178"/>
-      <w:bookmarkEnd w:id="61"/>
+      <w:bookmarkStart w:id="62" w:name="__RefHeading___Toc3198_1968430665"/>
+      <w:bookmarkEnd w:id="62"/>
       <w:r>
         <w:rPr>
           <w:rFonts w:eastAsia="Arial" w:cs="Arial" w:ascii="Arial" w:hAnsi="Arial"/>
           <w:sz w:val="24"/>
           <w:szCs w:val="24"/>
         </w:rPr>
-        <w:t>14.1 PIPELINE DE INTEGRAÇÃO E ENTREGA CONTÍNUA</w:t>
+        <w:t>15.1 PIPELINE DE INTEGRAÇÃO E ENTREGA CONTÍNUA</w:t>
       </w:r>
     </w:p>
     <w:p>
@@ -27828,8 +28042,8 @@
         <w:jc w:val="left"/>
         <w:rPr/>
       </w:pPr>
-      <w:bookmarkStart w:id="62" w:name="__RefHeading___Toc3183_1907633178"/>
-      <w:bookmarkEnd w:id="62"/>
+      <w:bookmarkStart w:id="63" w:name="__RefHeading___Toc3200_1968430665"/>
+      <w:bookmarkEnd w:id="63"/>
       <w:r>
         <w:rPr>
           <w:rFonts w:eastAsia="Arial" w:cs="Arial" w:ascii="Arial" w:hAnsi="Arial"/>
@@ -27838,7 +28052,7 @@
           <w:sz w:val="24"/>
           <w:szCs w:val="24"/>
         </w:rPr>
-        <w:t>14.1.1 Etapas do Pipeline</w:t>
+        <w:t>15.1.1 Etapas do Pipeline</w:t>
       </w:r>
     </w:p>
     <w:p>
@@ -27912,8 +28126,8 @@
         <w:jc w:val="left"/>
         <w:rPr/>
       </w:pPr>
-      <w:bookmarkStart w:id="63" w:name="__RefHeading___Toc3185_1907633178"/>
-      <w:bookmarkEnd w:id="63"/>
+      <w:bookmarkStart w:id="64" w:name="__RefHeading___Toc3202_1968430665"/>
+      <w:bookmarkEnd w:id="64"/>
       <w:r>
         <w:rPr>
           <w:rFonts w:eastAsia="Arial" w:cs="Arial" w:ascii="Arial" w:hAnsi="Arial"/>
@@ -27922,7 +28136,7 @@
           <w:sz w:val="24"/>
           <w:szCs w:val="24"/>
         </w:rPr>
-        <w:t>14.1.2 Critérios de Aprovação</w:t>
+        <w:t>15.1.2 Critérios de Aprovação</w:t>
       </w:r>
     </w:p>
     <w:p>
@@ -27975,8 +28189,8 @@
         <w:jc w:val="left"/>
         <w:rPr/>
       </w:pPr>
-      <w:bookmarkStart w:id="64" w:name="__RefHeading___Toc3187_1907633178"/>
-      <w:bookmarkEnd w:id="64"/>
+      <w:bookmarkStart w:id="65" w:name="__RefHeading___Toc3204_1968430665"/>
+      <w:bookmarkEnd w:id="65"/>
       <w:r>
         <w:rPr>
           <w:rFonts w:eastAsia="Arial" w:cs="Arial" w:ascii="Arial" w:hAnsi="Arial"/>
@@ -27985,7 +28199,7 @@
           <w:sz w:val="24"/>
           <w:szCs w:val="24"/>
         </w:rPr>
-        <w:t>14.1.3 Tratamento de Segredos</w:t>
+        <w:t>15.1.3 Tratamento de Segredos</w:t>
       </w:r>
     </w:p>
     <w:p>
@@ -28017,15 +28231,15 @@
         <w:jc w:val="left"/>
         <w:rPr/>
       </w:pPr>
-      <w:bookmarkStart w:id="65" w:name="__RefHeading___Toc3189_1907633178"/>
-      <w:bookmarkEnd w:id="65"/>
+      <w:bookmarkStart w:id="66" w:name="__RefHeading___Toc3206_1968430665"/>
+      <w:bookmarkEnd w:id="66"/>
       <w:r>
         <w:rPr>
           <w:rFonts w:eastAsia="Arial" w:cs="Arial" w:ascii="Arial" w:hAnsi="Arial"/>
           <w:sz w:val="24"/>
           <w:szCs w:val="24"/>
         </w:rPr>
-        <w:t>14.2 AMBIENTES</w:t>
+        <w:t>15.2 AMBIENTES</w:t>
       </w:r>
     </w:p>
     <w:p>
@@ -28667,8 +28881,8 @@
         <w:jc w:val="left"/>
         <w:rPr/>
       </w:pPr>
-      <w:bookmarkStart w:id="66" w:name="__RefHeading___Toc3191_1907633178"/>
-      <w:bookmarkEnd w:id="66"/>
+      <w:bookmarkStart w:id="67" w:name="__RefHeading___Toc3208_1968430665"/>
+      <w:bookmarkEnd w:id="67"/>
       <w:r>
         <w:rPr>
           <w:rFonts w:eastAsia="Arial" w:cs="Arial" w:ascii="Arial" w:hAnsi="Arial"/>
@@ -28677,7 +28891,7 @@
           <w:sz w:val="24"/>
           <w:szCs w:val="24"/>
         </w:rPr>
-        <w:t>15 PERFORMANCE E OTIMIZAÇÃO</w:t>
+        <w:t>16 PERFORMANCE E OTIMIZAÇÃO</w:t>
       </w:r>
     </w:p>
     <w:p>
@@ -28688,15 +28902,15 @@
         <w:jc w:val="left"/>
         <w:rPr/>
       </w:pPr>
-      <w:bookmarkStart w:id="67" w:name="__RefHeading___Toc3193_1907633178"/>
-      <w:bookmarkEnd w:id="67"/>
+      <w:bookmarkStart w:id="68" w:name="__RefHeading___Toc3210_1968430665"/>
+      <w:bookmarkEnd w:id="68"/>
       <w:r>
         <w:rPr>
           <w:rFonts w:eastAsia="Arial" w:cs="Arial" w:ascii="Arial" w:hAnsi="Arial"/>
           <w:sz w:val="24"/>
           <w:szCs w:val="24"/>
         </w:rPr>
-        <w:t>15.1 MÉTRICAS DE EFICIÊNCIA</w:t>
+        <w:t>16.1 MÉTRICAS DE EFICIÊNCIA</w:t>
       </w:r>
     </w:p>
     <w:p>
@@ -29597,7 +29811,7 @@
           <w:sz w:val="24"/>
           <w:szCs w:val="24"/>
         </w:rPr>
-        <w:t>A principal medida de otimização adotada é estrutural e antecede qualquer ajuste de infraestrutura: os índices definidos na seção 7.2 sustentam diretamente as duas consultas mais frequentes do sistema, a listagem pública de eventos e a localização do próximo participante da fila de espera. Sem eles, ambas degradariam de forma proporcional ao volume de registros.</w:t>
+        <w:t>A principal medida de otimização adotada é estrutural e antecede qualquer ajuste de infraestrutura: os índices definidos na seção 8.2 sustentam diretamente as duas consultas mais frequentes do sistema, a listagem pública de eventos e a localização do próximo participante da fila de espera. Sem eles, ambas degradariam de forma proporcional ao volume de registros.</w:t>
       </w:r>
     </w:p>
     <w:p>
@@ -29653,8 +29867,8 @@
         <w:jc w:val="left"/>
         <w:rPr/>
       </w:pPr>
-      <w:bookmarkStart w:id="68" w:name="__RefHeading___Toc3195_1907633178"/>
-      <w:bookmarkEnd w:id="68"/>
+      <w:bookmarkStart w:id="69" w:name="__RefHeading___Toc3212_1968430665"/>
+      <w:bookmarkEnd w:id="69"/>
       <w:r>
         <w:rPr>
           <w:rFonts w:eastAsia="Arial" w:cs="Arial" w:ascii="Arial" w:hAnsi="Arial"/>
@@ -29663,7 +29877,7 @@
           <w:sz w:val="24"/>
           <w:szCs w:val="24"/>
         </w:rPr>
-        <w:t>16 TROUBLESHOOTING</w:t>
+        <w:t>17 TROUBLESHOOTING</w:t>
       </w:r>
     </w:p>
     <w:p>
@@ -29674,15 +29888,15 @@
         <w:jc w:val="left"/>
         <w:rPr/>
       </w:pPr>
-      <w:bookmarkStart w:id="69" w:name="__RefHeading___Toc3197_1907633178"/>
-      <w:bookmarkEnd w:id="69"/>
+      <w:bookmarkStart w:id="70" w:name="__RefHeading___Toc3214_1968430665"/>
+      <w:bookmarkEnd w:id="70"/>
       <w:r>
         <w:rPr>
           <w:rFonts w:eastAsia="Arial" w:cs="Arial" w:ascii="Arial" w:hAnsi="Arial"/>
           <w:sz w:val="24"/>
           <w:szCs w:val="24"/>
         </w:rPr>
-        <w:t>16.1 PROBLEMAS COMUNS</w:t>
+        <w:t>17.1 PROBLEMAS COMUNS</w:t>
       </w:r>
     </w:p>
     <w:p>
@@ -31355,14 +31569,106 @@
         <w:pStyle w:val="Heading1"/>
         <w:keepNext w:val="true"/>
         <w:spacing w:lineRule="auto" w:line="360" w:before="0" w:after="360"/>
+        <w:jc w:val="left"/>
+        <w:rPr/>
+      </w:pPr>
+      <w:r>
+        <w:br w:type="page"/>
+      </w:r>
+      <w:bookmarkStart w:id="71" w:name="__RefHeading___Toc3216_1968430665"/>
+      <w:bookmarkEnd w:id="71"/>
+      <w:r>
+        <w:rPr>
+          <w:rFonts w:eastAsia="Arial" w:cs="Arial" w:ascii="Arial" w:hAnsi="Arial"/>
+          <w:b/>
+          <w:bCs/>
+          <w:sz w:val="24"/>
+          <w:szCs w:val="24"/>
+        </w:rPr>
+        <w:t>18 CONCLUSÃO</w:t>
+      </w:r>
+    </w:p>
+    <w:p>
+      <w:pPr>
+        <w:pStyle w:val="Normal"/>
+        <w:spacing w:lineRule="auto" w:line="360" w:before="0" w:after="120"/>
+        <w:ind w:firstLine="709"/>
+        <w:jc w:val="both"/>
+        <w:rPr/>
+      </w:pPr>
+      <w:r>
+        <w:rPr>
+          <w:rFonts w:eastAsia="Arial" w:cs="Arial"/>
+          <w:sz w:val="24"/>
+          <w:szCs w:val="24"/>
+        </w:rPr>
+        <w:t>O desenvolvimento do Gerenciador de Eventos Acadêmicos atingiu o objetivo proposto: a aplicação permite executar, de ponta a ponta, o fluxo que vai da criação de um evento pelo organizador até a emissão e a validação pública do certificado de um participante com presença registrada, critério definido no escopo como condição de conclusão do projeto. As regras de negócio foram implementadas no servidor e verificadas por 136 testes automatizados de unidade e de integração e por onze cenários de ponta a ponta executados em navegador real.</w:t>
+      </w:r>
+    </w:p>
+    <w:p>
+      <w:pPr>
+        <w:pStyle w:val="Normal"/>
+        <w:spacing w:lineRule="auto" w:line="360" w:before="0" w:after="120"/>
+        <w:ind w:firstLine="709"/>
+        <w:jc w:val="both"/>
+        <w:rPr/>
+      </w:pPr>
+      <w:r>
+        <w:rPr>
+          <w:rFonts w:eastAsia="Arial" w:cs="Arial"/>
+          <w:sz w:val="24"/>
+          <w:szCs w:val="24"/>
+        </w:rPr>
+        <w:t>A integração com inteligência artificial mostrou-se viável mesmo com recursos gratuitos, desde que tratada como apoio ao organizador: a extração de dados reduz o preenchimento manual, mas o evento só é gravado após a revisão humana, e a indisponibilidade do serviço não interrompe o cadastro. A rotação entre modelos de linguagem e o registro de cada interação tornaram esse comportamento previsível e auditável.</w:t>
+      </w:r>
+    </w:p>
+    <w:p>
+      <w:pPr>
+        <w:pStyle w:val="Normal"/>
+        <w:spacing w:lineRule="auto" w:line="360" w:before="0" w:after="120"/>
+        <w:ind w:firstLine="709"/>
+        <w:jc w:val="both"/>
+        <w:rPr/>
+      </w:pPr>
+      <w:r>
+        <w:rPr>
+          <w:rFonts w:eastAsia="Arial" w:cs="Arial"/>
+          <w:sz w:val="24"/>
+          <w:szCs w:val="24"/>
+        </w:rPr>
+        <w:t>Ao longo do projeto, os testes automatizados revelaram falhas que dificilmente seriam percebidas em verificações manuais, como a diferença de fuso horário entre o servidor e o usuário e respostas de busca que chegavam fora de ordem. O uso do sistema publicado, por sua vez, levou a ajustes na regra de liberação do certificado, que passou a exigir o término do evento, e na forma de guardar a sessão no navegador. Esses episódios reforçaram a importância de especificar as regras com precisão e de validá-las continuamente.</w:t>
+      </w:r>
+    </w:p>
+    <w:p>
+      <w:pPr>
+        <w:pStyle w:val="Normal"/>
+        <w:spacing w:lineRule="auto" w:line="360" w:before="0" w:after="120"/>
+        <w:ind w:firstLine="709"/>
+        <w:jc w:val="both"/>
+        <w:rPr/>
+      </w:pPr>
+      <w:r>
+        <w:rPr>
+          <w:rFonts w:eastAsia="Arial" w:cs="Arial"/>
+          <w:sz w:val="24"/>
+          <w:szCs w:val="24"/>
+        </w:rPr>
+        <w:t>Permanecem fora do escopo a cobrança de inscrições, a divisão do evento em sessões independentes, a submissão de trabalhos acadêmicos, o envio de notificações por correio eletrônico e o aplicativo móvel nativo, além do armazenamento apenas temporário das fotos de divulgação no plano gratuito de hospedagem. Esses pontos indicam caminhos para trabalhos futuros, ao lado do registro de saída dos participantes, que permitiria comprovar a permanência até o fim do evento, e do armazenamento das imagens em um serviço de objetos.</w:t>
+      </w:r>
+      <w:r>
+        <w:br w:type="page"/>
+      </w:r>
+    </w:p>
+    <w:p>
+      <w:pPr>
+        <w:pStyle w:val="Heading1"/>
+        <w:keepNext w:val="true"/>
+        <w:spacing w:lineRule="auto" w:line="360" w:before="0" w:after="360"/>
         <w:jc w:val="center"/>
         <w:rPr/>
       </w:pPr>
-      <w:r>
-        <w:br w:type="page"/>
-      </w:r>
-      <w:bookmarkStart w:id="70" w:name="__RefHeading___Toc3199_1907633178"/>
-      <w:bookmarkEnd w:id="70"/>
+      <w:bookmarkStart w:id="72" w:name="__RefHeading___Toc3218_1968430665"/>
+      <w:bookmarkEnd w:id="72"/>
       <w:r>
         <w:rPr>
           <w:rFonts w:eastAsia="Arial" w:cs="Arial" w:ascii="Arial" w:hAnsi="Arial"/>
@@ -31780,8 +32086,8 @@
         <w:jc w:val="center"/>
         <w:rPr/>
       </w:pPr>
-      <w:bookmarkStart w:id="71" w:name="__RefHeading___Toc3201_1907633178"/>
-      <w:bookmarkEnd w:id="71"/>
+      <w:bookmarkStart w:id="73" w:name="__RefHeading___Toc3220_1968430665"/>
+      <w:bookmarkEnd w:id="73"/>
       <w:r>
         <w:rPr>
           <w:rFonts w:eastAsia="Arial" w:cs="Arial" w:ascii="Arial" w:hAnsi="Arial"/>
@@ -31821,7 +32127,7 @@
           <w:sz w:val="24"/>
           <w:szCs w:val="24"/>
         </w:rPr>
-        <w:t>Reproduzem-se a seguir, em páginas próprias e em orientação paisagem, os seis diagramas citados na seção 6.2: casos de uso, classes, estados, atividades, os dois diagramas de interação e o diagrama de componentes. Cada página traz, abaixo da figura, uma legenda que relaciona o diagrama aos requisitos e regras correspondentes.</w:t>
+        <w:t>Reproduzem-se a seguir, em páginas próprias e em orientação paisagem, os seis diagramas citados na seção 7.2: casos de uso, classes, estados, atividades, os dois diagramas de interação e o diagrama de componentes. Cada página traz, abaixo da figura, uma legenda que relaciona o diagrama aos requisitos e regras correspondentes.</w:t>
       </w:r>
     </w:p>
     <w:p>
@@ -31881,8 +32187,8 @@
         <w:jc w:val="left"/>
         <w:rPr/>
       </w:pPr>
-      <w:bookmarkStart w:id="72" w:name="__RefHeading___Toc3203_1907633178"/>
-      <w:bookmarkEnd w:id="72"/>
+      <w:bookmarkStart w:id="74" w:name="__RefHeading___Toc3222_1968430665"/>
+      <w:bookmarkEnd w:id="74"/>
       <w:r>
         <w:rPr>
           <w:rFonts w:eastAsia="Arial" w:cs="Arial" w:ascii="Arial" w:hAnsi="Arial"/>
@@ -31979,8 +32285,8 @@
         <w:jc w:val="left"/>
         <w:rPr/>
       </w:pPr>
-      <w:bookmarkStart w:id="73" w:name="__RefHeading___Toc3205_1907633178"/>
-      <w:bookmarkEnd w:id="73"/>
+      <w:bookmarkStart w:id="75" w:name="__RefHeading___Toc3224_1968430665"/>
+      <w:bookmarkEnd w:id="75"/>
       <w:r>
         <w:rPr>
           <w:rFonts w:eastAsia="Arial" w:cs="Arial" w:ascii="Arial" w:hAnsi="Arial"/>
@@ -32077,8 +32383,8 @@
         <w:jc w:val="left"/>
         <w:rPr/>
       </w:pPr>
-      <w:bookmarkStart w:id="74" w:name="__RefHeading___Toc3207_1907633178"/>
-      <w:bookmarkEnd w:id="74"/>
+      <w:bookmarkStart w:id="76" w:name="__RefHeading___Toc3226_1968430665"/>
+      <w:bookmarkEnd w:id="76"/>
       <w:r>
         <w:rPr>
           <w:rFonts w:eastAsia="Arial" w:cs="Arial" w:ascii="Arial" w:hAnsi="Arial"/>
@@ -32175,8 +32481,8 @@
         <w:jc w:val="left"/>
         <w:rPr/>
       </w:pPr>
-      <w:bookmarkStart w:id="75" w:name="__RefHeading___Toc3209_1907633178"/>
-      <w:bookmarkEnd w:id="75"/>
+      <w:bookmarkStart w:id="77" w:name="__RefHeading___Toc3228_1968430665"/>
+      <w:bookmarkEnd w:id="77"/>
       <w:r>
         <w:rPr>
           <w:rFonts w:eastAsia="Arial" w:cs="Arial" w:ascii="Arial" w:hAnsi="Arial"/>
@@ -32273,8 +32579,8 @@
         <w:jc w:val="left"/>
         <w:rPr/>
       </w:pPr>
-      <w:bookmarkStart w:id="76" w:name="__RefHeading___Toc3211_1907633178"/>
-      <w:bookmarkEnd w:id="76"/>
+      <w:bookmarkStart w:id="78" w:name="__RefHeading___Toc3230_1968430665"/>
+      <w:bookmarkEnd w:id="78"/>
       <w:r>
         <w:rPr>
           <w:rFonts w:eastAsia="Arial" w:cs="Arial" w:ascii="Arial" w:hAnsi="Arial"/>
@@ -32371,8 +32677,8 @@
         <w:jc w:val="left"/>
         <w:rPr/>
       </w:pPr>
-      <w:bookmarkStart w:id="77" w:name="__RefHeading___Toc3213_1907633178"/>
-      <w:bookmarkEnd w:id="77"/>
+      <w:bookmarkStart w:id="79" w:name="__RefHeading___Toc3232_1968430665"/>
+      <w:bookmarkEnd w:id="79"/>
       <w:r>
         <w:rPr>
           <w:rFonts w:eastAsia="Arial" w:cs="Arial" w:ascii="Arial" w:hAnsi="Arial"/>
@@ -32469,8 +32775,8 @@
         <w:jc w:val="left"/>
         <w:rPr/>
       </w:pPr>
-      <w:bookmarkStart w:id="78" w:name="__RefHeading___Toc3215_1907633178"/>
-      <w:bookmarkEnd w:id="78"/>
+      <w:bookmarkStart w:id="80" w:name="__RefHeading___Toc3234_1968430665"/>
+      <w:bookmarkEnd w:id="80"/>
       <w:r>
         <w:rPr>
           <w:rFonts w:eastAsia="Arial" w:cs="Arial" w:ascii="Arial" w:hAnsi="Arial"/>
@@ -32567,8 +32873,8 @@
         <w:jc w:val="left"/>
         <w:rPr/>
       </w:pPr>
-      <w:bookmarkStart w:id="79" w:name="__RefHeading___Toc3217_1907633178"/>
-      <w:bookmarkEnd w:id="79"/>
+      <w:bookmarkStart w:id="81" w:name="__RefHeading___Toc3236_1968430665"/>
+      <w:bookmarkEnd w:id="81"/>
       <w:r>
         <w:rPr>
           <w:rFonts w:eastAsia="Arial" w:cs="Arial" w:ascii="Arial" w:hAnsi="Arial"/>
@@ -32665,8 +32971,8 @@
         <w:jc w:val="left"/>
         <w:rPr/>
       </w:pPr>
-      <w:bookmarkStart w:id="80" w:name="__RefHeading___Toc3219_1907633178"/>
-      <w:bookmarkEnd w:id="80"/>
+      <w:bookmarkStart w:id="82" w:name="__RefHeading___Toc3238_1968430665"/>
+      <w:bookmarkEnd w:id="82"/>
       <w:r>
         <w:rPr>
           <w:rFonts w:eastAsia="Arial" w:cs="Arial" w:ascii="Arial" w:hAnsi="Arial"/>
@@ -32763,8 +33069,8 @@
         <w:jc w:val="left"/>
         <w:rPr/>
       </w:pPr>
-      <w:bookmarkStart w:id="81" w:name="__RefHeading___Toc3221_1907633178"/>
-      <w:bookmarkEnd w:id="81"/>
+      <w:bookmarkStart w:id="83" w:name="__RefHeading___Toc3240_1968430665"/>
+      <w:bookmarkEnd w:id="83"/>
       <w:r>
         <w:rPr>
           <w:rFonts w:eastAsia="Arial" w:cs="Arial" w:ascii="Arial" w:hAnsi="Arial"/>
@@ -32861,8 +33167,8 @@
         <w:jc w:val="left"/>
         <w:rPr/>
       </w:pPr>
-      <w:bookmarkStart w:id="82" w:name="__RefHeading___Toc3223_1907633178"/>
-      <w:bookmarkEnd w:id="82"/>
+      <w:bookmarkStart w:id="84" w:name="__RefHeading___Toc3242_1968430665"/>
+      <w:bookmarkEnd w:id="84"/>
       <w:r>
         <w:rPr>
           <w:rFonts w:eastAsia="Arial" w:cs="Arial" w:ascii="Arial" w:hAnsi="Arial"/>
@@ -32913,8 +33219,8 @@
         <w:jc w:val="center"/>
         <w:rPr/>
       </w:pPr>
-      <w:bookmarkStart w:id="83" w:name="__RefHeading___Toc3225_1907633178"/>
-      <w:bookmarkEnd w:id="83"/>
+      <w:bookmarkStart w:id="85" w:name="__RefHeading___Toc3244_1968430665"/>
+      <w:bookmarkEnd w:id="85"/>
       <w:r>
         <w:rPr>
           <w:rFonts w:eastAsia="Arial" w:cs="Arial" w:ascii="Arial" w:hAnsi="Arial"/>
@@ -34422,8 +34728,8 @@
       <w:r>
         <w:br w:type="page"/>
       </w:r>
-      <w:bookmarkStart w:id="84" w:name="__RefHeading___Toc3227_1907633178"/>
-      <w:bookmarkEnd w:id="84"/>
+      <w:bookmarkStart w:id="86" w:name="__RefHeading___Toc3246_1968430665"/>
+      <w:bookmarkEnd w:id="86"/>
       <w:r>
         <w:rPr>
           <w:rFonts w:eastAsia="Arial" w:cs="Arial" w:ascii="Arial" w:hAnsi="Arial"/>
@@ -34633,7 +34939,7 @@
                 <w:sz w:val="18"/>
                 <w:szCs w:val="18"/>
               </w:rPr>
-              <w:t>Seções 2.2 e 9.1</w:t>
+              <w:t>Seções 3.2 e 10.1</w:t>
             </w:r>
           </w:p>
         </w:tc>
@@ -34813,7 +35119,7 @@
                 <w:sz w:val="18"/>
                 <w:szCs w:val="18"/>
               </w:rPr>
-              <w:t>RN-05 e seção 12.1.4</w:t>
+              <w:t>RN-05 e seção 13.1.4</w:t>
             </w:r>
           </w:p>
         </w:tc>
@@ -34903,7 +35209,7 @@
                 <w:sz w:val="18"/>
                 <w:szCs w:val="18"/>
               </w:rPr>
-              <w:t>Seção 7.2</w:t>
+              <w:t>Seção 8.2</w:t>
             </w:r>
           </w:p>
         </w:tc>
@@ -34993,7 +35299,7 @@
                 <w:sz w:val="18"/>
                 <w:szCs w:val="18"/>
               </w:rPr>
-              <w:t>Seção 6.2 e Apêndice A</w:t>
+              <w:t>Seção 7.2 e Apêndice A</w:t>
             </w:r>
           </w:p>
         </w:tc>
@@ -35083,7 +35389,7 @@
                 <w:sz w:val="18"/>
                 <w:szCs w:val="18"/>
               </w:rPr>
-              <w:t>Seções 11.1 e 14.1</w:t>
+              <w:t>Seções 12.1 e 15.1</w:t>
             </w:r>
           </w:p>
         </w:tc>
@@ -35173,7 +35479,7 @@
                 <w:sz w:val="18"/>
                 <w:szCs w:val="18"/>
               </w:rPr>
-              <w:t>Seção 15.1</w:t>
+              <w:t>Seção 16.1</w:t>
             </w:r>
           </w:p>
         </w:tc>
@@ -35263,7 +35569,7 @@
                 <w:sz w:val="18"/>
                 <w:szCs w:val="18"/>
               </w:rPr>
-              <w:t>Seções 9.1 e 16.1</w:t>
+              <w:t>Seções 10.1 e 17.1</w:t>
             </w:r>
           </w:p>
         </w:tc>
@@ -35353,7 +35659,7 @@
                 <w:sz w:val="18"/>
                 <w:szCs w:val="18"/>
               </w:rPr>
-              <w:t>Seções 9.2 e 14.2</w:t>
+              <w:t>Seções 10.2 e 15.2</w:t>
             </w:r>
           </w:p>
         </w:tc>
@@ -35396,7 +35702,7 @@
     </w:r>
     <w:r>
       <w:rPr/>
-      <w:t>52</w:t>
+      <w:t>55</w:t>
     </w:r>
     <w:r>
       <w:rPr/>
@@ -35428,7 +35734,7 @@
     </w:r>
     <w:r>
       <w:rPr/>
-      <w:t>57</w:t>
+      <w:t>60</w:t>
     </w:r>
     <w:r>
       <w:rPr/>
@@ -35466,7 +35772,7 @@
     </w:r>
     <w:r>
       <w:rPr/>
-      <w:t>58</w:t>
+      <w:t>61</w:t>
     </w:r>
     <w:r>
       <w:rPr/>
@@ -35504,7 +35810,7 @@
     </w:r>
     <w:r>
       <w:rPr/>
-      <w:t>59</w:t>
+      <w:t>62</w:t>
     </w:r>
     <w:r>
       <w:rPr/>
@@ -35542,7 +35848,7 @@
     </w:r>
     <w:r>
       <w:rPr/>
-      <w:t>60</w:t>
+      <w:t>63</w:t>
     </w:r>
     <w:r>
       <w:rPr/>
@@ -35580,7 +35886,7 @@
     </w:r>
     <w:r>
       <w:rPr/>
-      <w:t>61</w:t>
+      <w:t>64</w:t>
     </w:r>
     <w:r>
       <w:rPr/>
@@ -35618,7 +35924,7 @@
     </w:r>
     <w:r>
       <w:rPr/>
-      <w:t>53</w:t>
+      <w:t>56</w:t>
     </w:r>
     <w:r>
       <w:rPr/>
@@ -35650,7 +35956,7 @@
     </w:r>
     <w:r>
       <w:rPr/>
-      <w:t>62</w:t>
+      <w:t>65</w:t>
     </w:r>
     <w:r>
       <w:rPr/>
@@ -35688,7 +35994,7 @@
     </w:r>
     <w:r>
       <w:rPr/>
-      <w:t>63</w:t>
+      <w:t>66</w:t>
     </w:r>
     <w:r>
       <w:rPr/>
@@ -35726,7 +36032,7 @@
     </w:r>
     <w:r>
       <w:rPr/>
-      <w:t>65</w:t>
+      <w:t>68</w:t>
     </w:r>
     <w:r>
       <w:rPr/>
@@ -35770,7 +36076,7 @@
     </w:r>
     <w:r>
       <w:rPr/>
-      <w:t>54</w:t>
+      <w:t>57</w:t>
     </w:r>
     <w:r>
       <w:rPr/>
@@ -35808,7 +36114,7 @@
     </w:r>
     <w:r>
       <w:rPr/>
-      <w:t>55</w:t>
+      <w:t>58</w:t>
     </w:r>
     <w:r>
       <w:rPr/>
@@ -35846,7 +36152,7 @@
     </w:r>
     <w:r>
       <w:rPr/>
-      <w:t>56</w:t>
+      <w:t>59</w:t>
     </w:r>
     <w:r>
       <w:rPr/>

</xml_diff>

<commit_message>
docs: link do repositorio na documentacao
A introducao da versao ABNT e o passo de instalacao das tres versoes passam a
citar https://github.com/Jayzmatos22/GerenciadorDeEventos.

Co-Authored-By: Claude Opus 5.5 <noreply@anthropic.com>
Claude-Session: https://claude.ai/code/session_011SKCdnRmci1yJCi4ZvMpS2
</commit_message>
<xml_diff>
--- a/docs/Documentacao-ABNT.docx
+++ b/docs/Documentacao-ABNT.docx
@@ -539,7 +539,7 @@
             </w:rPr>
             <w:fldChar w:fldCharType="separate"/>
           </w:r>
-          <w:hyperlink w:anchor="__RefHeading___Toc3074_1968430665">
+          <w:hyperlink w:anchor="__RefHeading___Toc3074_1733997718">
             <w:r>
               <w:rPr>
                 <w:webHidden/>
@@ -560,7 +560,7 @@
             </w:tabs>
             <w:rPr/>
           </w:pPr>
-          <w:hyperlink w:anchor="__RefHeading___Toc3076_1968430665">
+          <w:hyperlink w:anchor="__RefHeading___Toc3076_1733997718">
             <w:r>
               <w:rPr>
                 <w:webHidden/>
@@ -568,7 +568,7 @@
               </w:rPr>
               <w:t>2 VISÃO GERAL DO PROJETO</w:t>
               <w:tab/>
-              <w:t>7</w:t>
+              <w:t>8</w:t>
             </w:r>
           </w:hyperlink>
         </w:p>
@@ -581,7 +581,7 @@
             </w:tabs>
             <w:rPr/>
           </w:pPr>
-          <w:hyperlink w:anchor="__RefHeading___Toc3078_1968430665">
+          <w:hyperlink w:anchor="__RefHeading___Toc3078_1733997718">
             <w:r>
               <w:rPr>
                 <w:webHidden/>
@@ -589,7 +589,7 @@
               </w:rPr>
               <w:t>2.1 DESCRIÇÃO EXECUTIVA</w:t>
               <w:tab/>
-              <w:t>7</w:t>
+              <w:t>8</w:t>
             </w:r>
           </w:hyperlink>
         </w:p>
@@ -602,7 +602,7 @@
             </w:tabs>
             <w:rPr/>
           </w:pPr>
-          <w:hyperlink w:anchor="__RefHeading___Toc3080_1968430665">
+          <w:hyperlink w:anchor="__RefHeading___Toc3080_1733997718">
             <w:r>
               <w:rPr>
                 <w:webHidden/>
@@ -610,7 +610,7 @@
               </w:rPr>
               <w:t>2.2 OBJETIVOS E ESCOPO</w:t>
               <w:tab/>
-              <w:t>7</w:t>
+              <w:t>8</w:t>
             </w:r>
           </w:hyperlink>
         </w:p>
@@ -623,7 +623,7 @@
             </w:tabs>
             <w:rPr/>
           </w:pPr>
-          <w:hyperlink w:anchor="__RefHeading___Toc3082_1968430665">
+          <w:hyperlink w:anchor="__RefHeading___Toc3082_1733997718">
             <w:r>
               <w:rPr>
                 <w:webHidden/>
@@ -631,7 +631,7 @@
               </w:rPr>
               <w:t>2.2.1 Objetivo Geral</w:t>
               <w:tab/>
-              <w:t>7</w:t>
+              <w:t>8</w:t>
             </w:r>
           </w:hyperlink>
         </w:p>
@@ -644,7 +644,7 @@
             </w:tabs>
             <w:rPr/>
           </w:pPr>
-          <w:hyperlink w:anchor="__RefHeading___Toc3084_1968430665">
+          <w:hyperlink w:anchor="__RefHeading___Toc3084_1733997718">
             <w:r>
               <w:rPr>
                 <w:webHidden/>
@@ -652,7 +652,7 @@
               </w:rPr>
               <w:t>2.2.2 Objetivos Específicos</w:t>
               <w:tab/>
-              <w:t>8</w:t>
+              <w:t>9</w:t>
             </w:r>
           </w:hyperlink>
         </w:p>
@@ -665,7 +665,7 @@
             </w:tabs>
             <w:rPr/>
           </w:pPr>
-          <w:hyperlink w:anchor="__RefHeading___Toc3086_1968430665">
+          <w:hyperlink w:anchor="__RefHeading___Toc3086_1733997718">
             <w:r>
               <w:rPr>
                 <w:webHidden/>
@@ -673,7 +673,7 @@
               </w:rPr>
               <w:t>2.2.3 Escopo do Projeto</w:t>
               <w:tab/>
-              <w:t>8</w:t>
+              <w:t>9</w:t>
             </w:r>
           </w:hyperlink>
         </w:p>
@@ -686,7 +686,7 @@
             </w:tabs>
             <w:rPr/>
           </w:pPr>
-          <w:hyperlink w:anchor="__RefHeading___Toc3088_1968430665">
+          <w:hyperlink w:anchor="__RefHeading___Toc3088_1733997718">
             <w:r>
               <w:rPr>
                 <w:webHidden/>
@@ -694,7 +694,7 @@
               </w:rPr>
               <w:t>2.2.4 Limitações de Escopo</w:t>
               <w:tab/>
-              <w:t>8</w:t>
+              <w:t>9</w:t>
             </w:r>
           </w:hyperlink>
         </w:p>
@@ -707,7 +707,7 @@
             </w:tabs>
             <w:rPr/>
           </w:pPr>
-          <w:hyperlink w:anchor="__RefHeading___Toc3090_1968430665">
+          <w:hyperlink w:anchor="__RefHeading___Toc3090_1733997718">
             <w:r>
               <w:rPr>
                 <w:webHidden/>
@@ -715,7 +715,7 @@
               </w:rPr>
               <w:t>2.3 REGRAS DE NEGÓCIO</w:t>
               <w:tab/>
-              <w:t>9</w:t>
+              <w:t>10</w:t>
             </w:r>
           </w:hyperlink>
         </w:p>
@@ -728,7 +728,7 @@
             </w:tabs>
             <w:rPr/>
           </w:pPr>
-          <w:hyperlink w:anchor="__RefHeading___Toc3092_1968430665">
+          <w:hyperlink w:anchor="__RefHeading___Toc3092_1733997718">
             <w:r>
               <w:rPr>
                 <w:webHidden/>
@@ -736,7 +736,7 @@
               </w:rPr>
               <w:t>3 ARQUITETURA DO SISTEMA</w:t>
               <w:tab/>
-              <w:t>11</w:t>
+              <w:t>12</w:t>
             </w:r>
           </w:hyperlink>
         </w:p>
@@ -749,7 +749,7 @@
             </w:tabs>
             <w:rPr/>
           </w:pPr>
-          <w:hyperlink w:anchor="__RefHeading___Toc3094_1968430665">
+          <w:hyperlink w:anchor="__RefHeading___Toc3094_1733997718">
             <w:r>
               <w:rPr>
                 <w:webHidden/>
@@ -757,7 +757,7 @@
               </w:rPr>
               <w:t>3.1 COMPONENTES PRINCIPAIS</w:t>
               <w:tab/>
-              <w:t>11</w:t>
+              <w:t>12</w:t>
             </w:r>
           </w:hyperlink>
         </w:p>
@@ -770,7 +770,7 @@
             </w:tabs>
             <w:rPr/>
           </w:pPr>
-          <w:hyperlink w:anchor="__RefHeading___Toc3096_1968430665">
+          <w:hyperlink w:anchor="__RefHeading___Toc3096_1733997718">
             <w:r>
               <w:rPr>
                 <w:webHidden/>
@@ -778,7 +778,7 @@
               </w:rPr>
               <w:t>3.2 DECISÕES ARQUITETURAIS (ADR)</w:t>
               <w:tab/>
-              <w:t>11</w:t>
+              <w:t>12</w:t>
             </w:r>
           </w:hyperlink>
         </w:p>
@@ -791,7 +791,7 @@
             </w:tabs>
             <w:rPr/>
           </w:pPr>
-          <w:hyperlink w:anchor="__RefHeading___Toc3098_1968430665">
+          <w:hyperlink w:anchor="__RefHeading___Toc3098_1733997718">
             <w:r>
               <w:rPr>
                 <w:webHidden/>
@@ -799,7 +799,7 @@
               </w:rPr>
               <w:t>3.3 STACK TECNOLÓGICA</w:t>
               <w:tab/>
-              <w:t>12</w:t>
+              <w:t>13</w:t>
             </w:r>
           </w:hyperlink>
         </w:p>
@@ -812,7 +812,7 @@
             </w:tabs>
             <w:rPr/>
           </w:pPr>
-          <w:hyperlink w:anchor="__RefHeading___Toc3100_1968430665">
+          <w:hyperlink w:anchor="__RefHeading___Toc3100_1733997718">
             <w:r>
               <w:rPr>
                 <w:webHidden/>
@@ -820,7 +820,7 @@
               </w:rPr>
               <w:t>4 ESPECIFICAÇÃO TÉCNICA</w:t>
               <w:tab/>
-              <w:t>13</w:t>
+              <w:t>14</w:t>
             </w:r>
           </w:hyperlink>
         </w:p>
@@ -833,7 +833,7 @@
             </w:tabs>
             <w:rPr/>
           </w:pPr>
-          <w:hyperlink w:anchor="__RefHeading___Toc3102_1968430665">
+          <w:hyperlink w:anchor="__RefHeading___Toc3102_1733997718">
             <w:r>
               <w:rPr>
                 <w:webHidden/>
@@ -841,7 +841,7 @@
               </w:rPr>
               <w:t>4.1 REQUISITOS FUNCIONAIS</w:t>
               <w:tab/>
-              <w:t>13</w:t>
+              <w:t>14</w:t>
             </w:r>
           </w:hyperlink>
         </w:p>
@@ -854,7 +854,7 @@
             </w:tabs>
             <w:rPr/>
           </w:pPr>
-          <w:hyperlink w:anchor="__RefHeading___Toc3104_1968430665">
+          <w:hyperlink w:anchor="__RefHeading___Toc3104_1733997718">
             <w:r>
               <w:rPr>
                 <w:webHidden/>
@@ -862,7 +862,7 @@
               </w:rPr>
               <w:t>4.2 REQUISITOS NÃO FUNCIONAIS</w:t>
               <w:tab/>
-              <w:t>13</w:t>
+              <w:t>14</w:t>
             </w:r>
           </w:hyperlink>
         </w:p>
@@ -875,7 +875,7 @@
             </w:tabs>
             <w:rPr/>
           </w:pPr>
-          <w:hyperlink w:anchor="__RefHeading___Toc3106_1968430665">
+          <w:hyperlink w:anchor="__RefHeading___Toc3106_1733997718">
             <w:r>
               <w:rPr>
                 <w:webHidden/>
@@ -883,7 +883,7 @@
               </w:rPr>
               <w:t>5 PROTÓTIPO DE BAIXA E ALTA FIDELIDADE</w:t>
               <w:tab/>
-              <w:t>14</w:t>
+              <w:t>15</w:t>
             </w:r>
           </w:hyperlink>
         </w:p>
@@ -896,7 +896,7 @@
             </w:tabs>
             <w:rPr/>
           </w:pPr>
-          <w:hyperlink w:anchor="__RefHeading___Toc3108_1968430665">
+          <w:hyperlink w:anchor="__RefHeading___Toc3108_1733997718">
             <w:r>
               <w:rPr>
                 <w:webHidden/>
@@ -904,7 +904,7 @@
               </w:rPr>
               <w:t>5.1 PROTÓTIPO DE BAIXA FIDELIDADE</w:t>
               <w:tab/>
-              <w:t>14</w:t>
+              <w:t>15</w:t>
             </w:r>
           </w:hyperlink>
         </w:p>
@@ -917,7 +917,7 @@
             </w:tabs>
             <w:rPr/>
           </w:pPr>
-          <w:hyperlink w:anchor="__RefHeading___Toc3110_1968430665">
+          <w:hyperlink w:anchor="__RefHeading___Toc3110_1733997718">
             <w:r>
               <w:rPr>
                 <w:webHidden/>
@@ -925,7 +925,7 @@
               </w:rPr>
               <w:t>5.2 PROTÓTIPO DE ALTA FIDELIDADE</w:t>
               <w:tab/>
-              <w:t>15</w:t>
+              <w:t>16</w:t>
             </w:r>
           </w:hyperlink>
         </w:p>
@@ -938,7 +938,7 @@
             </w:tabs>
             <w:rPr/>
           </w:pPr>
-          <w:hyperlink w:anchor="__RefHeading___Toc3112_1968430665">
+          <w:hyperlink w:anchor="__RefHeading___Toc3112_1733997718">
             <w:r>
               <w:rPr>
                 <w:webHidden/>
@@ -946,7 +946,7 @@
               </w:rPr>
               <w:t>6 MÉTRICAS E CRONOGRAMA</w:t>
               <w:tab/>
-              <w:t>17</w:t>
+              <w:t>18</w:t>
             </w:r>
           </w:hyperlink>
         </w:p>
@@ -959,7 +959,7 @@
             </w:tabs>
             <w:rPr/>
           </w:pPr>
-          <w:hyperlink w:anchor="__RefHeading___Toc3114_1968430665">
+          <w:hyperlink w:anchor="__RefHeading___Toc3114_1733997718">
             <w:r>
               <w:rPr>
                 <w:webHidden/>
@@ -967,7 +967,7 @@
               </w:rPr>
               <w:t>6.1 CRONOGRAMA</w:t>
               <w:tab/>
-              <w:t>17</w:t>
+              <w:t>18</w:t>
             </w:r>
           </w:hyperlink>
         </w:p>
@@ -980,7 +980,7 @@
             </w:tabs>
             <w:rPr/>
           </w:pPr>
-          <w:hyperlink w:anchor="__RefHeading___Toc3116_1968430665">
+          <w:hyperlink w:anchor="__RefHeading___Toc3116_1733997718">
             <w:r>
               <w:rPr>
                 <w:webHidden/>
@@ -988,7 +988,7 @@
               </w:rPr>
               <w:t>6.2 MÉTRICAS DE ACOMPANHAMENTO</w:t>
               <w:tab/>
-              <w:t>18</w:t>
+              <w:t>19</w:t>
             </w:r>
           </w:hyperlink>
         </w:p>
@@ -1001,7 +1001,7 @@
             </w:tabs>
             <w:rPr/>
           </w:pPr>
-          <w:hyperlink w:anchor="__RefHeading___Toc3118_1968430665">
+          <w:hyperlink w:anchor="__RefHeading___Toc3118_1733997718">
             <w:r>
               <w:rPr>
                 <w:webHidden/>
@@ -1009,7 +1009,7 @@
               </w:rPr>
               <w:t>7 MODELO DO DOMÍNIO</w:t>
               <w:tab/>
-              <w:t>19</w:t>
+              <w:t>20</w:t>
             </w:r>
           </w:hyperlink>
         </w:p>
@@ -1022,7 +1022,7 @@
             </w:tabs>
             <w:rPr/>
           </w:pPr>
-          <w:hyperlink w:anchor="__RefHeading___Toc3120_1968430665">
+          <w:hyperlink w:anchor="__RefHeading___Toc3120_1733997718">
             <w:r>
               <w:rPr>
                 <w:webHidden/>
@@ -1030,7 +1030,7 @@
               </w:rPr>
               <w:t>7.1 VISÃO CONCEITUAL DAS ENTIDADES</w:t>
               <w:tab/>
-              <w:t>19</w:t>
+              <w:t>20</w:t>
             </w:r>
           </w:hyperlink>
         </w:p>
@@ -1043,7 +1043,7 @@
             </w:tabs>
             <w:rPr/>
           </w:pPr>
-          <w:hyperlink w:anchor="__RefHeading___Toc3122_1968430665">
+          <w:hyperlink w:anchor="__RefHeading___Toc3122_1733997718">
             <w:r>
               <w:rPr>
                 <w:webHidden/>
@@ -1051,7 +1051,7 @@
               </w:rPr>
               <w:t>7.2 DIAGRAMAS DE MODELAGEM</w:t>
               <w:tab/>
-              <w:t>20</w:t>
+              <w:t>21</w:t>
             </w:r>
           </w:hyperlink>
         </w:p>
@@ -1064,7 +1064,7 @@
             </w:tabs>
             <w:rPr/>
           </w:pPr>
-          <w:hyperlink w:anchor="__RefHeading___Toc3124_1968430665">
+          <w:hyperlink w:anchor="__RefHeading___Toc3124_1733997718">
             <w:r>
               <w:rPr>
                 <w:webHidden/>
@@ -1072,7 +1072,7 @@
               </w:rPr>
               <w:t>8 MODELO DE DADOS</w:t>
               <w:tab/>
-              <w:t>21</w:t>
+              <w:t>22</w:t>
             </w:r>
           </w:hyperlink>
         </w:p>
@@ -1085,7 +1085,7 @@
             </w:tabs>
             <w:rPr/>
           </w:pPr>
-          <w:hyperlink w:anchor="__RefHeading___Toc3126_1968430665">
+          <w:hyperlink w:anchor="__RefHeading___Toc3126_1733997718">
             <w:r>
               <w:rPr>
                 <w:webHidden/>
@@ -1093,7 +1093,7 @@
               </w:rPr>
               <w:t>8.1 MODELO LÓGICO DA BASE DE DADOS</w:t>
               <w:tab/>
-              <w:t>21</w:t>
+              <w:t>22</w:t>
             </w:r>
           </w:hyperlink>
         </w:p>
@@ -1106,7 +1106,7 @@
             </w:tabs>
             <w:rPr/>
           </w:pPr>
-          <w:hyperlink w:anchor="__RefHeading___Toc3128_1968430665">
+          <w:hyperlink w:anchor="__RefHeading___Toc3128_1733997718">
             <w:r>
               <w:rPr>
                 <w:webHidden/>
@@ -1114,7 +1114,7 @@
               </w:rPr>
               <w:t>8.2 CRIAÇÃO FÍSICA DO MODELO DE DADOS</w:t>
               <w:tab/>
-              <w:t>22</w:t>
+              <w:t>23</w:t>
             </w:r>
           </w:hyperlink>
         </w:p>
@@ -1127,7 +1127,7 @@
             </w:tabs>
             <w:rPr/>
           </w:pPr>
-          <w:hyperlink w:anchor="__RefHeading___Toc3130_1968430665">
+          <w:hyperlink w:anchor="__RefHeading___Toc3130_1733997718">
             <w:r>
               <w:rPr>
                 <w:webHidden/>
@@ -1135,7 +1135,7 @@
               </w:rPr>
               <w:t>8.3 DICIONÁRIO DE DADOS</w:t>
               <w:tab/>
-              <w:t>24</w:t>
+              <w:t>25</w:t>
             </w:r>
           </w:hyperlink>
         </w:p>
@@ -1148,7 +1148,7 @@
             </w:tabs>
             <w:rPr/>
           </w:pPr>
-          <w:hyperlink w:anchor="__RefHeading___Toc3132_1968430665">
+          <w:hyperlink w:anchor="__RefHeading___Toc3132_1733997718">
             <w:r>
               <w:rPr>
                 <w:webHidden/>
@@ -1156,7 +1156,7 @@
               </w:rPr>
               <w:t>8.3.1 Tabela USUARIO</w:t>
               <w:tab/>
-              <w:t>24</w:t>
+              <w:t>25</w:t>
             </w:r>
           </w:hyperlink>
         </w:p>
@@ -1169,7 +1169,7 @@
             </w:tabs>
             <w:rPr/>
           </w:pPr>
-          <w:hyperlink w:anchor="__RefHeading___Toc3134_1968430665">
+          <w:hyperlink w:anchor="__RefHeading___Toc3134_1733997718">
             <w:r>
               <w:rPr>
                 <w:webHidden/>
@@ -1177,7 +1177,7 @@
               </w:rPr>
               <w:t>8.3.2 Tabela USUARIO_PAPEL</w:t>
               <w:tab/>
-              <w:t>24</w:t>
+              <w:t>25</w:t>
             </w:r>
           </w:hyperlink>
         </w:p>
@@ -1190,7 +1190,7 @@
             </w:tabs>
             <w:rPr/>
           </w:pPr>
-          <w:hyperlink w:anchor="__RefHeading___Toc3136_1968430665">
+          <w:hyperlink w:anchor="__RefHeading___Toc3136_1733997718">
             <w:r>
               <w:rPr>
                 <w:webHidden/>
@@ -1198,7 +1198,7 @@
               </w:rPr>
               <w:t>8.3.3 Tabela EVENTO</w:t>
               <w:tab/>
-              <w:t>24</w:t>
+              <w:t>25</w:t>
             </w:r>
           </w:hyperlink>
         </w:p>
@@ -1211,7 +1211,7 @@
             </w:tabs>
             <w:rPr/>
           </w:pPr>
-          <w:hyperlink w:anchor="__RefHeading___Toc3138_1968430665">
+          <w:hyperlink w:anchor="__RefHeading___Toc3138_1733997718">
             <w:r>
               <w:rPr>
                 <w:webHidden/>
@@ -1219,7 +1219,7 @@
               </w:rPr>
               <w:t>8.3.4 Tabela EVENTO_FOTO</w:t>
               <w:tab/>
-              <w:t>25</w:t>
+              <w:t>26</w:t>
             </w:r>
           </w:hyperlink>
         </w:p>
@@ -1232,7 +1232,7 @@
             </w:tabs>
             <w:rPr/>
           </w:pPr>
-          <w:hyperlink w:anchor="__RefHeading___Toc3140_1968430665">
+          <w:hyperlink w:anchor="__RefHeading___Toc3140_1733997718">
             <w:r>
               <w:rPr>
                 <w:webHidden/>
@@ -1240,7 +1240,7 @@
               </w:rPr>
               <w:t>8.3.5 Tabela INSCRICAO</w:t>
               <w:tab/>
-              <w:t>25</w:t>
+              <w:t>26</w:t>
             </w:r>
           </w:hyperlink>
         </w:p>
@@ -1253,7 +1253,7 @@
             </w:tabs>
             <w:rPr/>
           </w:pPr>
-          <w:hyperlink w:anchor="__RefHeading___Toc3142_1968430665">
+          <w:hyperlink w:anchor="__RefHeading___Toc3142_1733997718">
             <w:r>
               <w:rPr>
                 <w:webHidden/>
@@ -1261,7 +1261,7 @@
               </w:rPr>
               <w:t>8.3.6 Tabela PRESENCA</w:t>
               <w:tab/>
-              <w:t>25</w:t>
+              <w:t>26</w:t>
             </w:r>
           </w:hyperlink>
         </w:p>
@@ -1274,7 +1274,7 @@
             </w:tabs>
             <w:rPr/>
           </w:pPr>
-          <w:hyperlink w:anchor="__RefHeading___Toc3144_1968430665">
+          <w:hyperlink w:anchor="__RefHeading___Toc3144_1733997718">
             <w:r>
               <w:rPr>
                 <w:webHidden/>
@@ -1282,7 +1282,7 @@
               </w:rPr>
               <w:t>8.3.7 Tabela CERTIFICADO</w:t>
               <w:tab/>
-              <w:t>26</w:t>
+              <w:t>27</w:t>
             </w:r>
           </w:hyperlink>
         </w:p>
@@ -1295,7 +1295,7 @@
             </w:tabs>
             <w:rPr/>
           </w:pPr>
-          <w:hyperlink w:anchor="__RefHeading___Toc3146_1968430665">
+          <w:hyperlink w:anchor="__RefHeading___Toc3146_1733997718">
             <w:r>
               <w:rPr>
                 <w:webHidden/>
@@ -1303,7 +1303,7 @@
               </w:rPr>
               <w:t>8.3.8 Tabela AVALIACAO</w:t>
               <w:tab/>
-              <w:t>26</w:t>
+              <w:t>27</w:t>
             </w:r>
           </w:hyperlink>
         </w:p>
@@ -1316,7 +1316,7 @@
             </w:tabs>
             <w:rPr/>
           </w:pPr>
-          <w:hyperlink w:anchor="__RefHeading___Toc3148_1968430665">
+          <w:hyperlink w:anchor="__RefHeading___Toc3148_1733997718">
             <w:r>
               <w:rPr>
                 <w:webHidden/>
@@ -1324,7 +1324,7 @@
               </w:rPr>
               <w:t>8.3.9 Tabela RESUMO_AVALIACAO</w:t>
               <w:tab/>
-              <w:t>26</w:t>
+              <w:t>27</w:t>
             </w:r>
           </w:hyperlink>
         </w:p>
@@ -1337,7 +1337,7 @@
             </w:tabs>
             <w:rPr/>
           </w:pPr>
-          <w:hyperlink w:anchor="__RefHeading___Toc3150_1968430665">
+          <w:hyperlink w:anchor="__RefHeading___Toc3150_1733997718">
             <w:r>
               <w:rPr>
                 <w:webHidden/>
@@ -1345,7 +1345,7 @@
               </w:rPr>
               <w:t>8.3.10 Tabela INTERACAO_IA</w:t>
               <w:tab/>
-              <w:t>27</w:t>
+              <w:t>28</w:t>
             </w:r>
           </w:hyperlink>
         </w:p>
@@ -1358,7 +1358,7 @@
             </w:tabs>
             <w:rPr/>
           </w:pPr>
-          <w:hyperlink w:anchor="__RefHeading___Toc3152_1968430665">
+          <w:hyperlink w:anchor="__RefHeading___Toc3152_1733997718">
             <w:r>
               <w:rPr>
                 <w:webHidden/>
@@ -1366,7 +1366,7 @@
               </w:rPr>
               <w:t>9 AMBIENTE DE DESENVOLVIMENTO</w:t>
               <w:tab/>
-              <w:t>28</w:t>
+              <w:t>29</w:t>
             </w:r>
           </w:hyperlink>
         </w:p>
@@ -1379,7 +1379,7 @@
             </w:tabs>
             <w:rPr/>
           </w:pPr>
-          <w:hyperlink w:anchor="__RefHeading___Toc3154_1968430665">
+          <w:hyperlink w:anchor="__RefHeading___Toc3154_1733997718">
             <w:r>
               <w:rPr>
                 <w:webHidden/>
@@ -1387,7 +1387,7 @@
               </w:rPr>
               <w:t>10 SISTEMAS E COMPONENTES EXTERNOS UTILIZADOS</w:t>
               <w:tab/>
-              <w:t>29</w:t>
+              <w:t>30</w:t>
             </w:r>
           </w:hyperlink>
         </w:p>
@@ -1400,7 +1400,7 @@
             </w:tabs>
             <w:rPr/>
           </w:pPr>
-          <w:hyperlink w:anchor="__RefHeading___Toc3156_1968430665">
+          <w:hyperlink w:anchor="__RefHeading___Toc3156_1733997718">
             <w:r>
               <w:rPr>
                 <w:webHidden/>
@@ -1408,7 +1408,7 @@
               </w:rPr>
               <w:t>10.1 TECNOLOGIA EMERGENTE E SUA UTILIZAÇÃO</w:t>
               <w:tab/>
-              <w:t>30</w:t>
+              <w:t>31</w:t>
             </w:r>
           </w:hyperlink>
         </w:p>
@@ -1421,7 +1421,7 @@
             </w:tabs>
             <w:rPr/>
           </w:pPr>
-          <w:hyperlink w:anchor="__RefHeading___Toc3158_1968430665">
+          <w:hyperlink w:anchor="__RefHeading___Toc3158_1733997718">
             <w:r>
               <w:rPr>
                 <w:webHidden/>
@@ -1429,7 +1429,7 @@
               </w:rPr>
               <w:t>10.2 SEGURANÇA DE DADOS</w:t>
               <w:tab/>
-              <w:t>31</w:t>
+              <w:t>32</w:t>
             </w:r>
           </w:hyperlink>
         </w:p>
@@ -1442,7 +1442,7 @@
             </w:tabs>
             <w:rPr/>
           </w:pPr>
-          <w:hyperlink w:anchor="__RefHeading___Toc3160_1968430665">
+          <w:hyperlink w:anchor="__RefHeading___Toc3160_1733997718">
             <w:r>
               <w:rPr>
                 <w:webHidden/>
@@ -1450,7 +1450,7 @@
               </w:rPr>
               <w:t>11 INSTALAÇÃO E CONFIGURAÇÃO</w:t>
               <w:tab/>
-              <w:t>33</w:t>
+              <w:t>34</w:t>
             </w:r>
           </w:hyperlink>
         </w:p>
@@ -1463,7 +1463,7 @@
             </w:tabs>
             <w:rPr/>
           </w:pPr>
-          <w:hyperlink w:anchor="__RefHeading___Toc3162_1968430665">
+          <w:hyperlink w:anchor="__RefHeading___Toc3162_1733997718">
             <w:r>
               <w:rPr>
                 <w:webHidden/>
@@ -1471,7 +1471,7 @@
               </w:rPr>
               <w:t>11.1 PRÉ-REQUISITOS</w:t>
               <w:tab/>
-              <w:t>33</w:t>
+              <w:t>34</w:t>
             </w:r>
           </w:hyperlink>
         </w:p>
@@ -1484,7 +1484,7 @@
             </w:tabs>
             <w:rPr/>
           </w:pPr>
-          <w:hyperlink w:anchor="__RefHeading___Toc3164_1968430665">
+          <w:hyperlink w:anchor="__RefHeading___Toc3164_1733997718">
             <w:r>
               <w:rPr>
                 <w:webHidden/>
@@ -1492,7 +1492,7 @@
               </w:rPr>
               <w:t>11.2 PASSOS DE INSTALAÇÃO</w:t>
               <w:tab/>
-              <w:t>33</w:t>
+              <w:t>34</w:t>
             </w:r>
           </w:hyperlink>
         </w:p>
@@ -1505,7 +1505,7 @@
             </w:tabs>
             <w:rPr/>
           </w:pPr>
-          <w:hyperlink w:anchor="__RefHeading___Toc3166_1968430665">
+          <w:hyperlink w:anchor="__RefHeading___Toc3166_1733997718">
             <w:r>
               <w:rPr>
                 <w:webHidden/>
@@ -1513,7 +1513,7 @@
               </w:rPr>
               <w:t>12 DESENVOLVIMENTO</w:t>
               <w:tab/>
-              <w:t>35</w:t>
+              <w:t>36</w:t>
             </w:r>
           </w:hyperlink>
         </w:p>
@@ -1526,7 +1526,7 @@
             </w:tabs>
             <w:rPr/>
           </w:pPr>
-          <w:hyperlink w:anchor="__RefHeading___Toc3168_1968430665">
+          <w:hyperlink w:anchor="__RefHeading___Toc3168_1733997718">
             <w:r>
               <w:rPr>
                 <w:webHidden/>
@@ -1534,7 +1534,7 @@
               </w:rPr>
               <w:t>12.1 WORKFLOW DE BRANCHES</w:t>
               <w:tab/>
-              <w:t>35</w:t>
+              <w:t>36</w:t>
             </w:r>
           </w:hyperlink>
         </w:p>
@@ -1547,7 +1547,7 @@
             </w:tabs>
             <w:rPr/>
           </w:pPr>
-          <w:hyperlink w:anchor="__RefHeading___Toc3170_1968430665">
+          <w:hyperlink w:anchor="__RefHeading___Toc3170_1733997718">
             <w:r>
               <w:rPr>
                 <w:webHidden/>
@@ -1555,7 +1555,7 @@
               </w:rPr>
               <w:t>12.2 CONVENÇÕES DE CÓDIGO</w:t>
               <w:tab/>
-              <w:t>35</w:t>
+              <w:t>36</w:t>
             </w:r>
           </w:hyperlink>
         </w:p>
@@ -1568,7 +1568,7 @@
             </w:tabs>
             <w:rPr/>
           </w:pPr>
-          <w:hyperlink w:anchor="__RefHeading___Toc3172_1968430665">
+          <w:hyperlink w:anchor="__RefHeading___Toc3172_1733997718">
             <w:r>
               <w:rPr>
                 <w:webHidden/>
@@ -1576,7 +1576,7 @@
               </w:rPr>
               <w:t>13 API E INTERFACES</w:t>
               <w:tab/>
-              <w:t>37</w:t>
+              <w:t>38</w:t>
             </w:r>
           </w:hyperlink>
         </w:p>
@@ -1589,7 +1589,7 @@
             </w:tabs>
             <w:rPr/>
           </w:pPr>
-          <w:hyperlink w:anchor="__RefHeading___Toc3174_1968430665">
+          <w:hyperlink w:anchor="__RefHeading___Toc3174_1733997718">
             <w:r>
               <w:rPr>
                 <w:webHidden/>
@@ -1597,7 +1597,7 @@
               </w:rPr>
               <w:t>13.1 ENDPOINTS PRINCIPAIS</w:t>
               <w:tab/>
-              <w:t>37</w:t>
+              <w:t>38</w:t>
             </w:r>
           </w:hyperlink>
         </w:p>
@@ -1610,7 +1610,7 @@
             </w:tabs>
             <w:rPr/>
           </w:pPr>
-          <w:hyperlink w:anchor="__RefHeading___Toc3176_1968430665">
+          <w:hyperlink w:anchor="__RefHeading___Toc3176_1733997718">
             <w:r>
               <w:rPr>
                 <w:webHidden/>
@@ -1618,7 +1618,7 @@
               </w:rPr>
               <w:t>13.1.1 Rotas de Autenticação</w:t>
               <w:tab/>
-              <w:t>37</w:t>
+              <w:t>38</w:t>
             </w:r>
           </w:hyperlink>
         </w:p>
@@ -1631,7 +1631,7 @@
             </w:tabs>
             <w:rPr/>
           </w:pPr>
-          <w:hyperlink w:anchor="__RefHeading___Toc3178_1968430665">
+          <w:hyperlink w:anchor="__RefHeading___Toc3178_1733997718">
             <w:r>
               <w:rPr>
                 <w:webHidden/>
@@ -1639,7 +1639,7 @@
               </w:rPr>
               <w:t>13.1.2 Eventos</w:t>
               <w:tab/>
-              <w:t>37</w:t>
+              <w:t>38</w:t>
             </w:r>
           </w:hyperlink>
         </w:p>
@@ -1652,7 +1652,7 @@
             </w:tabs>
             <w:rPr/>
           </w:pPr>
-          <w:hyperlink w:anchor="__RefHeading___Toc3180_1968430665">
+          <w:hyperlink w:anchor="__RefHeading___Toc3180_1733997718">
             <w:r>
               <w:rPr>
                 <w:webHidden/>
@@ -1660,7 +1660,7 @@
               </w:rPr>
               <w:t>13.1.3 Inscrições</w:t>
               <w:tab/>
-              <w:t>38</w:t>
+              <w:t>39</w:t>
             </w:r>
           </w:hyperlink>
         </w:p>
@@ -1673,7 +1673,7 @@
             </w:tabs>
             <w:rPr/>
           </w:pPr>
-          <w:hyperlink w:anchor="__RefHeading___Toc3182_1968430665">
+          <w:hyperlink w:anchor="__RefHeading___Toc3182_1733997718">
             <w:r>
               <w:rPr>
                 <w:webHidden/>
@@ -1681,7 +1681,7 @@
               </w:rPr>
               <w:t>13.1.4 Presença e Certificação</w:t>
               <w:tab/>
-              <w:t>38</w:t>
+              <w:t>39</w:t>
             </w:r>
           </w:hyperlink>
         </w:p>
@@ -1694,7 +1694,7 @@
             </w:tabs>
             <w:rPr/>
           </w:pPr>
-          <w:hyperlink w:anchor="__RefHeading___Toc3184_1968430665">
+          <w:hyperlink w:anchor="__RefHeading___Toc3184_1733997718">
             <w:r>
               <w:rPr>
                 <w:webHidden/>
@@ -1702,7 +1702,7 @@
               </w:rPr>
               <w:t>13.1.5 Avaliações</w:t>
               <w:tab/>
-              <w:t>38</w:t>
+              <w:t>39</w:t>
             </w:r>
           </w:hyperlink>
         </w:p>
@@ -1715,7 +1715,7 @@
             </w:tabs>
             <w:rPr/>
           </w:pPr>
-          <w:hyperlink w:anchor="__RefHeading___Toc3186_1968430665">
+          <w:hyperlink w:anchor="__RefHeading___Toc3186_1733997718">
             <w:r>
               <w:rPr>
                 <w:webHidden/>
@@ -1723,7 +1723,7 @@
               </w:rPr>
               <w:t>13.1.6 Padronização de Erros</w:t>
               <w:tab/>
-              <w:t>39</w:t>
+              <w:t>40</w:t>
             </w:r>
           </w:hyperlink>
         </w:p>
@@ -1736,7 +1736,7 @@
             </w:tabs>
             <w:rPr/>
           </w:pPr>
-          <w:hyperlink w:anchor="__RefHeading___Toc3188_1968430665">
+          <w:hyperlink w:anchor="__RefHeading___Toc3188_1733997718">
             <w:r>
               <w:rPr>
                 <w:webHidden/>
@@ -1744,7 +1744,7 @@
               </w:rPr>
               <w:t>13.2 AUTENTICAÇÃO</w:t>
               <w:tab/>
-              <w:t>39</w:t>
+              <w:t>40</w:t>
             </w:r>
           </w:hyperlink>
         </w:p>
@@ -1757,7 +1757,7 @@
             </w:tabs>
             <w:rPr/>
           </w:pPr>
-          <w:hyperlink w:anchor="__RefHeading___Toc3190_1968430665">
+          <w:hyperlink w:anchor="__RefHeading___Toc3190_1733997718">
             <w:r>
               <w:rPr>
                 <w:webHidden/>
@@ -1765,7 +1765,7 @@
               </w:rPr>
               <w:t>14 ESTRATÉGIA DE TESTES</w:t>
               <w:tab/>
-              <w:t>41</w:t>
+              <w:t>42</w:t>
             </w:r>
           </w:hyperlink>
         </w:p>
@@ -1778,7 +1778,7 @@
             </w:tabs>
             <w:rPr/>
           </w:pPr>
-          <w:hyperlink w:anchor="__RefHeading___Toc3192_1968430665">
+          <w:hyperlink w:anchor="__RefHeading___Toc3192_1733997718">
             <w:r>
               <w:rPr>
                 <w:webHidden/>
@@ -1786,7 +1786,7 @@
               </w:rPr>
               <w:t>14.1 PIRÂMIDE DE TESTES</w:t>
               <w:tab/>
-              <w:t>41</w:t>
+              <w:t>42</w:t>
             </w:r>
           </w:hyperlink>
         </w:p>
@@ -1799,7 +1799,7 @@
             </w:tabs>
             <w:rPr/>
           </w:pPr>
-          <w:hyperlink w:anchor="__RefHeading___Toc3194_1968430665">
+          <w:hyperlink w:anchor="__RefHeading___Toc3194_1733997718">
             <w:r>
               <w:rPr>
                 <w:webHidden/>
@@ -1807,7 +1807,7 @@
               </w:rPr>
               <w:t>14.2 EXECUÇÃO DOS TESTES</w:t>
               <w:tab/>
-              <w:t>42</w:t>
+              <w:t>43</w:t>
             </w:r>
           </w:hyperlink>
         </w:p>
@@ -1820,7 +1820,7 @@
             </w:tabs>
             <w:rPr/>
           </w:pPr>
-          <w:hyperlink w:anchor="__RefHeading___Toc3196_1968430665">
+          <w:hyperlink w:anchor="__RefHeading___Toc3196_1733997718">
             <w:r>
               <w:rPr>
                 <w:webHidden/>
@@ -1828,7 +1828,7 @@
               </w:rPr>
               <w:t>15 DEPLOYMENT E DEVOPS</w:t>
               <w:tab/>
-              <w:t>44</w:t>
+              <w:t>45</w:t>
             </w:r>
           </w:hyperlink>
         </w:p>
@@ -1841,7 +1841,7 @@
             </w:tabs>
             <w:rPr/>
           </w:pPr>
-          <w:hyperlink w:anchor="__RefHeading___Toc3198_1968430665">
+          <w:hyperlink w:anchor="__RefHeading___Toc3198_1733997718">
             <w:r>
               <w:rPr>
                 <w:webHidden/>
@@ -1849,7 +1849,7 @@
               </w:rPr>
               <w:t>15.1 PIPELINE DE INTEGRAÇÃO E ENTREGA CONTÍNUA</w:t>
               <w:tab/>
-              <w:t>44</w:t>
+              <w:t>45</w:t>
             </w:r>
           </w:hyperlink>
         </w:p>
@@ -1862,7 +1862,7 @@
             </w:tabs>
             <w:rPr/>
           </w:pPr>
-          <w:hyperlink w:anchor="__RefHeading___Toc3200_1968430665">
+          <w:hyperlink w:anchor="__RefHeading___Toc3200_1733997718">
             <w:r>
               <w:rPr>
                 <w:webHidden/>
@@ -1870,7 +1870,7 @@
               </w:rPr>
               <w:t>15.1.1 Etapas do Pipeline</w:t>
               <w:tab/>
-              <w:t>44</w:t>
+              <w:t>45</w:t>
             </w:r>
           </w:hyperlink>
         </w:p>
@@ -1883,7 +1883,7 @@
             </w:tabs>
             <w:rPr/>
           </w:pPr>
-          <w:hyperlink w:anchor="__RefHeading___Toc3202_1968430665">
+          <w:hyperlink w:anchor="__RefHeading___Toc3202_1733997718">
             <w:r>
               <w:rPr>
                 <w:webHidden/>
@@ -1891,7 +1891,7 @@
               </w:rPr>
               <w:t>15.1.2 Critérios de Aprovação</w:t>
               <w:tab/>
-              <w:t>45</w:t>
+              <w:t>46</w:t>
             </w:r>
           </w:hyperlink>
         </w:p>
@@ -1904,7 +1904,7 @@
             </w:tabs>
             <w:rPr/>
           </w:pPr>
-          <w:hyperlink w:anchor="__RefHeading___Toc3204_1968430665">
+          <w:hyperlink w:anchor="__RefHeading___Toc3204_1733997718">
             <w:r>
               <w:rPr>
                 <w:webHidden/>
@@ -1912,7 +1912,7 @@
               </w:rPr>
               <w:t>15.1.3 Tratamento de Segredos</w:t>
               <w:tab/>
-              <w:t>45</w:t>
+              <w:t>46</w:t>
             </w:r>
           </w:hyperlink>
         </w:p>
@@ -1925,7 +1925,7 @@
             </w:tabs>
             <w:rPr/>
           </w:pPr>
-          <w:hyperlink w:anchor="__RefHeading___Toc3206_1968430665">
+          <w:hyperlink w:anchor="__RefHeading___Toc3206_1733997718">
             <w:r>
               <w:rPr>
                 <w:webHidden/>
@@ -1933,7 +1933,7 @@
               </w:rPr>
               <w:t>15.2 AMBIENTES</w:t>
               <w:tab/>
-              <w:t>45</w:t>
+              <w:t>46</w:t>
             </w:r>
           </w:hyperlink>
         </w:p>
@@ -1946,7 +1946,7 @@
             </w:tabs>
             <w:rPr/>
           </w:pPr>
-          <w:hyperlink w:anchor="__RefHeading___Toc3208_1968430665">
+          <w:hyperlink w:anchor="__RefHeading___Toc3208_1733997718">
             <w:r>
               <w:rPr>
                 <w:webHidden/>
@@ -1954,7 +1954,7 @@
               </w:rPr>
               <w:t>16 PERFORMANCE E OTIMIZAÇÃO</w:t>
               <w:tab/>
-              <w:t>48</w:t>
+              <w:t>49</w:t>
             </w:r>
           </w:hyperlink>
         </w:p>
@@ -1967,7 +1967,7 @@
             </w:tabs>
             <w:rPr/>
           </w:pPr>
-          <w:hyperlink w:anchor="__RefHeading___Toc3210_1968430665">
+          <w:hyperlink w:anchor="__RefHeading___Toc3210_1733997718">
             <w:r>
               <w:rPr>
                 <w:webHidden/>
@@ -1975,7 +1975,7 @@
               </w:rPr>
               <w:t>16.1 MÉTRICAS DE EFICIÊNCIA</w:t>
               <w:tab/>
-              <w:t>48</w:t>
+              <w:t>49</w:t>
             </w:r>
           </w:hyperlink>
         </w:p>
@@ -1988,7 +1988,7 @@
             </w:tabs>
             <w:rPr/>
           </w:pPr>
-          <w:hyperlink w:anchor="__RefHeading___Toc3212_1968430665">
+          <w:hyperlink w:anchor="__RefHeading___Toc3212_1733997718">
             <w:r>
               <w:rPr>
                 <w:webHidden/>
@@ -1996,7 +1996,7 @@
               </w:rPr>
               <w:t>17 TROUBLESHOOTING</w:t>
               <w:tab/>
-              <w:t>50</w:t>
+              <w:t>51</w:t>
             </w:r>
           </w:hyperlink>
         </w:p>
@@ -2009,7 +2009,7 @@
             </w:tabs>
             <w:rPr/>
           </w:pPr>
-          <w:hyperlink w:anchor="__RefHeading___Toc3214_1968430665">
+          <w:hyperlink w:anchor="__RefHeading___Toc3214_1733997718">
             <w:r>
               <w:rPr>
                 <w:webHidden/>
@@ -2017,7 +2017,7 @@
               </w:rPr>
               <w:t>17.1 PROBLEMAS COMUNS</w:t>
               <w:tab/>
-              <w:t>50</w:t>
+              <w:t>51</w:t>
             </w:r>
           </w:hyperlink>
         </w:p>
@@ -2030,7 +2030,7 @@
             </w:tabs>
             <w:rPr/>
           </w:pPr>
-          <w:hyperlink w:anchor="__RefHeading___Toc3216_1968430665">
+          <w:hyperlink w:anchor="__RefHeading___Toc3216_1733997718">
             <w:r>
               <w:rPr>
                 <w:webHidden/>
@@ -2038,7 +2038,7 @@
               </w:rPr>
               <w:t>18 CONCLUSÃO</w:t>
               <w:tab/>
-              <w:t>52</w:t>
+              <w:t>53</w:t>
             </w:r>
           </w:hyperlink>
         </w:p>
@@ -2051,7 +2051,7 @@
             </w:tabs>
             <w:rPr/>
           </w:pPr>
-          <w:hyperlink w:anchor="__RefHeading___Toc3218_1968430665">
+          <w:hyperlink w:anchor="__RefHeading___Toc3218_1733997718">
             <w:r>
               <w:rPr>
                 <w:webHidden/>
@@ -2059,7 +2059,7 @@
               </w:rPr>
               <w:t>REFERÊNCIAS</w:t>
               <w:tab/>
-              <w:t>53</w:t>
+              <w:t>54</w:t>
             </w:r>
           </w:hyperlink>
         </w:p>
@@ -2072,7 +2072,7 @@
             </w:tabs>
             <w:rPr/>
           </w:pPr>
-          <w:hyperlink w:anchor="__RefHeading___Toc3220_1968430665">
+          <w:hyperlink w:anchor="__RefHeading___Toc3220_1733997718">
             <w:r>
               <w:rPr>
                 <w:webHidden/>
@@ -2080,7 +2080,7 @@
               </w:rPr>
               <w:t>APÊNDICE A — DIAGRAMAS DE MODELAGEM</w:t>
               <w:tab/>
-              <w:t>55</w:t>
+              <w:t>56</w:t>
             </w:r>
           </w:hyperlink>
         </w:p>
@@ -2093,7 +2093,7 @@
             </w:tabs>
             <w:rPr/>
           </w:pPr>
-          <w:hyperlink w:anchor="__RefHeading___Toc3222_1968430665">
+          <w:hyperlink w:anchor="__RefHeading___Toc3222_1733997718">
             <w:r>
               <w:rPr>
                 <w:webHidden/>
@@ -2101,7 +2101,7 @@
               </w:rPr>
               <w:t>Apêndice A.1a — Diagrama de Casos de Uso: Visitante e Participante</w:t>
               <w:tab/>
-              <w:t>56</w:t>
+              <w:t>57</w:t>
             </w:r>
           </w:hyperlink>
         </w:p>
@@ -2114,7 +2114,7 @@
             </w:tabs>
             <w:rPr/>
           </w:pPr>
-          <w:hyperlink w:anchor="__RefHeading___Toc3224_1968430665">
+          <w:hyperlink w:anchor="__RefHeading___Toc3224_1733997718">
             <w:r>
               <w:rPr>
                 <w:webHidden/>
@@ -2122,7 +2122,7 @@
               </w:rPr>
               <w:t>Apêndice A.1b — Diagrama de Casos de Uso: Organizador</w:t>
               <w:tab/>
-              <w:t>57</w:t>
+              <w:t>58</w:t>
             </w:r>
           </w:hyperlink>
         </w:p>
@@ -2135,7 +2135,7 @@
             </w:tabs>
             <w:rPr/>
           </w:pPr>
-          <w:hyperlink w:anchor="__RefHeading___Toc3226_1968430665">
+          <w:hyperlink w:anchor="__RefHeading___Toc3226_1733997718">
             <w:r>
               <w:rPr>
                 <w:webHidden/>
@@ -2143,7 +2143,7 @@
               </w:rPr>
               <w:t>Apêndice A.2a — Diagrama de Classes: Usuários, Eventos e Inscrições</w:t>
               <w:tab/>
-              <w:t>58</w:t>
+              <w:t>59</w:t>
             </w:r>
           </w:hyperlink>
         </w:p>
@@ -2156,7 +2156,7 @@
             </w:tabs>
             <w:rPr/>
           </w:pPr>
-          <w:hyperlink w:anchor="__RefHeading___Toc3228_1968430665">
+          <w:hyperlink w:anchor="__RefHeading___Toc3228_1733997718">
             <w:r>
               <w:rPr>
                 <w:webHidden/>
@@ -2164,7 +2164,7 @@
               </w:rPr>
               <w:t>Apêndice A.2b — Diagrama de Classes: Participação e Inteligência Artificial</w:t>
               <w:tab/>
-              <w:t>59</w:t>
+              <w:t>60</w:t>
             </w:r>
           </w:hyperlink>
         </w:p>
@@ -2177,7 +2177,7 @@
             </w:tabs>
             <w:rPr/>
           </w:pPr>
-          <w:hyperlink w:anchor="__RefHeading___Toc3230_1968430665">
+          <w:hyperlink w:anchor="__RefHeading___Toc3230_1733997718">
             <w:r>
               <w:rPr>
                 <w:webHidden/>
@@ -2185,7 +2185,7 @@
               </w:rPr>
               <w:t>Apêndice A.3a — Diagrama de Estados: Inscrição</w:t>
               <w:tab/>
-              <w:t>60</w:t>
+              <w:t>61</w:t>
             </w:r>
           </w:hyperlink>
         </w:p>
@@ -2198,7 +2198,7 @@
             </w:tabs>
             <w:rPr/>
           </w:pPr>
-          <w:hyperlink w:anchor="__RefHeading___Toc3232_1968430665">
+          <w:hyperlink w:anchor="__RefHeading___Toc3232_1733997718">
             <w:r>
               <w:rPr>
                 <w:webHidden/>
@@ -2206,7 +2206,7 @@
               </w:rPr>
               <w:t>Apêndice A.3b — Diagrama de Estados: Evento</w:t>
               <w:tab/>
-              <w:t>61</w:t>
+              <w:t>62</w:t>
             </w:r>
           </w:hyperlink>
         </w:p>
@@ -2219,7 +2219,7 @@
             </w:tabs>
             <w:rPr/>
           </w:pPr>
-          <w:hyperlink w:anchor="__RefHeading___Toc3234_1968430665">
+          <w:hyperlink w:anchor="__RefHeading___Toc3234_1733997718">
             <w:r>
               <w:rPr>
                 <w:webHidden/>
@@ -2227,7 +2227,7 @@
               </w:rPr>
               <w:t>Apêndice A.4 — Diagrama de Atividades: Cadastro de Evento Assistido por IA</w:t>
               <w:tab/>
-              <w:t>62</w:t>
+              <w:t>63</w:t>
             </w:r>
           </w:hyperlink>
         </w:p>
@@ -2240,7 +2240,7 @@
             </w:tabs>
             <w:rPr/>
           </w:pPr>
-          <w:hyperlink w:anchor="__RefHeading___Toc3236_1968430665">
+          <w:hyperlink w:anchor="__RefHeading___Toc3236_1733997718">
             <w:r>
               <w:rPr>
                 <w:webHidden/>
@@ -2248,7 +2248,7 @@
               </w:rPr>
               <w:t>Apêndice A.5 — Diagrama de Interação: Cadastro de Evento via IA</w:t>
               <w:tab/>
-              <w:t>63</w:t>
+              <w:t>64</w:t>
             </w:r>
           </w:hyperlink>
         </w:p>
@@ -2261,7 +2261,7 @@
             </w:tabs>
             <w:rPr/>
           </w:pPr>
-          <w:hyperlink w:anchor="__RefHeading___Toc3238_1968430665">
+          <w:hyperlink w:anchor="__RefHeading___Toc3238_1733997718">
             <w:r>
               <w:rPr>
                 <w:webHidden/>
@@ -2269,7 +2269,7 @@
               </w:rPr>
               <w:t>Apêndice A.6a — Diagrama de Interação: Emissão de Certificado</w:t>
               <w:tab/>
-              <w:t>64</w:t>
+              <w:t>65</w:t>
             </w:r>
           </w:hyperlink>
         </w:p>
@@ -2282,7 +2282,7 @@
             </w:tabs>
             <w:rPr/>
           </w:pPr>
-          <w:hyperlink w:anchor="__RefHeading___Toc3240_1968430665">
+          <w:hyperlink w:anchor="__RefHeading___Toc3240_1733997718">
             <w:r>
               <w:rPr>
                 <w:webHidden/>
@@ -2290,7 +2290,7 @@
               </w:rPr>
               <w:t>Apêndice A.6b — Diagrama de Interação: Download do Certificado</w:t>
               <w:tab/>
-              <w:t>65</w:t>
+              <w:t>66</w:t>
             </w:r>
           </w:hyperlink>
         </w:p>
@@ -2303,7 +2303,7 @@
             </w:tabs>
             <w:rPr/>
           </w:pPr>
-          <w:hyperlink w:anchor="__RefHeading___Toc3242_1968430665">
+          <w:hyperlink w:anchor="__RefHeading___Toc3242_1733997718">
             <w:r>
               <w:rPr>
                 <w:webHidden/>
@@ -2311,7 +2311,7 @@
               </w:rPr>
               <w:t>Apêndice A.7 — Diagrama de Componentes</w:t>
               <w:tab/>
-              <w:t>66</w:t>
+              <w:t>67</w:t>
             </w:r>
           </w:hyperlink>
         </w:p>
@@ -2324,7 +2324,7 @@
             </w:tabs>
             <w:rPr/>
           </w:pPr>
-          <w:hyperlink w:anchor="__RefHeading___Toc3244_1968430665">
+          <w:hyperlink w:anchor="__RefHeading___Toc3244_1733997718">
             <w:r>
               <w:rPr>
                 <w:webHidden/>
@@ -2332,7 +2332,7 @@
               </w:rPr>
               <w:t>APÊNDICE B — VARIÁVEIS DE AMBIENTE</w:t>
               <w:tab/>
-              <w:t>67</w:t>
+              <w:t>68</w:t>
             </w:r>
           </w:hyperlink>
         </w:p>
@@ -2345,7 +2345,7 @@
             </w:tabs>
             <w:rPr/>
           </w:pPr>
-          <w:hyperlink w:anchor="__RefHeading___Toc3246_1968430665">
+          <w:hyperlink w:anchor="__RefHeading___Toc3246_1733997718">
             <w:r>
               <w:rPr>
                 <w:webHidden/>
@@ -2353,7 +2353,7 @@
               </w:rPr>
               <w:t>APÊNDICE C — GLOSSÁRIO</w:t>
               <w:tab/>
-              <w:t>68</w:t>
+              <w:t>69</w:t>
             </w:r>
           </w:hyperlink>
           <w:r>
@@ -2386,7 +2386,7 @@
         <w:jc w:val="left"/>
         <w:rPr/>
       </w:pPr>
-      <w:bookmarkStart w:id="0" w:name="__RefHeading___Toc3074_1968430665"/>
+      <w:bookmarkStart w:id="0" w:name="__RefHeading___Toc3074_1733997718"/>
       <w:bookmarkEnd w:id="0"/>
       <w:r>
         <w:rPr>
@@ -2464,7 +2464,7 @@
           <w:sz w:val="24"/>
           <w:szCs w:val="24"/>
         </w:rPr>
-        <w:t>O desenvolvimento seguiu uma especificação técnica com regras de negócio numeradas, rastreáveis até o código-fonte e os testes automatizados, e foi organizado nas etapas sucessivas apresentadas no cronograma da seção 6.</w:t>
+        <w:t>O desenvolvimento seguiu uma especificação técnica com regras de negócio numeradas, rastreáveis até o código-fonte e os testes automatizados, e foi organizado nas etapas sucessivas apresentadas no cronograma da seção 6. O código-fonte, a especificação técnica e os diagramas estão disponíveis no repositório do projeto: https://github.com/Jayzmatos22/GerenciadorDeEventos.</w:t>
       </w:r>
     </w:p>
     <w:p>
@@ -2495,7 +2495,7 @@
         <w:jc w:val="left"/>
         <w:rPr/>
       </w:pPr>
-      <w:bookmarkStart w:id="1" w:name="__RefHeading___Toc3076_1968430665"/>
+      <w:bookmarkStart w:id="1" w:name="__RefHeading___Toc3076_1733997718"/>
       <w:bookmarkEnd w:id="1"/>
       <w:r>
         <w:rPr>
@@ -2516,7 +2516,7 @@
         <w:jc w:val="left"/>
         <w:rPr/>
       </w:pPr>
-      <w:bookmarkStart w:id="2" w:name="__RefHeading___Toc3078_1968430665"/>
+      <w:bookmarkStart w:id="2" w:name="__RefHeading___Toc3078_1733997718"/>
       <w:bookmarkEnd w:id="2"/>
       <w:r>
         <w:rPr>
@@ -2619,7 +2619,7 @@
         <w:jc w:val="left"/>
         <w:rPr/>
       </w:pPr>
-      <w:bookmarkStart w:id="3" w:name="__RefHeading___Toc3080_1968430665"/>
+      <w:bookmarkStart w:id="3" w:name="__RefHeading___Toc3080_1733997718"/>
       <w:bookmarkEnd w:id="3"/>
       <w:r>
         <w:rPr>
@@ -2638,7 +2638,7 @@
         <w:jc w:val="left"/>
         <w:rPr/>
       </w:pPr>
-      <w:bookmarkStart w:id="4" w:name="__RefHeading___Toc3082_1968430665"/>
+      <w:bookmarkStart w:id="4" w:name="__RefHeading___Toc3082_1733997718"/>
       <w:bookmarkEnd w:id="4"/>
       <w:r>
         <w:rPr>
@@ -2680,7 +2680,7 @@
         <w:jc w:val="left"/>
         <w:rPr/>
       </w:pPr>
-      <w:bookmarkStart w:id="5" w:name="__RefHeading___Toc3084_1968430665"/>
+      <w:bookmarkStart w:id="5" w:name="__RefHeading___Toc3084_1733997718"/>
       <w:bookmarkEnd w:id="5"/>
       <w:r>
         <w:rPr>
@@ -2820,7 +2820,7 @@
         <w:jc w:val="left"/>
         <w:rPr/>
       </w:pPr>
-      <w:bookmarkStart w:id="6" w:name="__RefHeading___Toc3086_1968430665"/>
+      <w:bookmarkStart w:id="6" w:name="__RefHeading___Toc3086_1733997718"/>
       <w:bookmarkEnd w:id="6"/>
       <w:r>
         <w:rPr>
@@ -2883,7 +2883,7 @@
         <w:jc w:val="left"/>
         <w:rPr/>
       </w:pPr>
-      <w:bookmarkStart w:id="7" w:name="__RefHeading___Toc3088_1968430665"/>
+      <w:bookmarkStart w:id="7" w:name="__RefHeading___Toc3088_1733997718"/>
       <w:bookmarkEnd w:id="7"/>
       <w:r>
         <w:rPr>
@@ -3010,7 +3010,7 @@
         <w:jc w:val="left"/>
         <w:rPr/>
       </w:pPr>
-      <w:bookmarkStart w:id="8" w:name="__RefHeading___Toc3090_1968430665"/>
+      <w:bookmarkStart w:id="8" w:name="__RefHeading___Toc3090_1733997718"/>
       <w:bookmarkEnd w:id="8"/>
       <w:r>
         <w:rPr>
@@ -3240,7 +3240,7 @@
         <w:jc w:val="left"/>
         <w:rPr/>
       </w:pPr>
-      <w:bookmarkStart w:id="9" w:name="__RefHeading___Toc3092_1968430665"/>
+      <w:bookmarkStart w:id="9" w:name="__RefHeading___Toc3092_1733997718"/>
       <w:bookmarkEnd w:id="9"/>
       <w:r>
         <w:rPr>
@@ -3261,7 +3261,7 @@
         <w:jc w:val="left"/>
         <w:rPr/>
       </w:pPr>
-      <w:bookmarkStart w:id="10" w:name="__RefHeading___Toc3094_1968430665"/>
+      <w:bookmarkStart w:id="10" w:name="__RefHeading___Toc3094_1733997718"/>
       <w:bookmarkEnd w:id="10"/>
       <w:r>
         <w:rPr>
@@ -3343,7 +3343,7 @@
         <w:jc w:val="left"/>
         <w:rPr/>
       </w:pPr>
-      <w:bookmarkStart w:id="11" w:name="__RefHeading___Toc3096_1968430665"/>
+      <w:bookmarkStart w:id="11" w:name="__RefHeading___Toc3096_1733997718"/>
       <w:bookmarkEnd w:id="11"/>
       <w:r>
         <w:rPr>
@@ -3425,7 +3425,7 @@
         <w:jc w:val="left"/>
         <w:rPr/>
       </w:pPr>
-      <w:bookmarkStart w:id="12" w:name="__RefHeading___Toc3098_1968430665"/>
+      <w:bookmarkStart w:id="12" w:name="__RefHeading___Toc3098_1733997718"/>
       <w:bookmarkEnd w:id="12"/>
       <w:r>
         <w:rPr>
@@ -3489,7 +3489,7 @@
         <w:jc w:val="left"/>
         <w:rPr/>
       </w:pPr>
-      <w:bookmarkStart w:id="13" w:name="__RefHeading___Toc3100_1968430665"/>
+      <w:bookmarkStart w:id="13" w:name="__RefHeading___Toc3100_1733997718"/>
       <w:bookmarkEnd w:id="13"/>
       <w:r>
         <w:rPr>
@@ -3510,7 +3510,7 @@
         <w:jc w:val="left"/>
         <w:rPr/>
       </w:pPr>
-      <w:bookmarkStart w:id="14" w:name="__RefHeading___Toc3102_1968430665"/>
+      <w:bookmarkStart w:id="14" w:name="__RefHeading___Toc3102_1733997718"/>
       <w:bookmarkEnd w:id="14"/>
       <w:r>
         <w:rPr>
@@ -3699,7 +3699,7 @@
         <w:jc w:val="left"/>
         <w:rPr/>
       </w:pPr>
-      <w:bookmarkStart w:id="15" w:name="__RefHeading___Toc3104_1968430665"/>
+      <w:bookmarkStart w:id="15" w:name="__RefHeading___Toc3104_1733997718"/>
       <w:bookmarkEnd w:id="15"/>
       <w:r>
         <w:rPr>
@@ -3806,7 +3806,7 @@
         <w:jc w:val="left"/>
         <w:rPr/>
       </w:pPr>
-      <w:bookmarkStart w:id="16" w:name="__RefHeading___Toc3106_1968430665"/>
+      <w:bookmarkStart w:id="16" w:name="__RefHeading___Toc3106_1733997718"/>
       <w:bookmarkEnd w:id="16"/>
       <w:r>
         <w:rPr>
@@ -3848,7 +3848,7 @@
         <w:jc w:val="left"/>
         <w:rPr/>
       </w:pPr>
-      <w:bookmarkStart w:id="17" w:name="__RefHeading___Toc3108_1968430665"/>
+      <w:bookmarkStart w:id="17" w:name="__RefHeading___Toc3108_1733997718"/>
       <w:bookmarkEnd w:id="17"/>
       <w:r>
         <w:rPr>
@@ -4152,7 +4152,7 @@
         <w:jc w:val="left"/>
         <w:rPr/>
       </w:pPr>
-      <w:bookmarkStart w:id="18" w:name="__RefHeading___Toc3110_1968430665"/>
+      <w:bookmarkStart w:id="18" w:name="__RefHeading___Toc3110_1733997718"/>
       <w:bookmarkEnd w:id="18"/>
       <w:r>
         <w:rPr>
@@ -4459,7 +4459,7 @@
         <w:jc w:val="left"/>
         <w:rPr/>
       </w:pPr>
-      <w:bookmarkStart w:id="19" w:name="__RefHeading___Toc3112_1968430665"/>
+      <w:bookmarkStart w:id="19" w:name="__RefHeading___Toc3112_1733997718"/>
       <w:bookmarkEnd w:id="19"/>
       <w:r>
         <w:rPr>
@@ -4480,7 +4480,7 @@
         <w:jc w:val="left"/>
         <w:rPr/>
       </w:pPr>
-      <w:bookmarkStart w:id="20" w:name="__RefHeading___Toc3114_1968430665"/>
+      <w:bookmarkStart w:id="20" w:name="__RefHeading___Toc3114_1733997718"/>
       <w:bookmarkEnd w:id="20"/>
       <w:r>
         <w:rPr>
@@ -5659,7 +5659,7 @@
         <w:jc w:val="left"/>
         <w:rPr/>
       </w:pPr>
-      <w:bookmarkStart w:id="21" w:name="__RefHeading___Toc3116_1968430665"/>
+      <w:bookmarkStart w:id="21" w:name="__RefHeading___Toc3116_1733997718"/>
       <w:bookmarkEnd w:id="21"/>
       <w:r>
         <w:rPr>
@@ -6377,7 +6377,7 @@
         <w:jc w:val="left"/>
         <w:rPr/>
       </w:pPr>
-      <w:bookmarkStart w:id="22" w:name="__RefHeading___Toc3118_1968430665"/>
+      <w:bookmarkStart w:id="22" w:name="__RefHeading___Toc3118_1733997718"/>
       <w:bookmarkEnd w:id="22"/>
       <w:r>
         <w:rPr>
@@ -6398,7 +6398,7 @@
         <w:jc w:val="left"/>
         <w:rPr/>
       </w:pPr>
-      <w:bookmarkStart w:id="23" w:name="__RefHeading___Toc3120_1968430665"/>
+      <w:bookmarkStart w:id="23" w:name="__RefHeading___Toc3120_1733997718"/>
       <w:bookmarkEnd w:id="23"/>
       <w:r>
         <w:rPr>
@@ -6522,7 +6522,7 @@
         <w:jc w:val="left"/>
         <w:rPr/>
       </w:pPr>
-      <w:bookmarkStart w:id="24" w:name="__RefHeading___Toc3122_1968430665"/>
+      <w:bookmarkStart w:id="24" w:name="__RefHeading___Toc3122_1733997718"/>
       <w:bookmarkEnd w:id="24"/>
       <w:r>
         <w:rPr>
@@ -7240,7 +7240,7 @@
         <w:jc w:val="left"/>
         <w:rPr/>
       </w:pPr>
-      <w:bookmarkStart w:id="25" w:name="__RefHeading___Toc3124_1968430665"/>
+      <w:bookmarkStart w:id="25" w:name="__RefHeading___Toc3124_1733997718"/>
       <w:bookmarkEnd w:id="25"/>
       <w:r>
         <w:rPr>
@@ -7261,7 +7261,7 @@
         <w:jc w:val="left"/>
         <w:rPr/>
       </w:pPr>
-      <w:bookmarkStart w:id="26" w:name="__RefHeading___Toc3126_1968430665"/>
+      <w:bookmarkStart w:id="26" w:name="__RefHeading___Toc3126_1733997718"/>
       <w:bookmarkEnd w:id="26"/>
       <w:r>
         <w:rPr>
@@ -8699,7 +8699,7 @@
         <w:jc w:val="left"/>
         <w:rPr/>
       </w:pPr>
-      <w:bookmarkStart w:id="27" w:name="__RefHeading___Toc3128_1968430665"/>
+      <w:bookmarkStart w:id="27" w:name="__RefHeading___Toc3128_1733997718"/>
       <w:bookmarkEnd w:id="27"/>
       <w:r>
         <w:rPr>
@@ -10850,7 +10850,7 @@
         <w:jc w:val="left"/>
         <w:rPr/>
       </w:pPr>
-      <w:bookmarkStart w:id="28" w:name="__RefHeading___Toc3130_1968430665"/>
+      <w:bookmarkStart w:id="28" w:name="__RefHeading___Toc3130_1733997718"/>
       <w:bookmarkEnd w:id="28"/>
       <w:r>
         <w:rPr>
@@ -10890,7 +10890,7 @@
         <w:jc w:val="left"/>
         <w:rPr/>
       </w:pPr>
-      <w:bookmarkStart w:id="29" w:name="__RefHeading___Toc3132_1968430665"/>
+      <w:bookmarkStart w:id="29" w:name="__RefHeading___Toc3132_1733997718"/>
       <w:bookmarkEnd w:id="29"/>
       <w:r>
         <w:rPr>
@@ -11651,7 +11651,7 @@
         <w:jc w:val="left"/>
         <w:rPr/>
       </w:pPr>
-      <w:bookmarkStart w:id="30" w:name="__RefHeading___Toc3134_1968430665"/>
+      <w:bookmarkStart w:id="30" w:name="__RefHeading___Toc3134_1733997718"/>
       <w:bookmarkEnd w:id="30"/>
       <w:r>
         <w:rPr>
@@ -12174,7 +12174,7 @@
         <w:jc w:val="left"/>
         <w:rPr/>
       </w:pPr>
-      <w:bookmarkStart w:id="31" w:name="__RefHeading___Toc3136_1968430665"/>
+      <w:bookmarkStart w:id="31" w:name="__RefHeading___Toc3136_1733997718"/>
       <w:bookmarkEnd w:id="31"/>
       <w:r>
         <w:rPr>
@@ -13768,7 +13768,7 @@
         <w:jc w:val="left"/>
         <w:rPr/>
       </w:pPr>
-      <w:bookmarkStart w:id="32" w:name="__RefHeading___Toc3138_1968430665"/>
+      <w:bookmarkStart w:id="32" w:name="__RefHeading___Toc3138_1733997718"/>
       <w:bookmarkEnd w:id="32"/>
       <w:r>
         <w:rPr>
@@ -14410,7 +14410,7 @@
         <w:jc w:val="left"/>
         <w:rPr/>
       </w:pPr>
-      <w:bookmarkStart w:id="33" w:name="__RefHeading___Toc3140_1968430665"/>
+      <w:bookmarkStart w:id="33" w:name="__RefHeading___Toc3140_1733997718"/>
       <w:bookmarkEnd w:id="33"/>
       <w:r>
         <w:rPr>
@@ -15290,7 +15290,7 @@
         <w:jc w:val="left"/>
         <w:rPr/>
       </w:pPr>
-      <w:bookmarkStart w:id="34" w:name="__RefHeading___Toc3142_1968430665"/>
+      <w:bookmarkStart w:id="34" w:name="__RefHeading___Toc3142_1733997718"/>
       <w:bookmarkEnd w:id="34"/>
       <w:r>
         <w:rPr>
@@ -15932,7 +15932,7 @@
         <w:jc w:val="left"/>
         <w:rPr/>
       </w:pPr>
-      <w:bookmarkStart w:id="35" w:name="__RefHeading___Toc3144_1968430665"/>
+      <w:bookmarkStart w:id="35" w:name="__RefHeading___Toc3144_1733997718"/>
       <w:bookmarkEnd w:id="35"/>
       <w:r>
         <w:rPr>
@@ -16693,7 +16693,7 @@
         <w:jc w:val="left"/>
         <w:rPr/>
       </w:pPr>
-      <w:bookmarkStart w:id="36" w:name="__RefHeading___Toc3146_1968430665"/>
+      <w:bookmarkStart w:id="36" w:name="__RefHeading___Toc3146_1733997718"/>
       <w:bookmarkEnd w:id="36"/>
       <w:r>
         <w:rPr>
@@ -17454,7 +17454,7 @@
         <w:jc w:val="left"/>
         <w:rPr/>
       </w:pPr>
-      <w:bookmarkStart w:id="37" w:name="__RefHeading___Toc3148_1968430665"/>
+      <w:bookmarkStart w:id="37" w:name="__RefHeading___Toc3148_1733997718"/>
       <w:bookmarkEnd w:id="37"/>
       <w:r>
         <w:rPr>
@@ -18334,7 +18334,7 @@
         <w:jc w:val="left"/>
         <w:rPr/>
       </w:pPr>
-      <w:bookmarkStart w:id="38" w:name="__RefHeading___Toc3150_1968430665"/>
+      <w:bookmarkStart w:id="38" w:name="__RefHeading___Toc3150_1733997718"/>
       <w:bookmarkEnd w:id="38"/>
       <w:r>
         <w:rPr>
@@ -19336,7 +19336,7 @@
       <w:r>
         <w:br w:type="page"/>
       </w:r>
-      <w:bookmarkStart w:id="39" w:name="__RefHeading___Toc3152_1968430665"/>
+      <w:bookmarkStart w:id="39" w:name="__RefHeading___Toc3152_1733997718"/>
       <w:bookmarkEnd w:id="39"/>
       <w:r>
         <w:rPr>
@@ -20257,7 +20257,7 @@
         <w:jc w:val="left"/>
         <w:rPr/>
       </w:pPr>
-      <w:bookmarkStart w:id="40" w:name="__RefHeading___Toc3154_1968430665"/>
+      <w:bookmarkStart w:id="40" w:name="__RefHeading___Toc3154_1733997718"/>
       <w:bookmarkEnd w:id="40"/>
       <w:r>
         <w:rPr>
@@ -21655,7 +21655,7 @@
         <w:jc w:val="left"/>
         <w:rPr/>
       </w:pPr>
-      <w:bookmarkStart w:id="41" w:name="__RefHeading___Toc3156_1968430665"/>
+      <w:bookmarkStart w:id="41" w:name="__RefHeading___Toc3156_1733997718"/>
       <w:bookmarkEnd w:id="41"/>
       <w:r>
         <w:rPr>
@@ -21758,7 +21758,7 @@
         <w:jc w:val="left"/>
         <w:rPr/>
       </w:pPr>
-      <w:bookmarkStart w:id="42" w:name="__RefHeading___Toc3158_1968430665"/>
+      <w:bookmarkStart w:id="42" w:name="__RefHeading___Toc3158_1733997718"/>
       <w:bookmarkEnd w:id="42"/>
       <w:r>
         <w:rPr>
@@ -21885,7 +21885,7 @@
         <w:jc w:val="left"/>
         <w:rPr/>
       </w:pPr>
-      <w:bookmarkStart w:id="43" w:name="__RefHeading___Toc3160_1968430665"/>
+      <w:bookmarkStart w:id="43" w:name="__RefHeading___Toc3160_1733997718"/>
       <w:bookmarkEnd w:id="43"/>
       <w:r>
         <w:rPr>
@@ -21906,7 +21906,7 @@
         <w:jc w:val="left"/>
         <w:rPr/>
       </w:pPr>
-      <w:bookmarkStart w:id="44" w:name="__RefHeading___Toc3162_1968430665"/>
+      <w:bookmarkStart w:id="44" w:name="__RefHeading___Toc3162_1733997718"/>
       <w:bookmarkEnd w:id="44"/>
       <w:r>
         <w:rPr>
@@ -21967,7 +21967,7 @@
         <w:jc w:val="left"/>
         <w:rPr/>
       </w:pPr>
-      <w:bookmarkStart w:id="45" w:name="__RefHeading___Toc3164_1968430665"/>
+      <w:bookmarkStart w:id="45" w:name="__RefHeading___Toc3164_1733997718"/>
       <w:bookmarkEnd w:id="45"/>
       <w:r>
         <w:rPr>
@@ -22013,7 +22013,7 @@
           <w:sz w:val="24"/>
           <w:szCs w:val="24"/>
         </w:rPr>
-        <w:t>a) Obter o código-fonte a partir do repositório remoto e acessar o diretório criado.</w:t>
+        <w:t>a) Obter o código-fonte a partir do repositório remoto, disponível em https://github.com/Jayzmatos22/GerenciadorDeEventos, e acessar o diretório criado.</w:t>
       </w:r>
     </w:p>
     <w:p>
@@ -22286,7 +22286,7 @@
         <w:jc w:val="left"/>
         <w:rPr/>
       </w:pPr>
-      <w:bookmarkStart w:id="46" w:name="__RefHeading___Toc3166_1968430665"/>
+      <w:bookmarkStart w:id="46" w:name="__RefHeading___Toc3166_1733997718"/>
       <w:bookmarkEnd w:id="46"/>
       <w:r>
         <w:rPr>
@@ -22307,7 +22307,7 @@
         <w:jc w:val="left"/>
         <w:rPr/>
       </w:pPr>
-      <w:bookmarkStart w:id="47" w:name="__RefHeading___Toc3168_1968430665"/>
+      <w:bookmarkStart w:id="47" w:name="__RefHeading___Toc3168_1733997718"/>
       <w:bookmarkEnd w:id="47"/>
       <w:r>
         <w:rPr>
@@ -22389,7 +22389,7 @@
         <w:jc w:val="left"/>
         <w:rPr/>
       </w:pPr>
-      <w:bookmarkStart w:id="48" w:name="__RefHeading___Toc3170_1968430665"/>
+      <w:bookmarkStart w:id="48" w:name="__RefHeading___Toc3170_1733997718"/>
       <w:bookmarkEnd w:id="48"/>
       <w:r>
         <w:rPr>
@@ -22474,7 +22474,7 @@
         <w:jc w:val="left"/>
         <w:rPr/>
       </w:pPr>
-      <w:bookmarkStart w:id="49" w:name="__RefHeading___Toc3172_1968430665"/>
+      <w:bookmarkStart w:id="49" w:name="__RefHeading___Toc3172_1733997718"/>
       <w:bookmarkEnd w:id="49"/>
       <w:r>
         <w:rPr>
@@ -22495,7 +22495,7 @@
         <w:jc w:val="left"/>
         <w:rPr/>
       </w:pPr>
-      <w:bookmarkStart w:id="50" w:name="__RefHeading___Toc3174_1968430665"/>
+      <w:bookmarkStart w:id="50" w:name="__RefHeading___Toc3174_1733997718"/>
       <w:bookmarkEnd w:id="50"/>
       <w:r>
         <w:rPr>
@@ -22535,7 +22535,7 @@
         <w:jc w:val="left"/>
         <w:rPr/>
       </w:pPr>
-      <w:bookmarkStart w:id="51" w:name="__RefHeading___Toc3176_1968430665"/>
+      <w:bookmarkStart w:id="51" w:name="__RefHeading___Toc3176_1733997718"/>
       <w:bookmarkEnd w:id="51"/>
       <w:r>
         <w:rPr>
@@ -23058,7 +23058,7 @@
         <w:jc w:val="left"/>
         <w:rPr/>
       </w:pPr>
-      <w:bookmarkStart w:id="52" w:name="__RefHeading___Toc3178_1968430665"/>
+      <w:bookmarkStart w:id="52" w:name="__RefHeading___Toc3178_1733997718"/>
       <w:bookmarkEnd w:id="52"/>
       <w:r>
         <w:rPr>
@@ -24316,7 +24316,7 @@
         <w:jc w:val="left"/>
         <w:rPr/>
       </w:pPr>
-      <w:bookmarkStart w:id="53" w:name="__RefHeading___Toc3180_1968430665"/>
+      <w:bookmarkStart w:id="53" w:name="__RefHeading___Toc3180_1733997718"/>
       <w:bookmarkEnd w:id="53"/>
       <w:r>
         <w:rPr>
@@ -24958,7 +24958,7 @@
         <w:jc w:val="left"/>
         <w:rPr/>
       </w:pPr>
-      <w:bookmarkStart w:id="54" w:name="__RefHeading___Toc3182_1968430665"/>
+      <w:bookmarkStart w:id="54" w:name="__RefHeading___Toc3182_1733997718"/>
       <w:bookmarkEnd w:id="54"/>
       <w:r>
         <w:rPr>
@@ -25719,7 +25719,7 @@
         <w:jc w:val="left"/>
         <w:rPr/>
       </w:pPr>
-      <w:bookmarkStart w:id="55" w:name="__RefHeading___Toc3184_1968430665"/>
+      <w:bookmarkStart w:id="55" w:name="__RefHeading___Toc3184_1733997718"/>
       <w:bookmarkEnd w:id="55"/>
       <w:r>
         <w:rPr>
@@ -26361,7 +26361,7 @@
         <w:jc w:val="left"/>
         <w:rPr/>
       </w:pPr>
-      <w:bookmarkStart w:id="56" w:name="__RefHeading___Toc3186_1968430665"/>
+      <w:bookmarkStart w:id="56" w:name="__RefHeading___Toc3186_1733997718"/>
       <w:bookmarkEnd w:id="56"/>
       <w:r>
         <w:rPr>
@@ -27327,7 +27327,7 @@
         <w:jc w:val="left"/>
         <w:rPr/>
       </w:pPr>
-      <w:bookmarkStart w:id="57" w:name="__RefHeading___Toc3188_1968430665"/>
+      <w:bookmarkStart w:id="57" w:name="__RefHeading___Toc3188_1733997718"/>
       <w:bookmarkEnd w:id="57"/>
       <w:r>
         <w:rPr>
@@ -27501,7 +27501,7 @@
         <w:jc w:val="left"/>
         <w:rPr/>
       </w:pPr>
-      <w:bookmarkStart w:id="58" w:name="__RefHeading___Toc3190_1968430665"/>
+      <w:bookmarkStart w:id="58" w:name="__RefHeading___Toc3190_1733997718"/>
       <w:bookmarkEnd w:id="58"/>
       <w:r>
         <w:rPr>
@@ -27522,7 +27522,7 @@
         <w:jc w:val="left"/>
         <w:rPr/>
       </w:pPr>
-      <w:bookmarkStart w:id="59" w:name="__RefHeading___Toc3192_1968430665"/>
+      <w:bookmarkStart w:id="59" w:name="__RefHeading___Toc3192_1733997718"/>
       <w:bookmarkEnd w:id="59"/>
       <w:r>
         <w:rPr>
@@ -27667,7 +27667,7 @@
         <w:jc w:val="left"/>
         <w:rPr/>
       </w:pPr>
-      <w:bookmarkStart w:id="60" w:name="__RefHeading___Toc3194_1968430665"/>
+      <w:bookmarkStart w:id="60" w:name="__RefHeading___Toc3194_1733997718"/>
       <w:bookmarkEnd w:id="60"/>
       <w:r>
         <w:rPr>
@@ -27960,7 +27960,7 @@
         <w:jc w:val="left"/>
         <w:rPr/>
       </w:pPr>
-      <w:bookmarkStart w:id="61" w:name="__RefHeading___Toc3196_1968430665"/>
+      <w:bookmarkStart w:id="61" w:name="__RefHeading___Toc3196_1733997718"/>
       <w:bookmarkEnd w:id="61"/>
       <w:r>
         <w:rPr>
@@ -27981,7 +27981,7 @@
         <w:jc w:val="left"/>
         <w:rPr/>
       </w:pPr>
-      <w:bookmarkStart w:id="62" w:name="__RefHeading___Toc3198_1968430665"/>
+      <w:bookmarkStart w:id="62" w:name="__RefHeading___Toc3198_1733997718"/>
       <w:bookmarkEnd w:id="62"/>
       <w:r>
         <w:rPr>
@@ -28042,7 +28042,7 @@
         <w:jc w:val="left"/>
         <w:rPr/>
       </w:pPr>
-      <w:bookmarkStart w:id="63" w:name="__RefHeading___Toc3200_1968430665"/>
+      <w:bookmarkStart w:id="63" w:name="__RefHeading___Toc3200_1733997718"/>
       <w:bookmarkEnd w:id="63"/>
       <w:r>
         <w:rPr>
@@ -28126,7 +28126,7 @@
         <w:jc w:val="left"/>
         <w:rPr/>
       </w:pPr>
-      <w:bookmarkStart w:id="64" w:name="__RefHeading___Toc3202_1968430665"/>
+      <w:bookmarkStart w:id="64" w:name="__RefHeading___Toc3202_1733997718"/>
       <w:bookmarkEnd w:id="64"/>
       <w:r>
         <w:rPr>
@@ -28189,7 +28189,7 @@
         <w:jc w:val="left"/>
         <w:rPr/>
       </w:pPr>
-      <w:bookmarkStart w:id="65" w:name="__RefHeading___Toc3204_1968430665"/>
+      <w:bookmarkStart w:id="65" w:name="__RefHeading___Toc3204_1733997718"/>
       <w:bookmarkEnd w:id="65"/>
       <w:r>
         <w:rPr>
@@ -28231,7 +28231,7 @@
         <w:jc w:val="left"/>
         <w:rPr/>
       </w:pPr>
-      <w:bookmarkStart w:id="66" w:name="__RefHeading___Toc3206_1968430665"/>
+      <w:bookmarkStart w:id="66" w:name="__RefHeading___Toc3206_1733997718"/>
       <w:bookmarkEnd w:id="66"/>
       <w:r>
         <w:rPr>
@@ -28881,7 +28881,7 @@
         <w:jc w:val="left"/>
         <w:rPr/>
       </w:pPr>
-      <w:bookmarkStart w:id="67" w:name="__RefHeading___Toc3208_1968430665"/>
+      <w:bookmarkStart w:id="67" w:name="__RefHeading___Toc3208_1733997718"/>
       <w:bookmarkEnd w:id="67"/>
       <w:r>
         <w:rPr>
@@ -28902,7 +28902,7 @@
         <w:jc w:val="left"/>
         <w:rPr/>
       </w:pPr>
-      <w:bookmarkStart w:id="68" w:name="__RefHeading___Toc3210_1968430665"/>
+      <w:bookmarkStart w:id="68" w:name="__RefHeading___Toc3210_1733997718"/>
       <w:bookmarkEnd w:id="68"/>
       <w:r>
         <w:rPr>
@@ -29867,7 +29867,7 @@
         <w:jc w:val="left"/>
         <w:rPr/>
       </w:pPr>
-      <w:bookmarkStart w:id="69" w:name="__RefHeading___Toc3212_1968430665"/>
+      <w:bookmarkStart w:id="69" w:name="__RefHeading___Toc3212_1733997718"/>
       <w:bookmarkEnd w:id="69"/>
       <w:r>
         <w:rPr>
@@ -29888,7 +29888,7 @@
         <w:jc w:val="left"/>
         <w:rPr/>
       </w:pPr>
-      <w:bookmarkStart w:id="70" w:name="__RefHeading___Toc3214_1968430665"/>
+      <w:bookmarkStart w:id="70" w:name="__RefHeading___Toc3214_1733997718"/>
       <w:bookmarkEnd w:id="70"/>
       <w:r>
         <w:rPr>
@@ -31575,7 +31575,7 @@
       <w:r>
         <w:br w:type="page"/>
       </w:r>
-      <w:bookmarkStart w:id="71" w:name="__RefHeading___Toc3216_1968430665"/>
+      <w:bookmarkStart w:id="71" w:name="__RefHeading___Toc3216_1733997718"/>
       <w:bookmarkEnd w:id="71"/>
       <w:r>
         <w:rPr>
@@ -31667,7 +31667,7 @@
         <w:jc w:val="center"/>
         <w:rPr/>
       </w:pPr>
-      <w:bookmarkStart w:id="72" w:name="__RefHeading___Toc3218_1968430665"/>
+      <w:bookmarkStart w:id="72" w:name="__RefHeading___Toc3218_1733997718"/>
       <w:bookmarkEnd w:id="72"/>
       <w:r>
         <w:rPr>
@@ -32086,7 +32086,7 @@
         <w:jc w:val="center"/>
         <w:rPr/>
       </w:pPr>
-      <w:bookmarkStart w:id="73" w:name="__RefHeading___Toc3220_1968430665"/>
+      <w:bookmarkStart w:id="73" w:name="__RefHeading___Toc3220_1733997718"/>
       <w:bookmarkEnd w:id="73"/>
       <w:r>
         <w:rPr>
@@ -32187,7 +32187,7 @@
         <w:jc w:val="left"/>
         <w:rPr/>
       </w:pPr>
-      <w:bookmarkStart w:id="74" w:name="__RefHeading___Toc3222_1968430665"/>
+      <w:bookmarkStart w:id="74" w:name="__RefHeading___Toc3222_1733997718"/>
       <w:bookmarkEnd w:id="74"/>
       <w:r>
         <w:rPr>
@@ -32285,7 +32285,7 @@
         <w:jc w:val="left"/>
         <w:rPr/>
       </w:pPr>
-      <w:bookmarkStart w:id="75" w:name="__RefHeading___Toc3224_1968430665"/>
+      <w:bookmarkStart w:id="75" w:name="__RefHeading___Toc3224_1733997718"/>
       <w:bookmarkEnd w:id="75"/>
       <w:r>
         <w:rPr>
@@ -32383,7 +32383,7 @@
         <w:jc w:val="left"/>
         <w:rPr/>
       </w:pPr>
-      <w:bookmarkStart w:id="76" w:name="__RefHeading___Toc3226_1968430665"/>
+      <w:bookmarkStart w:id="76" w:name="__RefHeading___Toc3226_1733997718"/>
       <w:bookmarkEnd w:id="76"/>
       <w:r>
         <w:rPr>
@@ -32481,7 +32481,7 @@
         <w:jc w:val="left"/>
         <w:rPr/>
       </w:pPr>
-      <w:bookmarkStart w:id="77" w:name="__RefHeading___Toc3228_1968430665"/>
+      <w:bookmarkStart w:id="77" w:name="__RefHeading___Toc3228_1733997718"/>
       <w:bookmarkEnd w:id="77"/>
       <w:r>
         <w:rPr>
@@ -32579,7 +32579,7 @@
         <w:jc w:val="left"/>
         <w:rPr/>
       </w:pPr>
-      <w:bookmarkStart w:id="78" w:name="__RefHeading___Toc3230_1968430665"/>
+      <w:bookmarkStart w:id="78" w:name="__RefHeading___Toc3230_1733997718"/>
       <w:bookmarkEnd w:id="78"/>
       <w:r>
         <w:rPr>
@@ -32677,7 +32677,7 @@
         <w:jc w:val="left"/>
         <w:rPr/>
       </w:pPr>
-      <w:bookmarkStart w:id="79" w:name="__RefHeading___Toc3232_1968430665"/>
+      <w:bookmarkStart w:id="79" w:name="__RefHeading___Toc3232_1733997718"/>
       <w:bookmarkEnd w:id="79"/>
       <w:r>
         <w:rPr>
@@ -32775,7 +32775,7 @@
         <w:jc w:val="left"/>
         <w:rPr/>
       </w:pPr>
-      <w:bookmarkStart w:id="80" w:name="__RefHeading___Toc3234_1968430665"/>
+      <w:bookmarkStart w:id="80" w:name="__RefHeading___Toc3234_1733997718"/>
       <w:bookmarkEnd w:id="80"/>
       <w:r>
         <w:rPr>
@@ -32873,7 +32873,7 @@
         <w:jc w:val="left"/>
         <w:rPr/>
       </w:pPr>
-      <w:bookmarkStart w:id="81" w:name="__RefHeading___Toc3236_1968430665"/>
+      <w:bookmarkStart w:id="81" w:name="__RefHeading___Toc3236_1733997718"/>
       <w:bookmarkEnd w:id="81"/>
       <w:r>
         <w:rPr>
@@ -32971,7 +32971,7 @@
         <w:jc w:val="left"/>
         <w:rPr/>
       </w:pPr>
-      <w:bookmarkStart w:id="82" w:name="__RefHeading___Toc3238_1968430665"/>
+      <w:bookmarkStart w:id="82" w:name="__RefHeading___Toc3238_1733997718"/>
       <w:bookmarkEnd w:id="82"/>
       <w:r>
         <w:rPr>
@@ -33069,7 +33069,7 @@
         <w:jc w:val="left"/>
         <w:rPr/>
       </w:pPr>
-      <w:bookmarkStart w:id="83" w:name="__RefHeading___Toc3240_1968430665"/>
+      <w:bookmarkStart w:id="83" w:name="__RefHeading___Toc3240_1733997718"/>
       <w:bookmarkEnd w:id="83"/>
       <w:r>
         <w:rPr>
@@ -33167,7 +33167,7 @@
         <w:jc w:val="left"/>
         <w:rPr/>
       </w:pPr>
-      <w:bookmarkStart w:id="84" w:name="__RefHeading___Toc3242_1968430665"/>
+      <w:bookmarkStart w:id="84" w:name="__RefHeading___Toc3242_1733997718"/>
       <w:bookmarkEnd w:id="84"/>
       <w:r>
         <w:rPr>
@@ -33219,7 +33219,7 @@
         <w:jc w:val="center"/>
         <w:rPr/>
       </w:pPr>
-      <w:bookmarkStart w:id="85" w:name="__RefHeading___Toc3244_1968430665"/>
+      <w:bookmarkStart w:id="85" w:name="__RefHeading___Toc3244_1733997718"/>
       <w:bookmarkEnd w:id="85"/>
       <w:r>
         <w:rPr>
@@ -34728,7 +34728,7 @@
       <w:r>
         <w:br w:type="page"/>
       </w:r>
-      <w:bookmarkStart w:id="86" w:name="__RefHeading___Toc3246_1968430665"/>
+      <w:bookmarkStart w:id="86" w:name="__RefHeading___Toc3246_1733997718"/>
       <w:bookmarkEnd w:id="86"/>
       <w:r>
         <w:rPr>
@@ -35702,7 +35702,7 @@
     </w:r>
     <w:r>
       <w:rPr/>
-      <w:t>55</w:t>
+      <w:t>56</w:t>
     </w:r>
     <w:r>
       <w:rPr/>
@@ -35734,7 +35734,7 @@
     </w:r>
     <w:r>
       <w:rPr/>
-      <w:t>60</w:t>
+      <w:t>61</w:t>
     </w:r>
     <w:r>
       <w:rPr/>
@@ -35772,7 +35772,7 @@
     </w:r>
     <w:r>
       <w:rPr/>
-      <w:t>61</w:t>
+      <w:t>62</w:t>
     </w:r>
     <w:r>
       <w:rPr/>
@@ -35810,7 +35810,7 @@
     </w:r>
     <w:r>
       <w:rPr/>
-      <w:t>62</w:t>
+      <w:t>63</w:t>
     </w:r>
     <w:r>
       <w:rPr/>
@@ -35848,7 +35848,7 @@
     </w:r>
     <w:r>
       <w:rPr/>
-      <w:t>63</w:t>
+      <w:t>64</w:t>
     </w:r>
     <w:r>
       <w:rPr/>
@@ -35886,7 +35886,7 @@
     </w:r>
     <w:r>
       <w:rPr/>
-      <w:t>64</w:t>
+      <w:t>65</w:t>
     </w:r>
     <w:r>
       <w:rPr/>
@@ -35924,7 +35924,7 @@
     </w:r>
     <w:r>
       <w:rPr/>
-      <w:t>56</w:t>
+      <w:t>57</w:t>
     </w:r>
     <w:r>
       <w:rPr/>
@@ -35956,7 +35956,7 @@
     </w:r>
     <w:r>
       <w:rPr/>
-      <w:t>65</w:t>
+      <w:t>66</w:t>
     </w:r>
     <w:r>
       <w:rPr/>
@@ -35994,7 +35994,7 @@
     </w:r>
     <w:r>
       <w:rPr/>
-      <w:t>66</w:t>
+      <w:t>67</w:t>
     </w:r>
     <w:r>
       <w:rPr/>
@@ -36032,7 +36032,7 @@
     </w:r>
     <w:r>
       <w:rPr/>
-      <w:t>68</w:t>
+      <w:t>69</w:t>
     </w:r>
     <w:r>
       <w:rPr/>
@@ -36076,7 +36076,7 @@
     </w:r>
     <w:r>
       <w:rPr/>
-      <w:t>57</w:t>
+      <w:t>58</w:t>
     </w:r>
     <w:r>
       <w:rPr/>
@@ -36114,7 +36114,7 @@
     </w:r>
     <w:r>
       <w:rPr/>
-      <w:t>58</w:t>
+      <w:t>59</w:t>
     </w:r>
     <w:r>
       <w:rPr/>
@@ -36152,7 +36152,7 @@
     </w:r>
     <w:r>
       <w:rPr/>
-      <w:t>59</w:t>
+      <w:t>60</w:t>
     </w:r>
     <w:r>
       <w:rPr/>

</xml_diff>